<commit_message>
pruchod skrz n2k_stanoviste_prostor.R, komentovani hvezdice_eval, poznamky do metodiky
</commit_message>
<xml_diff>
--- a/Metodiky/Stanoviste/hodnoceni_stavu_stanovist.docx
+++ b/Metodiky/Stanoviste/hodnoceni_stavu_stanovist.docx
@@ -1183,16 +1183,14 @@
           <w:delText xml:space="preserve"> </w:delText>
         </w:r>
       </w:del>
-      <w:ins w:id="25" w:author="Jakub Rataj" w:date="2026-01-20T11:18:28Z">
-        <w:r>
-          <w:rPr>
-            <w:rFonts w:ascii="Times New Roman" w:hAnsi="Times New Roman"/>
-            <w:sz w:val="24"/>
-            <w:szCs w:val="24"/>
-          </w:rPr>
-        </w:r>
-      </w:ins>
-      <w:del w:id="26" w:author="Unknown Author" w:date="2026-01-07T14:46:52Z">
+      <w:r>
+        <w:rPr>
+          <w:rFonts w:ascii="Times New Roman" w:hAnsi="Times New Roman"/>
+          <w:sz w:val="24"/>
+          <w:szCs w:val="24"/>
+        </w:rPr>
+      </w:r>
+      <w:del w:id="25" w:author="Unknown Author" w:date="2026-01-07T14:46:52Z">
         <w:commentRangeEnd w:id="2"/>
         <w:r>
           <w:commentReference w:id="2"/>
@@ -1643,15 +1641,15 @@
         </w:rPr>
         <w:t>Parametr ukazuje plochou vážené zastoupení typických druhů na úz</w:t>
       </w:r>
-      <w:ins w:id="27" w:author="Unknown Author" w:date="2026-01-07T15:02:07Z">
-        <w:del w:id="28" w:author="Jakub Rataj" w:date="2026-01-20T11:37:13Z">
+      <w:ins w:id="26" w:author="Unknown Author" w:date="2026-01-07T15:02:07Z">
+        <w:del w:id="27" w:author="Jakub Rataj" w:date="2026-01-20T11:37:13Z">
           <w:r>
             <w:rPr/>
             <w:commentReference w:id="5"/>
           </w:r>
         </w:del>
       </w:ins>
-      <w:del w:id="29" w:author="Jakub Rataj" w:date="2026-01-20T11:37:42Z">
+      <w:del w:id="28" w:author="Jakub Rataj" w:date="2026-01-20T11:37:42Z">
         <w:r>
           <w:rPr/>
           <w:commentReference w:id="6"/>
@@ -1664,7 +1662,7 @@
         </w:rPr>
         <w:t>. Typické druhy charakterizují stav a vývoj stanoviště, jeho zachovalost a reprezentativnost. Zároveň dokládají stanovištní poměry a to, nakolik je dané stanoviště typické ve srovnání s poměry v širším regionu. Úbytek typických druhů je pak zpravidla známkou degradace či nějaké změny ekologických podmínek, k níž na stanovišti dochází. Parametr vychází z Příručky hodnocení biotopů (Lustyk 2</w:t>
       </w:r>
-      <w:ins w:id="30" w:author="Martin Vojík" w:date="2024-09-04T12:29:00Z">
+      <w:ins w:id="29" w:author="Martin Vojík" w:date="2024-09-04T12:29:00Z">
         <w:r>
           <w:rPr>
             <w:rFonts w:ascii="Times New Roman" w:hAnsi="Times New Roman"/>
@@ -1673,7 +1671,7 @@
           <w:t>024</w:t>
         </w:r>
       </w:ins>
-      <w:ins w:id="31" w:author="Martin Vojík" w:date="2024-09-04T12:58:00Z">
+      <w:ins w:id="30" w:author="Martin Vojík" w:date="2024-09-04T12:58:00Z">
         <w:r>
           <w:rPr>
             <w:rFonts w:ascii="Times New Roman" w:hAnsi="Times New Roman"/>
@@ -1682,7 +1680,7 @@
           <w:t>b</w:t>
         </w:r>
       </w:ins>
-      <w:del w:id="32" w:author="Martin Vojík" w:date="2024-09-04T12:29:00Z">
+      <w:del w:id="31" w:author="Martin Vojík" w:date="2024-09-04T12:29:00Z">
         <w:r>
           <w:rPr>
             <w:rFonts w:ascii="Times New Roman" w:hAnsi="Times New Roman"/>
@@ -1865,7 +1863,7 @@
         </w:rPr>
         <w:t xml:space="preserve">mohou nastat u těch stanovišť, která mají málo typických druhů cévnatých rostlin, nebo typické druhy mají nepravidelný výskyt s vazbou životního cyklu na jedinečnou událost (typicky se jedná o vodní biotopy). Hodnocení parametru v těchto případech je popsáno individuálně v PHB </w:t>
       </w:r>
-      <w:ins w:id="33" w:author="Martin Vojík" w:date="2024-09-04T12:56:00Z">
+      <w:ins w:id="32" w:author="Martin Vojík" w:date="2024-09-04T12:56:00Z">
         <w:r>
           <w:rPr>
             <w:rFonts w:ascii="Times New Roman" w:hAnsi="Times New Roman"/>
@@ -1874,7 +1872,7 @@
           <w:t>(Lustyk 2024</w:t>
         </w:r>
       </w:ins>
-      <w:ins w:id="34" w:author="Martin Vojík" w:date="2024-09-04T12:58:00Z">
+      <w:ins w:id="33" w:author="Martin Vojík" w:date="2024-09-04T12:58:00Z">
         <w:r>
           <w:rPr>
             <w:rFonts w:ascii="Times New Roman" w:hAnsi="Times New Roman"/>
@@ -1883,7 +1881,7 @@
           <w:t>b</w:t>
         </w:r>
       </w:ins>
-      <w:ins w:id="35" w:author="Martin Vojík" w:date="2024-09-04T12:56:00Z">
+      <w:ins w:id="34" w:author="Martin Vojík" w:date="2024-09-04T12:56:00Z">
         <w:r>
           <w:rPr>
             <w:rFonts w:ascii="Times New Roman" w:hAnsi="Times New Roman"/>
@@ -2316,13 +2314,13 @@
         <w:rPr/>
         <w:t>(</w:t>
       </w:r>
-      <w:ins w:id="36" w:author="Martin Vojík" w:date="2024-09-04T09:09:00Z">
+      <w:ins w:id="35" w:author="Martin Vojík" w:date="2024-09-04T09:09:00Z">
         <w:r>
           <w:rPr/>
           <w:t>a</w:t>
         </w:r>
       </w:ins>
-      <w:del w:id="37" w:author="Martin Vojík" w:date="2024-09-04T09:09:00Z">
+      <w:del w:id="36" w:author="Martin Vojík" w:date="2024-09-04T09:09:00Z">
         <w:r>
           <w:rPr/>
           <w:delText>1</w:delText>
@@ -2672,7 +2670,7 @@
         </w:rPr>
         <w:t>– parametr je počítán 2 různými způsoby podle procenta plochy stanoviště vyskytujícího se v rámci sledované EVL v mozaikách se zastoupením pod 50 % (viz tabulka</w:t>
       </w:r>
-      <w:del w:id="38" w:author="Jakub Rataj" w:date="2026-01-07T15:21:16Z">
+      <w:del w:id="37" w:author="Jakub Rataj" w:date="2026-01-07T15:21:16Z">
         <w:r>
           <w:rPr>
             <w:rFonts w:ascii="Times New Roman" w:hAnsi="Times New Roman"/>
@@ -3127,7 +3125,7 @@
         </w:rPr>
         <w:t>V </w:t>
       </w:r>
-      <w:del w:id="39" w:author="Martin Vojík" w:date="2024-09-04T09:16:00Z">
+      <w:del w:id="38" w:author="Martin Vojík" w:date="2024-09-04T09:16:00Z">
         <w:r>
           <w:rPr>
             <w:rFonts w:ascii="Times New Roman" w:hAnsi="Times New Roman"/>
@@ -3136,7 +3134,7 @@
           <w:delText xml:space="preserve">případě </w:delText>
         </w:r>
       </w:del>
-      <w:ins w:id="40" w:author="Martin Vojík" w:date="2024-09-04T09:16:00Z">
+      <w:ins w:id="39" w:author="Martin Vojík" w:date="2024-09-04T09:16:00Z">
         <w:r>
           <w:rPr>
             <w:rFonts w:ascii="Times New Roman" w:hAnsi="Times New Roman"/>
@@ -3242,7 +3240,34 @@
           <w:rFonts w:ascii="Times New Roman" w:hAnsi="Times New Roman"/>
           <w:sz w:val="24"/>
         </w:rPr>
-        <w:t xml:space="preserve">počet druhů červeného seznamu s výjimkou C4 (Grulich, 2012) v EVL vážený celkovou rozlohou daného typu přírodního stanoviště v EVL včetně degradovaných segmentů a pasek (logaritmicky transformované). Z důvodu optimálního pokrytí desetibodové stupnice je výsledná hodnota vynásobena hodnotou 4. Je-li násobek výsledného parametru vyšší než 10, nahradí se jeho hodnota číslem 10 (maximum). </w:t>
+        <w:t xml:space="preserve">počet druhů červeného seznamu s výjimkou C4 (Grulich, 2012) </w:t>
+      </w:r>
+      <w:commentRangeStart w:id="10"/>
+      <w:r>
+        <w:rPr>
+          <w:rFonts w:ascii="Times New Roman" w:hAnsi="Times New Roman"/>
+          <w:sz w:val="24"/>
+        </w:rPr>
+        <w:t>v EVL</w:t>
+      </w:r>
+      <w:ins w:id="40" w:author="Jakub Rataj" w:date="2026-01-29T14:35:59Z">
+        <w:r>
+          <w:rPr>
+            <w:rFonts w:ascii="Times New Roman" w:hAnsi="Times New Roman"/>
+            <w:sz w:val="24"/>
+          </w:rPr>
+        </w:r>
+      </w:ins>
+      <w:commentRangeEnd w:id="10"/>
+      <w:r>
+        <w:commentReference w:id="10"/>
+      </w:r>
+      <w:r>
+        <w:rPr>
+          <w:rFonts w:ascii="Times New Roman" w:hAnsi="Times New Roman"/>
+          <w:sz w:val="24"/>
+        </w:rPr>
+        <w:t xml:space="preserve"> vážený celkovou rozlohou daného typu přírodního stanoviště v EVL včetně degradovaných segmentů a pasek (logaritmicky transformované). Z důvodu optimálního pokrytí desetibodové stupnice je výsledná hodnota vynásobena hodnotou 4. Je-li násobek výsledného parametru vyšší než 10, nahradí se jeho hodnota číslem 10 (maximum). </w:t>
       </w:r>
     </w:p>
     <w:p>
@@ -3391,6 +3416,7 @@
         </w:rPr>
         <w:t xml:space="preserve"> je počet druhů červeného seznamu (kategorií C1, C2 a C3) zaznamenaných v daném typu přírodního stanoviště v dané EVL a </w:t>
       </w:r>
+      <w:commentRangeStart w:id="11"/>
       <w:r>
         <w:rPr>
           <w:rFonts w:ascii="Times New Roman" w:hAnsi="Times New Roman"/>
@@ -3413,7 +3439,26 @@
           <w:rFonts w:ascii="Times New Roman" w:hAnsi="Times New Roman"/>
           <w:sz w:val="24"/>
         </w:rPr>
-        <w:t xml:space="preserve"> celková rozloha všech polygonů daného typu přírodního stanoviště. </w:t>
+        <w:t xml:space="preserve"> celková rozloha všech polygonů daného typu přírodního stanoviště</w:t>
+      </w:r>
+      <w:ins w:id="41" w:author="Jakub Rataj" w:date="2026-01-29T14:37:59Z">
+        <w:r>
+          <w:rPr>
+            <w:rFonts w:ascii="Times New Roman" w:hAnsi="Times New Roman"/>
+            <w:sz w:val="24"/>
+          </w:rPr>
+        </w:r>
+      </w:ins>
+      <w:commentRangeEnd w:id="11"/>
+      <w:r>
+        <w:commentReference w:id="11"/>
+      </w:r>
+      <w:r>
+        <w:rPr>
+          <w:rFonts w:ascii="Times New Roman" w:hAnsi="Times New Roman"/>
+          <w:sz w:val="24"/>
+        </w:rPr>
+        <w:t xml:space="preserve">. </w:t>
       </w:r>
     </w:p>
     <w:p>
@@ -3543,7 +3588,7 @@
         </w:rPr>
         <w:t>Parametr výskytu invazních druhů, z nichž se část povinně zaznamenává při aktualizaci vrstvy mapování biotopů (Lustyk 202</w:t>
       </w:r>
-      <w:ins w:id="41" w:author="Martin Vojík" w:date="2024-09-04T12:29:00Z">
+      <w:ins w:id="42" w:author="Martin Vojík" w:date="2024-09-04T12:29:00Z">
         <w:r>
           <w:rPr>
             <w:rFonts w:ascii="Times New Roman" w:hAnsi="Times New Roman"/>
@@ -3552,7 +3597,7 @@
           <w:t>4</w:t>
         </w:r>
       </w:ins>
-      <w:ins w:id="42" w:author="Martin Vojík" w:date="2024-09-04T12:58:00Z">
+      <w:ins w:id="43" w:author="Martin Vojík" w:date="2024-09-04T12:58:00Z">
         <w:r>
           <w:rPr>
             <w:rFonts w:ascii="Times New Roman" w:hAnsi="Times New Roman"/>
@@ -3561,7 +3606,7 @@
           <w:t>a</w:t>
         </w:r>
       </w:ins>
-      <w:del w:id="43" w:author="Martin Vojík" w:date="2024-09-04T12:29:00Z">
+      <w:del w:id="44" w:author="Martin Vojík" w:date="2024-09-04T12:29:00Z">
         <w:r>
           <w:rPr>
             <w:rFonts w:ascii="Times New Roman" w:hAnsi="Times New Roman"/>
@@ -3589,7 +3634,7 @@
           <w:sz w:val="24"/>
         </w:rPr>
       </w:pPr>
-      <w:commentRangeStart w:id="10"/>
+      <w:commentRangeStart w:id="12"/>
       <w:r>
         <w:rPr>
           <w:rFonts w:ascii="Times New Roman" w:hAnsi="Times New Roman"/>
@@ -3614,7 +3659,7 @@
         </w:rPr>
         <w:t>předmětem hodnocení je procento plochy s výskytem invazních druhů cévnatých rostlin uvedených v příloze 2 Metodiky aktualizace vrstvy mapování biotopů (Lustyk, 202</w:t>
       </w:r>
-      <w:ins w:id="44" w:author="Martin Vojík" w:date="2024-09-04T12:29:00Z">
+      <w:ins w:id="45" w:author="Martin Vojík" w:date="2024-09-04T12:29:00Z">
         <w:r>
           <w:rPr>
             <w:rFonts w:ascii="Times New Roman" w:hAnsi="Times New Roman"/>
@@ -3623,7 +3668,7 @@
           <w:t>4</w:t>
         </w:r>
       </w:ins>
-      <w:del w:id="45" w:author="Martin Vojík" w:date="2024-09-04T12:29:00Z">
+      <w:del w:id="46" w:author="Martin Vojík" w:date="2024-09-04T12:29:00Z">
         <w:r>
           <w:rPr>
             <w:rFonts w:ascii="Times New Roman" w:hAnsi="Times New Roman"/>
@@ -3639,9 +3684,9 @@
         </w:rPr>
         <w:t>) a zároveň dalších nepůvodních druhů, které jsou součástí Černého, šedého a varovného seznamu (Pergl et al. 2016). Výsledná hodnota pro daný typ stanoviště se rovná maximální hodnotě škály (= 100 %) snížené o plochu stanoviště v dané EVL, dle vzorce:</w:t>
       </w:r>
-      <w:commentRangeEnd w:id="10"/>
-      <w:r>
-        <w:commentReference w:id="10"/>
+      <w:commentRangeEnd w:id="12"/>
+      <w:r>
+        <w:commentReference w:id="12"/>
       </w:r>
       <w:r>
         <w:rPr>
@@ -3950,7 +3995,7 @@
         </w:rPr>
         <w:t>předmětem hodnocení je procento plochy stanoviště s významným výskytem nativních expanzivních druhů uvedených v příloze 3</w:t>
       </w:r>
-      <w:ins w:id="46" w:author="Martin Vojík" w:date="2024-09-04T10:02:00Z">
+      <w:ins w:id="47" w:author="Martin Vojík" w:date="2024-09-04T10:02:00Z">
         <w:r>
           <w:rPr>
             <w:rFonts w:ascii="Times New Roman" w:hAnsi="Times New Roman"/>
@@ -3964,8 +4009,29 @@
           <w:rFonts w:ascii="Times New Roman" w:hAnsi="Times New Roman"/>
           <w:sz w:val="24"/>
         </w:rPr>
-        <w:t xml:space="preserve"> (příloha bude ve spolupráci s odborníky doplňována o vazbu druhů na konkrétní biotopy), které mají obdobný dopad na přírodní stanoviště, jako druhy invazní. Výsledná hodnota pro daný typ stanoviště se rovná maximální hodnotě škály (= 100 %) snížené o plochu stanoviště s výrazným zastoupením expanzivních druhů k celkové ploše stanoviště v rámci dané EVL, dle vzorce:</w:t>
-      </w:r>
+        <w:t xml:space="preserve"> (příloha bude ve spolupráci s odborníky doplňována o vazbu druhů na konkrétní biotopy), které mají obdobný dopad na přírodní stanoviště, jako druhy invazní. </w:t>
+      </w:r>
+      <w:commentRangeStart w:id="13"/>
+      <w:r>
+        <w:rPr>
+          <w:rFonts w:ascii="Times New Roman" w:hAnsi="Times New Roman"/>
+          <w:sz w:val="24"/>
+        </w:rPr>
+        <w:t>Výsledná hodnota pro daný typ stanoviště se rovná maximální hodnotě škály (= 100 %) snížené o plochu stanoviště s výrazným zastoupením expanzivních druhů k celkové ploše stanoviště v rámci dané EVL, dle vzorce:</w:t>
+      </w:r>
+      <w:ins w:id="48" w:author="Jakub Rataj" w:date="2026-01-29T15:05:44Z">
+        <w:commentRangeEnd w:id="13"/>
+        <w:r>
+          <w:commentReference w:id="13"/>
+        </w:r>
+        <w:r>
+          <w:rPr>
+            <w:rFonts w:ascii="Times New Roman" w:hAnsi="Times New Roman"/>
+            <w:i/>
+            <w:sz w:val="24"/>
+          </w:rPr>
+        </w:r>
+      </w:ins>
     </w:p>
     <w:p>
       <w:pPr>
@@ -4247,7 +4313,7 @@
         </w:rPr>
         <w:t>Mrtvé dřevo charakterizuje stav a stupeň přirozenost</w:t>
       </w:r>
-      <w:ins w:id="47" w:author="Martin Vojík" w:date="2024-09-04T09:51:00Z">
+      <w:ins w:id="49" w:author="Martin Vojík" w:date="2024-09-04T09:51:00Z">
         <w:r>
           <w:rPr>
             <w:rFonts w:ascii="Times New Roman" w:hAnsi="Times New Roman"/>
@@ -4263,7 +4329,7 @@
         </w:rPr>
         <w:t xml:space="preserve"> stanoviště, jeho zachovalost a reprezentativnost. Parametr vychází z </w:t>
       </w:r>
-      <w:del w:id="48" w:author="Martin Vojík" w:date="2024-09-04T11:56:00Z">
+      <w:del w:id="50" w:author="Martin Vojík" w:date="2024-09-04T11:56:00Z">
         <w:r>
           <w:rPr>
             <w:rFonts w:ascii="Times New Roman" w:hAnsi="Times New Roman"/>
@@ -4272,7 +4338,7 @@
           <w:delText>Příručky hodnocení biotopů</w:delText>
         </w:r>
       </w:del>
-      <w:ins w:id="49" w:author="Martin Vojík" w:date="2024-09-04T11:56:00Z">
+      <w:ins w:id="51" w:author="Martin Vojík" w:date="2024-09-04T11:56:00Z">
         <w:r>
           <w:rPr>
             <w:rFonts w:ascii="Times New Roman" w:hAnsi="Times New Roman"/>
@@ -4288,7 +4354,7 @@
         </w:rPr>
         <w:t xml:space="preserve"> (Lustyk </w:t>
       </w:r>
-      <w:del w:id="50" w:author="Martin Vojík" w:date="2024-09-04T12:26:00Z">
+      <w:del w:id="52" w:author="Martin Vojík" w:date="2024-09-04T12:26:00Z">
         <w:r>
           <w:rPr>
             <w:rFonts w:ascii="Times New Roman" w:hAnsi="Times New Roman"/>
@@ -4297,7 +4363,7 @@
           <w:delText>2015</w:delText>
         </w:r>
       </w:del>
-      <w:ins w:id="51" w:author="Martin Vojík" w:date="2024-09-04T12:26:00Z">
+      <w:ins w:id="53" w:author="Martin Vojík" w:date="2024-09-04T12:26:00Z">
         <w:r>
           <w:rPr>
             <w:rFonts w:ascii="Times New Roman" w:hAnsi="Times New Roman"/>
@@ -4306,7 +4372,7 @@
           <w:t>2024</w:t>
         </w:r>
       </w:ins>
-      <w:ins w:id="52" w:author="Martin Vojík" w:date="2024-09-04T12:58:00Z">
+      <w:ins w:id="54" w:author="Martin Vojík" w:date="2024-09-04T12:58:00Z">
         <w:r>
           <w:rPr>
             <w:rFonts w:ascii="Times New Roman" w:hAnsi="Times New Roman"/>
@@ -4501,7 +4567,7 @@
         </w:rPr>
         <w:t>Hodnocení je doplněno o parametr kalamita/polom, který vyjadřuje budoucí potenciál výskytu mrtvého dřeva na lokalitě: 3 (les po kalamitě</w:t>
       </w:r>
-      <w:ins w:id="53" w:author="Martin Vojík" w:date="2024-09-04T10:23:00Z">
+      <w:ins w:id="55" w:author="Martin Vojík" w:date="2024-09-04T10:23:00Z">
         <w:r>
           <w:rPr>
             <w:rFonts w:ascii="Times New Roman" w:hAnsi="Times New Roman"/>
@@ -4510,7 +4576,7 @@
           <w:t xml:space="preserve">, </w:t>
         </w:r>
       </w:ins>
-      <w:del w:id="54" w:author="Martin Vojík" w:date="2024-09-04T10:23:00Z">
+      <w:del w:id="56" w:author="Martin Vojík" w:date="2024-09-04T10:23:00Z">
         <w:r>
           <w:rPr>
             <w:rFonts w:ascii="Times New Roman" w:hAnsi="Times New Roman"/>
@@ -4526,7 +4592,7 @@
         </w:rPr>
         <w:t>např. kůrovcová, imisní, les po požáru, apod.</w:t>
       </w:r>
-      <w:del w:id="55" w:author="Martin Vojík" w:date="2024-09-04T10:23:00Z">
+      <w:del w:id="57" w:author="Martin Vojík" w:date="2024-09-04T10:23:00Z">
         <w:r>
           <w:rPr>
             <w:rFonts w:ascii="Times New Roman" w:hAnsi="Times New Roman"/>
@@ -4542,7 +4608,7 @@
         </w:rPr>
         <w:t xml:space="preserve">) = </w:t>
       </w:r>
-      <w:commentRangeStart w:id="11"/>
+      <w:commentRangeStart w:id="14"/>
       <w:r>
         <w:rPr>
           <w:rFonts w:ascii="Times New Roman" w:hAnsi="Times New Roman"/>
@@ -4556,9 +4622,9 @@
           <w:sz w:val="24"/>
         </w:rPr>
       </w:r>
-      <w:commentRangeEnd w:id="11"/>
-      <w:r>
-        <w:commentReference w:id="11"/>
+      <w:commentRangeEnd w:id="14"/>
+      <w:r>
+        <w:commentReference w:id="14"/>
       </w:r>
       <w:r>
         <w:rPr>
@@ -4567,7 +4633,7 @@
         </w:rPr>
         <w:t xml:space="preserve">(polom) = </w:t>
       </w:r>
-      <w:commentRangeStart w:id="12"/>
+      <w:commentRangeStart w:id="15"/>
       <w:r>
         <w:rPr>
           <w:rFonts w:ascii="Times New Roman" w:hAnsi="Times New Roman"/>
@@ -4581,9 +4647,9 @@
           <w:sz w:val="24"/>
         </w:rPr>
       </w:r>
-      <w:commentRangeEnd w:id="12"/>
-      <w:r>
-        <w:commentReference w:id="12"/>
+      <w:commentRangeEnd w:id="15"/>
+      <w:r>
+        <w:commentReference w:id="15"/>
       </w:r>
       <w:r>
         <w:rPr>
@@ -4702,8 +4768,8 @@
           <w:szCs w:val="24"/>
         </w:rPr>
       </w:pPr>
-      <w:commentRangeStart w:id="13"/>
-      <w:commentRangeStart w:id="14"/>
+      <w:commentRangeStart w:id="16"/>
+      <w:commentRangeStart w:id="17"/>
       <w:r>
         <w:rPr>
           <w:rFonts w:ascii="Times New Roman" w:hAnsi="Times New Roman"/>
@@ -4721,13 +4787,13 @@
           <w:szCs w:val="24"/>
         </w:rPr>
       </w:r>
-      <w:commentRangeEnd w:id="14"/>
-      <w:r>
-        <w:commentReference w:id="14"/>
-      </w:r>
-      <w:commentRangeEnd w:id="13"/>
-      <w:r>
-        <w:commentReference w:id="13"/>
+      <w:commentRangeEnd w:id="17"/>
+      <w:r>
+        <w:commentReference w:id="17"/>
+      </w:r>
+      <w:commentRangeEnd w:id="16"/>
+      <w:r>
+        <w:commentReference w:id="16"/>
       </w:r>
       <w:r>
         <w:rPr>
@@ -4782,7 +4848,7 @@
         <w:rPr>
           <w:rFonts w:ascii="Times New Roman" w:hAnsi="Times New Roman"/>
           <w:sz w:val="24"/>
-          <w:ins w:id="56" w:author="Martin Vojík" w:date="2024-09-04T10:27:00Z"/>
+          <w:ins w:id="58" w:author="Martin Vojík" w:date="2024-09-04T10:27:00Z"/>
         </w:rPr>
       </w:pPr>
       <w:r>
@@ -4826,7 +4892,7 @@
           <w:b/>
           <w:b/>
           <w:sz w:val="24"/>
-          <w:del w:id="57" w:author="Martin Vojík" w:date="2024-09-04T10:27:00Z"/>
+          <w:del w:id="59" w:author="Martin Vojík" w:date="2024-09-04T10:27:00Z"/>
         </w:rPr>
       </w:pPr>
       <w:r>
@@ -4853,10 +4919,10 @@
         <w:rPr>
           <w:rFonts w:ascii="Times New Roman" w:hAnsi="Times New Roman"/>
           <w:sz w:val="24"/>
-          <w:ins w:id="59" w:author="Martin Vojík" w:date="2024-09-04T10:27:00Z"/>
+          <w:ins w:id="61" w:author="Martin Vojík" w:date="2024-09-04T10:27:00Z"/>
         </w:rPr>
       </w:pPr>
-      <w:ins w:id="58" w:author="Martin Vojík" w:date="2024-09-04T10:27:00Z">
+      <w:ins w:id="60" w:author="Martin Vojík" w:date="2024-09-04T10:27:00Z">
         <w:r>
           <w:rPr>
             <w:rFonts w:ascii="Times New Roman" w:hAnsi="Times New Roman"/>
@@ -5069,10 +5135,10 @@
           <w:rFonts w:ascii="Times New Roman" w:hAnsi="Times New Roman" w:cs="Times New Roman"/>
           <w:sz w:val="24"/>
           <w:szCs w:val="24"/>
-          <w:del w:id="61" w:author="Martin Vojík" w:date="2024-09-04T13:16:00Z"/>
+          <w:del w:id="63" w:author="Martin Vojík" w:date="2024-09-04T13:16:00Z"/>
         </w:rPr>
       </w:pPr>
-      <w:del w:id="60" w:author="Martin Vojík" w:date="2024-09-04T13:16:00Z">
+      <w:del w:id="62" w:author="Martin Vojík" w:date="2024-09-04T13:16:00Z">
         <w:r>
           <w:rPr>
             <w:rFonts w:cs="Times New Roman" w:ascii="Times New Roman" w:hAnsi="Times New Roman"/>
@@ -5091,7 +5157,7 @@
           <w:rFonts w:ascii="Times New Roman" w:hAnsi="Times New Roman" w:cs="Times New Roman"/>
           <w:sz w:val="24"/>
           <w:szCs w:val="24"/>
-          <w:ins w:id="62" w:author="Martin Vojík" w:date="2024-09-04T13:02:00Z"/>
+          <w:ins w:id="64" w:author="Martin Vojík" w:date="2024-09-04T13:02:00Z"/>
         </w:rPr>
       </w:pPr>
       <w:r>
@@ -5113,7 +5179,7 @@
           <w:szCs w:val="24"/>
         </w:rPr>
       </w:pPr>
-      <w:ins w:id="63" w:author="Martin Vojík" w:date="2024-09-04T13:02:00Z">
+      <w:ins w:id="65" w:author="Martin Vojík" w:date="2024-09-04T13:02:00Z">
         <w:r>
           <w:rPr>
             <w:rFonts w:cs="Times New Roman" w:ascii="Times New Roman" w:hAnsi="Times New Roman"/>
@@ -5123,7 +5189,7 @@
           <w:t>Kučera T., Čížek L., Hofmeister J., Hošek J., Kloubcová P., Kučerová A., Malíček J., Svoboda T. &amp; Zítková I. (2016): Metodika sledování stavu předmětů ochrany evropsky významných lokalit</w:t>
         </w:r>
       </w:ins>
-      <w:ins w:id="64" w:author="Martin Vojík" w:date="2024-09-04T13:04:00Z">
+      <w:ins w:id="66" w:author="Martin Vojík" w:date="2024-09-04T13:04:00Z">
         <w:r>
           <w:rPr>
             <w:rFonts w:cs="Times New Roman" w:ascii="Times New Roman" w:hAnsi="Times New Roman"/>
@@ -5142,10 +5208,10 @@
           <w:rFonts w:ascii="Times New Roman" w:hAnsi="Times New Roman" w:cs="Times New Roman"/>
           <w:sz w:val="24"/>
           <w:szCs w:val="24"/>
-          <w:del w:id="68" w:author="Martin Vojík" w:date="2024-09-04T13:01:00Z"/>
+          <w:del w:id="70" w:author="Martin Vojík" w:date="2024-09-04T13:01:00Z"/>
         </w:rPr>
       </w:pPr>
-      <w:del w:id="65" w:author="Martin Vojík" w:date="2024-09-04T13:01:00Z">
+      <w:del w:id="67" w:author="Martin Vojík" w:date="2024-09-04T13:01:00Z">
         <w:r>
           <w:rPr>
             <w:rFonts w:cs="Times New Roman" w:ascii="Times New Roman" w:hAnsi="Times New Roman"/>
@@ -5155,7 +5221,7 @@
           <w:delText>Lustyk P. [ed.] (20</w:delText>
         </w:r>
       </w:del>
-      <w:del w:id="66" w:author="Martin Vojík" w:date="2024-09-04T12:30:00Z">
+      <w:del w:id="68" w:author="Martin Vojík" w:date="2024-09-04T12:30:00Z">
         <w:r>
           <w:rPr>
             <w:rFonts w:cs="Times New Roman" w:ascii="Times New Roman" w:hAnsi="Times New Roman"/>
@@ -5165,7 +5231,7 @@
           <w:delText>15</w:delText>
         </w:r>
       </w:del>
-      <w:del w:id="67" w:author="Martin Vojík" w:date="2024-09-04T13:01:00Z">
+      <w:del w:id="69" w:author="Martin Vojík" w:date="2024-09-04T13:01:00Z">
         <w:r>
           <w:rPr>
             <w:rFonts w:cs="Times New Roman" w:ascii="Times New Roman" w:hAnsi="Times New Roman"/>
@@ -5194,7 +5260,7 @@
         </w:rPr>
         <w:t>Lustyk P. (202</w:t>
       </w:r>
-      <w:ins w:id="69" w:author="Martin Vojík" w:date="2024-09-04T12:30:00Z">
+      <w:ins w:id="71" w:author="Martin Vojík" w:date="2024-09-04T12:30:00Z">
         <w:r>
           <w:rPr>
             <w:rFonts w:cs="Times New Roman" w:ascii="Times New Roman" w:hAnsi="Times New Roman"/>
@@ -5204,7 +5270,7 @@
           <w:t>4</w:t>
         </w:r>
       </w:ins>
-      <w:ins w:id="70" w:author="Martin Vojík" w:date="2024-09-04T13:01:00Z">
+      <w:ins w:id="72" w:author="Martin Vojík" w:date="2024-09-04T13:01:00Z">
         <w:r>
           <w:rPr>
             <w:rFonts w:cs="Times New Roman" w:ascii="Times New Roman" w:hAnsi="Times New Roman"/>
@@ -5214,7 +5280,7 @@
           <w:t>a</w:t>
         </w:r>
       </w:ins>
-      <w:del w:id="71" w:author="Martin Vojík" w:date="2024-09-04T12:30:00Z">
+      <w:del w:id="73" w:author="Martin Vojík" w:date="2024-09-04T12:30:00Z">
         <w:r>
           <w:rPr>
             <w:rFonts w:cs="Times New Roman" w:ascii="Times New Roman" w:hAnsi="Times New Roman"/>
@@ -5241,10 +5307,10 @@
           <w:rFonts w:ascii="Times New Roman" w:hAnsi="Times New Roman" w:cs="Times New Roman"/>
           <w:sz w:val="24"/>
           <w:szCs w:val="24"/>
-          <w:ins w:id="73" w:author="Martin Vojík" w:date="2024-09-04T13:01:00Z"/>
+          <w:ins w:id="75" w:author="Martin Vojík" w:date="2024-09-04T13:01:00Z"/>
         </w:rPr>
       </w:pPr>
-      <w:ins w:id="72" w:author="Martin Vojík" w:date="2024-09-04T13:01:00Z">
+      <w:ins w:id="74" w:author="Martin Vojík" w:date="2024-09-04T13:01:00Z">
         <w:r>
           <w:rPr>
             <w:rFonts w:cs="Times New Roman" w:ascii="Times New Roman" w:hAnsi="Times New Roman"/>
@@ -5263,7 +5329,7 @@
           <w:sz w:val="24"/>
         </w:rPr>
       </w:pPr>
-      <w:del w:id="74" w:author="Martin Vojík" w:date="2024-09-04T13:23:00Z">
+      <w:del w:id="76" w:author="Martin Vojík" w:date="2024-09-04T13:23:00Z">
         <w:r>
           <w:rPr>
             <w:rFonts w:ascii="Times New Roman" w:hAnsi="Times New Roman"/>
@@ -5272,7 +5338,7 @@
           <w:delText>Mehtälä J. &amp; Vuorisalo T. (2007): Conservation policy and the EU Habitats directive: favourable conservation status as a measure of conservation success. – European Environment 17: 363–375.</w:delText>
         </w:r>
       </w:del>
-      <w:ins w:id="75" w:author="Martin Vojík" w:date="2024-09-04T13:21:00Z">
+      <w:ins w:id="77" w:author="Martin Vojík" w:date="2024-09-04T13:21:00Z">
         <w:r>
           <w:rPr>
             <w:rFonts w:ascii="Times New Roman" w:hAnsi="Times New Roman"/>
@@ -5371,10 +5437,10 @@
         <w:rPr>
           <w:rFonts w:ascii="Times New Roman" w:hAnsi="Times New Roman"/>
           <w:sz w:val="24"/>
-          <w:del w:id="77" w:author="Martin Vojík" w:date="2024-09-04T13:05:00Z"/>
+          <w:del w:id="79" w:author="Martin Vojík" w:date="2024-09-04T13:05:00Z"/>
         </w:rPr>
       </w:pPr>
-      <w:del w:id="76" w:author="Martin Vojík" w:date="2024-09-04T13:05:00Z">
+      <w:del w:id="78" w:author="Martin Vojík" w:date="2024-09-04T13:05:00Z">
         <w:r>
           <w:rPr>
             <w:rFonts w:ascii="Times New Roman" w:hAnsi="Times New Roman"/>
@@ -5596,13 +5662,13 @@
         <w:rPr/>
         <w:t xml:space="preserve"> - Kombinované expertní stanovení hodnoty minimiareálu a stupně ohrožení stanoviště aktualizovaného podle ohrožení vegetace a stavu v okolních zemích EU a s ohledem na plochu výskytu. Stupeň ohrožení v závorce představuje odlišný odhad stavu před deseti lety (Červená kniha biotopů, Kučera 2005). Stupně: CR - kriticky ohrožený, EN - ohrožený, VU - zranitelný, NT - téměř ohrožený, LC - málo dotčený</w:t>
       </w:r>
-      <w:ins w:id="78" w:author="Martin Vojík" w:date="2024-09-04T13:05:00Z">
+      <w:ins w:id="80" w:author="Martin Vojík" w:date="2024-09-04T13:05:00Z">
         <w:r>
           <w:rPr/>
           <w:t xml:space="preserve"> (přejato z práce Kučera a kol. 2016).</w:t>
         </w:r>
       </w:ins>
-      <w:del w:id="79" w:author="Martin Vojík" w:date="2024-09-04T13:05:00Z">
+      <w:del w:id="81" w:author="Martin Vojík" w:date="2024-09-04T13:05:00Z">
         <w:r>
           <w:rPr/>
           <w:delText>.</w:delText>
@@ -5629,8 +5695,8 @@
         <w:gridCol w:w="875"/>
         <w:gridCol w:w="2016"/>
         <w:gridCol w:w="853"/>
-        <w:gridCol w:w="874"/>
-        <w:gridCol w:w="638"/>
+        <w:gridCol w:w="875"/>
+        <w:gridCol w:w="637"/>
         <w:gridCol w:w="604"/>
         <w:gridCol w:w="976"/>
       </w:tblGrid>
@@ -5849,7 +5915,7 @@
         </w:tc>
         <w:tc>
           <w:tcPr>
-            <w:tcW w:w="874" w:type="dxa"/>
+            <w:tcW w:w="875" w:type="dxa"/>
             <w:tcBorders>
               <w:top w:val="single" w:sz="8" w:space="0" w:color="000000"/>
               <w:bottom w:val="single" w:sz="8" w:space="0" w:color="000000"/>
@@ -5889,7 +5955,7 @@
         </w:tc>
         <w:tc>
           <w:tcPr>
-            <w:tcW w:w="638" w:type="dxa"/>
+            <w:tcW w:w="637" w:type="dxa"/>
             <w:tcBorders>
               <w:top w:val="single" w:sz="8" w:space="0" w:color="000000"/>
               <w:left w:val="single" w:sz="4" w:space="0" w:color="000000"/>
@@ -6199,7 +6265,7 @@
         </w:tc>
         <w:tc>
           <w:tcPr>
-            <w:tcW w:w="874" w:type="dxa"/>
+            <w:tcW w:w="875" w:type="dxa"/>
             <w:tcBorders>
               <w:bottom w:val="single" w:sz="4" w:space="0" w:color="000000"/>
               <w:right w:val="single" w:sz="4" w:space="0" w:color="000000"/>
@@ -6234,7 +6300,7 @@
         </w:tc>
         <w:tc>
           <w:tcPr>
-            <w:tcW w:w="638" w:type="dxa"/>
+            <w:tcW w:w="637" w:type="dxa"/>
             <w:tcBorders>
               <w:bottom w:val="single" w:sz="4" w:space="0" w:color="000000"/>
               <w:right w:val="single" w:sz="4" w:space="0" w:color="000000"/>
@@ -6566,7 +6632,7 @@
         </w:tc>
         <w:tc>
           <w:tcPr>
-            <w:tcW w:w="874" w:type="dxa"/>
+            <w:tcW w:w="875" w:type="dxa"/>
             <w:tcBorders>
               <w:bottom w:val="single" w:sz="4" w:space="0" w:color="000000"/>
               <w:right w:val="single" w:sz="4" w:space="0" w:color="000000"/>
@@ -6601,7 +6667,7 @@
         </w:tc>
         <w:tc>
           <w:tcPr>
-            <w:tcW w:w="638" w:type="dxa"/>
+            <w:tcW w:w="637" w:type="dxa"/>
             <w:vMerge w:val="restart"/>
             <w:tcBorders>
               <w:left w:val="single" w:sz="4" w:space="0" w:color="000000"/>
@@ -6909,7 +6975,7 @@
         </w:tc>
         <w:tc>
           <w:tcPr>
-            <w:tcW w:w="874" w:type="dxa"/>
+            <w:tcW w:w="875" w:type="dxa"/>
             <w:tcBorders>
               <w:bottom w:val="single" w:sz="4" w:space="0" w:color="000000"/>
               <w:right w:val="single" w:sz="4" w:space="0" w:color="000000"/>
@@ -6941,7 +7007,7 @@
         </w:tc>
         <w:tc>
           <w:tcPr>
-            <w:tcW w:w="638" w:type="dxa"/>
+            <w:tcW w:w="637" w:type="dxa"/>
             <w:vMerge w:val="continue"/>
             <w:tcBorders>
               <w:left w:val="single" w:sz="4" w:space="0" w:color="000000"/>
@@ -7223,7 +7289,7 @@
         </w:tc>
         <w:tc>
           <w:tcPr>
-            <w:tcW w:w="874" w:type="dxa"/>
+            <w:tcW w:w="875" w:type="dxa"/>
             <w:tcBorders>
               <w:bottom w:val="single" w:sz="4" w:space="0" w:color="000000"/>
               <w:right w:val="single" w:sz="4" w:space="0" w:color="000000"/>
@@ -7255,7 +7321,7 @@
         </w:tc>
         <w:tc>
           <w:tcPr>
-            <w:tcW w:w="638" w:type="dxa"/>
+            <w:tcW w:w="637" w:type="dxa"/>
             <w:vMerge w:val="continue"/>
             <w:tcBorders>
               <w:left w:val="single" w:sz="4" w:space="0" w:color="000000"/>
@@ -7574,7 +7640,7 @@
         </w:tc>
         <w:tc>
           <w:tcPr>
-            <w:tcW w:w="874" w:type="dxa"/>
+            <w:tcW w:w="875" w:type="dxa"/>
             <w:tcBorders>
               <w:bottom w:val="single" w:sz="4" w:space="0" w:color="000000"/>
               <w:right w:val="single" w:sz="4" w:space="0" w:color="000000"/>
@@ -7606,7 +7672,7 @@
         </w:tc>
         <w:tc>
           <w:tcPr>
-            <w:tcW w:w="638" w:type="dxa"/>
+            <w:tcW w:w="637" w:type="dxa"/>
             <w:vMerge w:val="restart"/>
             <w:tcBorders>
               <w:left w:val="single" w:sz="4" w:space="0" w:color="000000"/>
@@ -7890,7 +7956,7 @@
         </w:tc>
         <w:tc>
           <w:tcPr>
-            <w:tcW w:w="874" w:type="dxa"/>
+            <w:tcW w:w="875" w:type="dxa"/>
             <w:tcBorders>
               <w:bottom w:val="single" w:sz="4" w:space="0" w:color="000000"/>
               <w:right w:val="single" w:sz="4" w:space="0" w:color="000000"/>
@@ -7925,7 +7991,7 @@
         </w:tc>
         <w:tc>
           <w:tcPr>
-            <w:tcW w:w="638" w:type="dxa"/>
+            <w:tcW w:w="637" w:type="dxa"/>
             <w:vMerge w:val="continue"/>
             <w:tcBorders>
               <w:left w:val="single" w:sz="4" w:space="0" w:color="000000"/>
@@ -8208,7 +8274,7 @@
         </w:tc>
         <w:tc>
           <w:tcPr>
-            <w:tcW w:w="874" w:type="dxa"/>
+            <w:tcW w:w="875" w:type="dxa"/>
             <w:tcBorders>
               <w:bottom w:val="single" w:sz="4" w:space="0" w:color="000000"/>
               <w:right w:val="single" w:sz="4" w:space="0" w:color="000000"/>
@@ -8240,7 +8306,7 @@
         </w:tc>
         <w:tc>
           <w:tcPr>
-            <w:tcW w:w="638" w:type="dxa"/>
+            <w:tcW w:w="637" w:type="dxa"/>
             <w:vMerge w:val="continue"/>
             <w:tcBorders>
               <w:left w:val="single" w:sz="4" w:space="0" w:color="000000"/>
@@ -8518,7 +8584,7 @@
         </w:tc>
         <w:tc>
           <w:tcPr>
-            <w:tcW w:w="874" w:type="dxa"/>
+            <w:tcW w:w="875" w:type="dxa"/>
             <w:tcBorders>
               <w:bottom w:val="single" w:sz="4" w:space="0" w:color="000000"/>
               <w:right w:val="single" w:sz="4" w:space="0" w:color="000000"/>
@@ -8550,7 +8616,7 @@
         </w:tc>
         <w:tc>
           <w:tcPr>
-            <w:tcW w:w="638" w:type="dxa"/>
+            <w:tcW w:w="637" w:type="dxa"/>
             <w:vMerge w:val="continue"/>
             <w:tcBorders>
               <w:left w:val="single" w:sz="4" w:space="0" w:color="000000"/>
@@ -8848,7 +8914,7 @@
         </w:tc>
         <w:tc>
           <w:tcPr>
-            <w:tcW w:w="874" w:type="dxa"/>
+            <w:tcW w:w="875" w:type="dxa"/>
             <w:tcBorders>
               <w:bottom w:val="single" w:sz="4" w:space="0" w:color="000000"/>
               <w:right w:val="single" w:sz="4" w:space="0" w:color="000000"/>
@@ -8883,7 +8949,7 @@
         </w:tc>
         <w:tc>
           <w:tcPr>
-            <w:tcW w:w="638" w:type="dxa"/>
+            <w:tcW w:w="637" w:type="dxa"/>
             <w:vMerge w:val="continue"/>
             <w:tcBorders>
               <w:left w:val="single" w:sz="4" w:space="0" w:color="000000"/>
@@ -9163,7 +9229,7 @@
         </w:tc>
         <w:tc>
           <w:tcPr>
-            <w:tcW w:w="874" w:type="dxa"/>
+            <w:tcW w:w="875" w:type="dxa"/>
             <w:tcBorders>
               <w:bottom w:val="single" w:sz="4" w:space="0" w:color="000000"/>
               <w:right w:val="single" w:sz="4" w:space="0" w:color="000000"/>
@@ -9195,7 +9261,7 @@
         </w:tc>
         <w:tc>
           <w:tcPr>
-            <w:tcW w:w="638" w:type="dxa"/>
+            <w:tcW w:w="637" w:type="dxa"/>
             <w:tcBorders>
               <w:bottom w:val="single" w:sz="4" w:space="0" w:color="000000"/>
               <w:right w:val="single" w:sz="4" w:space="0" w:color="000000"/>
@@ -9538,7 +9604,7 @@
         </w:tc>
         <w:tc>
           <w:tcPr>
-            <w:tcW w:w="874" w:type="dxa"/>
+            <w:tcW w:w="875" w:type="dxa"/>
             <w:tcBorders>
               <w:bottom w:val="single" w:sz="4" w:space="0" w:color="000000"/>
               <w:right w:val="single" w:sz="4" w:space="0" w:color="000000"/>
@@ -9570,7 +9636,7 @@
         </w:tc>
         <w:tc>
           <w:tcPr>
-            <w:tcW w:w="638" w:type="dxa"/>
+            <w:tcW w:w="637" w:type="dxa"/>
             <w:vMerge w:val="restart"/>
             <w:tcBorders>
               <w:left w:val="single" w:sz="4" w:space="0" w:color="000000"/>
@@ -9878,7 +9944,7 @@
         </w:tc>
         <w:tc>
           <w:tcPr>
-            <w:tcW w:w="874" w:type="dxa"/>
+            <w:tcW w:w="875" w:type="dxa"/>
             <w:tcBorders>
               <w:bottom w:val="single" w:sz="4" w:space="0" w:color="000000"/>
               <w:right w:val="single" w:sz="4" w:space="0" w:color="000000"/>
@@ -9910,7 +9976,7 @@
         </w:tc>
         <w:tc>
           <w:tcPr>
-            <w:tcW w:w="638" w:type="dxa"/>
+            <w:tcW w:w="637" w:type="dxa"/>
             <w:vMerge w:val="continue"/>
             <w:tcBorders>
               <w:left w:val="single" w:sz="4" w:space="0" w:color="000000"/>
@@ -10232,7 +10298,7 @@
         </w:tc>
         <w:tc>
           <w:tcPr>
-            <w:tcW w:w="874" w:type="dxa"/>
+            <w:tcW w:w="875" w:type="dxa"/>
             <w:tcBorders>
               <w:bottom w:val="single" w:sz="4" w:space="0" w:color="000000"/>
               <w:right w:val="single" w:sz="4" w:space="0" w:color="000000"/>
@@ -10264,7 +10330,7 @@
         </w:tc>
         <w:tc>
           <w:tcPr>
-            <w:tcW w:w="638" w:type="dxa"/>
+            <w:tcW w:w="637" w:type="dxa"/>
             <w:vMerge w:val="continue"/>
             <w:tcBorders>
               <w:left w:val="single" w:sz="4" w:space="0" w:color="000000"/>
@@ -10566,7 +10632,7 @@
         </w:tc>
         <w:tc>
           <w:tcPr>
-            <w:tcW w:w="874" w:type="dxa"/>
+            <w:tcW w:w="875" w:type="dxa"/>
             <w:tcBorders>
               <w:bottom w:val="single" w:sz="4" w:space="0" w:color="000000"/>
               <w:right w:val="single" w:sz="4" w:space="0" w:color="000000"/>
@@ -10598,7 +10664,7 @@
         </w:tc>
         <w:tc>
           <w:tcPr>
-            <w:tcW w:w="638" w:type="dxa"/>
+            <w:tcW w:w="637" w:type="dxa"/>
             <w:vMerge w:val="continue"/>
             <w:tcBorders>
               <w:left w:val="single" w:sz="4" w:space="0" w:color="000000"/>
@@ -10900,7 +10966,7 @@
         </w:tc>
         <w:tc>
           <w:tcPr>
-            <w:tcW w:w="874" w:type="dxa"/>
+            <w:tcW w:w="875" w:type="dxa"/>
             <w:tcBorders>
               <w:bottom w:val="single" w:sz="4" w:space="0" w:color="000000"/>
               <w:right w:val="single" w:sz="4" w:space="0" w:color="000000"/>
@@ -10932,7 +10998,7 @@
         </w:tc>
         <w:tc>
           <w:tcPr>
-            <w:tcW w:w="638" w:type="dxa"/>
+            <w:tcW w:w="637" w:type="dxa"/>
             <w:vMerge w:val="continue"/>
             <w:tcBorders>
               <w:left w:val="single" w:sz="4" w:space="0" w:color="000000"/>
@@ -11214,7 +11280,7 @@
         </w:tc>
         <w:tc>
           <w:tcPr>
-            <w:tcW w:w="874" w:type="dxa"/>
+            <w:tcW w:w="875" w:type="dxa"/>
             <w:tcBorders>
               <w:bottom w:val="single" w:sz="4" w:space="0" w:color="000000"/>
               <w:right w:val="single" w:sz="4" w:space="0" w:color="000000"/>
@@ -11246,7 +11312,7 @@
         </w:tc>
         <w:tc>
           <w:tcPr>
-            <w:tcW w:w="638" w:type="dxa"/>
+            <w:tcW w:w="637" w:type="dxa"/>
             <w:vMerge w:val="continue"/>
             <w:tcBorders>
               <w:left w:val="single" w:sz="4" w:space="0" w:color="000000"/>
@@ -11531,7 +11597,7 @@
         </w:tc>
         <w:tc>
           <w:tcPr>
-            <w:tcW w:w="874" w:type="dxa"/>
+            <w:tcW w:w="875" w:type="dxa"/>
             <w:tcBorders>
               <w:bottom w:val="single" w:sz="4" w:space="0" w:color="000000"/>
               <w:right w:val="single" w:sz="4" w:space="0" w:color="000000"/>
@@ -11563,7 +11629,7 @@
         </w:tc>
         <w:tc>
           <w:tcPr>
-            <w:tcW w:w="638" w:type="dxa"/>
+            <w:tcW w:w="637" w:type="dxa"/>
             <w:tcBorders>
               <w:bottom w:val="single" w:sz="4" w:space="0" w:color="000000"/>
               <w:right w:val="single" w:sz="4" w:space="0" w:color="000000"/>
@@ -11870,7 +11936,7 @@
         </w:tc>
         <w:tc>
           <w:tcPr>
-            <w:tcW w:w="874" w:type="dxa"/>
+            <w:tcW w:w="875" w:type="dxa"/>
             <w:tcBorders>
               <w:bottom w:val="single" w:sz="4" w:space="0" w:color="000000"/>
               <w:right w:val="single" w:sz="4" w:space="0" w:color="000000"/>
@@ -11902,7 +11968,7 @@
         </w:tc>
         <w:tc>
           <w:tcPr>
-            <w:tcW w:w="638" w:type="dxa"/>
+            <w:tcW w:w="637" w:type="dxa"/>
             <w:tcBorders>
               <w:bottom w:val="single" w:sz="4" w:space="0" w:color="000000"/>
               <w:right w:val="single" w:sz="4" w:space="0" w:color="000000"/>
@@ -12224,7 +12290,7 @@
         </w:tc>
         <w:tc>
           <w:tcPr>
-            <w:tcW w:w="874" w:type="dxa"/>
+            <w:tcW w:w="875" w:type="dxa"/>
             <w:tcBorders>
               <w:bottom w:val="single" w:sz="4" w:space="0" w:color="000000"/>
               <w:right w:val="single" w:sz="4" w:space="0" w:color="000000"/>
@@ -12259,7 +12325,7 @@
         </w:tc>
         <w:tc>
           <w:tcPr>
-            <w:tcW w:w="638" w:type="dxa"/>
+            <w:tcW w:w="637" w:type="dxa"/>
             <w:tcBorders>
               <w:bottom w:val="single" w:sz="4" w:space="0" w:color="000000"/>
               <w:right w:val="single" w:sz="4" w:space="0" w:color="000000"/>
@@ -12566,7 +12632,7 @@
         </w:tc>
         <w:tc>
           <w:tcPr>
-            <w:tcW w:w="874" w:type="dxa"/>
+            <w:tcW w:w="875" w:type="dxa"/>
             <w:tcBorders>
               <w:bottom w:val="single" w:sz="4" w:space="0" w:color="000000"/>
               <w:right w:val="single" w:sz="4" w:space="0" w:color="000000"/>
@@ -12598,7 +12664,7 @@
         </w:tc>
         <w:tc>
           <w:tcPr>
-            <w:tcW w:w="638" w:type="dxa"/>
+            <w:tcW w:w="637" w:type="dxa"/>
             <w:tcBorders>
               <w:bottom w:val="single" w:sz="4" w:space="0" w:color="000000"/>
               <w:right w:val="single" w:sz="4" w:space="0" w:color="000000"/>
@@ -12925,7 +12991,7 @@
         </w:tc>
         <w:tc>
           <w:tcPr>
-            <w:tcW w:w="874" w:type="dxa"/>
+            <w:tcW w:w="875" w:type="dxa"/>
             <w:tcBorders>
               <w:bottom w:val="single" w:sz="4" w:space="0" w:color="000000"/>
               <w:right w:val="single" w:sz="4" w:space="0" w:color="000000"/>
@@ -12957,7 +13023,7 @@
         </w:tc>
         <w:tc>
           <w:tcPr>
-            <w:tcW w:w="638" w:type="dxa"/>
+            <w:tcW w:w="637" w:type="dxa"/>
             <w:tcBorders>
               <w:bottom w:val="single" w:sz="4" w:space="0" w:color="000000"/>
               <w:right w:val="single" w:sz="4" w:space="0" w:color="000000"/>
@@ -13284,7 +13350,7 @@
         </w:tc>
         <w:tc>
           <w:tcPr>
-            <w:tcW w:w="874" w:type="dxa"/>
+            <w:tcW w:w="875" w:type="dxa"/>
             <w:tcBorders>
               <w:bottom w:val="single" w:sz="4" w:space="0" w:color="000000"/>
               <w:right w:val="single" w:sz="4" w:space="0" w:color="000000"/>
@@ -13316,7 +13382,7 @@
         </w:tc>
         <w:tc>
           <w:tcPr>
-            <w:tcW w:w="638" w:type="dxa"/>
+            <w:tcW w:w="637" w:type="dxa"/>
             <w:tcBorders>
               <w:bottom w:val="single" w:sz="4" w:space="0" w:color="000000"/>
               <w:right w:val="single" w:sz="4" w:space="0" w:color="000000"/>
@@ -13623,7 +13689,7 @@
         </w:tc>
         <w:tc>
           <w:tcPr>
-            <w:tcW w:w="874" w:type="dxa"/>
+            <w:tcW w:w="875" w:type="dxa"/>
             <w:tcBorders>
               <w:bottom w:val="single" w:sz="4" w:space="0" w:color="000000"/>
               <w:right w:val="single" w:sz="4" w:space="0" w:color="000000"/>
@@ -13655,7 +13721,7 @@
         </w:tc>
         <w:tc>
           <w:tcPr>
-            <w:tcW w:w="638" w:type="dxa"/>
+            <w:tcW w:w="637" w:type="dxa"/>
             <w:vMerge w:val="restart"/>
             <w:tcBorders>
               <w:left w:val="single" w:sz="4" w:space="0" w:color="000000"/>
@@ -13958,7 +14024,7 @@
         </w:tc>
         <w:tc>
           <w:tcPr>
-            <w:tcW w:w="874" w:type="dxa"/>
+            <w:tcW w:w="875" w:type="dxa"/>
             <w:tcBorders>
               <w:bottom w:val="single" w:sz="4" w:space="0" w:color="000000"/>
               <w:right w:val="single" w:sz="4" w:space="0" w:color="000000"/>
@@ -13990,7 +14056,7 @@
         </w:tc>
         <w:tc>
           <w:tcPr>
-            <w:tcW w:w="638" w:type="dxa"/>
+            <w:tcW w:w="637" w:type="dxa"/>
             <w:vMerge w:val="continue"/>
             <w:tcBorders>
               <w:left w:val="single" w:sz="4" w:space="0" w:color="000000"/>
@@ -14267,7 +14333,7 @@
         </w:tc>
         <w:tc>
           <w:tcPr>
-            <w:tcW w:w="874" w:type="dxa"/>
+            <w:tcW w:w="875" w:type="dxa"/>
             <w:tcBorders>
               <w:bottom w:val="single" w:sz="4" w:space="0" w:color="000000"/>
               <w:right w:val="single" w:sz="4" w:space="0" w:color="000000"/>
@@ -14299,7 +14365,7 @@
         </w:tc>
         <w:tc>
           <w:tcPr>
-            <w:tcW w:w="638" w:type="dxa"/>
+            <w:tcW w:w="637" w:type="dxa"/>
             <w:vMerge w:val="continue"/>
             <w:tcBorders>
               <w:left w:val="single" w:sz="4" w:space="0" w:color="000000"/>
@@ -14584,7 +14650,7 @@
         </w:tc>
         <w:tc>
           <w:tcPr>
-            <w:tcW w:w="874" w:type="dxa"/>
+            <w:tcW w:w="875" w:type="dxa"/>
             <w:tcBorders>
               <w:bottom w:val="single" w:sz="4" w:space="0" w:color="000000"/>
               <w:right w:val="single" w:sz="4" w:space="0" w:color="000000"/>
@@ -14616,7 +14682,7 @@
         </w:tc>
         <w:tc>
           <w:tcPr>
-            <w:tcW w:w="638" w:type="dxa"/>
+            <w:tcW w:w="637" w:type="dxa"/>
             <w:vMerge w:val="restart"/>
             <w:tcBorders>
               <w:left w:val="single" w:sz="4" w:space="0" w:color="000000"/>
@@ -14899,7 +14965,7 @@
         </w:tc>
         <w:tc>
           <w:tcPr>
-            <w:tcW w:w="874" w:type="dxa"/>
+            <w:tcW w:w="875" w:type="dxa"/>
             <w:tcBorders>
               <w:bottom w:val="single" w:sz="4" w:space="0" w:color="000000"/>
               <w:right w:val="single" w:sz="4" w:space="0" w:color="000000"/>
@@ -14931,7 +14997,7 @@
         </w:tc>
         <w:tc>
           <w:tcPr>
-            <w:tcW w:w="638" w:type="dxa"/>
+            <w:tcW w:w="637" w:type="dxa"/>
             <w:vMerge w:val="continue"/>
             <w:tcBorders>
               <w:left w:val="single" w:sz="4" w:space="0" w:color="000000"/>
@@ -15276,7 +15342,7 @@
         </w:tc>
         <w:tc>
           <w:tcPr>
-            <w:tcW w:w="874" w:type="dxa"/>
+            <w:tcW w:w="875" w:type="dxa"/>
             <w:tcBorders>
               <w:bottom w:val="single" w:sz="4" w:space="0" w:color="000000"/>
               <w:right w:val="single" w:sz="4" w:space="0" w:color="000000"/>
@@ -15308,7 +15374,7 @@
         </w:tc>
         <w:tc>
           <w:tcPr>
-            <w:tcW w:w="638" w:type="dxa"/>
+            <w:tcW w:w="637" w:type="dxa"/>
             <w:tcBorders>
               <w:bottom w:val="single" w:sz="4" w:space="0" w:color="000000"/>
               <w:right w:val="single" w:sz="4" w:space="0" w:color="000000"/>
@@ -15620,7 +15686,7 @@
         </w:tc>
         <w:tc>
           <w:tcPr>
-            <w:tcW w:w="874" w:type="dxa"/>
+            <w:tcW w:w="875" w:type="dxa"/>
             <w:tcBorders>
               <w:bottom w:val="single" w:sz="4" w:space="0" w:color="000000"/>
               <w:right w:val="single" w:sz="4" w:space="0" w:color="000000"/>
@@ -15655,7 +15721,7 @@
         </w:tc>
         <w:tc>
           <w:tcPr>
-            <w:tcW w:w="638" w:type="dxa"/>
+            <w:tcW w:w="637" w:type="dxa"/>
             <w:vMerge w:val="restart"/>
             <w:tcBorders>
               <w:left w:val="single" w:sz="4" w:space="0" w:color="000000"/>
@@ -15943,7 +16009,7 @@
         </w:tc>
         <w:tc>
           <w:tcPr>
-            <w:tcW w:w="874" w:type="dxa"/>
+            <w:tcW w:w="875" w:type="dxa"/>
             <w:tcBorders>
               <w:bottom w:val="single" w:sz="4" w:space="0" w:color="000000"/>
               <w:right w:val="single" w:sz="4" w:space="0" w:color="000000"/>
@@ -15975,7 +16041,7 @@
         </w:tc>
         <w:tc>
           <w:tcPr>
-            <w:tcW w:w="638" w:type="dxa"/>
+            <w:tcW w:w="637" w:type="dxa"/>
             <w:vMerge w:val="continue"/>
             <w:tcBorders>
               <w:left w:val="single" w:sz="4" w:space="0" w:color="000000"/>
@@ -16276,7 +16342,7 @@
         </w:tc>
         <w:tc>
           <w:tcPr>
-            <w:tcW w:w="874" w:type="dxa"/>
+            <w:tcW w:w="875" w:type="dxa"/>
             <w:tcBorders>
               <w:bottom w:val="single" w:sz="4" w:space="0" w:color="000000"/>
               <w:right w:val="single" w:sz="4" w:space="0" w:color="000000"/>
@@ -16308,7 +16374,7 @@
         </w:tc>
         <w:tc>
           <w:tcPr>
-            <w:tcW w:w="638" w:type="dxa"/>
+            <w:tcW w:w="637" w:type="dxa"/>
             <w:vMerge w:val="restart"/>
             <w:tcBorders>
               <w:left w:val="single" w:sz="4" w:space="0" w:color="000000"/>
@@ -16616,7 +16682,7 @@
         </w:tc>
         <w:tc>
           <w:tcPr>
-            <w:tcW w:w="874" w:type="dxa"/>
+            <w:tcW w:w="875" w:type="dxa"/>
             <w:tcBorders>
               <w:bottom w:val="single" w:sz="4" w:space="0" w:color="000000"/>
               <w:right w:val="single" w:sz="4" w:space="0" w:color="000000"/>
@@ -16651,7 +16717,7 @@
         </w:tc>
         <w:tc>
           <w:tcPr>
-            <w:tcW w:w="638" w:type="dxa"/>
+            <w:tcW w:w="637" w:type="dxa"/>
             <w:vMerge w:val="continue"/>
             <w:tcBorders>
               <w:left w:val="single" w:sz="4" w:space="0" w:color="000000"/>
@@ -16981,7 +17047,7 @@
         </w:tc>
         <w:tc>
           <w:tcPr>
-            <w:tcW w:w="874" w:type="dxa"/>
+            <w:tcW w:w="875" w:type="dxa"/>
             <w:tcBorders>
               <w:bottom w:val="single" w:sz="4" w:space="0" w:color="000000"/>
               <w:right w:val="single" w:sz="4" w:space="0" w:color="000000"/>
@@ -17013,7 +17079,7 @@
         </w:tc>
         <w:tc>
           <w:tcPr>
-            <w:tcW w:w="638" w:type="dxa"/>
+            <w:tcW w:w="637" w:type="dxa"/>
             <w:vMerge w:val="restart"/>
             <w:tcBorders>
               <w:left w:val="single" w:sz="4" w:space="0" w:color="000000"/>
@@ -17321,7 +17387,7 @@
         </w:tc>
         <w:tc>
           <w:tcPr>
-            <w:tcW w:w="874" w:type="dxa"/>
+            <w:tcW w:w="875" w:type="dxa"/>
             <w:tcBorders>
               <w:bottom w:val="single" w:sz="4" w:space="0" w:color="000000"/>
               <w:right w:val="single" w:sz="4" w:space="0" w:color="000000"/>
@@ -17353,7 +17419,7 @@
         </w:tc>
         <w:tc>
           <w:tcPr>
-            <w:tcW w:w="638" w:type="dxa"/>
+            <w:tcW w:w="637" w:type="dxa"/>
             <w:vMerge w:val="continue"/>
             <w:tcBorders>
               <w:left w:val="single" w:sz="4" w:space="0" w:color="000000"/>
@@ -17655,7 +17721,7 @@
         </w:tc>
         <w:tc>
           <w:tcPr>
-            <w:tcW w:w="874" w:type="dxa"/>
+            <w:tcW w:w="875" w:type="dxa"/>
             <w:tcBorders>
               <w:bottom w:val="single" w:sz="4" w:space="0" w:color="000000"/>
               <w:right w:val="single" w:sz="4" w:space="0" w:color="000000"/>
@@ -17687,7 +17753,7 @@
         </w:tc>
         <w:tc>
           <w:tcPr>
-            <w:tcW w:w="638" w:type="dxa"/>
+            <w:tcW w:w="637" w:type="dxa"/>
             <w:vMerge w:val="continue"/>
             <w:tcBorders>
               <w:left w:val="single" w:sz="4" w:space="0" w:color="000000"/>
@@ -18017,7 +18083,7 @@
         </w:tc>
         <w:tc>
           <w:tcPr>
-            <w:tcW w:w="874" w:type="dxa"/>
+            <w:tcW w:w="875" w:type="dxa"/>
             <w:tcBorders>
               <w:bottom w:val="single" w:sz="4" w:space="0" w:color="000000"/>
               <w:right w:val="single" w:sz="4" w:space="0" w:color="000000"/>
@@ -18049,7 +18115,7 @@
         </w:tc>
         <w:tc>
           <w:tcPr>
-            <w:tcW w:w="638" w:type="dxa"/>
+            <w:tcW w:w="637" w:type="dxa"/>
             <w:vMerge w:val="restart"/>
             <w:tcBorders>
               <w:left w:val="single" w:sz="4" w:space="0" w:color="000000"/>
@@ -18357,7 +18423,7 @@
         </w:tc>
         <w:tc>
           <w:tcPr>
-            <w:tcW w:w="874" w:type="dxa"/>
+            <w:tcW w:w="875" w:type="dxa"/>
             <w:tcBorders>
               <w:bottom w:val="single" w:sz="4" w:space="0" w:color="000000"/>
               <w:right w:val="single" w:sz="4" w:space="0" w:color="000000"/>
@@ -18389,7 +18455,7 @@
         </w:tc>
         <w:tc>
           <w:tcPr>
-            <w:tcW w:w="638" w:type="dxa"/>
+            <w:tcW w:w="637" w:type="dxa"/>
             <w:vMerge w:val="continue"/>
             <w:tcBorders>
               <w:left w:val="single" w:sz="4" w:space="0" w:color="000000"/>
@@ -18679,7 +18745,7 @@
         </w:tc>
         <w:tc>
           <w:tcPr>
-            <w:tcW w:w="874" w:type="dxa"/>
+            <w:tcW w:w="875" w:type="dxa"/>
             <w:tcBorders>
               <w:bottom w:val="single" w:sz="4" w:space="0" w:color="000000"/>
               <w:right w:val="single" w:sz="4" w:space="0" w:color="000000"/>
@@ -18711,7 +18777,7 @@
         </w:tc>
         <w:tc>
           <w:tcPr>
-            <w:tcW w:w="638" w:type="dxa"/>
+            <w:tcW w:w="637" w:type="dxa"/>
             <w:vMerge w:val="restart"/>
             <w:tcBorders>
               <w:left w:val="single" w:sz="4" w:space="0" w:color="000000"/>
@@ -18999,7 +19065,7 @@
         </w:tc>
         <w:tc>
           <w:tcPr>
-            <w:tcW w:w="874" w:type="dxa"/>
+            <w:tcW w:w="875" w:type="dxa"/>
             <w:tcBorders>
               <w:bottom w:val="single" w:sz="4" w:space="0" w:color="000000"/>
               <w:right w:val="single" w:sz="4" w:space="0" w:color="000000"/>
@@ -19031,7 +19097,7 @@
         </w:tc>
         <w:tc>
           <w:tcPr>
-            <w:tcW w:w="638" w:type="dxa"/>
+            <w:tcW w:w="637" w:type="dxa"/>
             <w:vMerge w:val="continue"/>
             <w:tcBorders>
               <w:left w:val="single" w:sz="4" w:space="0" w:color="000000"/>
@@ -19313,7 +19379,7 @@
         </w:tc>
         <w:tc>
           <w:tcPr>
-            <w:tcW w:w="874" w:type="dxa"/>
+            <w:tcW w:w="875" w:type="dxa"/>
             <w:tcBorders>
               <w:bottom w:val="single" w:sz="4" w:space="0" w:color="000000"/>
               <w:right w:val="single" w:sz="4" w:space="0" w:color="000000"/>
@@ -19348,7 +19414,7 @@
         </w:tc>
         <w:tc>
           <w:tcPr>
-            <w:tcW w:w="638" w:type="dxa"/>
+            <w:tcW w:w="637" w:type="dxa"/>
             <w:vMerge w:val="continue"/>
             <w:tcBorders>
               <w:left w:val="single" w:sz="4" w:space="0" w:color="000000"/>
@@ -19678,7 +19744,7 @@
         </w:tc>
         <w:tc>
           <w:tcPr>
-            <w:tcW w:w="874" w:type="dxa"/>
+            <w:tcW w:w="875" w:type="dxa"/>
             <w:tcBorders>
               <w:bottom w:val="single" w:sz="4" w:space="0" w:color="000000"/>
               <w:right w:val="single" w:sz="4" w:space="0" w:color="000000"/>
@@ -19710,7 +19776,7 @@
         </w:tc>
         <w:tc>
           <w:tcPr>
-            <w:tcW w:w="638" w:type="dxa"/>
+            <w:tcW w:w="637" w:type="dxa"/>
             <w:vMerge w:val="restart"/>
             <w:tcBorders>
               <w:left w:val="single" w:sz="4" w:space="0" w:color="000000"/>
@@ -19998,7 +20064,7 @@
         </w:tc>
         <w:tc>
           <w:tcPr>
-            <w:tcW w:w="874" w:type="dxa"/>
+            <w:tcW w:w="875" w:type="dxa"/>
             <w:tcBorders>
               <w:bottom w:val="single" w:sz="4" w:space="0" w:color="000000"/>
               <w:right w:val="single" w:sz="4" w:space="0" w:color="000000"/>
@@ -20030,7 +20096,7 @@
         </w:tc>
         <w:tc>
           <w:tcPr>
-            <w:tcW w:w="638" w:type="dxa"/>
+            <w:tcW w:w="637" w:type="dxa"/>
             <w:vMerge w:val="continue"/>
             <w:tcBorders>
               <w:left w:val="single" w:sz="4" w:space="0" w:color="000000"/>
@@ -20340,7 +20406,7 @@
         </w:tc>
         <w:tc>
           <w:tcPr>
-            <w:tcW w:w="874" w:type="dxa"/>
+            <w:tcW w:w="875" w:type="dxa"/>
             <w:tcBorders>
               <w:bottom w:val="single" w:sz="4" w:space="0" w:color="000000"/>
               <w:right w:val="single" w:sz="4" w:space="0" w:color="000000"/>
@@ -20372,7 +20438,7 @@
         </w:tc>
         <w:tc>
           <w:tcPr>
-            <w:tcW w:w="638" w:type="dxa"/>
+            <w:tcW w:w="637" w:type="dxa"/>
             <w:vMerge w:val="restart"/>
             <w:tcBorders>
               <w:left w:val="single" w:sz="4" w:space="0" w:color="000000"/>
@@ -20660,7 +20726,7 @@
         </w:tc>
         <w:tc>
           <w:tcPr>
-            <w:tcW w:w="874" w:type="dxa"/>
+            <w:tcW w:w="875" w:type="dxa"/>
             <w:tcBorders>
               <w:bottom w:val="single" w:sz="4" w:space="0" w:color="000000"/>
               <w:right w:val="single" w:sz="4" w:space="0" w:color="000000"/>
@@ -20692,7 +20758,7 @@
         </w:tc>
         <w:tc>
           <w:tcPr>
-            <w:tcW w:w="638" w:type="dxa"/>
+            <w:tcW w:w="637" w:type="dxa"/>
             <w:vMerge w:val="continue"/>
             <w:tcBorders>
               <w:left w:val="single" w:sz="4" w:space="0" w:color="000000"/>
@@ -20994,7 +21060,7 @@
         </w:tc>
         <w:tc>
           <w:tcPr>
-            <w:tcW w:w="874" w:type="dxa"/>
+            <w:tcW w:w="875" w:type="dxa"/>
             <w:tcBorders>
               <w:bottom w:val="single" w:sz="4" w:space="0" w:color="000000"/>
               <w:right w:val="single" w:sz="4" w:space="0" w:color="000000"/>
@@ -21026,7 +21092,7 @@
         </w:tc>
         <w:tc>
           <w:tcPr>
-            <w:tcW w:w="638" w:type="dxa"/>
+            <w:tcW w:w="637" w:type="dxa"/>
             <w:vMerge w:val="continue"/>
             <w:tcBorders>
               <w:left w:val="single" w:sz="4" w:space="0" w:color="000000"/>
@@ -21328,7 +21394,7 @@
         </w:tc>
         <w:tc>
           <w:tcPr>
-            <w:tcW w:w="874" w:type="dxa"/>
+            <w:tcW w:w="875" w:type="dxa"/>
             <w:tcBorders>
               <w:bottom w:val="single" w:sz="4" w:space="0" w:color="000000"/>
               <w:right w:val="single" w:sz="4" w:space="0" w:color="000000"/>
@@ -21360,7 +21426,7 @@
         </w:tc>
         <w:tc>
           <w:tcPr>
-            <w:tcW w:w="638" w:type="dxa"/>
+            <w:tcW w:w="637" w:type="dxa"/>
             <w:vMerge w:val="continue"/>
             <w:tcBorders>
               <w:left w:val="single" w:sz="4" w:space="0" w:color="000000"/>
@@ -21642,7 +21708,7 @@
         </w:tc>
         <w:tc>
           <w:tcPr>
-            <w:tcW w:w="874" w:type="dxa"/>
+            <w:tcW w:w="875" w:type="dxa"/>
             <w:tcBorders>
               <w:bottom w:val="single" w:sz="4" w:space="0" w:color="000000"/>
               <w:right w:val="single" w:sz="4" w:space="0" w:color="000000"/>
@@ -21674,7 +21740,7 @@
         </w:tc>
         <w:tc>
           <w:tcPr>
-            <w:tcW w:w="638" w:type="dxa"/>
+            <w:tcW w:w="637" w:type="dxa"/>
             <w:vMerge w:val="continue"/>
             <w:tcBorders>
               <w:left w:val="single" w:sz="4" w:space="0" w:color="000000"/>
@@ -21956,7 +22022,7 @@
         </w:tc>
         <w:tc>
           <w:tcPr>
-            <w:tcW w:w="874" w:type="dxa"/>
+            <w:tcW w:w="875" w:type="dxa"/>
             <w:tcBorders>
               <w:bottom w:val="single" w:sz="4" w:space="0" w:color="000000"/>
               <w:right w:val="single" w:sz="4" w:space="0" w:color="000000"/>
@@ -21988,7 +22054,7 @@
         </w:tc>
         <w:tc>
           <w:tcPr>
-            <w:tcW w:w="638" w:type="dxa"/>
+            <w:tcW w:w="637" w:type="dxa"/>
             <w:vMerge w:val="continue"/>
             <w:tcBorders>
               <w:left w:val="single" w:sz="4" w:space="0" w:color="000000"/>
@@ -22270,7 +22336,7 @@
         </w:tc>
         <w:tc>
           <w:tcPr>
-            <w:tcW w:w="874" w:type="dxa"/>
+            <w:tcW w:w="875" w:type="dxa"/>
             <w:tcBorders>
               <w:bottom w:val="single" w:sz="4" w:space="0" w:color="000000"/>
               <w:right w:val="single" w:sz="4" w:space="0" w:color="000000"/>
@@ -22302,7 +22368,7 @@
         </w:tc>
         <w:tc>
           <w:tcPr>
-            <w:tcW w:w="638" w:type="dxa"/>
+            <w:tcW w:w="637" w:type="dxa"/>
             <w:vMerge w:val="continue"/>
             <w:tcBorders>
               <w:left w:val="single" w:sz="4" w:space="0" w:color="000000"/>
@@ -22592,7 +22658,7 @@
         </w:tc>
         <w:tc>
           <w:tcPr>
-            <w:tcW w:w="874" w:type="dxa"/>
+            <w:tcW w:w="875" w:type="dxa"/>
             <w:tcBorders>
               <w:bottom w:val="single" w:sz="4" w:space="0" w:color="000000"/>
               <w:right w:val="single" w:sz="4" w:space="0" w:color="000000"/>
@@ -22624,7 +22690,7 @@
         </w:tc>
         <w:tc>
           <w:tcPr>
-            <w:tcW w:w="638" w:type="dxa"/>
+            <w:tcW w:w="637" w:type="dxa"/>
             <w:vMerge w:val="restart"/>
             <w:tcBorders>
               <w:left w:val="single" w:sz="4" w:space="0" w:color="000000"/>
@@ -22912,7 +22978,7 @@
         </w:tc>
         <w:tc>
           <w:tcPr>
-            <w:tcW w:w="874" w:type="dxa"/>
+            <w:tcW w:w="875" w:type="dxa"/>
             <w:tcBorders>
               <w:bottom w:val="single" w:sz="4" w:space="0" w:color="000000"/>
               <w:right w:val="single" w:sz="4" w:space="0" w:color="000000"/>
@@ -22944,7 +23010,7 @@
         </w:tc>
         <w:tc>
           <w:tcPr>
-            <w:tcW w:w="638" w:type="dxa"/>
+            <w:tcW w:w="637" w:type="dxa"/>
             <w:vMerge w:val="continue"/>
             <w:tcBorders>
               <w:left w:val="single" w:sz="4" w:space="0" w:color="000000"/>
@@ -23246,7 +23312,7 @@
         </w:tc>
         <w:tc>
           <w:tcPr>
-            <w:tcW w:w="874" w:type="dxa"/>
+            <w:tcW w:w="875" w:type="dxa"/>
             <w:tcBorders>
               <w:bottom w:val="single" w:sz="4" w:space="0" w:color="000000"/>
               <w:right w:val="single" w:sz="4" w:space="0" w:color="000000"/>
@@ -23278,7 +23344,7 @@
         </w:tc>
         <w:tc>
           <w:tcPr>
-            <w:tcW w:w="638" w:type="dxa"/>
+            <w:tcW w:w="637" w:type="dxa"/>
             <w:vMerge w:val="continue"/>
             <w:tcBorders>
               <w:left w:val="single" w:sz="4" w:space="0" w:color="000000"/>
@@ -23560,7 +23626,7 @@
         </w:tc>
         <w:tc>
           <w:tcPr>
-            <w:tcW w:w="874" w:type="dxa"/>
+            <w:tcW w:w="875" w:type="dxa"/>
             <w:tcBorders>
               <w:bottom w:val="single" w:sz="4" w:space="0" w:color="000000"/>
               <w:right w:val="single" w:sz="4" w:space="0" w:color="000000"/>
@@ -23592,7 +23658,7 @@
         </w:tc>
         <w:tc>
           <w:tcPr>
-            <w:tcW w:w="638" w:type="dxa"/>
+            <w:tcW w:w="637" w:type="dxa"/>
             <w:vMerge w:val="continue"/>
             <w:tcBorders>
               <w:left w:val="single" w:sz="4" w:space="0" w:color="000000"/>
@@ -23877,7 +23943,7 @@
         </w:tc>
         <w:tc>
           <w:tcPr>
-            <w:tcW w:w="874" w:type="dxa"/>
+            <w:tcW w:w="875" w:type="dxa"/>
             <w:tcBorders>
               <w:bottom w:val="single" w:sz="4" w:space="0" w:color="000000"/>
               <w:right w:val="single" w:sz="4" w:space="0" w:color="000000"/>
@@ -23909,7 +23975,7 @@
         </w:tc>
         <w:tc>
           <w:tcPr>
-            <w:tcW w:w="638" w:type="dxa"/>
+            <w:tcW w:w="637" w:type="dxa"/>
             <w:tcBorders>
               <w:bottom w:val="single" w:sz="4" w:space="0" w:color="000000"/>
               <w:right w:val="single" w:sz="4" w:space="0" w:color="000000"/>
@@ -24196,7 +24262,7 @@
         </w:tc>
         <w:tc>
           <w:tcPr>
-            <w:tcW w:w="874" w:type="dxa"/>
+            <w:tcW w:w="875" w:type="dxa"/>
             <w:tcBorders>
               <w:bottom w:val="single" w:sz="4" w:space="0" w:color="000000"/>
               <w:right w:val="single" w:sz="4" w:space="0" w:color="000000"/>
@@ -24228,7 +24294,7 @@
         </w:tc>
         <w:tc>
           <w:tcPr>
-            <w:tcW w:w="638" w:type="dxa"/>
+            <w:tcW w:w="637" w:type="dxa"/>
             <w:tcBorders>
               <w:bottom w:val="single" w:sz="4" w:space="0" w:color="000000"/>
               <w:right w:val="single" w:sz="4" w:space="0" w:color="000000"/>
@@ -24515,7 +24581,7 @@
         </w:tc>
         <w:tc>
           <w:tcPr>
-            <w:tcW w:w="874" w:type="dxa"/>
+            <w:tcW w:w="875" w:type="dxa"/>
             <w:tcBorders>
               <w:bottom w:val="single" w:sz="4" w:space="0" w:color="000000"/>
               <w:right w:val="single" w:sz="4" w:space="0" w:color="000000"/>
@@ -24555,7 +24621,7 @@
         </w:tc>
         <w:tc>
           <w:tcPr>
-            <w:tcW w:w="638" w:type="dxa"/>
+            <w:tcW w:w="637" w:type="dxa"/>
             <w:tcBorders>
               <w:bottom w:val="single" w:sz="4" w:space="0" w:color="000000"/>
               <w:right w:val="single" w:sz="4" w:space="0" w:color="000000"/>
@@ -24857,7 +24923,7 @@
         </w:tc>
         <w:tc>
           <w:tcPr>
-            <w:tcW w:w="874" w:type="dxa"/>
+            <w:tcW w:w="875" w:type="dxa"/>
             <w:tcBorders>
               <w:bottom w:val="single" w:sz="4" w:space="0" w:color="000000"/>
               <w:right w:val="single" w:sz="4" w:space="0" w:color="000000"/>
@@ -24889,7 +24955,7 @@
         </w:tc>
         <w:tc>
           <w:tcPr>
-            <w:tcW w:w="638" w:type="dxa"/>
+            <w:tcW w:w="637" w:type="dxa"/>
             <w:tcBorders>
               <w:bottom w:val="single" w:sz="4" w:space="0" w:color="000000"/>
               <w:right w:val="single" w:sz="4" w:space="0" w:color="000000"/>
@@ -25181,7 +25247,7 @@
         </w:tc>
         <w:tc>
           <w:tcPr>
-            <w:tcW w:w="874" w:type="dxa"/>
+            <w:tcW w:w="875" w:type="dxa"/>
             <w:tcBorders>
               <w:bottom w:val="single" w:sz="4" w:space="0" w:color="000000"/>
               <w:right w:val="single" w:sz="4" w:space="0" w:color="000000"/>
@@ -25213,7 +25279,7 @@
         </w:tc>
         <w:tc>
           <w:tcPr>
-            <w:tcW w:w="638" w:type="dxa"/>
+            <w:tcW w:w="637" w:type="dxa"/>
             <w:vMerge w:val="restart"/>
             <w:tcBorders>
               <w:left w:val="single" w:sz="4" w:space="0" w:color="000000"/>
@@ -25501,7 +25567,7 @@
         </w:tc>
         <w:tc>
           <w:tcPr>
-            <w:tcW w:w="874" w:type="dxa"/>
+            <w:tcW w:w="875" w:type="dxa"/>
             <w:tcBorders>
               <w:bottom w:val="single" w:sz="4" w:space="0" w:color="000000"/>
               <w:right w:val="single" w:sz="4" w:space="0" w:color="000000"/>
@@ -25533,7 +25599,7 @@
         </w:tc>
         <w:tc>
           <w:tcPr>
-            <w:tcW w:w="638" w:type="dxa"/>
+            <w:tcW w:w="637" w:type="dxa"/>
             <w:vMerge w:val="continue"/>
             <w:tcBorders>
               <w:left w:val="single" w:sz="4" w:space="0" w:color="000000"/>
@@ -25815,7 +25881,7 @@
         </w:tc>
         <w:tc>
           <w:tcPr>
-            <w:tcW w:w="874" w:type="dxa"/>
+            <w:tcW w:w="875" w:type="dxa"/>
             <w:tcBorders>
               <w:bottom w:val="single" w:sz="4" w:space="0" w:color="000000"/>
               <w:right w:val="single" w:sz="4" w:space="0" w:color="000000"/>
@@ -25847,7 +25913,7 @@
         </w:tc>
         <w:tc>
           <w:tcPr>
-            <w:tcW w:w="638" w:type="dxa"/>
+            <w:tcW w:w="637" w:type="dxa"/>
             <w:vMerge w:val="continue"/>
             <w:tcBorders>
               <w:left w:val="single" w:sz="4" w:space="0" w:color="000000"/>
@@ -26129,7 +26195,7 @@
         </w:tc>
         <w:tc>
           <w:tcPr>
-            <w:tcW w:w="874" w:type="dxa"/>
+            <w:tcW w:w="875" w:type="dxa"/>
             <w:tcBorders>
               <w:bottom w:val="single" w:sz="4" w:space="0" w:color="000000"/>
               <w:right w:val="single" w:sz="4" w:space="0" w:color="000000"/>
@@ -26161,7 +26227,7 @@
         </w:tc>
         <w:tc>
           <w:tcPr>
-            <w:tcW w:w="638" w:type="dxa"/>
+            <w:tcW w:w="637" w:type="dxa"/>
             <w:vMerge w:val="continue"/>
             <w:tcBorders>
               <w:left w:val="single" w:sz="4" w:space="0" w:color="000000"/>
@@ -26443,7 +26509,7 @@
         </w:tc>
         <w:tc>
           <w:tcPr>
-            <w:tcW w:w="874" w:type="dxa"/>
+            <w:tcW w:w="875" w:type="dxa"/>
             <w:tcBorders>
               <w:bottom w:val="single" w:sz="4" w:space="0" w:color="000000"/>
               <w:right w:val="single" w:sz="4" w:space="0" w:color="000000"/>
@@ -26475,7 +26541,7 @@
         </w:tc>
         <w:tc>
           <w:tcPr>
-            <w:tcW w:w="638" w:type="dxa"/>
+            <w:tcW w:w="637" w:type="dxa"/>
             <w:vMerge w:val="continue"/>
             <w:tcBorders>
               <w:left w:val="single" w:sz="4" w:space="0" w:color="000000"/>
@@ -26757,7 +26823,7 @@
         </w:tc>
         <w:tc>
           <w:tcPr>
-            <w:tcW w:w="874" w:type="dxa"/>
+            <w:tcW w:w="875" w:type="dxa"/>
             <w:tcBorders>
               <w:bottom w:val="single" w:sz="4" w:space="0" w:color="000000"/>
               <w:right w:val="single" w:sz="4" w:space="0" w:color="000000"/>
@@ -26789,7 +26855,7 @@
         </w:tc>
         <w:tc>
           <w:tcPr>
-            <w:tcW w:w="638" w:type="dxa"/>
+            <w:tcW w:w="637" w:type="dxa"/>
             <w:vMerge w:val="continue"/>
             <w:tcBorders>
               <w:left w:val="single" w:sz="4" w:space="0" w:color="000000"/>
@@ -27071,7 +27137,7 @@
         </w:tc>
         <w:tc>
           <w:tcPr>
-            <w:tcW w:w="874" w:type="dxa"/>
+            <w:tcW w:w="875" w:type="dxa"/>
             <w:tcBorders>
               <w:bottom w:val="single" w:sz="4" w:space="0" w:color="000000"/>
               <w:right w:val="single" w:sz="4" w:space="0" w:color="000000"/>
@@ -27106,7 +27172,7 @@
         </w:tc>
         <w:tc>
           <w:tcPr>
-            <w:tcW w:w="638" w:type="dxa"/>
+            <w:tcW w:w="637" w:type="dxa"/>
             <w:vMerge w:val="continue"/>
             <w:tcBorders>
               <w:left w:val="single" w:sz="4" w:space="0" w:color="000000"/>
@@ -27411,7 +27477,7 @@
         </w:tc>
         <w:tc>
           <w:tcPr>
-            <w:tcW w:w="874" w:type="dxa"/>
+            <w:tcW w:w="875" w:type="dxa"/>
             <w:tcBorders>
               <w:bottom w:val="single" w:sz="4" w:space="0" w:color="000000"/>
               <w:right w:val="single" w:sz="4" w:space="0" w:color="000000"/>
@@ -27443,7 +27509,7 @@
         </w:tc>
         <w:tc>
           <w:tcPr>
-            <w:tcW w:w="638" w:type="dxa"/>
+            <w:tcW w:w="637" w:type="dxa"/>
             <w:tcBorders>
               <w:bottom w:val="single" w:sz="4" w:space="0" w:color="000000"/>
               <w:right w:val="single" w:sz="4" w:space="0" w:color="000000"/>
@@ -27765,7 +27831,7 @@
         </w:tc>
         <w:tc>
           <w:tcPr>
-            <w:tcW w:w="874" w:type="dxa"/>
+            <w:tcW w:w="875" w:type="dxa"/>
             <w:tcBorders>
               <w:bottom w:val="single" w:sz="4" w:space="0" w:color="000000"/>
               <w:right w:val="single" w:sz="4" w:space="0" w:color="000000"/>
@@ -27797,7 +27863,7 @@
         </w:tc>
         <w:tc>
           <w:tcPr>
-            <w:tcW w:w="638" w:type="dxa"/>
+            <w:tcW w:w="637" w:type="dxa"/>
             <w:tcBorders>
               <w:bottom w:val="single" w:sz="4" w:space="0" w:color="000000"/>
               <w:right w:val="single" w:sz="4" w:space="0" w:color="000000"/>
@@ -28079,7 +28145,7 @@
         </w:tc>
         <w:tc>
           <w:tcPr>
-            <w:tcW w:w="874" w:type="dxa"/>
+            <w:tcW w:w="875" w:type="dxa"/>
             <w:tcBorders>
               <w:bottom w:val="single" w:sz="4" w:space="0" w:color="000000"/>
               <w:right w:val="single" w:sz="4" w:space="0" w:color="000000"/>
@@ -28111,7 +28177,7 @@
         </w:tc>
         <w:tc>
           <w:tcPr>
-            <w:tcW w:w="638" w:type="dxa"/>
+            <w:tcW w:w="637" w:type="dxa"/>
             <w:tcBorders>
               <w:bottom w:val="single" w:sz="4" w:space="0" w:color="000000"/>
               <w:right w:val="single" w:sz="4" w:space="0" w:color="000000"/>
@@ -28403,7 +28469,7 @@
         </w:tc>
         <w:tc>
           <w:tcPr>
-            <w:tcW w:w="874" w:type="dxa"/>
+            <w:tcW w:w="875" w:type="dxa"/>
             <w:tcBorders>
               <w:bottom w:val="single" w:sz="4" w:space="0" w:color="000000"/>
               <w:right w:val="single" w:sz="4" w:space="0" w:color="000000"/>
@@ -28435,7 +28501,7 @@
         </w:tc>
         <w:tc>
           <w:tcPr>
-            <w:tcW w:w="638" w:type="dxa"/>
+            <w:tcW w:w="637" w:type="dxa"/>
             <w:vMerge w:val="restart"/>
             <w:tcBorders>
               <w:left w:val="single" w:sz="4" w:space="0" w:color="000000"/>
@@ -28723,7 +28789,7 @@
         </w:tc>
         <w:tc>
           <w:tcPr>
-            <w:tcW w:w="874" w:type="dxa"/>
+            <w:tcW w:w="875" w:type="dxa"/>
             <w:tcBorders>
               <w:bottom w:val="single" w:sz="4" w:space="0" w:color="000000"/>
               <w:right w:val="single" w:sz="4" w:space="0" w:color="000000"/>
@@ -28755,7 +28821,7 @@
         </w:tc>
         <w:tc>
           <w:tcPr>
-            <w:tcW w:w="638" w:type="dxa"/>
+            <w:tcW w:w="637" w:type="dxa"/>
             <w:vMerge w:val="continue"/>
             <w:tcBorders>
               <w:left w:val="single" w:sz="4" w:space="0" w:color="000000"/>
@@ -29040,7 +29106,7 @@
         </w:tc>
         <w:tc>
           <w:tcPr>
-            <w:tcW w:w="874" w:type="dxa"/>
+            <w:tcW w:w="875" w:type="dxa"/>
             <w:tcBorders>
               <w:bottom w:val="single" w:sz="4" w:space="0" w:color="000000"/>
               <w:right w:val="single" w:sz="4" w:space="0" w:color="000000"/>
@@ -29072,7 +29138,7 @@
         </w:tc>
         <w:tc>
           <w:tcPr>
-            <w:tcW w:w="638" w:type="dxa"/>
+            <w:tcW w:w="637" w:type="dxa"/>
             <w:tcBorders>
               <w:bottom w:val="single" w:sz="4" w:space="0" w:color="000000"/>
               <w:right w:val="single" w:sz="4" w:space="0" w:color="000000"/>
@@ -29364,7 +29430,7 @@
         </w:tc>
         <w:tc>
           <w:tcPr>
-            <w:tcW w:w="874" w:type="dxa"/>
+            <w:tcW w:w="875" w:type="dxa"/>
             <w:tcBorders>
               <w:bottom w:val="single" w:sz="4" w:space="0" w:color="000000"/>
               <w:right w:val="single" w:sz="4" w:space="0" w:color="000000"/>
@@ -29396,7 +29462,7 @@
         </w:tc>
         <w:tc>
           <w:tcPr>
-            <w:tcW w:w="638" w:type="dxa"/>
+            <w:tcW w:w="637" w:type="dxa"/>
             <w:vMerge w:val="restart"/>
             <w:tcBorders>
               <w:left w:val="single" w:sz="4" w:space="0" w:color="000000"/>
@@ -29684,7 +29750,7 @@
         </w:tc>
         <w:tc>
           <w:tcPr>
-            <w:tcW w:w="874" w:type="dxa"/>
+            <w:tcW w:w="875" w:type="dxa"/>
             <w:tcBorders>
               <w:bottom w:val="single" w:sz="4" w:space="0" w:color="000000"/>
               <w:right w:val="single" w:sz="4" w:space="0" w:color="000000"/>
@@ -29716,7 +29782,7 @@
         </w:tc>
         <w:tc>
           <w:tcPr>
-            <w:tcW w:w="638" w:type="dxa"/>
+            <w:tcW w:w="637" w:type="dxa"/>
             <w:vMerge w:val="continue"/>
             <w:tcBorders>
               <w:left w:val="single" w:sz="4" w:space="0" w:color="000000"/>
@@ -29998,7 +30064,7 @@
         </w:tc>
         <w:tc>
           <w:tcPr>
-            <w:tcW w:w="874" w:type="dxa"/>
+            <w:tcW w:w="875" w:type="dxa"/>
             <w:tcBorders>
               <w:bottom w:val="single" w:sz="4" w:space="0" w:color="000000"/>
               <w:right w:val="single" w:sz="4" w:space="0" w:color="000000"/>
@@ -30030,7 +30096,7 @@
         </w:tc>
         <w:tc>
           <w:tcPr>
-            <w:tcW w:w="638" w:type="dxa"/>
+            <w:tcW w:w="637" w:type="dxa"/>
             <w:vMerge w:val="continue"/>
             <w:tcBorders>
               <w:left w:val="single" w:sz="4" w:space="0" w:color="000000"/>
@@ -30355,7 +30421,7 @@
         </w:tc>
         <w:tc>
           <w:tcPr>
-            <w:tcW w:w="874" w:type="dxa"/>
+            <w:tcW w:w="875" w:type="dxa"/>
             <w:tcBorders>
               <w:bottom w:val="single" w:sz="4" w:space="0" w:color="000000"/>
               <w:right w:val="single" w:sz="4" w:space="0" w:color="000000"/>
@@ -30387,7 +30453,7 @@
         </w:tc>
         <w:tc>
           <w:tcPr>
-            <w:tcW w:w="638" w:type="dxa"/>
+            <w:tcW w:w="637" w:type="dxa"/>
             <w:tcBorders>
               <w:bottom w:val="single" w:sz="4" w:space="0" w:color="000000"/>
               <w:right w:val="single" w:sz="4" w:space="0" w:color="000000"/>
@@ -30709,7 +30775,7 @@
         </w:tc>
         <w:tc>
           <w:tcPr>
-            <w:tcW w:w="874" w:type="dxa"/>
+            <w:tcW w:w="875" w:type="dxa"/>
             <w:tcBorders>
               <w:bottom w:val="single" w:sz="4" w:space="0" w:color="000000"/>
               <w:right w:val="single" w:sz="4" w:space="0" w:color="000000"/>
@@ -30744,7 +30810,7 @@
         </w:tc>
         <w:tc>
           <w:tcPr>
-            <w:tcW w:w="638" w:type="dxa"/>
+            <w:tcW w:w="637" w:type="dxa"/>
             <w:tcBorders>
               <w:bottom w:val="single" w:sz="4" w:space="0" w:color="000000"/>
               <w:right w:val="single" w:sz="4" w:space="0" w:color="000000"/>
@@ -31051,7 +31117,7 @@
         </w:tc>
         <w:tc>
           <w:tcPr>
-            <w:tcW w:w="874" w:type="dxa"/>
+            <w:tcW w:w="875" w:type="dxa"/>
             <w:tcBorders>
               <w:bottom w:val="single" w:sz="4" w:space="0" w:color="000000"/>
               <w:right w:val="single" w:sz="4" w:space="0" w:color="000000"/>
@@ -31083,7 +31149,7 @@
         </w:tc>
         <w:tc>
           <w:tcPr>
-            <w:tcW w:w="638" w:type="dxa"/>
+            <w:tcW w:w="637" w:type="dxa"/>
             <w:vMerge w:val="restart"/>
             <w:tcBorders>
               <w:left w:val="single" w:sz="4" w:space="0" w:color="000000"/>
@@ -31366,7 +31432,7 @@
         </w:tc>
         <w:tc>
           <w:tcPr>
-            <w:tcW w:w="874" w:type="dxa"/>
+            <w:tcW w:w="875" w:type="dxa"/>
             <w:tcBorders>
               <w:bottom w:val="single" w:sz="4" w:space="0" w:color="000000"/>
               <w:right w:val="single" w:sz="4" w:space="0" w:color="000000"/>
@@ -31398,7 +31464,7 @@
         </w:tc>
         <w:tc>
           <w:tcPr>
-            <w:tcW w:w="638" w:type="dxa"/>
+            <w:tcW w:w="637" w:type="dxa"/>
             <w:vMerge w:val="continue"/>
             <w:tcBorders>
               <w:left w:val="single" w:sz="4" w:space="0" w:color="000000"/>
@@ -31683,7 +31749,7 @@
         </w:tc>
         <w:tc>
           <w:tcPr>
-            <w:tcW w:w="874" w:type="dxa"/>
+            <w:tcW w:w="875" w:type="dxa"/>
             <w:tcBorders>
               <w:bottom w:val="single" w:sz="4" w:space="0" w:color="000000"/>
               <w:right w:val="single" w:sz="4" w:space="0" w:color="000000"/>
@@ -31715,7 +31781,7 @@
         </w:tc>
         <w:tc>
           <w:tcPr>
-            <w:tcW w:w="638" w:type="dxa"/>
+            <w:tcW w:w="637" w:type="dxa"/>
             <w:tcBorders>
               <w:bottom w:val="single" w:sz="4" w:space="0" w:color="000000"/>
               <w:right w:val="single" w:sz="4" w:space="0" w:color="000000"/>
@@ -32042,7 +32108,7 @@
         </w:tc>
         <w:tc>
           <w:tcPr>
-            <w:tcW w:w="874" w:type="dxa"/>
+            <w:tcW w:w="875" w:type="dxa"/>
             <w:tcBorders>
               <w:bottom w:val="single" w:sz="4" w:space="0" w:color="000000"/>
               <w:right w:val="single" w:sz="4" w:space="0" w:color="000000"/>
@@ -32074,7 +32140,7 @@
         </w:tc>
         <w:tc>
           <w:tcPr>
-            <w:tcW w:w="638" w:type="dxa"/>
+            <w:tcW w:w="637" w:type="dxa"/>
             <w:tcBorders>
               <w:bottom w:val="single" w:sz="4" w:space="0" w:color="000000"/>
               <w:right w:val="single" w:sz="4" w:space="0" w:color="000000"/>
@@ -32361,7 +32427,7 @@
         </w:tc>
         <w:tc>
           <w:tcPr>
-            <w:tcW w:w="874" w:type="dxa"/>
+            <w:tcW w:w="875" w:type="dxa"/>
             <w:tcBorders>
               <w:bottom w:val="single" w:sz="4" w:space="0" w:color="000000"/>
               <w:right w:val="single" w:sz="4" w:space="0" w:color="000000"/>
@@ -32393,7 +32459,7 @@
         </w:tc>
         <w:tc>
           <w:tcPr>
-            <w:tcW w:w="638" w:type="dxa"/>
+            <w:tcW w:w="637" w:type="dxa"/>
             <w:tcBorders>
               <w:bottom w:val="single" w:sz="4" w:space="0" w:color="000000"/>
               <w:right w:val="single" w:sz="4" w:space="0" w:color="000000"/>
@@ -32680,7 +32746,7 @@
         </w:tc>
         <w:tc>
           <w:tcPr>
-            <w:tcW w:w="874" w:type="dxa"/>
+            <w:tcW w:w="875" w:type="dxa"/>
             <w:tcBorders>
               <w:bottom w:val="single" w:sz="4" w:space="0" w:color="000000"/>
               <w:right w:val="single" w:sz="4" w:space="0" w:color="000000"/>
@@ -32712,7 +32778,7 @@
         </w:tc>
         <w:tc>
           <w:tcPr>
-            <w:tcW w:w="638" w:type="dxa"/>
+            <w:tcW w:w="637" w:type="dxa"/>
             <w:tcBorders>
               <w:bottom w:val="single" w:sz="4" w:space="0" w:color="000000"/>
               <w:right w:val="single" w:sz="4" w:space="0" w:color="000000"/>
@@ -32987,7 +33053,7 @@
         </w:tc>
         <w:tc>
           <w:tcPr>
-            <w:tcW w:w="874" w:type="dxa"/>
+            <w:tcW w:w="875" w:type="dxa"/>
             <w:tcBorders>
               <w:bottom w:val="single" w:sz="4" w:space="0" w:color="000000"/>
               <w:right w:val="single" w:sz="4" w:space="0" w:color="000000"/>
@@ -33019,7 +33085,7 @@
         </w:tc>
         <w:tc>
           <w:tcPr>
-            <w:tcW w:w="638" w:type="dxa"/>
+            <w:tcW w:w="637" w:type="dxa"/>
             <w:tcBorders>
               <w:bottom w:val="single" w:sz="4" w:space="0" w:color="000000"/>
               <w:right w:val="single" w:sz="4" w:space="0" w:color="000000"/>
@@ -33312,7 +33378,7 @@
         </w:tc>
         <w:tc>
           <w:tcPr>
-            <w:tcW w:w="874" w:type="dxa"/>
+            <w:tcW w:w="875" w:type="dxa"/>
             <w:tcBorders>
               <w:bottom w:val="single" w:sz="4" w:space="0" w:color="000000"/>
               <w:right w:val="single" w:sz="4" w:space="0" w:color="000000"/>
@@ -33344,7 +33410,7 @@
         </w:tc>
         <w:tc>
           <w:tcPr>
-            <w:tcW w:w="638" w:type="dxa"/>
+            <w:tcW w:w="637" w:type="dxa"/>
             <w:vMerge w:val="restart"/>
             <w:tcBorders>
               <w:left w:val="single" w:sz="4" w:space="0" w:color="000000"/>
@@ -33632,7 +33698,7 @@
         </w:tc>
         <w:tc>
           <w:tcPr>
-            <w:tcW w:w="874" w:type="dxa"/>
+            <w:tcW w:w="875" w:type="dxa"/>
             <w:tcBorders>
               <w:bottom w:val="single" w:sz="4" w:space="0" w:color="000000"/>
               <w:right w:val="single" w:sz="4" w:space="0" w:color="000000"/>
@@ -33667,7 +33733,7 @@
         </w:tc>
         <w:tc>
           <w:tcPr>
-            <w:tcW w:w="638" w:type="dxa"/>
+            <w:tcW w:w="637" w:type="dxa"/>
             <w:vMerge w:val="continue"/>
             <w:tcBorders>
               <w:left w:val="single" w:sz="4" w:space="0" w:color="000000"/>
@@ -33949,7 +34015,7 @@
         </w:tc>
         <w:tc>
           <w:tcPr>
-            <w:tcW w:w="874" w:type="dxa"/>
+            <w:tcW w:w="875" w:type="dxa"/>
             <w:tcBorders>
               <w:bottom w:val="single" w:sz="4" w:space="0" w:color="000000"/>
               <w:right w:val="single" w:sz="4" w:space="0" w:color="000000"/>
@@ -33981,7 +34047,7 @@
         </w:tc>
         <w:tc>
           <w:tcPr>
-            <w:tcW w:w="638" w:type="dxa"/>
+            <w:tcW w:w="637" w:type="dxa"/>
             <w:vMerge w:val="continue"/>
             <w:tcBorders>
               <w:left w:val="single" w:sz="4" w:space="0" w:color="000000"/>
@@ -34333,7 +34399,7 @@
         </w:tc>
         <w:tc>
           <w:tcPr>
-            <w:tcW w:w="874" w:type="dxa"/>
+            <w:tcW w:w="875" w:type="dxa"/>
             <w:tcBorders>
               <w:bottom w:val="single" w:sz="4" w:space="0" w:color="000000"/>
               <w:right w:val="single" w:sz="4" w:space="0" w:color="000000"/>
@@ -34365,7 +34431,7 @@
         </w:tc>
         <w:tc>
           <w:tcPr>
-            <w:tcW w:w="638" w:type="dxa"/>
+            <w:tcW w:w="637" w:type="dxa"/>
             <w:vMerge w:val="restart"/>
             <w:tcBorders>
               <w:left w:val="single" w:sz="4" w:space="0" w:color="000000"/>
@@ -34673,7 +34739,7 @@
         </w:tc>
         <w:tc>
           <w:tcPr>
-            <w:tcW w:w="874" w:type="dxa"/>
+            <w:tcW w:w="875" w:type="dxa"/>
             <w:tcBorders>
               <w:bottom w:val="single" w:sz="4" w:space="0" w:color="000000"/>
               <w:right w:val="single" w:sz="4" w:space="0" w:color="000000"/>
@@ -34705,7 +34771,7 @@
         </w:tc>
         <w:tc>
           <w:tcPr>
-            <w:tcW w:w="638" w:type="dxa"/>
+            <w:tcW w:w="637" w:type="dxa"/>
             <w:vMerge w:val="continue"/>
             <w:tcBorders>
               <w:left w:val="single" w:sz="4" w:space="0" w:color="000000"/>
@@ -35005,7 +35071,7 @@
         </w:tc>
         <w:tc>
           <w:tcPr>
-            <w:tcW w:w="874" w:type="dxa"/>
+            <w:tcW w:w="875" w:type="dxa"/>
             <w:tcBorders>
               <w:bottom w:val="single" w:sz="4" w:space="0" w:color="000000"/>
               <w:right w:val="single" w:sz="4" w:space="0" w:color="000000"/>
@@ -35037,7 +35103,7 @@
         </w:tc>
         <w:tc>
           <w:tcPr>
-            <w:tcW w:w="638" w:type="dxa"/>
+            <w:tcW w:w="637" w:type="dxa"/>
             <w:tcBorders>
               <w:bottom w:val="single" w:sz="4" w:space="0" w:color="000000"/>
               <w:right w:val="single" w:sz="4" w:space="0" w:color="000000"/>
@@ -35339,7 +35405,7 @@
         </w:tc>
         <w:tc>
           <w:tcPr>
-            <w:tcW w:w="874" w:type="dxa"/>
+            <w:tcW w:w="875" w:type="dxa"/>
             <w:tcBorders>
               <w:bottom w:val="single" w:sz="4" w:space="0" w:color="000000"/>
               <w:right w:val="single" w:sz="4" w:space="0" w:color="000000"/>
@@ -35371,7 +35437,7 @@
         </w:tc>
         <w:tc>
           <w:tcPr>
-            <w:tcW w:w="638" w:type="dxa"/>
+            <w:tcW w:w="637" w:type="dxa"/>
             <w:tcBorders>
               <w:bottom w:val="single" w:sz="4" w:space="0" w:color="000000"/>
               <w:right w:val="single" w:sz="4" w:space="0" w:color="000000"/>
@@ -35698,7 +35764,7 @@
         </w:tc>
         <w:tc>
           <w:tcPr>
-            <w:tcW w:w="874" w:type="dxa"/>
+            <w:tcW w:w="875" w:type="dxa"/>
             <w:tcBorders>
               <w:bottom w:val="single" w:sz="4" w:space="0" w:color="000000"/>
               <w:right w:val="single" w:sz="4" w:space="0" w:color="000000"/>
@@ -35730,7 +35796,7 @@
         </w:tc>
         <w:tc>
           <w:tcPr>
-            <w:tcW w:w="638" w:type="dxa"/>
+            <w:tcW w:w="637" w:type="dxa"/>
             <w:tcBorders>
               <w:bottom w:val="single" w:sz="4" w:space="0" w:color="000000"/>
               <w:right w:val="single" w:sz="4" w:space="0" w:color="000000"/>
@@ -36037,7 +36103,7 @@
         </w:tc>
         <w:tc>
           <w:tcPr>
-            <w:tcW w:w="874" w:type="dxa"/>
+            <w:tcW w:w="875" w:type="dxa"/>
             <w:tcBorders>
               <w:bottom w:val="single" w:sz="4" w:space="0" w:color="000000"/>
               <w:right w:val="single" w:sz="4" w:space="0" w:color="000000"/>
@@ -36069,7 +36135,7 @@
         </w:tc>
         <w:tc>
           <w:tcPr>
-            <w:tcW w:w="638" w:type="dxa"/>
+            <w:tcW w:w="637" w:type="dxa"/>
             <w:tcBorders>
               <w:bottom w:val="single" w:sz="4" w:space="0" w:color="000000"/>
               <w:right w:val="single" w:sz="4" w:space="0" w:color="000000"/>
@@ -36368,7 +36434,7 @@
         </w:tc>
         <w:tc>
           <w:tcPr>
-            <w:tcW w:w="874" w:type="dxa"/>
+            <w:tcW w:w="875" w:type="dxa"/>
             <w:tcBorders>
               <w:bottom w:val="single" w:sz="4" w:space="0" w:color="000000"/>
               <w:right w:val="single" w:sz="4" w:space="0" w:color="000000"/>
@@ -36400,7 +36466,7 @@
         </w:tc>
         <w:tc>
           <w:tcPr>
-            <w:tcW w:w="638" w:type="dxa"/>
+            <w:tcW w:w="637" w:type="dxa"/>
             <w:vMerge w:val="restart"/>
             <w:tcBorders>
               <w:left w:val="single" w:sz="4" w:space="0" w:color="000000"/>
@@ -36683,7 +36749,7 @@
         </w:tc>
         <w:tc>
           <w:tcPr>
-            <w:tcW w:w="874" w:type="dxa"/>
+            <w:tcW w:w="875" w:type="dxa"/>
             <w:tcBorders>
               <w:bottom w:val="single" w:sz="4" w:space="0" w:color="000000"/>
               <w:right w:val="single" w:sz="4" w:space="0" w:color="000000"/>
@@ -36715,7 +36781,7 @@
         </w:tc>
         <w:tc>
           <w:tcPr>
-            <w:tcW w:w="638" w:type="dxa"/>
+            <w:tcW w:w="637" w:type="dxa"/>
             <w:vMerge w:val="continue"/>
             <w:tcBorders>
               <w:left w:val="single" w:sz="4" w:space="0" w:color="000000"/>
@@ -36992,7 +37058,7 @@
         </w:tc>
         <w:tc>
           <w:tcPr>
-            <w:tcW w:w="874" w:type="dxa"/>
+            <w:tcW w:w="875" w:type="dxa"/>
             <w:tcBorders>
               <w:bottom w:val="single" w:sz="4" w:space="0" w:color="000000"/>
               <w:right w:val="single" w:sz="4" w:space="0" w:color="000000"/>
@@ -37024,7 +37090,7 @@
         </w:tc>
         <w:tc>
           <w:tcPr>
-            <w:tcW w:w="638" w:type="dxa"/>
+            <w:tcW w:w="637" w:type="dxa"/>
             <w:vMerge w:val="continue"/>
             <w:tcBorders>
               <w:left w:val="single" w:sz="4" w:space="0" w:color="000000"/>
@@ -37324,7 +37390,7 @@
         </w:tc>
         <w:tc>
           <w:tcPr>
-            <w:tcW w:w="874" w:type="dxa"/>
+            <w:tcW w:w="875" w:type="dxa"/>
             <w:tcBorders>
               <w:bottom w:val="single" w:sz="4" w:space="0" w:color="000000"/>
               <w:right w:val="single" w:sz="4" w:space="0" w:color="000000"/>
@@ -37356,7 +37422,7 @@
         </w:tc>
         <w:tc>
           <w:tcPr>
-            <w:tcW w:w="638" w:type="dxa"/>
+            <w:tcW w:w="637" w:type="dxa"/>
             <w:tcBorders>
               <w:bottom w:val="single" w:sz="4" w:space="0" w:color="000000"/>
               <w:right w:val="single" w:sz="4" w:space="0" w:color="000000"/>
@@ -37663,7 +37729,7 @@
         </w:tc>
         <w:tc>
           <w:tcPr>
-            <w:tcW w:w="874" w:type="dxa"/>
+            <w:tcW w:w="875" w:type="dxa"/>
             <w:tcBorders>
               <w:bottom w:val="single" w:sz="4" w:space="0" w:color="000000"/>
               <w:right w:val="single" w:sz="4" w:space="0" w:color="000000"/>
@@ -37695,7 +37761,7 @@
         </w:tc>
         <w:tc>
           <w:tcPr>
-            <w:tcW w:w="638" w:type="dxa"/>
+            <w:tcW w:w="637" w:type="dxa"/>
             <w:tcBorders>
               <w:bottom w:val="single" w:sz="4" w:space="0" w:color="000000"/>
               <w:right w:val="single" w:sz="4" w:space="0" w:color="000000"/>
@@ -38007,7 +38073,7 @@
         </w:tc>
         <w:tc>
           <w:tcPr>
-            <w:tcW w:w="874" w:type="dxa"/>
+            <w:tcW w:w="875" w:type="dxa"/>
             <w:tcBorders>
               <w:bottom w:val="single" w:sz="4" w:space="0" w:color="000000"/>
               <w:right w:val="single" w:sz="4" w:space="0" w:color="000000"/>
@@ -38039,7 +38105,7 @@
         </w:tc>
         <w:tc>
           <w:tcPr>
-            <w:tcW w:w="638" w:type="dxa"/>
+            <w:tcW w:w="637" w:type="dxa"/>
             <w:vMerge w:val="restart"/>
             <w:tcBorders>
               <w:left w:val="single" w:sz="4" w:space="0" w:color="000000"/>
@@ -38327,7 +38393,7 @@
         </w:tc>
         <w:tc>
           <w:tcPr>
-            <w:tcW w:w="874" w:type="dxa"/>
+            <w:tcW w:w="875" w:type="dxa"/>
             <w:tcBorders>
               <w:bottom w:val="single" w:sz="4" w:space="0" w:color="000000"/>
               <w:right w:val="single" w:sz="4" w:space="0" w:color="000000"/>
@@ -38359,7 +38425,7 @@
         </w:tc>
         <w:tc>
           <w:tcPr>
-            <w:tcW w:w="638" w:type="dxa"/>
+            <w:tcW w:w="637" w:type="dxa"/>
             <w:vMerge w:val="continue"/>
             <w:tcBorders>
               <w:left w:val="single" w:sz="4" w:space="0" w:color="000000"/>
@@ -38641,7 +38707,7 @@
         </w:tc>
         <w:tc>
           <w:tcPr>
-            <w:tcW w:w="874" w:type="dxa"/>
+            <w:tcW w:w="875" w:type="dxa"/>
             <w:tcBorders>
               <w:bottom w:val="single" w:sz="4" w:space="0" w:color="000000"/>
               <w:right w:val="single" w:sz="4" w:space="0" w:color="000000"/>
@@ -38673,7 +38739,7 @@
         </w:tc>
         <w:tc>
           <w:tcPr>
-            <w:tcW w:w="638" w:type="dxa"/>
+            <w:tcW w:w="637" w:type="dxa"/>
             <w:vMerge w:val="continue"/>
             <w:tcBorders>
               <w:left w:val="single" w:sz="4" w:space="0" w:color="000000"/>
@@ -38955,7 +39021,7 @@
         </w:tc>
         <w:tc>
           <w:tcPr>
-            <w:tcW w:w="874" w:type="dxa"/>
+            <w:tcW w:w="875" w:type="dxa"/>
             <w:tcBorders>
               <w:bottom w:val="single" w:sz="4" w:space="0" w:color="000000"/>
               <w:right w:val="single" w:sz="4" w:space="0" w:color="000000"/>
@@ -38987,7 +39053,7 @@
         </w:tc>
         <w:tc>
           <w:tcPr>
-            <w:tcW w:w="638" w:type="dxa"/>
+            <w:tcW w:w="637" w:type="dxa"/>
             <w:vMerge w:val="continue"/>
             <w:tcBorders>
               <w:left w:val="single" w:sz="4" w:space="0" w:color="000000"/>
@@ -39269,7 +39335,7 @@
         </w:tc>
         <w:tc>
           <w:tcPr>
-            <w:tcW w:w="874" w:type="dxa"/>
+            <w:tcW w:w="875" w:type="dxa"/>
             <w:tcBorders>
               <w:bottom w:val="single" w:sz="4" w:space="0" w:color="000000"/>
               <w:right w:val="single" w:sz="4" w:space="0" w:color="000000"/>
@@ -39304,7 +39370,7 @@
         </w:tc>
         <w:tc>
           <w:tcPr>
-            <w:tcW w:w="638" w:type="dxa"/>
+            <w:tcW w:w="637" w:type="dxa"/>
             <w:vMerge w:val="continue"/>
             <w:tcBorders>
               <w:left w:val="single" w:sz="4" w:space="0" w:color="000000"/>
@@ -39586,7 +39652,7 @@
         </w:tc>
         <w:tc>
           <w:tcPr>
-            <w:tcW w:w="874" w:type="dxa"/>
+            <w:tcW w:w="875" w:type="dxa"/>
             <w:tcBorders>
               <w:bottom w:val="single" w:sz="4" w:space="0" w:color="000000"/>
               <w:right w:val="single" w:sz="4" w:space="0" w:color="000000"/>
@@ -39618,7 +39684,7 @@
         </w:tc>
         <w:tc>
           <w:tcPr>
-            <w:tcW w:w="638" w:type="dxa"/>
+            <w:tcW w:w="637" w:type="dxa"/>
             <w:vMerge w:val="continue"/>
             <w:tcBorders>
               <w:left w:val="single" w:sz="4" w:space="0" w:color="000000"/>
@@ -39988,7 +40054,7 @@
         </w:tc>
         <w:tc>
           <w:tcPr>
-            <w:tcW w:w="874" w:type="dxa"/>
+            <w:tcW w:w="875" w:type="dxa"/>
             <w:tcBorders>
               <w:bottom w:val="single" w:sz="4" w:space="0" w:color="000000"/>
               <w:right w:val="single" w:sz="4" w:space="0" w:color="000000"/>
@@ -40020,7 +40086,7 @@
         </w:tc>
         <w:tc>
           <w:tcPr>
-            <w:tcW w:w="638" w:type="dxa"/>
+            <w:tcW w:w="637" w:type="dxa"/>
             <w:vMerge w:val="restart"/>
             <w:tcBorders>
               <w:left w:val="single" w:sz="4" w:space="0" w:color="000000"/>
@@ -40308,7 +40374,7 @@
         </w:tc>
         <w:tc>
           <w:tcPr>
-            <w:tcW w:w="874" w:type="dxa"/>
+            <w:tcW w:w="875" w:type="dxa"/>
             <w:tcBorders>
               <w:bottom w:val="single" w:sz="4" w:space="0" w:color="000000"/>
               <w:right w:val="single" w:sz="4" w:space="0" w:color="000000"/>
@@ -40340,7 +40406,7 @@
         </w:tc>
         <w:tc>
           <w:tcPr>
-            <w:tcW w:w="638" w:type="dxa"/>
+            <w:tcW w:w="637" w:type="dxa"/>
             <w:vMerge w:val="continue"/>
             <w:tcBorders>
               <w:left w:val="single" w:sz="4" w:space="0" w:color="000000"/>
@@ -40622,7 +40688,7 @@
         </w:tc>
         <w:tc>
           <w:tcPr>
-            <w:tcW w:w="874" w:type="dxa"/>
+            <w:tcW w:w="875" w:type="dxa"/>
             <w:tcBorders>
               <w:bottom w:val="single" w:sz="4" w:space="0" w:color="000000"/>
               <w:right w:val="single" w:sz="4" w:space="0" w:color="000000"/>
@@ -40654,7 +40720,7 @@
         </w:tc>
         <w:tc>
           <w:tcPr>
-            <w:tcW w:w="638" w:type="dxa"/>
+            <w:tcW w:w="637" w:type="dxa"/>
             <w:vMerge w:val="continue"/>
             <w:tcBorders>
               <w:left w:val="single" w:sz="4" w:space="0" w:color="000000"/>
@@ -41055,7 +41121,7 @@
         </w:tc>
         <w:tc>
           <w:tcPr>
-            <w:tcW w:w="874" w:type="dxa"/>
+            <w:tcW w:w="875" w:type="dxa"/>
             <w:tcBorders>
               <w:bottom w:val="single" w:sz="4" w:space="0" w:color="000000"/>
               <w:right w:val="single" w:sz="4" w:space="0" w:color="000000"/>
@@ -41087,7 +41153,7 @@
         </w:tc>
         <w:tc>
           <w:tcPr>
-            <w:tcW w:w="638" w:type="dxa"/>
+            <w:tcW w:w="637" w:type="dxa"/>
             <w:tcBorders>
               <w:bottom w:val="single" w:sz="4" w:space="0" w:color="000000"/>
               <w:right w:val="single" w:sz="4" w:space="0" w:color="000000"/>
@@ -41374,7 +41440,7 @@
         </w:tc>
         <w:tc>
           <w:tcPr>
-            <w:tcW w:w="874" w:type="dxa"/>
+            <w:tcW w:w="875" w:type="dxa"/>
             <w:tcBorders>
               <w:bottom w:val="single" w:sz="4" w:space="0" w:color="000000"/>
               <w:right w:val="single" w:sz="4" w:space="0" w:color="000000"/>
@@ -41406,7 +41472,7 @@
         </w:tc>
         <w:tc>
           <w:tcPr>
-            <w:tcW w:w="638" w:type="dxa"/>
+            <w:tcW w:w="637" w:type="dxa"/>
             <w:vMerge w:val="restart"/>
             <w:tcBorders>
               <w:left w:val="single" w:sz="4" w:space="0" w:color="000000"/>
@@ -41689,7 +41755,7 @@
         </w:tc>
         <w:tc>
           <w:tcPr>
-            <w:tcW w:w="874" w:type="dxa"/>
+            <w:tcW w:w="875" w:type="dxa"/>
             <w:tcBorders>
               <w:bottom w:val="single" w:sz="4" w:space="0" w:color="000000"/>
               <w:right w:val="single" w:sz="4" w:space="0" w:color="000000"/>
@@ -41721,7 +41787,7 @@
         </w:tc>
         <w:tc>
           <w:tcPr>
-            <w:tcW w:w="638" w:type="dxa"/>
+            <w:tcW w:w="637" w:type="dxa"/>
             <w:vMerge w:val="continue"/>
             <w:tcBorders>
               <w:left w:val="single" w:sz="4" w:space="0" w:color="000000"/>
@@ -42006,7 +42072,7 @@
         </w:tc>
         <w:tc>
           <w:tcPr>
-            <w:tcW w:w="874" w:type="dxa"/>
+            <w:tcW w:w="875" w:type="dxa"/>
             <w:tcBorders>
               <w:bottom w:val="single" w:sz="4" w:space="0" w:color="000000"/>
               <w:right w:val="single" w:sz="4" w:space="0" w:color="000000"/>
@@ -42038,7 +42104,7 @@
         </w:tc>
         <w:tc>
           <w:tcPr>
-            <w:tcW w:w="638" w:type="dxa"/>
+            <w:tcW w:w="637" w:type="dxa"/>
             <w:tcBorders>
               <w:bottom w:val="single" w:sz="4" w:space="0" w:color="000000"/>
               <w:right w:val="single" w:sz="4" w:space="0" w:color="000000"/>
@@ -42325,7 +42391,7 @@
         </w:tc>
         <w:tc>
           <w:tcPr>
-            <w:tcW w:w="874" w:type="dxa"/>
+            <w:tcW w:w="875" w:type="dxa"/>
             <w:tcBorders>
               <w:bottom w:val="single" w:sz="4" w:space="0" w:color="000000"/>
               <w:right w:val="single" w:sz="4" w:space="0" w:color="000000"/>
@@ -42357,7 +42423,7 @@
         </w:tc>
         <w:tc>
           <w:tcPr>
-            <w:tcW w:w="638" w:type="dxa"/>
+            <w:tcW w:w="637" w:type="dxa"/>
             <w:vMerge w:val="restart"/>
             <w:tcBorders>
               <w:left w:val="single" w:sz="4" w:space="0" w:color="000000"/>
@@ -42640,7 +42706,7 @@
         </w:tc>
         <w:tc>
           <w:tcPr>
-            <w:tcW w:w="874" w:type="dxa"/>
+            <w:tcW w:w="875" w:type="dxa"/>
             <w:tcBorders>
               <w:bottom w:val="single" w:sz="4" w:space="0" w:color="000000"/>
               <w:right w:val="single" w:sz="4" w:space="0" w:color="000000"/>
@@ -42672,7 +42738,7 @@
         </w:tc>
         <w:tc>
           <w:tcPr>
-            <w:tcW w:w="638" w:type="dxa"/>
+            <w:tcW w:w="637" w:type="dxa"/>
             <w:vMerge w:val="continue"/>
             <w:tcBorders>
               <w:left w:val="single" w:sz="4" w:space="0" w:color="000000"/>
@@ -42949,7 +43015,7 @@
         </w:tc>
         <w:tc>
           <w:tcPr>
-            <w:tcW w:w="874" w:type="dxa"/>
+            <w:tcW w:w="875" w:type="dxa"/>
             <w:tcBorders>
               <w:bottom w:val="single" w:sz="4" w:space="0" w:color="000000"/>
               <w:right w:val="single" w:sz="4" w:space="0" w:color="000000"/>
@@ -42981,7 +43047,7 @@
         </w:tc>
         <w:tc>
           <w:tcPr>
-            <w:tcW w:w="638" w:type="dxa"/>
+            <w:tcW w:w="637" w:type="dxa"/>
             <w:vMerge w:val="continue"/>
             <w:tcBorders>
               <w:left w:val="single" w:sz="4" w:space="0" w:color="000000"/>
@@ -43269,7 +43335,7 @@
         </w:tc>
         <w:tc>
           <w:tcPr>
-            <w:tcW w:w="874" w:type="dxa"/>
+            <w:tcW w:w="875" w:type="dxa"/>
             <w:tcBorders>
               <w:bottom w:val="single" w:sz="4" w:space="0" w:color="000000"/>
               <w:right w:val="single" w:sz="4" w:space="0" w:color="000000"/>
@@ -43301,7 +43367,7 @@
         </w:tc>
         <w:tc>
           <w:tcPr>
-            <w:tcW w:w="638" w:type="dxa"/>
+            <w:tcW w:w="637" w:type="dxa"/>
             <w:vMerge w:val="continue"/>
             <w:tcBorders>
               <w:left w:val="single" w:sz="4" w:space="0" w:color="000000"/>
@@ -43586,7 +43652,7 @@
         </w:tc>
         <w:tc>
           <w:tcPr>
-            <w:tcW w:w="874" w:type="dxa"/>
+            <w:tcW w:w="875" w:type="dxa"/>
             <w:tcBorders>
               <w:bottom w:val="single" w:sz="4" w:space="0" w:color="000000"/>
               <w:right w:val="single" w:sz="4" w:space="0" w:color="000000"/>
@@ -43618,7 +43684,7 @@
         </w:tc>
         <w:tc>
           <w:tcPr>
-            <w:tcW w:w="638" w:type="dxa"/>
+            <w:tcW w:w="637" w:type="dxa"/>
             <w:tcBorders>
               <w:bottom w:val="single" w:sz="4" w:space="0" w:color="000000"/>
               <w:right w:val="single" w:sz="4" w:space="0" w:color="000000"/>
@@ -43905,7 +43971,7 @@
         </w:tc>
         <w:tc>
           <w:tcPr>
-            <w:tcW w:w="874" w:type="dxa"/>
+            <w:tcW w:w="875" w:type="dxa"/>
             <w:tcBorders>
               <w:bottom w:val="single" w:sz="4" w:space="0" w:color="000000"/>
               <w:right w:val="single" w:sz="4" w:space="0" w:color="000000"/>
@@ -43937,7 +44003,7 @@
         </w:tc>
         <w:tc>
           <w:tcPr>
-            <w:tcW w:w="638" w:type="dxa"/>
+            <w:tcW w:w="637" w:type="dxa"/>
             <w:tcBorders>
               <w:bottom w:val="single" w:sz="4" w:space="0" w:color="000000"/>
               <w:right w:val="single" w:sz="4" w:space="0" w:color="000000"/>
@@ -44249,7 +44315,7 @@
         </w:tc>
         <w:tc>
           <w:tcPr>
-            <w:tcW w:w="874" w:type="dxa"/>
+            <w:tcW w:w="875" w:type="dxa"/>
             <w:tcBorders>
               <w:bottom w:val="single" w:sz="4" w:space="0" w:color="000000"/>
               <w:right w:val="single" w:sz="4" w:space="0" w:color="000000"/>
@@ -44281,7 +44347,7 @@
         </w:tc>
         <w:tc>
           <w:tcPr>
-            <w:tcW w:w="638" w:type="dxa"/>
+            <w:tcW w:w="637" w:type="dxa"/>
             <w:vMerge w:val="restart"/>
             <w:tcBorders>
               <w:left w:val="single" w:sz="4" w:space="0" w:color="000000"/>
@@ -44569,7 +44635,7 @@
         </w:tc>
         <w:tc>
           <w:tcPr>
-            <w:tcW w:w="874" w:type="dxa"/>
+            <w:tcW w:w="875" w:type="dxa"/>
             <w:tcBorders>
               <w:bottom w:val="single" w:sz="4" w:space="0" w:color="000000"/>
               <w:right w:val="single" w:sz="4" w:space="0" w:color="000000"/>
@@ -44601,7 +44667,7 @@
         </w:tc>
         <w:tc>
           <w:tcPr>
-            <w:tcW w:w="638" w:type="dxa"/>
+            <w:tcW w:w="637" w:type="dxa"/>
             <w:vMerge w:val="continue"/>
             <w:tcBorders>
               <w:left w:val="single" w:sz="4" w:space="0" w:color="000000"/>
@@ -44883,7 +44949,7 @@
         </w:tc>
         <w:tc>
           <w:tcPr>
-            <w:tcW w:w="874" w:type="dxa"/>
+            <w:tcW w:w="875" w:type="dxa"/>
             <w:tcBorders>
               <w:bottom w:val="single" w:sz="4" w:space="0" w:color="000000"/>
               <w:right w:val="single" w:sz="4" w:space="0" w:color="000000"/>
@@ -44915,7 +44981,7 @@
         </w:tc>
         <w:tc>
           <w:tcPr>
-            <w:tcW w:w="638" w:type="dxa"/>
+            <w:tcW w:w="637" w:type="dxa"/>
             <w:vMerge w:val="continue"/>
             <w:tcBorders>
               <w:left w:val="single" w:sz="4" w:space="0" w:color="000000"/>
@@ -45116,13 +45182,13 @@
         <w:rPr/>
         <w:t xml:space="preserve"> agg. může zahrnovat i významné a vzácné taxony </w:t>
       </w:r>
-      <w:del w:id="80" w:author="Martin Vojík" w:date="2024-09-04T11:57:00Z">
+      <w:del w:id="82" w:author="Martin Vojík" w:date="2024-09-04T11:57:00Z">
         <w:r>
           <w:rPr/>
           <w:delText>(např.</w:delText>
         </w:r>
       </w:del>
-      <w:ins w:id="81" w:author="Martin Vojík" w:date="2024-09-04T11:57:00Z">
+      <w:ins w:id="83" w:author="Martin Vojík" w:date="2024-09-04T11:57:00Z">
         <w:r>
           <w:rPr/>
           <w:t>–</w:t>
@@ -45172,13 +45238,13 @@
         <w:rPr/>
         <w:t>), které nevykazují expanzní aktivitu, ba naopak, může se jednat o druhy end</w:t>
       </w:r>
-      <w:ins w:id="82" w:author="Martin Vojík" w:date="2024-09-04T11:58:00Z">
+      <w:ins w:id="84" w:author="Martin Vojík" w:date="2024-09-04T11:58:00Z">
         <w:r>
           <w:rPr/>
           <w:t>e</w:t>
         </w:r>
       </w:ins>
-      <w:del w:id="83" w:author="Martin Vojík" w:date="2024-09-04T11:58:00Z">
+      <w:del w:id="85" w:author="Martin Vojík" w:date="2024-09-04T11:58:00Z">
         <w:r>
           <w:rPr/>
           <w:delText>e</w:delText>
@@ -51378,65 +51444,6 @@
     </w:p>
   </w:comment>
   <w:comment w:id="2" w:author="Jakub Rataj" w:date="2026-01-20T11:18:28Z" w:initials="JR">
-    <w:p>
-      <w:r>
-        <w:rPr>
-          <w:rFonts w:eastAsia="Calibri" w:cstheme="minorBidi" w:eastAsiaTheme="minorHAnsi" w:cs="" w:ascii="Calibri" w:hAnsi="Calibri"/>
-          <w:b w:val="false"/>
-          <w:bCs w:val="false"/>
-          <w:i w:val="false"/>
-          <w:iCs w:val="false"/>
-          <w:caps w:val="false"/>
-          <w:smallCaps w:val="false"/>
-          <w:strike w:val="false"/>
-          <w:dstrike w:val="false"/>
-          <w:outline w:val="false"/>
-          <w:shadow w:val="false"/>
-          <w:emboss w:val="false"/>
-          <w:imprint w:val="false"/>
-          <w:color w:val="auto"/>
-          <w:spacing w:val="0"/>
-          <w:w w:val="100"/>
-          <w:kern w:val="0"/>
-          <w:position w:val="0"/>
-          <w:sz w:val="20"/>
-          <w:szCs w:val="22"/>
-          <w:u w:val="none"/>
-          <w:vertAlign w:val="baseline"/>
-          <w:em w:val="none"/>
-          <w:lang w:bidi="ar-SA" w:eastAsia="en-US" w:val="cs-CZ"/>
-        </w:rPr>
-        <w:t>aktualizovat</w:t>
-      </w:r>
-    </w:p>
-  </w:comment>
-  <w:comment w:id="3" w:author="Martin Vojík" w:date="2024-09-03T14:36:00Z" w:initials="MV">
-    <w:p>
-      <w:r>
-        <w:rPr>
-          <w:rFonts w:ascii="Liberation Serif" w:hAnsi="Liberation Serif" w:eastAsia="DejaVu Sans" w:cs="DejaVu Sans"/>
-          <w:sz w:val="24"/>
-          <w:szCs w:val="24"/>
-          <w:lang w:val="en-US" w:eastAsia="en-US" w:bidi="en-US"/>
-        </w:rPr>
-        <w:t>Platí stále? Pokud ano, je řeba revidovat interpretační manuál.</w:t>
-      </w:r>
-    </w:p>
-  </w:comment>
-  <w:comment w:id="4" w:author="Martin Vojík" w:date="2024-09-04T10:48:00Z" w:initials="MV">
-    <w:p>
-      <w:r>
-        <w:rPr>
-          <w:rFonts w:ascii="Liberation Serif" w:hAnsi="Liberation Serif" w:eastAsia="DejaVu Sans" w:cs="DejaVu Sans"/>
-          <w:sz w:val="24"/>
-          <w:szCs w:val="24"/>
-          <w:lang w:val="en-US" w:eastAsia="en-US" w:bidi="en-US"/>
-        </w:rPr>
-        <w:t>Proč je potřeba jít nad rámec citování, když to má být stručné a jasné? Musel bych přejmout celou převodní tabulku včetně odstavce, kde říkají, že se to jede podle ní…nemají to ani v té velké metodice aktualizace, asi jim to také přijde zbytečné…a když je to zbytečné zahlcení tam, necpal bych to ani sem…</w:t>
-      </w:r>
-    </w:p>
-  </w:comment>
-  <w:comment w:id="5" w:author="Unknown Author" w:date="2026-01-07T15:02:07Z" w:initials="">
     <w:p>
       <w:r>
         <w:rPr>
@@ -51466,11 +51473,37 @@
           <w:em w:val="none"/>
           <w:lang w:val="cs-CZ" w:eastAsia="en-US" w:bidi="ar-SA"/>
         </w:rPr>
-        <w:t>?</w:t>
+        <w:t>aktualizovat</w:t>
       </w:r>
     </w:p>
   </w:comment>
-  <w:comment w:id="6" w:author="Jakub Rataj" w:date="2026-01-07T15:03:01Z" w:initials="JR">
+  <w:comment w:id="3" w:author="Martin Vojík" w:date="2024-09-03T14:36:00Z" w:initials="MV">
+    <w:p>
+      <w:r>
+        <w:rPr>
+          <w:rFonts w:ascii="Liberation Serif" w:hAnsi="Liberation Serif" w:eastAsia="DejaVu Sans" w:cs="DejaVu Sans"/>
+          <w:sz w:val="24"/>
+          <w:szCs w:val="24"/>
+          <w:lang w:val="en-US" w:eastAsia="en-US" w:bidi="en-US"/>
+        </w:rPr>
+        <w:t>Platí stále? Pokud ano, je řeba revidovat interpretační manuál.</w:t>
+      </w:r>
+    </w:p>
+  </w:comment>
+  <w:comment w:id="4" w:author="Martin Vojík" w:date="2024-09-04T10:48:00Z" w:initials="MV">
+    <w:p>
+      <w:r>
+        <w:rPr>
+          <w:rFonts w:ascii="Liberation Serif" w:hAnsi="Liberation Serif" w:eastAsia="DejaVu Sans" w:cs="DejaVu Sans"/>
+          <w:sz w:val="24"/>
+          <w:szCs w:val="24"/>
+          <w:lang w:val="en-US" w:eastAsia="en-US" w:bidi="en-US"/>
+        </w:rPr>
+        <w:t>Proč je potřeba jít nad rámec citování, když to má být stručné a jasné? Musel bych přejmout celou převodní tabulku včetně odstavce, kde říkají, že se to jede podle ní…nemají to ani v té velké metodice aktualizace, asi jim to také přijde zbytečné…a když je to zbytečné zahlcení tam, necpal bych to ani sem…</w:t>
+      </w:r>
+    </w:p>
+  </w:comment>
+  <w:comment w:id="5" w:author="Unknown Author" w:date="2026-01-07T15:02:07Z" w:initials="">
     <w:p>
       <w:r>
         <w:rPr>
@@ -51504,46 +51537,7 @@
       </w:r>
     </w:p>
   </w:comment>
-  <w:comment w:id="7" w:author="Martin Vojík" w:date="2024-09-04T10:29:00Z" w:initials="MV">
-    <w:p>
-      <w:r>
-        <w:rPr>
-          <w:rFonts w:ascii="Liberation Serif" w:hAnsi="Liberation Serif" w:eastAsia="DejaVu Sans" w:cs="DejaVu Sans"/>
-          <w:sz w:val="24"/>
-          <w:szCs w:val="24"/>
-          <w:lang w:val="en-US" w:eastAsia="en-US" w:bidi="en-US"/>
-        </w:rPr>
-        <w:t>Přílohu 2 tedy zachováme, je tak?</w:t>
-      </w:r>
-    </w:p>
-  </w:comment>
-  <w:comment w:id="9" w:author="Martin Vojík" w:date="2024-09-04T09:09:00Z" w:initials="MV">
-    <w:p>
-      <w:r>
-        <w:rPr>
-          <w:rFonts w:ascii="Liberation Serif" w:hAnsi="Liberation Serif" w:eastAsia="DejaVu Sans" w:cs="DejaVu Sans"/>
-          <w:sz w:val="24"/>
-          <w:szCs w:val="24"/>
-          <w:lang w:val="en-US" w:eastAsia="en-US" w:bidi="en-US"/>
-        </w:rPr>
-        <w:t>Z a) udělat „1“ a z b „2“, udělal bych to ale nemám editovatelnou verzi obrázku</w:t>
-      </w:r>
-    </w:p>
-  </w:comment>
-  <w:comment w:id="8" w:author="Martin Vojík" w:date="2024-09-04T09:07:00Z" w:initials="MV">
-    <w:p>
-      <w:r>
-        <w:rPr>
-          <w:rFonts w:ascii="Liberation Serif" w:hAnsi="Liberation Serif" w:eastAsia="DejaVu Sans" w:cs="DejaVu Sans"/>
-          <w:sz w:val="24"/>
-          <w:szCs w:val="24"/>
-          <w:lang w:val="en-US" w:eastAsia="en-US" w:bidi="en-US"/>
-        </w:rPr>
-        <w:t>Tady není úplně jasné co znamená A a B…pak tu jsou skupiny C a D, to také není popsáno</w:t>
-      </w:r>
-    </w:p>
-  </w:comment>
-  <w:comment w:id="10" w:author="Jakub Rataj" w:date="2026-01-07T16:08:22Z" w:initials="JR">
+  <w:comment w:id="6" w:author="Jakub Rataj" w:date="2026-01-07T15:03:01Z" w:initials="JR">
     <w:p>
       <w:r>
         <w:rPr>
@@ -51573,11 +51567,11 @@
           <w:em w:val="none"/>
           <w:lang w:val="cs-CZ" w:eastAsia="en-US" w:bidi="ar-SA"/>
         </w:rPr>
-        <w:t>vyšší číslo -&gt; lepší stav</w:t>
+        <w:t>?</w:t>
       </w:r>
     </w:p>
   </w:comment>
-  <w:comment w:id="11" w:author="Martin Vojík" w:date="2024-09-04T10:24:00Z" w:initials="MV">
+  <w:comment w:id="7" w:author="Martin Vojík" w:date="2024-09-04T10:29:00Z" w:initials="MV">
     <w:p>
       <w:r>
         <w:rPr>
@@ -51586,11 +51580,11 @@
           <w:szCs w:val="24"/>
           <w:lang w:val="en-US" w:eastAsia="en-US" w:bidi="en-US"/>
         </w:rPr>
-        <w:t>V interpretačním manuálu je „10,4“</w:t>
+        <w:t>Přílohu 2 tedy zachováme, je tak?</w:t>
       </w:r>
     </w:p>
   </w:comment>
-  <w:comment w:id="12" w:author="Martin Vojík" w:date="2024-09-04T10:24:00Z" w:initials="MV">
+  <w:comment w:id="9" w:author="Martin Vojík" w:date="2024-09-04T09:09:00Z" w:initials="MV">
     <w:p>
       <w:r>
         <w:rPr>
@@ -51599,11 +51593,11 @@
           <w:szCs w:val="24"/>
           <w:lang w:val="en-US" w:eastAsia="en-US" w:bidi="en-US"/>
         </w:rPr>
-        <w:t>Tamtéž uvedeno ¨“10“</w:t>
+        <w:t>Z a) udělat „1“ a z b „2“, udělal bych to ale nemám editovatelnou verzi obrázku</w:t>
       </w:r>
     </w:p>
   </w:comment>
-  <w:comment w:id="14" w:author="Martin Vojík" w:date="2024-09-04T10:26:00Z" w:initials="MV">
+  <w:comment w:id="8" w:author="Martin Vojík" w:date="2024-09-04T09:07:00Z" w:initials="MV">
     <w:p>
       <w:r>
         <w:rPr>
@@ -51612,11 +51606,183 @@
           <w:szCs w:val="24"/>
           <w:lang w:val="en-US" w:eastAsia="en-US" w:bidi="en-US"/>
         </w:rPr>
-        <w:t>Chceme zde mít nějaké ty příklady z interpetačního manuálu či nikoli?</w:t>
+        <w:t>Tady není úplně jasné co znamená A a B…pak tu jsou skupiny C a D, to také není popsáno</w:t>
       </w:r>
     </w:p>
   </w:comment>
-  <w:comment w:id="13" w:author="Martin Vojík" w:date="2024-09-04T12:27:00Z" w:initials="MV">
+  <w:comment w:id="10" w:author="Jakub Rataj" w:date="2026-01-29T14:35:59Z" w:initials="JR">
+    <w:p>
+      <w:r>
+        <w:rPr>
+          <w:rFonts w:eastAsia="Calibri" w:cstheme="minorBidi" w:eastAsiaTheme="minorHAnsi" w:cs="" w:ascii="Calibri" w:hAnsi="Calibri"/>
+          <w:b w:val="false"/>
+          <w:bCs w:val="false"/>
+          <w:i w:val="false"/>
+          <w:iCs w:val="false"/>
+          <w:caps w:val="false"/>
+          <w:smallCaps w:val="false"/>
+          <w:strike w:val="false"/>
+          <w:dstrike w:val="false"/>
+          <w:outline w:val="false"/>
+          <w:shadow w:val="false"/>
+          <w:emboss w:val="false"/>
+          <w:imprint w:val="false"/>
+          <w:color w:val="auto"/>
+          <w:spacing w:val="0"/>
+          <w:w w:val="100"/>
+          <w:kern w:val="0"/>
+          <w:position w:val="0"/>
+          <w:sz w:val="20"/>
+          <w:szCs w:val="22"/>
+          <w:u w:val="none"/>
+          <w:vertAlign w:val="baseline"/>
+          <w:em w:val="none"/>
+          <w:lang w:bidi="ar-SA" w:eastAsia="en-US" w:val="cs-CZ"/>
+        </w:rPr>
+        <w:t>v habitatech v EVL</w:t>
+      </w:r>
+    </w:p>
+  </w:comment>
+  <w:comment w:id="11" w:author="Jakub Rataj" w:date="2026-01-29T14:37:59Z" w:initials="JR">
+    <w:p>
+      <w:r>
+        <w:rPr>
+          <w:rFonts w:eastAsia="Calibri" w:cstheme="minorBidi" w:eastAsiaTheme="minorHAnsi" w:cs="" w:ascii="Calibri" w:hAnsi="Calibri"/>
+          <w:b w:val="false"/>
+          <w:bCs w:val="false"/>
+          <w:i w:val="false"/>
+          <w:iCs w:val="false"/>
+          <w:caps w:val="false"/>
+          <w:smallCaps w:val="false"/>
+          <w:strike w:val="false"/>
+          <w:dstrike w:val="false"/>
+          <w:outline w:val="false"/>
+          <w:shadow w:val="false"/>
+          <w:emboss w:val="false"/>
+          <w:imprint w:val="false"/>
+          <w:color w:val="auto"/>
+          <w:spacing w:val="0"/>
+          <w:w w:val="100"/>
+          <w:kern w:val="0"/>
+          <w:position w:val="0"/>
+          <w:sz w:val="20"/>
+          <w:szCs w:val="22"/>
+          <w:u w:val="none"/>
+          <w:vertAlign w:val="baseline"/>
+          <w:em w:val="none"/>
+          <w:lang w:bidi="ar-SA" w:eastAsia="en-US" w:val="cs-CZ"/>
+        </w:rPr>
+        <w:t>ve formuli je jenom jako „plocha stanoviště“</w:t>
+      </w:r>
+    </w:p>
+  </w:comment>
+  <w:comment w:id="12" w:author="Jakub Rataj" w:date="2026-01-07T16:08:22Z" w:initials="JR">
+    <w:p>
+      <w:r>
+        <w:rPr>
+          <w:rFonts w:ascii="Calibri" w:hAnsi="Calibri" w:eastAsia="Calibri" w:cs=""/>
+          <w:b w:val="false"/>
+          <w:bCs w:val="false"/>
+          <w:i w:val="false"/>
+          <w:iCs w:val="false"/>
+          <w:caps w:val="false"/>
+          <w:smallCaps w:val="false"/>
+          <w:strike w:val="false"/>
+          <w:dstrike w:val="false"/>
+          <w:outline w:val="false"/>
+          <w:shadow w:val="false"/>
+          <w:emboss w:val="false"/>
+          <w:imprint w:val="false"/>
+          <w:color w:val="auto"/>
+          <w:spacing w:val="0"/>
+          <w:w w:val="100"/>
+          <w:kern w:val="0"/>
+          <w:position w:val="0"/>
+          <w:sz w:val="20"/>
+          <w:sz w:val="20"/>
+          <w:szCs w:val="22"/>
+          <w:u w:val="none"/>
+          <w:vertAlign w:val="baseline"/>
+          <w:em w:val="none"/>
+          <w:lang w:eastAsia="en-US" w:val="cs-CZ" w:bidi="ar-SA"/>
+        </w:rPr>
+        <w:t>vzorec: v kódu chybí začátek rovnice 100-…</w:t>
+      </w:r>
+    </w:p>
+  </w:comment>
+  <w:comment w:id="13" w:author="Jakub Rataj" w:date="2026-01-29T15:05:44Z" w:initials="JR">
+    <w:p>
+      <w:r>
+        <w:rPr>
+          <w:rFonts w:eastAsia="Calibri" w:cstheme="minorBidi" w:eastAsiaTheme="minorHAnsi" w:cs="" w:ascii="Calibri" w:hAnsi="Calibri"/>
+          <w:b w:val="false"/>
+          <w:bCs w:val="false"/>
+          <w:i w:val="false"/>
+          <w:iCs w:val="false"/>
+          <w:caps w:val="false"/>
+          <w:smallCaps w:val="false"/>
+          <w:strike w:val="false"/>
+          <w:dstrike w:val="false"/>
+          <w:outline w:val="false"/>
+          <w:shadow w:val="false"/>
+          <w:emboss w:val="false"/>
+          <w:imprint w:val="false"/>
+          <w:color w:val="auto"/>
+          <w:spacing w:val="0"/>
+          <w:w w:val="100"/>
+          <w:kern w:val="0"/>
+          <w:position w:val="0"/>
+          <w:sz w:val="20"/>
+          <w:szCs w:val="22"/>
+          <w:u w:val="none"/>
+          <w:vertAlign w:val="baseline"/>
+          <w:em w:val="none"/>
+          <w:lang w:bidi="ar-SA" w:eastAsia="en-US" w:val="cs-CZ"/>
+        </w:rPr>
+        <w:t>opět, v kódu nevidím 100-...</w:t>
+      </w:r>
+    </w:p>
+  </w:comment>
+  <w:comment w:id="14" w:author="Martin Vojík" w:date="2024-09-04T10:24:00Z" w:initials="MV">
+    <w:p>
+      <w:r>
+        <w:rPr>
+          <w:rFonts w:ascii="Liberation Serif" w:hAnsi="Liberation Serif" w:eastAsia="DejaVu Sans" w:cs="DejaVu Sans"/>
+          <w:sz w:val="24"/>
+          <w:szCs w:val="24"/>
+          <w:lang w:val="en-US" w:eastAsia="en-US" w:bidi="en-US"/>
+        </w:rPr>
+        <w:t>V interpretačním manuálu je „10,4“</w:t>
+      </w:r>
+    </w:p>
+  </w:comment>
+  <w:comment w:id="15" w:author="Martin Vojík" w:date="2024-09-04T10:24:00Z" w:initials="MV">
+    <w:p>
+      <w:r>
+        <w:rPr>
+          <w:rFonts w:ascii="Liberation Serif" w:hAnsi="Liberation Serif" w:eastAsia="DejaVu Sans" w:cs="DejaVu Sans"/>
+          <w:sz w:val="24"/>
+          <w:szCs w:val="24"/>
+          <w:lang w:val="en-US" w:eastAsia="en-US" w:bidi="en-US"/>
+        </w:rPr>
+        <w:t>Tamtéž uvedeno ¨“10“</w:t>
+      </w:r>
+    </w:p>
+  </w:comment>
+  <w:comment w:id="17" w:author="Martin Vojík" w:date="2024-09-04T10:26:00Z" w:initials="MV">
+    <w:p>
+      <w:r>
+        <w:rPr>
+          <w:rFonts w:ascii="Liberation Serif" w:hAnsi="Liberation Serif" w:eastAsia="DejaVu Sans" w:cs="DejaVu Sans"/>
+          <w:sz w:val="24"/>
+          <w:szCs w:val="24"/>
+          <w:lang w:val="en-US" w:eastAsia="en-US" w:bidi="en-US"/>
+        </w:rPr>
+        <w:t>Chceme zde mít nějaké ty příklady z interpetačního manuálu či nikoli?</w:t>
+      </w:r>
+    </w:p>
+  </w:comment>
+  <w:comment w:id="16" w:author="Martin Vojík" w:date="2024-09-04T12:27:00Z" w:initials="MV">
     <w:p>
       <w:r>
         <w:rPr>
@@ -51700,18 +51866,6 @@
         <w:rPr/>
         <w:t>Lustyk P. (20</w:t>
       </w:r>
-      <w:ins w:id="85" w:author="Martin Vojík" w:date="2024-09-04T12:28:00Z">
-        <w:r>
-          <w:rPr/>
-          <w:t>24</w:t>
-        </w:r>
-      </w:ins>
-      <w:del w:id="86" w:author="Martin Vojík" w:date="2024-09-04T13:14:00Z">
-        <w:r>
-          <w:rPr/>
-          <w:delText>16): Metodika aktualizace vrstvy mapování biotopů, pracovní verze pro sezónu 20</w:delText>
-        </w:r>
-      </w:del>
       <w:ins w:id="87" w:author="Martin Vojík" w:date="2024-09-04T12:28:00Z">
         <w:r>
           <w:rPr/>
@@ -51719,6 +51873,18 @@
         </w:r>
       </w:ins>
       <w:del w:id="88" w:author="Martin Vojík" w:date="2024-09-04T13:14:00Z">
+        <w:r>
+          <w:rPr/>
+          <w:delText>16): Metodika aktualizace vrstvy mapování biotopů, pracovní verze pro sezónu 20</w:delText>
+        </w:r>
+      </w:del>
+      <w:ins w:id="89" w:author="Martin Vojík" w:date="2024-09-04T12:28:00Z">
+        <w:r>
+          <w:rPr/>
+          <w:t>24</w:t>
+        </w:r>
+      </w:ins>
+      <w:del w:id="90" w:author="Martin Vojík" w:date="2024-09-04T13:14:00Z">
         <w:r>
           <w:rPr/>
           <w:delText>16. – Ms., 33 p. [Depon in: Agentura ochrany přírody a krajiny ČR, Praha]</w:delText>
@@ -51731,7 +51897,7 @@
       <w:pPr>
         <w:pStyle w:val="Footnote"/>
         <w:rPr>
-          <w:del w:id="89" w:author="Martin Vojík" w:date="2024-09-04T13:14:00Z"/>
+          <w:del w:id="91" w:author="Martin Vojík" w:date="2024-09-04T13:14:00Z"/>
         </w:rPr>
       </w:pPr>
       <w:r>
@@ -51754,7 +51920,7 @@
         <w:pStyle w:val="Footnote"/>
         <w:rPr/>
       </w:pPr>
-      <w:del w:id="90" w:author="Martin Vojík" w:date="2024-09-04T13:14:00Z">
+      <w:del w:id="92" w:author="Martin Vojík" w:date="2024-09-04T13:14:00Z">
         <w:r>
           <w:rPr/>
           <w:delText>Chytrý M., Kučera T., Kočí M., Grulich V. &amp; Lustyk P. [eds] (2010): Katalog biotopů České republiky, Ed. 2. – Agentura ochrany přírody a krajiny ČR, Praha.</w:delText>
@@ -51782,13 +51948,13 @@
         <w:rPr/>
         <w:t>Lustyk P. [ed.] (20</w:t>
       </w:r>
-      <w:ins w:id="91" w:author="Martin Vojík" w:date="2024-09-04T12:25:00Z">
+      <w:ins w:id="93" w:author="Martin Vojík" w:date="2024-09-04T12:25:00Z">
         <w:r>
           <w:rPr/>
           <w:t>24</w:t>
         </w:r>
       </w:ins>
-      <w:del w:id="92" w:author="Martin Vojík" w:date="2024-09-04T13:15:00Z">
+      <w:del w:id="94" w:author="Martin Vojík" w:date="2024-09-04T13:15:00Z">
         <w:r>
           <w:rPr/>
           <w:delText>15): Příručka hodnocení biotopů. – Ms., 540 p. [Depon in: Agentura ochrany přírody a krajiny ČR, Praha]</w:delText>
@@ -51961,13 +52127,13 @@
         <w:rPr/>
         <w:t xml:space="preserve">Zde je myšlena mozaika segmentů či polygonů v rámci EVL, nikoliv mozaikovité segmenty </w:t>
       </w:r>
-      <w:del w:id="93" w:author="Martin Vojík" w:date="2024-09-04T09:10:00Z">
+      <w:del w:id="95" w:author="Martin Vojík" w:date="2024-09-04T09:10:00Z">
         <w:r>
           <w:rPr/>
           <w:delText>z více</w:delText>
         </w:r>
       </w:del>
-      <w:ins w:id="94" w:author="Martin Vojík" w:date="2024-09-04T09:10:00Z">
+      <w:ins w:id="96" w:author="Martin Vojík" w:date="2024-09-04T09:10:00Z">
         <w:r>
           <w:rPr/>
           <w:t>tvořené více</w:t>
@@ -51977,13 +52143,13 @@
         <w:rPr/>
         <w:t xml:space="preserve"> biotop</w:t>
       </w:r>
-      <w:ins w:id="95" w:author="Martin Vojík" w:date="2024-09-04T09:10:00Z">
+      <w:ins w:id="97" w:author="Martin Vojík" w:date="2024-09-04T09:10:00Z">
         <w:r>
           <w:rPr/>
           <w:t>y</w:t>
         </w:r>
       </w:ins>
-      <w:del w:id="96" w:author="Martin Vojík" w:date="2024-09-04T09:10:00Z">
+      <w:del w:id="98" w:author="Martin Vojík" w:date="2024-09-04T09:10:00Z">
         <w:r>
           <w:rPr/>
           <w:delText>ů</w:delText>

</xml_diff>

<commit_message>
comments on further work
</commit_message>
<xml_diff>
--- a/Metodiky/Stanoviste/hodnoceni_stavu_stanovist.docx
+++ b/Metodiky/Stanoviste/hodnoceni_stavu_stanovist.docx
@@ -973,10 +973,19 @@
           <w:sz w:val="20"/>
         </w:rPr>
       </w:r>
-      <w:commentRangeEnd w:id="0"/>
-      <w:r>
-        <w:commentReference w:id="0"/>
-      </w:r>
+      <w:ins w:id="19" w:author="Jakub Rataj" w:date="2026-02-05T12:35:29Z">
+        <w:commentRangeEnd w:id="0"/>
+        <w:r>
+          <w:commentReference w:id="0"/>
+        </w:r>
+        <w:r>
+          <w:rPr>
+            <w:rFonts w:ascii="Times New Roman" w:hAnsi="Times New Roman"/>
+            <w:sz w:val="20"/>
+          </w:rPr>
+          <w:commentReference w:id="2"/>
+        </w:r>
+      </w:ins>
       <w:r>
         <w:rPr>
           <w:rFonts w:ascii="Times New Roman" w:hAnsi="Times New Roman"/>
@@ -984,7 +993,7 @@
         </w:rPr>
         <w:t>červená kniha rostlinných společenstev ČR (stav 1995)</w:t>
       </w:r>
-      <w:ins w:id="19" w:author="Martin Vojík" w:date="2024-09-04T13:20:00Z">
+      <w:ins w:id="20" w:author="Martin Vojík" w:date="2024-09-04T13:20:00Z">
         <w:r>
           <w:rPr>
             <w:rFonts w:ascii="Times New Roman" w:hAnsi="Times New Roman"/>
@@ -993,7 +1002,7 @@
           <w:t xml:space="preserve"> (Moravec 1995)</w:t>
         </w:r>
       </w:ins>
-      <w:del w:id="20" w:author="Martin Vojík" w:date="2024-09-04T13:20:00Z">
+      <w:del w:id="21" w:author="Martin Vojík" w:date="2024-09-04T13:20:00Z">
         <w:r>
           <w:rPr>
             <w:rStyle w:val="FootnoteAnchor"/>
@@ -1010,7 +1019,7 @@
         </w:rPr>
         <w:t xml:space="preserve"> a červená kniha biotopů (</w:t>
       </w:r>
-      <w:ins w:id="21" w:author="Martin Vojík" w:date="2024-09-04T13:21:00Z">
+      <w:ins w:id="22" w:author="Martin Vojík" w:date="2024-09-04T13:21:00Z">
         <w:r>
           <w:rPr>
             <w:rFonts w:ascii="Times New Roman" w:hAnsi="Times New Roman"/>
@@ -1019,7 +1028,7 @@
           <w:t>Härtel a kol. 2009</w:t>
         </w:r>
       </w:ins>
-      <w:del w:id="22" w:author="Martin Vojík" w:date="2024-09-04T13:21:00Z">
+      <w:del w:id="23" w:author="Martin Vojík" w:date="2024-09-04T13:21:00Z">
         <w:r>
           <w:rPr>
             <w:rFonts w:ascii="Times New Roman" w:hAnsi="Times New Roman"/>
@@ -1035,7 +1044,7 @@
         </w:rPr>
         <w:t>)</w:t>
       </w:r>
-      <w:del w:id="23" w:author="Martin Vojík" w:date="2024-09-04T13:23:00Z">
+      <w:del w:id="24" w:author="Martin Vojík" w:date="2024-09-04T13:23:00Z">
         <w:r>
           <w:rPr>
             <w:rStyle w:val="FootnoteAnchor"/>
@@ -1125,7 +1134,7 @@
           <w:szCs w:val="24"/>
         </w:rPr>
       </w:pPr>
-      <w:commentRangeStart w:id="2"/>
+      <w:commentRangeStart w:id="3"/>
       <w:r>
         <w:rPr>
           <w:rFonts w:ascii="Times New Roman" w:hAnsi="Times New Roman"/>
@@ -1173,7 +1182,7 @@
         </w:rPr>
         <w:t>.</w:t>
       </w:r>
-      <w:del w:id="24" w:author="Unknown Author" w:date="2026-01-07T14:46:52Z">
+      <w:del w:id="25" w:author="Unknown Author" w:date="2026-01-07T14:46:52Z">
         <w:r>
           <w:rPr>
             <w:rFonts w:ascii="Times New Roman" w:hAnsi="Times New Roman"/>
@@ -1190,10 +1199,10 @@
           <w:szCs w:val="24"/>
         </w:rPr>
       </w:r>
-      <w:del w:id="25" w:author="Unknown Author" w:date="2026-01-07T14:46:52Z">
-        <w:commentRangeEnd w:id="2"/>
+      <w:del w:id="26" w:author="Unknown Author" w:date="2026-01-07T14:46:52Z">
+        <w:commentRangeEnd w:id="3"/>
         <w:r>
-          <w:commentReference w:id="2"/>
+          <w:commentReference w:id="3"/>
         </w:r>
         <w:r>
           <w:rPr>
@@ -1270,7 +1279,7 @@
         </w:rPr>
         <w:t xml:space="preserve">reprezentativnost/degradace „W“) a plochy pasek. Hodnota rozlohy je porovnávána s hodnotou stanovenou jako cílový stav na lokalitě a je hodnoceno její dosažení. </w:t>
       </w:r>
-      <w:commentRangeStart w:id="3"/>
+      <w:commentRangeStart w:id="4"/>
       <w:r>
         <w:rPr>
           <w:rFonts w:ascii="Times New Roman" w:hAnsi="Times New Roman"/>
@@ -1284,17 +1293,14 @@
           <w:sz w:val="24"/>
         </w:rPr>
       </w:r>
-      <w:ins w:id="26" w:author="Jakub Rataj" w:date="2026-02-04T15:14:28Z">
-        <w:commentRangeEnd w:id="3"/>
+      <w:ins w:id="27" w:author="Jakub Rataj" w:date="2026-02-04T15:14:28Z">
+        <w:commentRangeEnd w:id="4"/>
         <w:r>
-          <w:commentReference w:id="3"/>
+          <w:commentReference w:id="4"/>
         </w:r>
         <w:r>
-          <w:rPr>
-            <w:rFonts w:ascii="Times New Roman" w:hAnsi="Times New Roman"/>
-            <w:sz w:val="24"/>
-          </w:rPr>
-          <w:commentReference w:id="4"/>
+          <w:rPr/>
+          <w:commentReference w:id="5"/>
         </w:r>
       </w:ins>
       <w:r>
@@ -1373,13 +1379,35 @@
           <w:sz w:val="24"/>
         </w:rPr>
       </w:pPr>
+      <w:commentRangeStart w:id="6"/>
       <w:r>
         <w:rPr>
           <w:rFonts w:ascii="Times New Roman" w:hAnsi="Times New Roman"/>
           <w:b/>
           <w:sz w:val="24"/>
         </w:rPr>
-        <w:t>Popis parametru</w:t>
+        <w:t xml:space="preserve">Popis </w:t>
+      </w:r>
+      <w:ins w:id="28" w:author="Jakub Rataj" w:date="2026-02-05T12:41:50Z">
+        <w:r>
+          <w:rPr>
+            <w:rFonts w:ascii="Times New Roman" w:hAnsi="Times New Roman"/>
+            <w:b/>
+            <w:sz w:val="24"/>
+          </w:rPr>
+        </w:r>
+      </w:ins>
+      <w:commentRangeEnd w:id="6"/>
+      <w:r>
+        <w:commentReference w:id="6"/>
+      </w:r>
+      <w:r>
+        <w:rPr>
+          <w:rFonts w:ascii="Times New Roman" w:hAnsi="Times New Roman"/>
+          <w:b/>
+          <w:sz w:val="24"/>
+        </w:rPr>
+        <w:t>parametru</w:t>
       </w:r>
       <w:r>
         <w:rPr>
@@ -1521,7 +1549,7 @@
         </w:rPr>
         <w:t>Výpočet kvality polygonů příslušného stanoviště vychází z kombinace parametrů „degradace“ a „struktura a funkce“ v aktualizované VMB</w:t>
       </w:r>
-      <w:commentRangeStart w:id="5"/>
+      <w:commentRangeStart w:id="7"/>
       <w:r>
         <w:rPr>
           <w:rFonts w:ascii="Times New Roman" w:hAnsi="Times New Roman"/>
@@ -1551,9 +1579,9 @@
           <w:sz w:val="24"/>
         </w:rPr>
       </w:r>
-      <w:commentRangeEnd w:id="5"/>
-      <w:r>
-        <w:commentReference w:id="5"/>
+      <w:commentRangeEnd w:id="7"/>
+      <w:r>
+        <w:commentReference w:id="7"/>
       </w:r>
       <w:r>
         <w:rPr>
@@ -1650,18 +1678,24 @@
         </w:rPr>
         <w:t>Parametr ukazuje plochou vážené zastoupení typických druhů na úz</w:t>
       </w:r>
-      <w:ins w:id="27" w:author="Unknown Author" w:date="2026-01-07T15:02:07Z">
-        <w:del w:id="28" w:author="Jakub Rataj" w:date="2026-01-20T11:37:13Z">
+      <w:ins w:id="29" w:author="Unknown Author" w:date="2026-01-07T15:02:07Z">
+        <w:del w:id="30" w:author="Jakub Rataj" w:date="2026-01-20T11:37:13Z">
           <w:r>
             <w:rPr/>
-            <w:commentReference w:id="6"/>
+            <w:commentReference w:id="8"/>
           </w:r>
         </w:del>
       </w:ins>
-      <w:del w:id="29" w:author="Jakub Rataj" w:date="2026-01-20T11:37:42Z">
+      <w:ins w:id="31" w:author="Jakub Rataj" w:date="2026-02-05T12:43:20Z">
         <w:r>
           <w:rPr/>
-          <w:commentReference w:id="7"/>
+          <w:t>emí</w:t>
+        </w:r>
+      </w:ins>
+      <w:del w:id="32" w:author="Jakub Rataj" w:date="2026-01-20T11:37:42Z">
+        <w:r>
+          <w:rPr/>
+          <w:commentReference w:id="9"/>
         </w:r>
       </w:del>
       <w:r>
@@ -1671,7 +1705,7 @@
         </w:rPr>
         <w:t>. Typické druhy charakterizují stav a vývoj stanoviště, jeho zachovalost a reprezentativnost. Zároveň dokládají stanovištní poměry a to, nakolik je dané stanoviště typické ve srovnání s poměry v širším regionu. Úbytek typických druhů je pak zpravidla známkou degradace či nějaké změny ekologických podmínek, k níž na stanovišti dochází. Parametr vychází z Příručky hodnocení biotopů (Lustyk 2</w:t>
       </w:r>
-      <w:ins w:id="30" w:author="Martin Vojík" w:date="2024-09-04T12:29:00Z">
+      <w:ins w:id="33" w:author="Martin Vojík" w:date="2024-09-04T12:29:00Z">
         <w:r>
           <w:rPr>
             <w:rFonts w:ascii="Times New Roman" w:hAnsi="Times New Roman"/>
@@ -1680,7 +1714,7 @@
           <w:t>024</w:t>
         </w:r>
       </w:ins>
-      <w:ins w:id="31" w:author="Martin Vojík" w:date="2024-09-04T12:58:00Z">
+      <w:ins w:id="34" w:author="Martin Vojík" w:date="2024-09-04T12:58:00Z">
         <w:r>
           <w:rPr>
             <w:rFonts w:ascii="Times New Roman" w:hAnsi="Times New Roman"/>
@@ -1689,7 +1723,7 @@
           <w:t>b</w:t>
         </w:r>
       </w:ins>
-      <w:del w:id="32" w:author="Martin Vojík" w:date="2024-09-04T12:29:00Z">
+      <w:del w:id="35" w:author="Martin Vojík" w:date="2024-09-04T12:29:00Z">
         <w:r>
           <w:rPr>
             <w:rFonts w:ascii="Times New Roman" w:hAnsi="Times New Roman"/>
@@ -1872,7 +1906,7 @@
         </w:rPr>
         <w:t xml:space="preserve">mohou nastat u těch stanovišť, která mají málo typických druhů cévnatých rostlin, nebo typické druhy mají nepravidelný výskyt s vazbou životního cyklu na jedinečnou událost (typicky se jedná o vodní biotopy). Hodnocení parametru v těchto případech je popsáno individuálně v PHB </w:t>
       </w:r>
-      <w:ins w:id="33" w:author="Martin Vojík" w:date="2024-09-04T12:56:00Z">
+      <w:ins w:id="36" w:author="Martin Vojík" w:date="2024-09-04T12:56:00Z">
         <w:r>
           <w:rPr>
             <w:rFonts w:ascii="Times New Roman" w:hAnsi="Times New Roman"/>
@@ -1881,7 +1915,7 @@
           <w:t>(Lustyk 2024</w:t>
         </w:r>
       </w:ins>
-      <w:ins w:id="34" w:author="Martin Vojík" w:date="2024-09-04T12:58:00Z">
+      <w:ins w:id="37" w:author="Martin Vojík" w:date="2024-09-04T12:58:00Z">
         <w:r>
           <w:rPr>
             <w:rFonts w:ascii="Times New Roman" w:hAnsi="Times New Roman"/>
@@ -1890,7 +1924,7 @@
           <w:t>b</w:t>
         </w:r>
       </w:ins>
-      <w:ins w:id="35" w:author="Martin Vojík" w:date="2024-09-04T12:56:00Z">
+      <w:ins w:id="38" w:author="Martin Vojík" w:date="2024-09-04T12:56:00Z">
         <w:r>
           <w:rPr>
             <w:rFonts w:ascii="Times New Roman" w:hAnsi="Times New Roman"/>
@@ -2224,7 +2258,7 @@
         </w:rPr>
         <w:t xml:space="preserve"> - hodnota vzešlá původně z expertního posouzení byla korigována na základě srovnání reálné rozlohy polygonů kvality 1 a 2 oproti polygonům kvality 3 a 4 v EVL a mimo EVL na pozadí údajů uvedených v pracích Seják a Dejmal (2003; kapitola 4.2.3.1.– Minimální rozlohy přírodních typů biotopů) a Dostálová (2012; tab. 9). Nově byly stanoveny hodnoty minimiareálů na základě srovnání s konkrétními hodnotami excerpovanými z aktualizované VMB. Tabulka s hodnotami minimareálů je v </w:t>
       </w:r>
-      <w:commentRangeStart w:id="8"/>
+      <w:commentRangeStart w:id="10"/>
       <w:r>
         <w:rPr>
           <w:rFonts w:ascii="Times New Roman" w:hAnsi="Times New Roman"/>
@@ -2238,9 +2272,9 @@
           <w:sz w:val="24"/>
         </w:rPr>
       </w:r>
-      <w:commentRangeEnd w:id="8"/>
-      <w:r>
-        <w:commentReference w:id="8"/>
+      <w:commentRangeEnd w:id="10"/>
+      <w:r>
+        <w:commentReference w:id="10"/>
       </w:r>
       <w:r>
         <w:rPr>
@@ -2313,23 +2347,23 @@
         <w:jc w:val="both"/>
         <w:rPr/>
       </w:pPr>
-      <w:commentRangeStart w:id="9"/>
+      <w:commentRangeStart w:id="11"/>
       <w:r>
         <w:rPr/>
         <w:t xml:space="preserve">Obr. 3.  Schéma znázorňující segmenty dotčeného typu přírodního stanoviště sloučené s využitím 50m bufferu (modře) ve vztahu  k velikosti minimiareálu. Výpočet probíhá ve dvou krocích. Nejdříve </w:t>
       </w:r>
-      <w:commentRangeStart w:id="10"/>
+      <w:commentRangeStart w:id="12"/>
       <w:r>
         <w:rPr/>
         <w:t>(</w:t>
       </w:r>
-      <w:ins w:id="36" w:author="Martin Vojík" w:date="2024-09-04T09:09:00Z">
+      <w:ins w:id="39" w:author="Martin Vojík" w:date="2024-09-04T09:09:00Z">
         <w:r>
           <w:rPr/>
           <w:t>a</w:t>
         </w:r>
       </w:ins>
-      <w:del w:id="37" w:author="Martin Vojík" w:date="2024-09-04T09:09:00Z">
+      <w:del w:id="40" w:author="Martin Vojík" w:date="2024-09-04T09:09:00Z">
         <w:r>
           <w:rPr/>
           <w:delText>1</w:delText>
@@ -2342,17 +2376,17 @@
       <w:r>
         <w:rPr/>
       </w:r>
-      <w:commentRangeEnd w:id="10"/>
-      <w:r>
-        <w:commentReference w:id="10"/>
+      <w:commentRangeEnd w:id="12"/>
+      <w:r>
+        <w:commentReference w:id="12"/>
       </w:r>
       <w:r>
         <w:rPr/>
         <w:t>jsou vytvořeny skupiny segmentů s výskytem, které od sebe nejsou vzdáleny více jak 50 m (červená linie). Následně (b) je součet plochy stanoviště pro každou skupinu porovnán s hodnotou minimiareálu. Definici stanoviště v celistvém uspořádání alespoň o rozloze minimiareálu tak splňují segmenty v rámci skupiny C a D.</w:t>
       </w:r>
-      <w:commentRangeEnd w:id="9"/>
-      <w:r>
-        <w:commentReference w:id="9"/>
+      <w:commentRangeEnd w:id="11"/>
+      <w:r>
+        <w:commentReference w:id="11"/>
       </w:r>
       <w:r>
         <w:rPr/>
@@ -2679,7 +2713,7 @@
         </w:rPr>
         <w:t>– parametr je počítán 2 různými způsoby podle procenta plochy stanoviště vyskytujícího se v rámci sledované EVL v mozaikách se zastoupením pod 50 % (viz tabulka</w:t>
       </w:r>
-      <w:del w:id="38" w:author="Jakub Rataj" w:date="2026-01-07T15:21:16Z">
+      <w:del w:id="41" w:author="Jakub Rataj" w:date="2026-01-07T15:21:16Z">
         <w:r>
           <w:rPr>
             <w:rFonts w:ascii="Times New Roman" w:hAnsi="Times New Roman"/>
@@ -3134,7 +3168,7 @@
         </w:rPr>
         <w:t>V </w:t>
       </w:r>
-      <w:del w:id="39" w:author="Martin Vojík" w:date="2024-09-04T09:16:00Z">
+      <w:del w:id="42" w:author="Martin Vojík" w:date="2024-09-04T09:16:00Z">
         <w:r>
           <w:rPr>
             <w:rFonts w:ascii="Times New Roman" w:hAnsi="Times New Roman"/>
@@ -3143,7 +3177,7 @@
           <w:delText xml:space="preserve">případě </w:delText>
         </w:r>
       </w:del>
-      <w:ins w:id="40" w:author="Martin Vojík" w:date="2024-09-04T09:16:00Z">
+      <w:ins w:id="43" w:author="Martin Vojík" w:date="2024-09-04T09:16:00Z">
         <w:r>
           <w:rPr>
             <w:rFonts w:ascii="Times New Roman" w:hAnsi="Times New Roman"/>
@@ -3251,7 +3285,7 @@
         </w:rPr>
         <w:t xml:space="preserve">počet druhů červeného seznamu s výjimkou C4 (Grulich, 2012) </w:t>
       </w:r>
-      <w:commentRangeStart w:id="11"/>
+      <w:commentRangeStart w:id="13"/>
       <w:r>
         <w:rPr>
           <w:rFonts w:ascii="Times New Roman" w:hAnsi="Times New Roman"/>
@@ -3265,9 +3299,9 @@
           <w:sz w:val="24"/>
         </w:rPr>
       </w:r>
-      <w:commentRangeEnd w:id="11"/>
-      <w:r>
-        <w:commentReference w:id="11"/>
+      <w:commentRangeEnd w:id="13"/>
+      <w:r>
+        <w:commentReference w:id="13"/>
       </w:r>
       <w:r>
         <w:rPr>
@@ -3423,7 +3457,7 @@
         </w:rPr>
         <w:t xml:space="preserve"> je počet druhů červeného seznamu (kategorií C1, C2 a C3) zaznamenaných v daném typu přírodního stanoviště v dané EVL a </w:t>
       </w:r>
-      <w:commentRangeStart w:id="12"/>
+      <w:commentRangeStart w:id="14"/>
       <w:r>
         <w:rPr>
           <w:rFonts w:ascii="Times New Roman" w:hAnsi="Times New Roman"/>
@@ -3454,9 +3488,9 @@
           <w:sz w:val="24"/>
         </w:rPr>
       </w:r>
-      <w:commentRangeEnd w:id="12"/>
-      <w:r>
-        <w:commentReference w:id="12"/>
+      <w:commentRangeEnd w:id="14"/>
+      <w:r>
+        <w:commentReference w:id="14"/>
       </w:r>
       <w:r>
         <w:rPr>
@@ -3592,77 +3626,6 @@
           <w:sz w:val="24"/>
         </w:rPr>
         <w:t>Parametr výskytu invazních druhů, z nichž se část povinně zaznamenává při aktualizaci vrstvy mapování biotopů (Lustyk 202</w:t>
-      </w:r>
-      <w:ins w:id="41" w:author="Martin Vojík" w:date="2024-09-04T12:29:00Z">
-        <w:r>
-          <w:rPr>
-            <w:rFonts w:ascii="Times New Roman" w:hAnsi="Times New Roman"/>
-            <w:sz w:val="24"/>
-          </w:rPr>
-          <w:t>4</w:t>
-        </w:r>
-      </w:ins>
-      <w:ins w:id="42" w:author="Martin Vojík" w:date="2024-09-04T12:58:00Z">
-        <w:r>
-          <w:rPr>
-            <w:rFonts w:ascii="Times New Roman" w:hAnsi="Times New Roman"/>
-            <w:sz w:val="24"/>
-          </w:rPr>
-          <w:t>a</w:t>
-        </w:r>
-      </w:ins>
-      <w:del w:id="43" w:author="Martin Vojík" w:date="2024-09-04T12:29:00Z">
-        <w:r>
-          <w:rPr>
-            <w:rFonts w:ascii="Times New Roman" w:hAnsi="Times New Roman"/>
-            <w:sz w:val="24"/>
-          </w:rPr>
-          <w:delText>0</w:delText>
-        </w:r>
-      </w:del>
-      <w:r>
-        <w:rPr>
-          <w:rFonts w:ascii="Times New Roman" w:hAnsi="Times New Roman"/>
-          <w:sz w:val="24"/>
-        </w:rPr>
-        <w:t xml:space="preserve">), indikuje míru narušení a degradace stanoviště. </w:t>
-      </w:r>
-    </w:p>
-    <w:p>
-      <w:pPr>
-        <w:pStyle w:val="Normal"/>
-        <w:jc w:val="both"/>
-        <w:rPr>
-          <w:rFonts w:ascii="Times New Roman" w:hAnsi="Times New Roman"/>
-          <w:i/>
-          <w:i/>
-          <w:sz w:val="24"/>
-        </w:rPr>
-      </w:pPr>
-      <w:commentRangeStart w:id="13"/>
-      <w:r>
-        <w:rPr>
-          <w:rFonts w:ascii="Times New Roman" w:hAnsi="Times New Roman"/>
-          <w:b/>
-          <w:sz w:val="24"/>
-        </w:rPr>
-        <w:t>Popis parametru –</w:t>
-      </w:r>
-      <w:r>
-        <w:rPr>
-          <w:rFonts w:ascii="Times New Roman" w:hAnsi="Times New Roman"/>
-          <w:i/>
-          <w:color w:val="4F81BD"/>
-          <w:sz w:val="24"/>
-        </w:rPr>
-        <w:t xml:space="preserve"> </w:t>
-      </w:r>
-      <w:r>
-        <w:rPr>
-          <w:rFonts w:ascii="Times New Roman" w:hAnsi="Times New Roman"/>
-          <w:sz w:val="24"/>
-        </w:rPr>
-        <w:t>předmětem hodnocení je procento plochy s výskytem invazních druhů cévnatých rostlin uvedených v příloze 2 Metodiky aktualizace vrstvy mapování biotopů (Lustyk, 202</w:t>
       </w:r>
       <w:ins w:id="44" w:author="Martin Vojík" w:date="2024-09-04T12:29:00Z">
         <w:r>
@@ -3673,7 +3636,16 @@
           <w:t>4</w:t>
         </w:r>
       </w:ins>
-      <w:del w:id="45" w:author="Martin Vojík" w:date="2024-09-04T12:29:00Z">
+      <w:ins w:id="45" w:author="Martin Vojík" w:date="2024-09-04T12:58:00Z">
+        <w:r>
+          <w:rPr>
+            <w:rFonts w:ascii="Times New Roman" w:hAnsi="Times New Roman"/>
+            <w:sz w:val="24"/>
+          </w:rPr>
+          <w:t>a</w:t>
+        </w:r>
+      </w:ins>
+      <w:del w:id="46" w:author="Martin Vojík" w:date="2024-09-04T12:29:00Z">
         <w:r>
           <w:rPr>
             <w:rFonts w:ascii="Times New Roman" w:hAnsi="Times New Roman"/>
@@ -3687,11 +3659,73 @@
           <w:rFonts w:ascii="Times New Roman" w:hAnsi="Times New Roman"/>
           <w:sz w:val="24"/>
         </w:rPr>
+        <w:t xml:space="preserve">), indikuje míru narušení a degradace stanoviště. </w:t>
+      </w:r>
+    </w:p>
+    <w:p>
+      <w:pPr>
+        <w:pStyle w:val="Normal"/>
+        <w:jc w:val="both"/>
+        <w:rPr>
+          <w:rFonts w:ascii="Times New Roman" w:hAnsi="Times New Roman"/>
+          <w:i/>
+          <w:i/>
+          <w:sz w:val="24"/>
+        </w:rPr>
+      </w:pPr>
+      <w:commentRangeStart w:id="15"/>
+      <w:r>
+        <w:rPr>
+          <w:rFonts w:ascii="Times New Roman" w:hAnsi="Times New Roman"/>
+          <w:b/>
+          <w:sz w:val="24"/>
+        </w:rPr>
+        <w:t>Popis parametru –</w:t>
+      </w:r>
+      <w:r>
+        <w:rPr>
+          <w:rFonts w:ascii="Times New Roman" w:hAnsi="Times New Roman"/>
+          <w:i/>
+          <w:color w:val="4F81BD"/>
+          <w:sz w:val="24"/>
+        </w:rPr>
+        <w:t xml:space="preserve"> </w:t>
+      </w:r>
+      <w:r>
+        <w:rPr>
+          <w:rFonts w:ascii="Times New Roman" w:hAnsi="Times New Roman"/>
+          <w:sz w:val="24"/>
+        </w:rPr>
+        <w:t>předmětem hodnocení je procento plochy s výskytem invazních druhů cévnatých rostlin uvedených v příloze 2 Metodiky aktualizace vrstvy mapování biotopů (Lustyk, 202</w:t>
+      </w:r>
+      <w:ins w:id="47" w:author="Martin Vojík" w:date="2024-09-04T12:29:00Z">
+        <w:r>
+          <w:rPr>
+            <w:rFonts w:ascii="Times New Roman" w:hAnsi="Times New Roman"/>
+            <w:sz w:val="24"/>
+          </w:rPr>
+          <w:t>4</w:t>
+        </w:r>
+      </w:ins>
+      <w:del w:id="48" w:author="Martin Vojík" w:date="2024-09-04T12:29:00Z">
+        <w:r>
+          <w:rPr>
+            <w:rFonts w:ascii="Times New Roman" w:hAnsi="Times New Roman"/>
+            <w:sz w:val="24"/>
+          </w:rPr>
+          <w:delText>0</w:delText>
+        </w:r>
+      </w:del>
+      <w:r>
+        <w:rPr>
+          <w:rFonts w:ascii="Times New Roman" w:hAnsi="Times New Roman"/>
+          <w:sz w:val="24"/>
+        </w:rPr>
         <w:t>) a zároveň dalších nepůvodních druhů, které jsou součástí Černého, šedého a varovného seznamu (Pergl et al. 2016). Výsledná hodnota pro daný typ stanoviště se rovná maximální hodnotě škály (= 100 %) snížené o plochu stanoviště v dané EVL, dle vzorce:</w:t>
       </w:r>
-      <w:commentRangeEnd w:id="13"/>
-      <w:r>
-        <w:commentReference w:id="13"/>
+      <w:commentRangeEnd w:id="15"/>
+      <w:r>
+        <w:commentReference w:id="15"/>
       </w:r>
       <w:r>
         <w:rPr>
@@ -4000,7 +4034,7 @@
         </w:rPr>
         <w:t>předmětem hodnocení je procento plochy stanoviště s významným výskytem nativních expanzivních druhů uvedených v příloze 3</w:t>
       </w:r>
-      <w:ins w:id="46" w:author="Martin Vojík" w:date="2024-09-04T10:02:00Z">
+      <w:ins w:id="49" w:author="Martin Vojík" w:date="2024-09-04T10:02:00Z">
         <w:r>
           <w:rPr>
             <w:rFonts w:ascii="Times New Roman" w:hAnsi="Times New Roman"/>
@@ -4016,7 +4050,7 @@
         </w:rPr>
         <w:t xml:space="preserve"> (příloha bude ve spolupráci s odborníky doplňována o vazbu druhů na konkrétní biotopy), které mají obdobný dopad na přírodní stanoviště, jako druhy invazní. </w:t>
       </w:r>
-      <w:commentRangeStart w:id="14"/>
+      <w:commentRangeStart w:id="16"/>
       <w:r>
         <w:rPr>
           <w:rFonts w:ascii="Times New Roman" w:hAnsi="Times New Roman"/>
@@ -4024,9 +4058,9 @@
         </w:rPr>
         <w:t>Výsledná hodnota pro daný typ stanoviště se rovná maximální hodnotě škály (= 100 %) snížené o plochu stanoviště s výrazným zastoupením expanzivních druhů k celkové ploše stanoviště v rámci dané EVL, dle vzorce:</w:t>
       </w:r>
-      <w:commentRangeEnd w:id="14"/>
-      <w:r>
-        <w:commentReference w:id="14"/>
+      <w:commentRangeEnd w:id="16"/>
+      <w:r>
+        <w:commentReference w:id="16"/>
       </w:r>
       <w:r>
         <w:rPr>
@@ -4315,7 +4349,7 @@
         </w:rPr>
         <w:t>Mrtvé dřevo charakterizuje stav a stupeň přirozenost</w:t>
       </w:r>
-      <w:ins w:id="47" w:author="Martin Vojík" w:date="2024-09-04T09:51:00Z">
+      <w:ins w:id="50" w:author="Martin Vojík" w:date="2024-09-04T09:51:00Z">
         <w:r>
           <w:rPr>
             <w:rFonts w:ascii="Times New Roman" w:hAnsi="Times New Roman"/>
@@ -4331,7 +4365,7 @@
         </w:rPr>
         <w:t xml:space="preserve"> stanoviště, jeho zachovalost a reprezentativnost. Parametr vychází z </w:t>
       </w:r>
-      <w:del w:id="48" w:author="Martin Vojík" w:date="2024-09-04T11:56:00Z">
+      <w:del w:id="51" w:author="Martin Vojík" w:date="2024-09-04T11:56:00Z">
         <w:r>
           <w:rPr>
             <w:rFonts w:ascii="Times New Roman" w:hAnsi="Times New Roman"/>
@@ -4340,7 +4374,7 @@
           <w:delText>Příručky hodnocení biotopů</w:delText>
         </w:r>
       </w:del>
-      <w:ins w:id="49" w:author="Martin Vojík" w:date="2024-09-04T11:56:00Z">
+      <w:ins w:id="52" w:author="Martin Vojík" w:date="2024-09-04T11:56:00Z">
         <w:r>
           <w:rPr>
             <w:rFonts w:ascii="Times New Roman" w:hAnsi="Times New Roman"/>
@@ -4356,7 +4390,7 @@
         </w:rPr>
         <w:t xml:space="preserve"> (Lustyk </w:t>
       </w:r>
-      <w:del w:id="50" w:author="Martin Vojík" w:date="2024-09-04T12:26:00Z">
+      <w:del w:id="53" w:author="Martin Vojík" w:date="2024-09-04T12:26:00Z">
         <w:r>
           <w:rPr>
             <w:rFonts w:ascii="Times New Roman" w:hAnsi="Times New Roman"/>
@@ -4365,7 +4399,7 @@
           <w:delText>2015</w:delText>
         </w:r>
       </w:del>
-      <w:ins w:id="51" w:author="Martin Vojík" w:date="2024-09-04T12:26:00Z">
+      <w:ins w:id="54" w:author="Martin Vojík" w:date="2024-09-04T12:26:00Z">
         <w:r>
           <w:rPr>
             <w:rFonts w:ascii="Times New Roman" w:hAnsi="Times New Roman"/>
@@ -4374,7 +4408,7 @@
           <w:t>2024</w:t>
         </w:r>
       </w:ins>
-      <w:ins w:id="52" w:author="Martin Vojík" w:date="2024-09-04T12:58:00Z">
+      <w:ins w:id="55" w:author="Martin Vojík" w:date="2024-09-04T12:58:00Z">
         <w:r>
           <w:rPr>
             <w:rFonts w:ascii="Times New Roman" w:hAnsi="Times New Roman"/>
@@ -4567,9 +4601,35 @@
           <w:rFonts w:ascii="Times New Roman" w:hAnsi="Times New Roman"/>
           <w:sz w:val="24"/>
         </w:rPr>
-        <w:t>Hodnocení je doplněno o parametr kalamita/polom, který vyjadřuje budoucí potenciál výskytu mrtvého dřeva na lokalitě: 3 (les po kalamitě</w:t>
-      </w:r>
-      <w:ins w:id="53" w:author="Martin Vojík" w:date="2024-09-04T10:23:00Z">
+        <w:t xml:space="preserve">Hodnocení je doplněno o parametr </w:t>
+      </w:r>
+      <w:r>
+        <w:rPr>
+          <w:rFonts w:ascii="Times New Roman" w:hAnsi="Times New Roman"/>
+          <w:rFonts w:ascii="Times New Roman" w:hAnsi="Times New Roman" w:eastAsia="Calibri" w:cs="" w:cstheme="minorBidi" w:eastAsiaTheme="minorHAnsi"/>
+          <w:b/>
+          <w:bCs/>
+          <w:color w:val="auto"/>
+          <w:sz w:val="24"/>
+          <w:lang w:val="cs-CZ" w:eastAsia="en-US" w:bidi="ar-SA"/>
+          <w:rPrChange w:id="0" w:author="Jakub Rataj" w:date="2026-02-05T12:49:35Z">
+            <w:rPr>
+              <w:sz w:val="24"/>
+              <w:kern w:val="0"/>
+              <w:szCs w:val="22"/>
+            </w:rPr>
+          </w:rPrChange>
+        </w:rPr>
+        <w:t>kalamita/polom</w:t>
+      </w:r>
+      <w:r>
+        <w:rPr>
+          <w:rFonts w:ascii="Times New Roman" w:hAnsi="Times New Roman"/>
+          <w:sz w:val="24"/>
+        </w:rPr>
+        <w:t>, který vyjadřuje budoucí potenciál výskytu mrtvého dřeva na lokalitě: 3 (les po kalamitě</w:t>
+      </w:r>
+      <w:ins w:id="57" w:author="Martin Vojík" w:date="2024-09-04T10:23:00Z">
         <w:r>
           <w:rPr>
             <w:rFonts w:ascii="Times New Roman" w:hAnsi="Times New Roman"/>
@@ -4578,7 +4638,7 @@
           <w:t xml:space="preserve">, </w:t>
         </w:r>
       </w:ins>
-      <w:del w:id="54" w:author="Martin Vojík" w:date="2024-09-04T10:23:00Z">
+      <w:del w:id="58" w:author="Martin Vojík" w:date="2024-09-04T10:23:00Z">
         <w:r>
           <w:rPr>
             <w:rFonts w:ascii="Times New Roman" w:hAnsi="Times New Roman"/>
@@ -4594,7 +4654,7 @@
         </w:rPr>
         <w:t>např. kůrovcová, imisní, les po požáru, apod.</w:t>
       </w:r>
-      <w:del w:id="55" w:author="Martin Vojík" w:date="2024-09-04T10:23:00Z">
+      <w:del w:id="59" w:author="Martin Vojík" w:date="2024-09-04T10:23:00Z">
         <w:r>
           <w:rPr>
             <w:rFonts w:ascii="Times New Roman" w:hAnsi="Times New Roman"/>
@@ -4610,7 +4670,7 @@
         </w:rPr>
         <w:t xml:space="preserve">) = </w:t>
       </w:r>
-      <w:commentRangeStart w:id="15"/>
+      <w:commentRangeStart w:id="17"/>
       <w:r>
         <w:rPr>
           <w:rFonts w:ascii="Times New Roman" w:hAnsi="Times New Roman"/>
@@ -4624,9 +4684,9 @@
           <w:sz w:val="24"/>
         </w:rPr>
       </w:r>
-      <w:commentRangeEnd w:id="15"/>
-      <w:r>
-        <w:commentReference w:id="15"/>
+      <w:commentRangeEnd w:id="17"/>
+      <w:r>
+        <w:commentReference w:id="17"/>
       </w:r>
       <w:r>
         <w:rPr>
@@ -4635,7 +4695,7 @@
         </w:rPr>
         <w:t xml:space="preserve">(polom) = </w:t>
       </w:r>
-      <w:commentRangeStart w:id="16"/>
+      <w:commentRangeStart w:id="18"/>
       <w:r>
         <w:rPr>
           <w:rFonts w:ascii="Times New Roman" w:hAnsi="Times New Roman"/>
@@ -4649,17 +4709,14 @@
           <w:sz w:val="24"/>
         </w:rPr>
       </w:r>
-      <w:ins w:id="56" w:author="Jakub Rataj" w:date="2026-02-04T16:48:13Z">
-        <w:commentRangeEnd w:id="16"/>
+      <w:ins w:id="60" w:author="Jakub Rataj" w:date="2026-02-04T16:48:13Z">
+        <w:commentRangeEnd w:id="18"/>
         <w:r>
-          <w:commentReference w:id="16"/>
+          <w:commentReference w:id="18"/>
         </w:r>
         <w:r>
-          <w:rPr>
-            <w:rFonts w:ascii="Times New Roman" w:hAnsi="Times New Roman"/>
-            <w:sz w:val="24"/>
-          </w:rPr>
-          <w:commentReference w:id="17"/>
+          <w:rPr/>
+          <w:commentReference w:id="19"/>
         </w:r>
       </w:ins>
       <w:r>
@@ -4779,8 +4836,8 @@
           <w:szCs w:val="24"/>
         </w:rPr>
       </w:pPr>
-      <w:commentRangeStart w:id="18"/>
-      <w:commentRangeStart w:id="19"/>
+      <w:commentRangeStart w:id="20"/>
+      <w:commentRangeStart w:id="21"/>
       <w:r>
         <w:rPr>
           <w:rFonts w:ascii="Times New Roman" w:hAnsi="Times New Roman"/>
@@ -4798,13 +4855,13 @@
           <w:szCs w:val="24"/>
         </w:rPr>
       </w:r>
-      <w:commentRangeEnd w:id="19"/>
-      <w:r>
-        <w:commentReference w:id="19"/>
-      </w:r>
-      <w:commentRangeEnd w:id="18"/>
-      <w:r>
-        <w:commentReference w:id="18"/>
+      <w:commentRangeEnd w:id="21"/>
+      <w:r>
+        <w:commentReference w:id="21"/>
+      </w:r>
+      <w:commentRangeEnd w:id="20"/>
+      <w:r>
+        <w:commentReference w:id="20"/>
       </w:r>
       <w:r>
         <w:rPr>
@@ -4859,7 +4916,7 @@
         <w:rPr>
           <w:rFonts w:ascii="Times New Roman" w:hAnsi="Times New Roman"/>
           <w:sz w:val="24"/>
-          <w:ins w:id="57" w:author="Martin Vojík" w:date="2024-09-04T10:27:00Z"/>
+          <w:ins w:id="61" w:author="Martin Vojík" w:date="2024-09-04T10:27:00Z"/>
         </w:rPr>
       </w:pPr>
       <w:r>
@@ -4903,7 +4960,7 @@
           <w:b/>
           <w:b/>
           <w:sz w:val="24"/>
-          <w:del w:id="58" w:author="Martin Vojík" w:date="2024-09-04T10:27:00Z"/>
+          <w:del w:id="62" w:author="Martin Vojík" w:date="2024-09-04T10:27:00Z"/>
         </w:rPr>
       </w:pPr>
       <w:r>
@@ -4930,10 +4987,10 @@
         <w:rPr>
           <w:rFonts w:ascii="Times New Roman" w:hAnsi="Times New Roman"/>
           <w:sz w:val="24"/>
-          <w:ins w:id="60" w:author="Martin Vojík" w:date="2024-09-04T10:27:00Z"/>
+          <w:ins w:id="64" w:author="Martin Vojík" w:date="2024-09-04T10:27:00Z"/>
         </w:rPr>
       </w:pPr>
-      <w:ins w:id="59" w:author="Martin Vojík" w:date="2024-09-04T10:27:00Z">
+      <w:ins w:id="63" w:author="Martin Vojík" w:date="2024-09-04T10:27:00Z">
         <w:r>
           <w:rPr>
             <w:rFonts w:ascii="Times New Roman" w:hAnsi="Times New Roman"/>
@@ -5146,10 +5203,10 @@
           <w:rFonts w:ascii="Times New Roman" w:hAnsi="Times New Roman" w:cs="Times New Roman"/>
           <w:sz w:val="24"/>
           <w:szCs w:val="24"/>
-          <w:del w:id="62" w:author="Martin Vojík" w:date="2024-09-04T13:16:00Z"/>
+          <w:del w:id="66" w:author="Martin Vojík" w:date="2024-09-04T13:16:00Z"/>
         </w:rPr>
       </w:pPr>
-      <w:del w:id="61" w:author="Martin Vojík" w:date="2024-09-04T13:16:00Z">
+      <w:del w:id="65" w:author="Martin Vojík" w:date="2024-09-04T13:16:00Z">
         <w:r>
           <w:rPr>
             <w:rFonts w:cs="Times New Roman" w:ascii="Times New Roman" w:hAnsi="Times New Roman"/>
@@ -5168,7 +5225,7 @@
           <w:rFonts w:ascii="Times New Roman" w:hAnsi="Times New Roman" w:cs="Times New Roman"/>
           <w:sz w:val="24"/>
           <w:szCs w:val="24"/>
-          <w:ins w:id="63" w:author="Martin Vojík" w:date="2024-09-04T13:02:00Z"/>
+          <w:ins w:id="67" w:author="Martin Vojík" w:date="2024-09-04T13:02:00Z"/>
         </w:rPr>
       </w:pPr>
       <w:r>
@@ -5190,7 +5247,7 @@
           <w:szCs w:val="24"/>
         </w:rPr>
       </w:pPr>
-      <w:ins w:id="64" w:author="Martin Vojík" w:date="2024-09-04T13:02:00Z">
+      <w:ins w:id="68" w:author="Martin Vojík" w:date="2024-09-04T13:02:00Z">
         <w:r>
           <w:rPr>
             <w:rFonts w:cs="Times New Roman" w:ascii="Times New Roman" w:hAnsi="Times New Roman"/>
@@ -5200,7 +5257,7 @@
           <w:t>Kučera T., Čížek L., Hofmeister J., Hošek J., Kloubcová P., Kučerová A., Malíček J., Svoboda T. &amp; Zítková I. (2016): Metodika sledování stavu předmětů ochrany evropsky významných lokalit</w:t>
         </w:r>
       </w:ins>
-      <w:ins w:id="65" w:author="Martin Vojík" w:date="2024-09-04T13:04:00Z">
+      <w:ins w:id="69" w:author="Martin Vojík" w:date="2024-09-04T13:04:00Z">
         <w:r>
           <w:rPr>
             <w:rFonts w:cs="Times New Roman" w:ascii="Times New Roman" w:hAnsi="Times New Roman"/>
@@ -5219,10 +5276,10 @@
           <w:rFonts w:ascii="Times New Roman" w:hAnsi="Times New Roman" w:cs="Times New Roman"/>
           <w:sz w:val="24"/>
           <w:szCs w:val="24"/>
-          <w:del w:id="69" w:author="Martin Vojík" w:date="2024-09-04T13:01:00Z"/>
+          <w:del w:id="73" w:author="Martin Vojík" w:date="2024-09-04T13:01:00Z"/>
         </w:rPr>
       </w:pPr>
-      <w:del w:id="66" w:author="Martin Vojík" w:date="2024-09-04T13:01:00Z">
+      <w:del w:id="70" w:author="Martin Vojík" w:date="2024-09-04T13:01:00Z">
         <w:r>
           <w:rPr>
             <w:rFonts w:cs="Times New Roman" w:ascii="Times New Roman" w:hAnsi="Times New Roman"/>
@@ -5232,7 +5289,7 @@
           <w:delText>Lustyk P. [ed.] (20</w:delText>
         </w:r>
       </w:del>
-      <w:del w:id="67" w:author="Martin Vojík" w:date="2024-09-04T12:30:00Z">
+      <w:del w:id="71" w:author="Martin Vojík" w:date="2024-09-04T12:30:00Z">
         <w:r>
           <w:rPr>
             <w:rFonts w:cs="Times New Roman" w:ascii="Times New Roman" w:hAnsi="Times New Roman"/>
@@ -5242,7 +5299,7 @@
           <w:delText>15</w:delText>
         </w:r>
       </w:del>
-      <w:del w:id="68" w:author="Martin Vojík" w:date="2024-09-04T13:01:00Z">
+      <w:del w:id="72" w:author="Martin Vojík" w:date="2024-09-04T13:01:00Z">
         <w:r>
           <w:rPr>
             <w:rFonts w:cs="Times New Roman" w:ascii="Times New Roman" w:hAnsi="Times New Roman"/>
@@ -5271,7 +5328,7 @@
         </w:rPr>
         <w:t>Lustyk P. (202</w:t>
       </w:r>
-      <w:ins w:id="70" w:author="Martin Vojík" w:date="2024-09-04T12:30:00Z">
+      <w:ins w:id="74" w:author="Martin Vojík" w:date="2024-09-04T12:30:00Z">
         <w:r>
           <w:rPr>
             <w:rFonts w:cs="Times New Roman" w:ascii="Times New Roman" w:hAnsi="Times New Roman"/>
@@ -5281,7 +5338,7 @@
           <w:t>4</w:t>
         </w:r>
       </w:ins>
-      <w:ins w:id="71" w:author="Martin Vojík" w:date="2024-09-04T13:01:00Z">
+      <w:ins w:id="75" w:author="Martin Vojík" w:date="2024-09-04T13:01:00Z">
         <w:r>
           <w:rPr>
             <w:rFonts w:cs="Times New Roman" w:ascii="Times New Roman" w:hAnsi="Times New Roman"/>
@@ -5291,7 +5348,7 @@
           <w:t>a</w:t>
         </w:r>
       </w:ins>
-      <w:del w:id="72" w:author="Martin Vojík" w:date="2024-09-04T12:30:00Z">
+      <w:del w:id="76" w:author="Martin Vojík" w:date="2024-09-04T12:30:00Z">
         <w:r>
           <w:rPr>
             <w:rFonts w:cs="Times New Roman" w:ascii="Times New Roman" w:hAnsi="Times New Roman"/>
@@ -5318,10 +5375,10 @@
           <w:rFonts w:ascii="Times New Roman" w:hAnsi="Times New Roman" w:cs="Times New Roman"/>
           <w:sz w:val="24"/>
           <w:szCs w:val="24"/>
-          <w:ins w:id="74" w:author="Martin Vojík" w:date="2024-09-04T13:01:00Z"/>
+          <w:ins w:id="78" w:author="Martin Vojík" w:date="2024-09-04T13:01:00Z"/>
         </w:rPr>
       </w:pPr>
-      <w:ins w:id="73" w:author="Martin Vojík" w:date="2024-09-04T13:01:00Z">
+      <w:ins w:id="77" w:author="Martin Vojík" w:date="2024-09-04T13:01:00Z">
         <w:r>
           <w:rPr>
             <w:rFonts w:cs="Times New Roman" w:ascii="Times New Roman" w:hAnsi="Times New Roman"/>
@@ -5340,7 +5397,7 @@
           <w:sz w:val="24"/>
         </w:rPr>
       </w:pPr>
-      <w:del w:id="75" w:author="Martin Vojík" w:date="2024-09-04T13:23:00Z">
+      <w:del w:id="79" w:author="Martin Vojík" w:date="2024-09-04T13:23:00Z">
         <w:r>
           <w:rPr>
             <w:rFonts w:ascii="Times New Roman" w:hAnsi="Times New Roman"/>
@@ -5349,7 +5406,7 @@
           <w:delText>Mehtälä J. &amp; Vuorisalo T. (2007): Conservation policy and the EU Habitats directive: favourable conservation status as a measure of conservation success. – European Environment 17: 363–375.</w:delText>
         </w:r>
       </w:del>
-      <w:ins w:id="76" w:author="Martin Vojík" w:date="2024-09-04T13:21:00Z">
+      <w:ins w:id="80" w:author="Martin Vojík" w:date="2024-09-04T13:21:00Z">
         <w:r>
           <w:rPr>
             <w:rFonts w:ascii="Times New Roman" w:hAnsi="Times New Roman"/>
@@ -5448,10 +5505,10 @@
         <w:rPr>
           <w:rFonts w:ascii="Times New Roman" w:hAnsi="Times New Roman"/>
           <w:sz w:val="24"/>
-          <w:del w:id="78" w:author="Martin Vojík" w:date="2024-09-04T13:05:00Z"/>
+          <w:del w:id="82" w:author="Martin Vojík" w:date="2024-09-04T13:05:00Z"/>
         </w:rPr>
       </w:pPr>
-      <w:del w:id="77" w:author="Martin Vojík" w:date="2024-09-04T13:05:00Z">
+      <w:del w:id="81" w:author="Martin Vojík" w:date="2024-09-04T13:05:00Z">
         <w:r>
           <w:rPr>
             <w:rFonts w:ascii="Times New Roman" w:hAnsi="Times New Roman"/>
@@ -5673,13 +5730,13 @@
         <w:rPr/>
         <w:t xml:space="preserve"> - Kombinované expertní stanovení hodnoty minimiareálu a stupně ohrožení stanoviště aktualizovaného podle ohrožení vegetace a stavu v okolních zemích EU a s ohledem na plochu výskytu. Stupeň ohrožení v závorce představuje odlišný odhad stavu před deseti lety (Červená kniha biotopů, Kučera 2005). Stupně: CR - kriticky ohrožený, EN - ohrožený, VU - zranitelný, NT - téměř ohrožený, LC - málo dotčený</w:t>
       </w:r>
-      <w:ins w:id="79" w:author="Martin Vojík" w:date="2024-09-04T13:05:00Z">
+      <w:ins w:id="83" w:author="Martin Vojík" w:date="2024-09-04T13:05:00Z">
         <w:r>
           <w:rPr/>
           <w:t xml:space="preserve"> (přejato z práce Kučera a kol. 2016).</w:t>
         </w:r>
       </w:ins>
-      <w:del w:id="80" w:author="Martin Vojík" w:date="2024-09-04T13:05:00Z">
+      <w:del w:id="84" w:author="Martin Vojík" w:date="2024-09-04T13:05:00Z">
         <w:r>
           <w:rPr/>
           <w:delText>.</w:delText>
@@ -5706,8 +5763,8 @@
         <w:gridCol w:w="875"/>
         <w:gridCol w:w="2016"/>
         <w:gridCol w:w="853"/>
-        <w:gridCol w:w="876"/>
-        <w:gridCol w:w="636"/>
+        <w:gridCol w:w="877"/>
+        <w:gridCol w:w="635"/>
         <w:gridCol w:w="604"/>
         <w:gridCol w:w="976"/>
       </w:tblGrid>
@@ -5926,7 +5983,7 @@
         </w:tc>
         <w:tc>
           <w:tcPr>
-            <w:tcW w:w="876" w:type="dxa"/>
+            <w:tcW w:w="877" w:type="dxa"/>
             <w:tcBorders>
               <w:top w:val="single" w:sz="8" w:space="0" w:color="000000"/>
               <w:bottom w:val="single" w:sz="8" w:space="0" w:color="000000"/>
@@ -5966,7 +6023,7 @@
         </w:tc>
         <w:tc>
           <w:tcPr>
-            <w:tcW w:w="636" w:type="dxa"/>
+            <w:tcW w:w="635" w:type="dxa"/>
             <w:tcBorders>
               <w:top w:val="single" w:sz="8" w:space="0" w:color="000000"/>
               <w:left w:val="single" w:sz="4" w:space="0" w:color="000000"/>
@@ -6276,7 +6333,7 @@
         </w:tc>
         <w:tc>
           <w:tcPr>
-            <w:tcW w:w="876" w:type="dxa"/>
+            <w:tcW w:w="877" w:type="dxa"/>
             <w:tcBorders>
               <w:bottom w:val="single" w:sz="4" w:space="0" w:color="000000"/>
               <w:right w:val="single" w:sz="4" w:space="0" w:color="000000"/>
@@ -6311,7 +6368,7 @@
         </w:tc>
         <w:tc>
           <w:tcPr>
-            <w:tcW w:w="636" w:type="dxa"/>
+            <w:tcW w:w="635" w:type="dxa"/>
             <w:tcBorders>
               <w:bottom w:val="single" w:sz="4" w:space="0" w:color="000000"/>
               <w:right w:val="single" w:sz="4" w:space="0" w:color="000000"/>
@@ -6643,7 +6700,7 @@
         </w:tc>
         <w:tc>
           <w:tcPr>
-            <w:tcW w:w="876" w:type="dxa"/>
+            <w:tcW w:w="877" w:type="dxa"/>
             <w:tcBorders>
               <w:bottom w:val="single" w:sz="4" w:space="0" w:color="000000"/>
               <w:right w:val="single" w:sz="4" w:space="0" w:color="000000"/>
@@ -6678,7 +6735,7 @@
         </w:tc>
         <w:tc>
           <w:tcPr>
-            <w:tcW w:w="636" w:type="dxa"/>
+            <w:tcW w:w="635" w:type="dxa"/>
             <w:vMerge w:val="restart"/>
             <w:tcBorders>
               <w:left w:val="single" w:sz="4" w:space="0" w:color="000000"/>
@@ -6986,7 +7043,7 @@
         </w:tc>
         <w:tc>
           <w:tcPr>
-            <w:tcW w:w="876" w:type="dxa"/>
+            <w:tcW w:w="877" w:type="dxa"/>
             <w:tcBorders>
               <w:bottom w:val="single" w:sz="4" w:space="0" w:color="000000"/>
               <w:right w:val="single" w:sz="4" w:space="0" w:color="000000"/>
@@ -7018,7 +7075,7 @@
         </w:tc>
         <w:tc>
           <w:tcPr>
-            <w:tcW w:w="636" w:type="dxa"/>
+            <w:tcW w:w="635" w:type="dxa"/>
             <w:vMerge w:val="continue"/>
             <w:tcBorders>
               <w:left w:val="single" w:sz="4" w:space="0" w:color="000000"/>
@@ -7300,7 +7357,7 @@
         </w:tc>
         <w:tc>
           <w:tcPr>
-            <w:tcW w:w="876" w:type="dxa"/>
+            <w:tcW w:w="877" w:type="dxa"/>
             <w:tcBorders>
               <w:bottom w:val="single" w:sz="4" w:space="0" w:color="000000"/>
               <w:right w:val="single" w:sz="4" w:space="0" w:color="000000"/>
@@ -7332,7 +7389,7 @@
         </w:tc>
         <w:tc>
           <w:tcPr>
-            <w:tcW w:w="636" w:type="dxa"/>
+            <w:tcW w:w="635" w:type="dxa"/>
             <w:vMerge w:val="continue"/>
             <w:tcBorders>
               <w:left w:val="single" w:sz="4" w:space="0" w:color="000000"/>
@@ -7651,7 +7708,7 @@
         </w:tc>
         <w:tc>
           <w:tcPr>
-            <w:tcW w:w="876" w:type="dxa"/>
+            <w:tcW w:w="877" w:type="dxa"/>
             <w:tcBorders>
               <w:bottom w:val="single" w:sz="4" w:space="0" w:color="000000"/>
               <w:right w:val="single" w:sz="4" w:space="0" w:color="000000"/>
@@ -7683,7 +7740,7 @@
         </w:tc>
         <w:tc>
           <w:tcPr>
-            <w:tcW w:w="636" w:type="dxa"/>
+            <w:tcW w:w="635" w:type="dxa"/>
             <w:vMerge w:val="restart"/>
             <w:tcBorders>
               <w:left w:val="single" w:sz="4" w:space="0" w:color="000000"/>
@@ -7967,7 +8024,7 @@
         </w:tc>
         <w:tc>
           <w:tcPr>
-            <w:tcW w:w="876" w:type="dxa"/>
+            <w:tcW w:w="877" w:type="dxa"/>
             <w:tcBorders>
               <w:bottom w:val="single" w:sz="4" w:space="0" w:color="000000"/>
               <w:right w:val="single" w:sz="4" w:space="0" w:color="000000"/>
@@ -8002,7 +8059,7 @@
         </w:tc>
         <w:tc>
           <w:tcPr>
-            <w:tcW w:w="636" w:type="dxa"/>
+            <w:tcW w:w="635" w:type="dxa"/>
             <w:vMerge w:val="continue"/>
             <w:tcBorders>
               <w:left w:val="single" w:sz="4" w:space="0" w:color="000000"/>
@@ -8285,7 +8342,7 @@
         </w:tc>
         <w:tc>
           <w:tcPr>
-            <w:tcW w:w="876" w:type="dxa"/>
+            <w:tcW w:w="877" w:type="dxa"/>
             <w:tcBorders>
               <w:bottom w:val="single" w:sz="4" w:space="0" w:color="000000"/>
               <w:right w:val="single" w:sz="4" w:space="0" w:color="000000"/>
@@ -8317,7 +8374,7 @@
         </w:tc>
         <w:tc>
           <w:tcPr>
-            <w:tcW w:w="636" w:type="dxa"/>
+            <w:tcW w:w="635" w:type="dxa"/>
             <w:vMerge w:val="continue"/>
             <w:tcBorders>
               <w:left w:val="single" w:sz="4" w:space="0" w:color="000000"/>
@@ -8595,7 +8652,7 @@
         </w:tc>
         <w:tc>
           <w:tcPr>
-            <w:tcW w:w="876" w:type="dxa"/>
+            <w:tcW w:w="877" w:type="dxa"/>
             <w:tcBorders>
               <w:bottom w:val="single" w:sz="4" w:space="0" w:color="000000"/>
               <w:right w:val="single" w:sz="4" w:space="0" w:color="000000"/>
@@ -8627,7 +8684,7 @@
         </w:tc>
         <w:tc>
           <w:tcPr>
-            <w:tcW w:w="636" w:type="dxa"/>
+            <w:tcW w:w="635" w:type="dxa"/>
             <w:vMerge w:val="continue"/>
             <w:tcBorders>
               <w:left w:val="single" w:sz="4" w:space="0" w:color="000000"/>
@@ -8925,7 +8982,7 @@
         </w:tc>
         <w:tc>
           <w:tcPr>
-            <w:tcW w:w="876" w:type="dxa"/>
+            <w:tcW w:w="877" w:type="dxa"/>
             <w:tcBorders>
               <w:bottom w:val="single" w:sz="4" w:space="0" w:color="000000"/>
               <w:right w:val="single" w:sz="4" w:space="0" w:color="000000"/>
@@ -8960,7 +9017,7 @@
         </w:tc>
         <w:tc>
           <w:tcPr>
-            <w:tcW w:w="636" w:type="dxa"/>
+            <w:tcW w:w="635" w:type="dxa"/>
             <w:vMerge w:val="continue"/>
             <w:tcBorders>
               <w:left w:val="single" w:sz="4" w:space="0" w:color="000000"/>
@@ -9240,7 +9297,7 @@
         </w:tc>
         <w:tc>
           <w:tcPr>
-            <w:tcW w:w="876" w:type="dxa"/>
+            <w:tcW w:w="877" w:type="dxa"/>
             <w:tcBorders>
               <w:bottom w:val="single" w:sz="4" w:space="0" w:color="000000"/>
               <w:right w:val="single" w:sz="4" w:space="0" w:color="000000"/>
@@ -9272,7 +9329,7 @@
         </w:tc>
         <w:tc>
           <w:tcPr>
-            <w:tcW w:w="636" w:type="dxa"/>
+            <w:tcW w:w="635" w:type="dxa"/>
             <w:tcBorders>
               <w:bottom w:val="single" w:sz="4" w:space="0" w:color="000000"/>
               <w:right w:val="single" w:sz="4" w:space="0" w:color="000000"/>
@@ -9615,7 +9672,7 @@
         </w:tc>
         <w:tc>
           <w:tcPr>
-            <w:tcW w:w="876" w:type="dxa"/>
+            <w:tcW w:w="877" w:type="dxa"/>
             <w:tcBorders>
               <w:bottom w:val="single" w:sz="4" w:space="0" w:color="000000"/>
               <w:right w:val="single" w:sz="4" w:space="0" w:color="000000"/>
@@ -9647,7 +9704,7 @@
         </w:tc>
         <w:tc>
           <w:tcPr>
-            <w:tcW w:w="636" w:type="dxa"/>
+            <w:tcW w:w="635" w:type="dxa"/>
             <w:vMerge w:val="restart"/>
             <w:tcBorders>
               <w:left w:val="single" w:sz="4" w:space="0" w:color="000000"/>
@@ -9955,7 +10012,7 @@
         </w:tc>
         <w:tc>
           <w:tcPr>
-            <w:tcW w:w="876" w:type="dxa"/>
+            <w:tcW w:w="877" w:type="dxa"/>
             <w:tcBorders>
               <w:bottom w:val="single" w:sz="4" w:space="0" w:color="000000"/>
               <w:right w:val="single" w:sz="4" w:space="0" w:color="000000"/>
@@ -9987,7 +10044,7 @@
         </w:tc>
         <w:tc>
           <w:tcPr>
-            <w:tcW w:w="636" w:type="dxa"/>
+            <w:tcW w:w="635" w:type="dxa"/>
             <w:vMerge w:val="continue"/>
             <w:tcBorders>
               <w:left w:val="single" w:sz="4" w:space="0" w:color="000000"/>
@@ -10309,7 +10366,7 @@
         </w:tc>
         <w:tc>
           <w:tcPr>
-            <w:tcW w:w="876" w:type="dxa"/>
+            <w:tcW w:w="877" w:type="dxa"/>
             <w:tcBorders>
               <w:bottom w:val="single" w:sz="4" w:space="0" w:color="000000"/>
               <w:right w:val="single" w:sz="4" w:space="0" w:color="000000"/>
@@ -10341,7 +10398,7 @@
         </w:tc>
         <w:tc>
           <w:tcPr>
-            <w:tcW w:w="636" w:type="dxa"/>
+            <w:tcW w:w="635" w:type="dxa"/>
             <w:vMerge w:val="continue"/>
             <w:tcBorders>
               <w:left w:val="single" w:sz="4" w:space="0" w:color="000000"/>
@@ -10643,7 +10700,7 @@
         </w:tc>
         <w:tc>
           <w:tcPr>
-            <w:tcW w:w="876" w:type="dxa"/>
+            <w:tcW w:w="877" w:type="dxa"/>
             <w:tcBorders>
               <w:bottom w:val="single" w:sz="4" w:space="0" w:color="000000"/>
               <w:right w:val="single" w:sz="4" w:space="0" w:color="000000"/>
@@ -10675,7 +10732,7 @@
         </w:tc>
         <w:tc>
           <w:tcPr>
-            <w:tcW w:w="636" w:type="dxa"/>
+            <w:tcW w:w="635" w:type="dxa"/>
             <w:vMerge w:val="continue"/>
             <w:tcBorders>
               <w:left w:val="single" w:sz="4" w:space="0" w:color="000000"/>
@@ -10977,7 +11034,7 @@
         </w:tc>
         <w:tc>
           <w:tcPr>
-            <w:tcW w:w="876" w:type="dxa"/>
+            <w:tcW w:w="877" w:type="dxa"/>
             <w:tcBorders>
               <w:bottom w:val="single" w:sz="4" w:space="0" w:color="000000"/>
               <w:right w:val="single" w:sz="4" w:space="0" w:color="000000"/>
@@ -11009,7 +11066,7 @@
         </w:tc>
         <w:tc>
           <w:tcPr>
-            <w:tcW w:w="636" w:type="dxa"/>
+            <w:tcW w:w="635" w:type="dxa"/>
             <w:vMerge w:val="continue"/>
             <w:tcBorders>
               <w:left w:val="single" w:sz="4" w:space="0" w:color="000000"/>
@@ -11291,7 +11348,7 @@
         </w:tc>
         <w:tc>
           <w:tcPr>
-            <w:tcW w:w="876" w:type="dxa"/>
+            <w:tcW w:w="877" w:type="dxa"/>
             <w:tcBorders>
               <w:bottom w:val="single" w:sz="4" w:space="0" w:color="000000"/>
               <w:right w:val="single" w:sz="4" w:space="0" w:color="000000"/>
@@ -11323,7 +11380,7 @@
         </w:tc>
         <w:tc>
           <w:tcPr>
-            <w:tcW w:w="636" w:type="dxa"/>
+            <w:tcW w:w="635" w:type="dxa"/>
             <w:vMerge w:val="continue"/>
             <w:tcBorders>
               <w:left w:val="single" w:sz="4" w:space="0" w:color="000000"/>
@@ -11608,7 +11665,7 @@
         </w:tc>
         <w:tc>
           <w:tcPr>
-            <w:tcW w:w="876" w:type="dxa"/>
+            <w:tcW w:w="877" w:type="dxa"/>
             <w:tcBorders>
               <w:bottom w:val="single" w:sz="4" w:space="0" w:color="000000"/>
               <w:right w:val="single" w:sz="4" w:space="0" w:color="000000"/>
@@ -11640,7 +11697,7 @@
         </w:tc>
         <w:tc>
           <w:tcPr>
-            <w:tcW w:w="636" w:type="dxa"/>
+            <w:tcW w:w="635" w:type="dxa"/>
             <w:tcBorders>
               <w:bottom w:val="single" w:sz="4" w:space="0" w:color="000000"/>
               <w:right w:val="single" w:sz="4" w:space="0" w:color="000000"/>
@@ -11947,7 +12004,7 @@
         </w:tc>
         <w:tc>
           <w:tcPr>
-            <w:tcW w:w="876" w:type="dxa"/>
+            <w:tcW w:w="877" w:type="dxa"/>
             <w:tcBorders>
               <w:bottom w:val="single" w:sz="4" w:space="0" w:color="000000"/>
               <w:right w:val="single" w:sz="4" w:space="0" w:color="000000"/>
@@ -11979,7 +12036,7 @@
         </w:tc>
         <w:tc>
           <w:tcPr>
-            <w:tcW w:w="636" w:type="dxa"/>
+            <w:tcW w:w="635" w:type="dxa"/>
             <w:tcBorders>
               <w:bottom w:val="single" w:sz="4" w:space="0" w:color="000000"/>
               <w:right w:val="single" w:sz="4" w:space="0" w:color="000000"/>
@@ -12301,7 +12358,7 @@
         </w:tc>
         <w:tc>
           <w:tcPr>
-            <w:tcW w:w="876" w:type="dxa"/>
+            <w:tcW w:w="877" w:type="dxa"/>
             <w:tcBorders>
               <w:bottom w:val="single" w:sz="4" w:space="0" w:color="000000"/>
               <w:right w:val="single" w:sz="4" w:space="0" w:color="000000"/>
@@ -12336,7 +12393,7 @@
         </w:tc>
         <w:tc>
           <w:tcPr>
-            <w:tcW w:w="636" w:type="dxa"/>
+            <w:tcW w:w="635" w:type="dxa"/>
             <w:tcBorders>
               <w:bottom w:val="single" w:sz="4" w:space="0" w:color="000000"/>
               <w:right w:val="single" w:sz="4" w:space="0" w:color="000000"/>
@@ -12643,7 +12700,7 @@
         </w:tc>
         <w:tc>
           <w:tcPr>
-            <w:tcW w:w="876" w:type="dxa"/>
+            <w:tcW w:w="877" w:type="dxa"/>
             <w:tcBorders>
               <w:bottom w:val="single" w:sz="4" w:space="0" w:color="000000"/>
               <w:right w:val="single" w:sz="4" w:space="0" w:color="000000"/>
@@ -12675,7 +12732,7 @@
         </w:tc>
         <w:tc>
           <w:tcPr>
-            <w:tcW w:w="636" w:type="dxa"/>
+            <w:tcW w:w="635" w:type="dxa"/>
             <w:tcBorders>
               <w:bottom w:val="single" w:sz="4" w:space="0" w:color="000000"/>
               <w:right w:val="single" w:sz="4" w:space="0" w:color="000000"/>
@@ -13002,7 +13059,7 @@
         </w:tc>
         <w:tc>
           <w:tcPr>
-            <w:tcW w:w="876" w:type="dxa"/>
+            <w:tcW w:w="877" w:type="dxa"/>
             <w:tcBorders>
               <w:bottom w:val="single" w:sz="4" w:space="0" w:color="000000"/>
               <w:right w:val="single" w:sz="4" w:space="0" w:color="000000"/>
@@ -13034,7 +13091,7 @@
         </w:tc>
         <w:tc>
           <w:tcPr>
-            <w:tcW w:w="636" w:type="dxa"/>
+            <w:tcW w:w="635" w:type="dxa"/>
             <w:tcBorders>
               <w:bottom w:val="single" w:sz="4" w:space="0" w:color="000000"/>
               <w:right w:val="single" w:sz="4" w:space="0" w:color="000000"/>
@@ -13361,7 +13418,7 @@
         </w:tc>
         <w:tc>
           <w:tcPr>
-            <w:tcW w:w="876" w:type="dxa"/>
+            <w:tcW w:w="877" w:type="dxa"/>
             <w:tcBorders>
               <w:bottom w:val="single" w:sz="4" w:space="0" w:color="000000"/>
               <w:right w:val="single" w:sz="4" w:space="0" w:color="000000"/>
@@ -13393,7 +13450,7 @@
         </w:tc>
         <w:tc>
           <w:tcPr>
-            <w:tcW w:w="636" w:type="dxa"/>
+            <w:tcW w:w="635" w:type="dxa"/>
             <w:tcBorders>
               <w:bottom w:val="single" w:sz="4" w:space="0" w:color="000000"/>
               <w:right w:val="single" w:sz="4" w:space="0" w:color="000000"/>
@@ -13700,7 +13757,7 @@
         </w:tc>
         <w:tc>
           <w:tcPr>
-            <w:tcW w:w="876" w:type="dxa"/>
+            <w:tcW w:w="877" w:type="dxa"/>
             <w:tcBorders>
               <w:bottom w:val="single" w:sz="4" w:space="0" w:color="000000"/>
               <w:right w:val="single" w:sz="4" w:space="0" w:color="000000"/>
@@ -13732,7 +13789,7 @@
         </w:tc>
         <w:tc>
           <w:tcPr>
-            <w:tcW w:w="636" w:type="dxa"/>
+            <w:tcW w:w="635" w:type="dxa"/>
             <w:vMerge w:val="restart"/>
             <w:tcBorders>
               <w:left w:val="single" w:sz="4" w:space="0" w:color="000000"/>
@@ -14035,7 +14092,7 @@
         </w:tc>
         <w:tc>
           <w:tcPr>
-            <w:tcW w:w="876" w:type="dxa"/>
+            <w:tcW w:w="877" w:type="dxa"/>
             <w:tcBorders>
               <w:bottom w:val="single" w:sz="4" w:space="0" w:color="000000"/>
               <w:right w:val="single" w:sz="4" w:space="0" w:color="000000"/>
@@ -14067,7 +14124,7 @@
         </w:tc>
         <w:tc>
           <w:tcPr>
-            <w:tcW w:w="636" w:type="dxa"/>
+            <w:tcW w:w="635" w:type="dxa"/>
             <w:vMerge w:val="continue"/>
             <w:tcBorders>
               <w:left w:val="single" w:sz="4" w:space="0" w:color="000000"/>
@@ -14344,7 +14401,7 @@
         </w:tc>
         <w:tc>
           <w:tcPr>
-            <w:tcW w:w="876" w:type="dxa"/>
+            <w:tcW w:w="877" w:type="dxa"/>
             <w:tcBorders>
               <w:bottom w:val="single" w:sz="4" w:space="0" w:color="000000"/>
               <w:right w:val="single" w:sz="4" w:space="0" w:color="000000"/>
@@ -14376,7 +14433,7 @@
         </w:tc>
         <w:tc>
           <w:tcPr>
-            <w:tcW w:w="636" w:type="dxa"/>
+            <w:tcW w:w="635" w:type="dxa"/>
             <w:vMerge w:val="continue"/>
             <w:tcBorders>
               <w:left w:val="single" w:sz="4" w:space="0" w:color="000000"/>
@@ -14661,7 +14718,7 @@
         </w:tc>
         <w:tc>
           <w:tcPr>
-            <w:tcW w:w="876" w:type="dxa"/>
+            <w:tcW w:w="877" w:type="dxa"/>
             <w:tcBorders>
               <w:bottom w:val="single" w:sz="4" w:space="0" w:color="000000"/>
               <w:right w:val="single" w:sz="4" w:space="0" w:color="000000"/>
@@ -14693,7 +14750,7 @@
         </w:tc>
         <w:tc>
           <w:tcPr>
-            <w:tcW w:w="636" w:type="dxa"/>
+            <w:tcW w:w="635" w:type="dxa"/>
             <w:vMerge w:val="restart"/>
             <w:tcBorders>
               <w:left w:val="single" w:sz="4" w:space="0" w:color="000000"/>
@@ -14976,7 +15033,7 @@
         </w:tc>
         <w:tc>
           <w:tcPr>
-            <w:tcW w:w="876" w:type="dxa"/>
+            <w:tcW w:w="877" w:type="dxa"/>
             <w:tcBorders>
               <w:bottom w:val="single" w:sz="4" w:space="0" w:color="000000"/>
               <w:right w:val="single" w:sz="4" w:space="0" w:color="000000"/>
@@ -15008,7 +15065,7 @@
         </w:tc>
         <w:tc>
           <w:tcPr>
-            <w:tcW w:w="636" w:type="dxa"/>
+            <w:tcW w:w="635" w:type="dxa"/>
             <w:vMerge w:val="continue"/>
             <w:tcBorders>
               <w:left w:val="single" w:sz="4" w:space="0" w:color="000000"/>
@@ -15353,7 +15410,7 @@
         </w:tc>
         <w:tc>
           <w:tcPr>
-            <w:tcW w:w="876" w:type="dxa"/>
+            <w:tcW w:w="877" w:type="dxa"/>
             <w:tcBorders>
               <w:bottom w:val="single" w:sz="4" w:space="0" w:color="000000"/>
               <w:right w:val="single" w:sz="4" w:space="0" w:color="000000"/>
@@ -15385,7 +15442,7 @@
         </w:tc>
         <w:tc>
           <w:tcPr>
-            <w:tcW w:w="636" w:type="dxa"/>
+            <w:tcW w:w="635" w:type="dxa"/>
             <w:tcBorders>
               <w:bottom w:val="single" w:sz="4" w:space="0" w:color="000000"/>
               <w:right w:val="single" w:sz="4" w:space="0" w:color="000000"/>
@@ -15697,7 +15754,7 @@
         </w:tc>
         <w:tc>
           <w:tcPr>
-            <w:tcW w:w="876" w:type="dxa"/>
+            <w:tcW w:w="877" w:type="dxa"/>
             <w:tcBorders>
               <w:bottom w:val="single" w:sz="4" w:space="0" w:color="000000"/>
               <w:right w:val="single" w:sz="4" w:space="0" w:color="000000"/>
@@ -15732,7 +15789,7 @@
         </w:tc>
         <w:tc>
           <w:tcPr>
-            <w:tcW w:w="636" w:type="dxa"/>
+            <w:tcW w:w="635" w:type="dxa"/>
             <w:vMerge w:val="restart"/>
             <w:tcBorders>
               <w:left w:val="single" w:sz="4" w:space="0" w:color="000000"/>
@@ -16020,7 +16077,7 @@
         </w:tc>
         <w:tc>
           <w:tcPr>
-            <w:tcW w:w="876" w:type="dxa"/>
+            <w:tcW w:w="877" w:type="dxa"/>
             <w:tcBorders>
               <w:bottom w:val="single" w:sz="4" w:space="0" w:color="000000"/>
               <w:right w:val="single" w:sz="4" w:space="0" w:color="000000"/>
@@ -16052,7 +16109,7 @@
         </w:tc>
         <w:tc>
           <w:tcPr>
-            <w:tcW w:w="636" w:type="dxa"/>
+            <w:tcW w:w="635" w:type="dxa"/>
             <w:vMerge w:val="continue"/>
             <w:tcBorders>
               <w:left w:val="single" w:sz="4" w:space="0" w:color="000000"/>
@@ -16353,7 +16410,7 @@
         </w:tc>
         <w:tc>
           <w:tcPr>
-            <w:tcW w:w="876" w:type="dxa"/>
+            <w:tcW w:w="877" w:type="dxa"/>
             <w:tcBorders>
               <w:bottom w:val="single" w:sz="4" w:space="0" w:color="000000"/>
               <w:right w:val="single" w:sz="4" w:space="0" w:color="000000"/>
@@ -16385,7 +16442,7 @@
         </w:tc>
         <w:tc>
           <w:tcPr>
-            <w:tcW w:w="636" w:type="dxa"/>
+            <w:tcW w:w="635" w:type="dxa"/>
             <w:vMerge w:val="restart"/>
             <w:tcBorders>
               <w:left w:val="single" w:sz="4" w:space="0" w:color="000000"/>
@@ -16693,7 +16750,7 @@
         </w:tc>
         <w:tc>
           <w:tcPr>
-            <w:tcW w:w="876" w:type="dxa"/>
+            <w:tcW w:w="877" w:type="dxa"/>
             <w:tcBorders>
               <w:bottom w:val="single" w:sz="4" w:space="0" w:color="000000"/>
               <w:right w:val="single" w:sz="4" w:space="0" w:color="000000"/>
@@ -16728,7 +16785,7 @@
         </w:tc>
         <w:tc>
           <w:tcPr>
-            <w:tcW w:w="636" w:type="dxa"/>
+            <w:tcW w:w="635" w:type="dxa"/>
             <w:vMerge w:val="continue"/>
             <w:tcBorders>
               <w:left w:val="single" w:sz="4" w:space="0" w:color="000000"/>
@@ -17058,7 +17115,7 @@
         </w:tc>
         <w:tc>
           <w:tcPr>
-            <w:tcW w:w="876" w:type="dxa"/>
+            <w:tcW w:w="877" w:type="dxa"/>
             <w:tcBorders>
               <w:bottom w:val="single" w:sz="4" w:space="0" w:color="000000"/>
               <w:right w:val="single" w:sz="4" w:space="0" w:color="000000"/>
@@ -17090,7 +17147,7 @@
         </w:tc>
         <w:tc>
           <w:tcPr>
-            <w:tcW w:w="636" w:type="dxa"/>
+            <w:tcW w:w="635" w:type="dxa"/>
             <w:vMerge w:val="restart"/>
             <w:tcBorders>
               <w:left w:val="single" w:sz="4" w:space="0" w:color="000000"/>
@@ -17398,7 +17455,7 @@
         </w:tc>
         <w:tc>
           <w:tcPr>
-            <w:tcW w:w="876" w:type="dxa"/>
+            <w:tcW w:w="877" w:type="dxa"/>
             <w:tcBorders>
               <w:bottom w:val="single" w:sz="4" w:space="0" w:color="000000"/>
               <w:right w:val="single" w:sz="4" w:space="0" w:color="000000"/>
@@ -17430,7 +17487,7 @@
         </w:tc>
         <w:tc>
           <w:tcPr>
-            <w:tcW w:w="636" w:type="dxa"/>
+            <w:tcW w:w="635" w:type="dxa"/>
             <w:vMerge w:val="continue"/>
             <w:tcBorders>
               <w:left w:val="single" w:sz="4" w:space="0" w:color="000000"/>
@@ -17732,7 +17789,7 @@
         </w:tc>
         <w:tc>
           <w:tcPr>
-            <w:tcW w:w="876" w:type="dxa"/>
+            <w:tcW w:w="877" w:type="dxa"/>
             <w:tcBorders>
               <w:bottom w:val="single" w:sz="4" w:space="0" w:color="000000"/>
               <w:right w:val="single" w:sz="4" w:space="0" w:color="000000"/>
@@ -17764,7 +17821,7 @@
         </w:tc>
         <w:tc>
           <w:tcPr>
-            <w:tcW w:w="636" w:type="dxa"/>
+            <w:tcW w:w="635" w:type="dxa"/>
             <w:vMerge w:val="continue"/>
             <w:tcBorders>
               <w:left w:val="single" w:sz="4" w:space="0" w:color="000000"/>
@@ -18094,7 +18151,7 @@
         </w:tc>
         <w:tc>
           <w:tcPr>
-            <w:tcW w:w="876" w:type="dxa"/>
+            <w:tcW w:w="877" w:type="dxa"/>
             <w:tcBorders>
               <w:bottom w:val="single" w:sz="4" w:space="0" w:color="000000"/>
               <w:right w:val="single" w:sz="4" w:space="0" w:color="000000"/>
@@ -18126,7 +18183,7 @@
         </w:tc>
         <w:tc>
           <w:tcPr>
-            <w:tcW w:w="636" w:type="dxa"/>
+            <w:tcW w:w="635" w:type="dxa"/>
             <w:vMerge w:val="restart"/>
             <w:tcBorders>
               <w:left w:val="single" w:sz="4" w:space="0" w:color="000000"/>
@@ -18434,7 +18491,7 @@
         </w:tc>
         <w:tc>
           <w:tcPr>
-            <w:tcW w:w="876" w:type="dxa"/>
+            <w:tcW w:w="877" w:type="dxa"/>
             <w:tcBorders>
               <w:bottom w:val="single" w:sz="4" w:space="0" w:color="000000"/>
               <w:right w:val="single" w:sz="4" w:space="0" w:color="000000"/>
@@ -18466,7 +18523,7 @@
         </w:tc>
         <w:tc>
           <w:tcPr>
-            <w:tcW w:w="636" w:type="dxa"/>
+            <w:tcW w:w="635" w:type="dxa"/>
             <w:vMerge w:val="continue"/>
             <w:tcBorders>
               <w:left w:val="single" w:sz="4" w:space="0" w:color="000000"/>
@@ -18756,7 +18813,7 @@
         </w:tc>
         <w:tc>
           <w:tcPr>
-            <w:tcW w:w="876" w:type="dxa"/>
+            <w:tcW w:w="877" w:type="dxa"/>
             <w:tcBorders>
               <w:bottom w:val="single" w:sz="4" w:space="0" w:color="000000"/>
               <w:right w:val="single" w:sz="4" w:space="0" w:color="000000"/>
@@ -18788,7 +18845,7 @@
         </w:tc>
         <w:tc>
           <w:tcPr>
-            <w:tcW w:w="636" w:type="dxa"/>
+            <w:tcW w:w="635" w:type="dxa"/>
             <w:vMerge w:val="restart"/>
             <w:tcBorders>
               <w:left w:val="single" w:sz="4" w:space="0" w:color="000000"/>
@@ -19076,7 +19133,7 @@
         </w:tc>
         <w:tc>
           <w:tcPr>
-            <w:tcW w:w="876" w:type="dxa"/>
+            <w:tcW w:w="877" w:type="dxa"/>
             <w:tcBorders>
               <w:bottom w:val="single" w:sz="4" w:space="0" w:color="000000"/>
               <w:right w:val="single" w:sz="4" w:space="0" w:color="000000"/>
@@ -19108,7 +19165,7 @@
         </w:tc>
         <w:tc>
           <w:tcPr>
-            <w:tcW w:w="636" w:type="dxa"/>
+            <w:tcW w:w="635" w:type="dxa"/>
             <w:vMerge w:val="continue"/>
             <w:tcBorders>
               <w:left w:val="single" w:sz="4" w:space="0" w:color="000000"/>
@@ -19390,7 +19447,7 @@
         </w:tc>
         <w:tc>
           <w:tcPr>
-            <w:tcW w:w="876" w:type="dxa"/>
+            <w:tcW w:w="877" w:type="dxa"/>
             <w:tcBorders>
               <w:bottom w:val="single" w:sz="4" w:space="0" w:color="000000"/>
               <w:right w:val="single" w:sz="4" w:space="0" w:color="000000"/>
@@ -19425,7 +19482,7 @@
         </w:tc>
         <w:tc>
           <w:tcPr>
-            <w:tcW w:w="636" w:type="dxa"/>
+            <w:tcW w:w="635" w:type="dxa"/>
             <w:vMerge w:val="continue"/>
             <w:tcBorders>
               <w:left w:val="single" w:sz="4" w:space="0" w:color="000000"/>
@@ -19755,7 +19812,7 @@
         </w:tc>
         <w:tc>
           <w:tcPr>
-            <w:tcW w:w="876" w:type="dxa"/>
+            <w:tcW w:w="877" w:type="dxa"/>
             <w:tcBorders>
               <w:bottom w:val="single" w:sz="4" w:space="0" w:color="000000"/>
               <w:right w:val="single" w:sz="4" w:space="0" w:color="000000"/>
@@ -19787,7 +19844,7 @@
         </w:tc>
         <w:tc>
           <w:tcPr>
-            <w:tcW w:w="636" w:type="dxa"/>
+            <w:tcW w:w="635" w:type="dxa"/>
             <w:vMerge w:val="restart"/>
             <w:tcBorders>
               <w:left w:val="single" w:sz="4" w:space="0" w:color="000000"/>
@@ -20075,7 +20132,7 @@
         </w:tc>
         <w:tc>
           <w:tcPr>
-            <w:tcW w:w="876" w:type="dxa"/>
+            <w:tcW w:w="877" w:type="dxa"/>
             <w:tcBorders>
               <w:bottom w:val="single" w:sz="4" w:space="0" w:color="000000"/>
               <w:right w:val="single" w:sz="4" w:space="0" w:color="000000"/>
@@ -20107,7 +20164,7 @@
         </w:tc>
         <w:tc>
           <w:tcPr>
-            <w:tcW w:w="636" w:type="dxa"/>
+            <w:tcW w:w="635" w:type="dxa"/>
             <w:vMerge w:val="continue"/>
             <w:tcBorders>
               <w:left w:val="single" w:sz="4" w:space="0" w:color="000000"/>
@@ -20417,7 +20474,7 @@
         </w:tc>
         <w:tc>
           <w:tcPr>
-            <w:tcW w:w="876" w:type="dxa"/>
+            <w:tcW w:w="877" w:type="dxa"/>
             <w:tcBorders>
               <w:bottom w:val="single" w:sz="4" w:space="0" w:color="000000"/>
               <w:right w:val="single" w:sz="4" w:space="0" w:color="000000"/>
@@ -20449,7 +20506,7 @@
         </w:tc>
         <w:tc>
           <w:tcPr>
-            <w:tcW w:w="636" w:type="dxa"/>
+            <w:tcW w:w="635" w:type="dxa"/>
             <w:vMerge w:val="restart"/>
             <w:tcBorders>
               <w:left w:val="single" w:sz="4" w:space="0" w:color="000000"/>
@@ -20737,7 +20794,7 @@
         </w:tc>
         <w:tc>
           <w:tcPr>
-            <w:tcW w:w="876" w:type="dxa"/>
+            <w:tcW w:w="877" w:type="dxa"/>
             <w:tcBorders>
               <w:bottom w:val="single" w:sz="4" w:space="0" w:color="000000"/>
               <w:right w:val="single" w:sz="4" w:space="0" w:color="000000"/>
@@ -20769,7 +20826,7 @@
         </w:tc>
         <w:tc>
           <w:tcPr>
-            <w:tcW w:w="636" w:type="dxa"/>
+            <w:tcW w:w="635" w:type="dxa"/>
             <w:vMerge w:val="continue"/>
             <w:tcBorders>
               <w:left w:val="single" w:sz="4" w:space="0" w:color="000000"/>
@@ -21071,7 +21128,7 @@
         </w:tc>
         <w:tc>
           <w:tcPr>
-            <w:tcW w:w="876" w:type="dxa"/>
+            <w:tcW w:w="877" w:type="dxa"/>
             <w:tcBorders>
               <w:bottom w:val="single" w:sz="4" w:space="0" w:color="000000"/>
               <w:right w:val="single" w:sz="4" w:space="0" w:color="000000"/>
@@ -21103,7 +21160,7 @@
         </w:tc>
         <w:tc>
           <w:tcPr>
-            <w:tcW w:w="636" w:type="dxa"/>
+            <w:tcW w:w="635" w:type="dxa"/>
             <w:vMerge w:val="continue"/>
             <w:tcBorders>
               <w:left w:val="single" w:sz="4" w:space="0" w:color="000000"/>
@@ -21405,7 +21462,7 @@
         </w:tc>
         <w:tc>
           <w:tcPr>
-            <w:tcW w:w="876" w:type="dxa"/>
+            <w:tcW w:w="877" w:type="dxa"/>
             <w:tcBorders>
               <w:bottom w:val="single" w:sz="4" w:space="0" w:color="000000"/>
               <w:right w:val="single" w:sz="4" w:space="0" w:color="000000"/>
@@ -21437,7 +21494,7 @@
         </w:tc>
         <w:tc>
           <w:tcPr>
-            <w:tcW w:w="636" w:type="dxa"/>
+            <w:tcW w:w="635" w:type="dxa"/>
             <w:vMerge w:val="continue"/>
             <w:tcBorders>
               <w:left w:val="single" w:sz="4" w:space="0" w:color="000000"/>
@@ -21719,7 +21776,7 @@
         </w:tc>
         <w:tc>
           <w:tcPr>
-            <w:tcW w:w="876" w:type="dxa"/>
+            <w:tcW w:w="877" w:type="dxa"/>
             <w:tcBorders>
               <w:bottom w:val="single" w:sz="4" w:space="0" w:color="000000"/>
               <w:right w:val="single" w:sz="4" w:space="0" w:color="000000"/>
@@ -21751,7 +21808,7 @@
         </w:tc>
         <w:tc>
           <w:tcPr>
-            <w:tcW w:w="636" w:type="dxa"/>
+            <w:tcW w:w="635" w:type="dxa"/>
             <w:vMerge w:val="continue"/>
             <w:tcBorders>
               <w:left w:val="single" w:sz="4" w:space="0" w:color="000000"/>
@@ -22033,7 +22090,7 @@
         </w:tc>
         <w:tc>
           <w:tcPr>
-            <w:tcW w:w="876" w:type="dxa"/>
+            <w:tcW w:w="877" w:type="dxa"/>
             <w:tcBorders>
               <w:bottom w:val="single" w:sz="4" w:space="0" w:color="000000"/>
               <w:right w:val="single" w:sz="4" w:space="0" w:color="000000"/>
@@ -22065,7 +22122,7 @@
         </w:tc>
         <w:tc>
           <w:tcPr>
-            <w:tcW w:w="636" w:type="dxa"/>
+            <w:tcW w:w="635" w:type="dxa"/>
             <w:vMerge w:val="continue"/>
             <w:tcBorders>
               <w:left w:val="single" w:sz="4" w:space="0" w:color="000000"/>
@@ -22347,7 +22404,7 @@
         </w:tc>
         <w:tc>
           <w:tcPr>
-            <w:tcW w:w="876" w:type="dxa"/>
+            <w:tcW w:w="877" w:type="dxa"/>
             <w:tcBorders>
               <w:bottom w:val="single" w:sz="4" w:space="0" w:color="000000"/>
               <w:right w:val="single" w:sz="4" w:space="0" w:color="000000"/>
@@ -22379,7 +22436,7 @@
         </w:tc>
         <w:tc>
           <w:tcPr>
-            <w:tcW w:w="636" w:type="dxa"/>
+            <w:tcW w:w="635" w:type="dxa"/>
             <w:vMerge w:val="continue"/>
             <w:tcBorders>
               <w:left w:val="single" w:sz="4" w:space="0" w:color="000000"/>
@@ -22669,7 +22726,7 @@
         </w:tc>
         <w:tc>
           <w:tcPr>
-            <w:tcW w:w="876" w:type="dxa"/>
+            <w:tcW w:w="877" w:type="dxa"/>
             <w:tcBorders>
               <w:bottom w:val="single" w:sz="4" w:space="0" w:color="000000"/>
               <w:right w:val="single" w:sz="4" w:space="0" w:color="000000"/>
@@ -22701,7 +22758,7 @@
         </w:tc>
         <w:tc>
           <w:tcPr>
-            <w:tcW w:w="636" w:type="dxa"/>
+            <w:tcW w:w="635" w:type="dxa"/>
             <w:vMerge w:val="restart"/>
             <w:tcBorders>
               <w:left w:val="single" w:sz="4" w:space="0" w:color="000000"/>
@@ -22989,7 +23046,7 @@
         </w:tc>
         <w:tc>
           <w:tcPr>
-            <w:tcW w:w="876" w:type="dxa"/>
+            <w:tcW w:w="877" w:type="dxa"/>
             <w:tcBorders>
               <w:bottom w:val="single" w:sz="4" w:space="0" w:color="000000"/>
               <w:right w:val="single" w:sz="4" w:space="0" w:color="000000"/>
@@ -23021,7 +23078,7 @@
         </w:tc>
         <w:tc>
           <w:tcPr>
-            <w:tcW w:w="636" w:type="dxa"/>
+            <w:tcW w:w="635" w:type="dxa"/>
             <w:vMerge w:val="continue"/>
             <w:tcBorders>
               <w:left w:val="single" w:sz="4" w:space="0" w:color="000000"/>
@@ -23323,7 +23380,7 @@
         </w:tc>
         <w:tc>
           <w:tcPr>
-            <w:tcW w:w="876" w:type="dxa"/>
+            <w:tcW w:w="877" w:type="dxa"/>
             <w:tcBorders>
               <w:bottom w:val="single" w:sz="4" w:space="0" w:color="000000"/>
               <w:right w:val="single" w:sz="4" w:space="0" w:color="000000"/>
@@ -23355,7 +23412,7 @@
         </w:tc>
         <w:tc>
           <w:tcPr>
-            <w:tcW w:w="636" w:type="dxa"/>
+            <w:tcW w:w="635" w:type="dxa"/>
             <w:vMerge w:val="continue"/>
             <w:tcBorders>
               <w:left w:val="single" w:sz="4" w:space="0" w:color="000000"/>
@@ -23637,7 +23694,7 @@
         </w:tc>
         <w:tc>
           <w:tcPr>
-            <w:tcW w:w="876" w:type="dxa"/>
+            <w:tcW w:w="877" w:type="dxa"/>
             <w:tcBorders>
               <w:bottom w:val="single" w:sz="4" w:space="0" w:color="000000"/>
               <w:right w:val="single" w:sz="4" w:space="0" w:color="000000"/>
@@ -23669,7 +23726,7 @@
         </w:tc>
         <w:tc>
           <w:tcPr>
-            <w:tcW w:w="636" w:type="dxa"/>
+            <w:tcW w:w="635" w:type="dxa"/>
             <w:vMerge w:val="continue"/>
             <w:tcBorders>
               <w:left w:val="single" w:sz="4" w:space="0" w:color="000000"/>
@@ -23954,7 +24011,7 @@
         </w:tc>
         <w:tc>
           <w:tcPr>
-            <w:tcW w:w="876" w:type="dxa"/>
+            <w:tcW w:w="877" w:type="dxa"/>
             <w:tcBorders>
               <w:bottom w:val="single" w:sz="4" w:space="0" w:color="000000"/>
               <w:right w:val="single" w:sz="4" w:space="0" w:color="000000"/>
@@ -23986,7 +24043,7 @@
         </w:tc>
         <w:tc>
           <w:tcPr>
-            <w:tcW w:w="636" w:type="dxa"/>
+            <w:tcW w:w="635" w:type="dxa"/>
             <w:tcBorders>
               <w:bottom w:val="single" w:sz="4" w:space="0" w:color="000000"/>
               <w:right w:val="single" w:sz="4" w:space="0" w:color="000000"/>
@@ -24273,7 +24330,7 @@
         </w:tc>
         <w:tc>
           <w:tcPr>
-            <w:tcW w:w="876" w:type="dxa"/>
+            <w:tcW w:w="877" w:type="dxa"/>
             <w:tcBorders>
               <w:bottom w:val="single" w:sz="4" w:space="0" w:color="000000"/>
               <w:right w:val="single" w:sz="4" w:space="0" w:color="000000"/>
@@ -24305,7 +24362,7 @@
         </w:tc>
         <w:tc>
           <w:tcPr>
-            <w:tcW w:w="636" w:type="dxa"/>
+            <w:tcW w:w="635" w:type="dxa"/>
             <w:tcBorders>
               <w:bottom w:val="single" w:sz="4" w:space="0" w:color="000000"/>
               <w:right w:val="single" w:sz="4" w:space="0" w:color="000000"/>
@@ -24592,7 +24649,7 @@
         </w:tc>
         <w:tc>
           <w:tcPr>
-            <w:tcW w:w="876" w:type="dxa"/>
+            <w:tcW w:w="877" w:type="dxa"/>
             <w:tcBorders>
               <w:bottom w:val="single" w:sz="4" w:space="0" w:color="000000"/>
               <w:right w:val="single" w:sz="4" w:space="0" w:color="000000"/>
@@ -24632,7 +24689,7 @@
         </w:tc>
         <w:tc>
           <w:tcPr>
-            <w:tcW w:w="636" w:type="dxa"/>
+            <w:tcW w:w="635" w:type="dxa"/>
             <w:tcBorders>
               <w:bottom w:val="single" w:sz="4" w:space="0" w:color="000000"/>
               <w:right w:val="single" w:sz="4" w:space="0" w:color="000000"/>
@@ -24934,7 +24991,7 @@
         </w:tc>
         <w:tc>
           <w:tcPr>
-            <w:tcW w:w="876" w:type="dxa"/>
+            <w:tcW w:w="877" w:type="dxa"/>
             <w:tcBorders>
               <w:bottom w:val="single" w:sz="4" w:space="0" w:color="000000"/>
               <w:right w:val="single" w:sz="4" w:space="0" w:color="000000"/>
@@ -24966,7 +25023,7 @@
         </w:tc>
         <w:tc>
           <w:tcPr>
-            <w:tcW w:w="636" w:type="dxa"/>
+            <w:tcW w:w="635" w:type="dxa"/>
             <w:tcBorders>
               <w:bottom w:val="single" w:sz="4" w:space="0" w:color="000000"/>
               <w:right w:val="single" w:sz="4" w:space="0" w:color="000000"/>
@@ -25258,7 +25315,7 @@
         </w:tc>
         <w:tc>
           <w:tcPr>
-            <w:tcW w:w="876" w:type="dxa"/>
+            <w:tcW w:w="877" w:type="dxa"/>
             <w:tcBorders>
               <w:bottom w:val="single" w:sz="4" w:space="0" w:color="000000"/>
               <w:right w:val="single" w:sz="4" w:space="0" w:color="000000"/>
@@ -25290,7 +25347,7 @@
         </w:tc>
         <w:tc>
           <w:tcPr>
-            <w:tcW w:w="636" w:type="dxa"/>
+            <w:tcW w:w="635" w:type="dxa"/>
             <w:vMerge w:val="restart"/>
             <w:tcBorders>
               <w:left w:val="single" w:sz="4" w:space="0" w:color="000000"/>
@@ -25578,7 +25635,7 @@
         </w:tc>
         <w:tc>
           <w:tcPr>
-            <w:tcW w:w="876" w:type="dxa"/>
+            <w:tcW w:w="877" w:type="dxa"/>
             <w:tcBorders>
               <w:bottom w:val="single" w:sz="4" w:space="0" w:color="000000"/>
               <w:right w:val="single" w:sz="4" w:space="0" w:color="000000"/>
@@ -25610,7 +25667,7 @@
         </w:tc>
         <w:tc>
           <w:tcPr>
-            <w:tcW w:w="636" w:type="dxa"/>
+            <w:tcW w:w="635" w:type="dxa"/>
             <w:vMerge w:val="continue"/>
             <w:tcBorders>
               <w:left w:val="single" w:sz="4" w:space="0" w:color="000000"/>
@@ -25892,7 +25949,7 @@
         </w:tc>
         <w:tc>
           <w:tcPr>
-            <w:tcW w:w="876" w:type="dxa"/>
+            <w:tcW w:w="877" w:type="dxa"/>
             <w:tcBorders>
               <w:bottom w:val="single" w:sz="4" w:space="0" w:color="000000"/>
               <w:right w:val="single" w:sz="4" w:space="0" w:color="000000"/>
@@ -25924,7 +25981,7 @@
         </w:tc>
         <w:tc>
           <w:tcPr>
-            <w:tcW w:w="636" w:type="dxa"/>
+            <w:tcW w:w="635" w:type="dxa"/>
             <w:vMerge w:val="continue"/>
             <w:tcBorders>
               <w:left w:val="single" w:sz="4" w:space="0" w:color="000000"/>
@@ -26206,7 +26263,7 @@
         </w:tc>
         <w:tc>
           <w:tcPr>
-            <w:tcW w:w="876" w:type="dxa"/>
+            <w:tcW w:w="877" w:type="dxa"/>
             <w:tcBorders>
               <w:bottom w:val="single" w:sz="4" w:space="0" w:color="000000"/>
               <w:right w:val="single" w:sz="4" w:space="0" w:color="000000"/>
@@ -26238,7 +26295,7 @@
         </w:tc>
         <w:tc>
           <w:tcPr>
-            <w:tcW w:w="636" w:type="dxa"/>
+            <w:tcW w:w="635" w:type="dxa"/>
             <w:vMerge w:val="continue"/>
             <w:tcBorders>
               <w:left w:val="single" w:sz="4" w:space="0" w:color="000000"/>
@@ -26520,7 +26577,7 @@
         </w:tc>
         <w:tc>
           <w:tcPr>
-            <w:tcW w:w="876" w:type="dxa"/>
+            <w:tcW w:w="877" w:type="dxa"/>
             <w:tcBorders>
               <w:bottom w:val="single" w:sz="4" w:space="0" w:color="000000"/>
               <w:right w:val="single" w:sz="4" w:space="0" w:color="000000"/>
@@ -26552,7 +26609,7 @@
         </w:tc>
         <w:tc>
           <w:tcPr>
-            <w:tcW w:w="636" w:type="dxa"/>
+            <w:tcW w:w="635" w:type="dxa"/>
             <w:vMerge w:val="continue"/>
             <w:tcBorders>
               <w:left w:val="single" w:sz="4" w:space="0" w:color="000000"/>
@@ -26834,7 +26891,7 @@
         </w:tc>
         <w:tc>
           <w:tcPr>
-            <w:tcW w:w="876" w:type="dxa"/>
+            <w:tcW w:w="877" w:type="dxa"/>
             <w:tcBorders>
               <w:bottom w:val="single" w:sz="4" w:space="0" w:color="000000"/>
               <w:right w:val="single" w:sz="4" w:space="0" w:color="000000"/>
@@ -26866,7 +26923,7 @@
         </w:tc>
         <w:tc>
           <w:tcPr>
-            <w:tcW w:w="636" w:type="dxa"/>
+            <w:tcW w:w="635" w:type="dxa"/>
             <w:vMerge w:val="continue"/>
             <w:tcBorders>
               <w:left w:val="single" w:sz="4" w:space="0" w:color="000000"/>
@@ -27148,7 +27205,7 @@
         </w:tc>
         <w:tc>
           <w:tcPr>
-            <w:tcW w:w="876" w:type="dxa"/>
+            <w:tcW w:w="877" w:type="dxa"/>
             <w:tcBorders>
               <w:bottom w:val="single" w:sz="4" w:space="0" w:color="000000"/>
               <w:right w:val="single" w:sz="4" w:space="0" w:color="000000"/>
@@ -27183,7 +27240,7 @@
         </w:tc>
         <w:tc>
           <w:tcPr>
-            <w:tcW w:w="636" w:type="dxa"/>
+            <w:tcW w:w="635" w:type="dxa"/>
             <w:vMerge w:val="continue"/>
             <w:tcBorders>
               <w:left w:val="single" w:sz="4" w:space="0" w:color="000000"/>
@@ -27488,7 +27545,7 @@
         </w:tc>
         <w:tc>
           <w:tcPr>
-            <w:tcW w:w="876" w:type="dxa"/>
+            <w:tcW w:w="877" w:type="dxa"/>
             <w:tcBorders>
               <w:bottom w:val="single" w:sz="4" w:space="0" w:color="000000"/>
               <w:right w:val="single" w:sz="4" w:space="0" w:color="000000"/>
@@ -27520,7 +27577,7 @@
         </w:tc>
         <w:tc>
           <w:tcPr>
-            <w:tcW w:w="636" w:type="dxa"/>
+            <w:tcW w:w="635" w:type="dxa"/>
             <w:tcBorders>
               <w:bottom w:val="single" w:sz="4" w:space="0" w:color="000000"/>
               <w:right w:val="single" w:sz="4" w:space="0" w:color="000000"/>
@@ -27842,7 +27899,7 @@
         </w:tc>
         <w:tc>
           <w:tcPr>
-            <w:tcW w:w="876" w:type="dxa"/>
+            <w:tcW w:w="877" w:type="dxa"/>
             <w:tcBorders>
               <w:bottom w:val="single" w:sz="4" w:space="0" w:color="000000"/>
               <w:right w:val="single" w:sz="4" w:space="0" w:color="000000"/>
@@ -27874,7 +27931,7 @@
         </w:tc>
         <w:tc>
           <w:tcPr>
-            <w:tcW w:w="636" w:type="dxa"/>
+            <w:tcW w:w="635" w:type="dxa"/>
             <w:tcBorders>
               <w:bottom w:val="single" w:sz="4" w:space="0" w:color="000000"/>
               <w:right w:val="single" w:sz="4" w:space="0" w:color="000000"/>
@@ -28156,7 +28213,7 @@
         </w:tc>
         <w:tc>
           <w:tcPr>
-            <w:tcW w:w="876" w:type="dxa"/>
+            <w:tcW w:w="877" w:type="dxa"/>
             <w:tcBorders>
               <w:bottom w:val="single" w:sz="4" w:space="0" w:color="000000"/>
               <w:right w:val="single" w:sz="4" w:space="0" w:color="000000"/>
@@ -28188,7 +28245,7 @@
         </w:tc>
         <w:tc>
           <w:tcPr>
-            <w:tcW w:w="636" w:type="dxa"/>
+            <w:tcW w:w="635" w:type="dxa"/>
             <w:tcBorders>
               <w:bottom w:val="single" w:sz="4" w:space="0" w:color="000000"/>
               <w:right w:val="single" w:sz="4" w:space="0" w:color="000000"/>
@@ -28480,7 +28537,7 @@
         </w:tc>
         <w:tc>
           <w:tcPr>
-            <w:tcW w:w="876" w:type="dxa"/>
+            <w:tcW w:w="877" w:type="dxa"/>
             <w:tcBorders>
               <w:bottom w:val="single" w:sz="4" w:space="0" w:color="000000"/>
               <w:right w:val="single" w:sz="4" w:space="0" w:color="000000"/>
@@ -28512,7 +28569,7 @@
         </w:tc>
         <w:tc>
           <w:tcPr>
-            <w:tcW w:w="636" w:type="dxa"/>
+            <w:tcW w:w="635" w:type="dxa"/>
             <w:vMerge w:val="restart"/>
             <w:tcBorders>
               <w:left w:val="single" w:sz="4" w:space="0" w:color="000000"/>
@@ -28800,7 +28857,7 @@
         </w:tc>
         <w:tc>
           <w:tcPr>
-            <w:tcW w:w="876" w:type="dxa"/>
+            <w:tcW w:w="877" w:type="dxa"/>
             <w:tcBorders>
               <w:bottom w:val="single" w:sz="4" w:space="0" w:color="000000"/>
               <w:right w:val="single" w:sz="4" w:space="0" w:color="000000"/>
@@ -28832,7 +28889,7 @@
         </w:tc>
         <w:tc>
           <w:tcPr>
-            <w:tcW w:w="636" w:type="dxa"/>
+            <w:tcW w:w="635" w:type="dxa"/>
             <w:vMerge w:val="continue"/>
             <w:tcBorders>
               <w:left w:val="single" w:sz="4" w:space="0" w:color="000000"/>
@@ -29117,7 +29174,7 @@
         </w:tc>
         <w:tc>
           <w:tcPr>
-            <w:tcW w:w="876" w:type="dxa"/>
+            <w:tcW w:w="877" w:type="dxa"/>
             <w:tcBorders>
               <w:bottom w:val="single" w:sz="4" w:space="0" w:color="000000"/>
               <w:right w:val="single" w:sz="4" w:space="0" w:color="000000"/>
@@ -29149,7 +29206,7 @@
         </w:tc>
         <w:tc>
           <w:tcPr>
-            <w:tcW w:w="636" w:type="dxa"/>
+            <w:tcW w:w="635" w:type="dxa"/>
             <w:tcBorders>
               <w:bottom w:val="single" w:sz="4" w:space="0" w:color="000000"/>
               <w:right w:val="single" w:sz="4" w:space="0" w:color="000000"/>
@@ -29441,7 +29498,7 @@
         </w:tc>
         <w:tc>
           <w:tcPr>
-            <w:tcW w:w="876" w:type="dxa"/>
+            <w:tcW w:w="877" w:type="dxa"/>
             <w:tcBorders>
               <w:bottom w:val="single" w:sz="4" w:space="0" w:color="000000"/>
               <w:right w:val="single" w:sz="4" w:space="0" w:color="000000"/>
@@ -29473,7 +29530,7 @@
         </w:tc>
         <w:tc>
           <w:tcPr>
-            <w:tcW w:w="636" w:type="dxa"/>
+            <w:tcW w:w="635" w:type="dxa"/>
             <w:vMerge w:val="restart"/>
             <w:tcBorders>
               <w:left w:val="single" w:sz="4" w:space="0" w:color="000000"/>
@@ -29761,7 +29818,7 @@
         </w:tc>
         <w:tc>
           <w:tcPr>
-            <w:tcW w:w="876" w:type="dxa"/>
+            <w:tcW w:w="877" w:type="dxa"/>
             <w:tcBorders>
               <w:bottom w:val="single" w:sz="4" w:space="0" w:color="000000"/>
               <w:right w:val="single" w:sz="4" w:space="0" w:color="000000"/>
@@ -29793,7 +29850,7 @@
         </w:tc>
         <w:tc>
           <w:tcPr>
-            <w:tcW w:w="636" w:type="dxa"/>
+            <w:tcW w:w="635" w:type="dxa"/>
             <w:vMerge w:val="continue"/>
             <w:tcBorders>
               <w:left w:val="single" w:sz="4" w:space="0" w:color="000000"/>
@@ -30075,7 +30132,7 @@
         </w:tc>
         <w:tc>
           <w:tcPr>
-            <w:tcW w:w="876" w:type="dxa"/>
+            <w:tcW w:w="877" w:type="dxa"/>
             <w:tcBorders>
               <w:bottom w:val="single" w:sz="4" w:space="0" w:color="000000"/>
               <w:right w:val="single" w:sz="4" w:space="0" w:color="000000"/>
@@ -30107,7 +30164,7 @@
         </w:tc>
         <w:tc>
           <w:tcPr>
-            <w:tcW w:w="636" w:type="dxa"/>
+            <w:tcW w:w="635" w:type="dxa"/>
             <w:vMerge w:val="continue"/>
             <w:tcBorders>
               <w:left w:val="single" w:sz="4" w:space="0" w:color="000000"/>
@@ -30432,7 +30489,7 @@
         </w:tc>
         <w:tc>
           <w:tcPr>
-            <w:tcW w:w="876" w:type="dxa"/>
+            <w:tcW w:w="877" w:type="dxa"/>
             <w:tcBorders>
               <w:bottom w:val="single" w:sz="4" w:space="0" w:color="000000"/>
               <w:right w:val="single" w:sz="4" w:space="0" w:color="000000"/>
@@ -30464,7 +30521,7 @@
         </w:tc>
         <w:tc>
           <w:tcPr>
-            <w:tcW w:w="636" w:type="dxa"/>
+            <w:tcW w:w="635" w:type="dxa"/>
             <w:tcBorders>
               <w:bottom w:val="single" w:sz="4" w:space="0" w:color="000000"/>
               <w:right w:val="single" w:sz="4" w:space="0" w:color="000000"/>
@@ -30786,7 +30843,7 @@
         </w:tc>
         <w:tc>
           <w:tcPr>
-            <w:tcW w:w="876" w:type="dxa"/>
+            <w:tcW w:w="877" w:type="dxa"/>
             <w:tcBorders>
               <w:bottom w:val="single" w:sz="4" w:space="0" w:color="000000"/>
               <w:right w:val="single" w:sz="4" w:space="0" w:color="000000"/>
@@ -30821,7 +30878,7 @@
         </w:tc>
         <w:tc>
           <w:tcPr>
-            <w:tcW w:w="636" w:type="dxa"/>
+            <w:tcW w:w="635" w:type="dxa"/>
             <w:tcBorders>
               <w:bottom w:val="single" w:sz="4" w:space="0" w:color="000000"/>
               <w:right w:val="single" w:sz="4" w:space="0" w:color="000000"/>
@@ -31128,7 +31185,7 @@
         </w:tc>
         <w:tc>
           <w:tcPr>
-            <w:tcW w:w="876" w:type="dxa"/>
+            <w:tcW w:w="877" w:type="dxa"/>
             <w:tcBorders>
               <w:bottom w:val="single" w:sz="4" w:space="0" w:color="000000"/>
               <w:right w:val="single" w:sz="4" w:space="0" w:color="000000"/>
@@ -31160,7 +31217,7 @@
         </w:tc>
         <w:tc>
           <w:tcPr>
-            <w:tcW w:w="636" w:type="dxa"/>
+            <w:tcW w:w="635" w:type="dxa"/>
             <w:vMerge w:val="restart"/>
             <w:tcBorders>
               <w:left w:val="single" w:sz="4" w:space="0" w:color="000000"/>
@@ -31443,7 +31500,7 @@
         </w:tc>
         <w:tc>
           <w:tcPr>
-            <w:tcW w:w="876" w:type="dxa"/>
+            <w:tcW w:w="877" w:type="dxa"/>
             <w:tcBorders>
               <w:bottom w:val="single" w:sz="4" w:space="0" w:color="000000"/>
               <w:right w:val="single" w:sz="4" w:space="0" w:color="000000"/>
@@ -31475,7 +31532,7 @@
         </w:tc>
         <w:tc>
           <w:tcPr>
-            <w:tcW w:w="636" w:type="dxa"/>
+            <w:tcW w:w="635" w:type="dxa"/>
             <w:vMerge w:val="continue"/>
             <w:tcBorders>
               <w:left w:val="single" w:sz="4" w:space="0" w:color="000000"/>
@@ -31760,7 +31817,7 @@
         </w:tc>
         <w:tc>
           <w:tcPr>
-            <w:tcW w:w="876" w:type="dxa"/>
+            <w:tcW w:w="877" w:type="dxa"/>
             <w:tcBorders>
               <w:bottom w:val="single" w:sz="4" w:space="0" w:color="000000"/>
               <w:right w:val="single" w:sz="4" w:space="0" w:color="000000"/>
@@ -31792,7 +31849,7 @@
         </w:tc>
         <w:tc>
           <w:tcPr>
-            <w:tcW w:w="636" w:type="dxa"/>
+            <w:tcW w:w="635" w:type="dxa"/>
             <w:tcBorders>
               <w:bottom w:val="single" w:sz="4" w:space="0" w:color="000000"/>
               <w:right w:val="single" w:sz="4" w:space="0" w:color="000000"/>
@@ -32119,7 +32176,7 @@
         </w:tc>
         <w:tc>
           <w:tcPr>
-            <w:tcW w:w="876" w:type="dxa"/>
+            <w:tcW w:w="877" w:type="dxa"/>
             <w:tcBorders>
               <w:bottom w:val="single" w:sz="4" w:space="0" w:color="000000"/>
               <w:right w:val="single" w:sz="4" w:space="0" w:color="000000"/>
@@ -32151,7 +32208,7 @@
         </w:tc>
         <w:tc>
           <w:tcPr>
-            <w:tcW w:w="636" w:type="dxa"/>
+            <w:tcW w:w="635" w:type="dxa"/>
             <w:tcBorders>
               <w:bottom w:val="single" w:sz="4" w:space="0" w:color="000000"/>
               <w:right w:val="single" w:sz="4" w:space="0" w:color="000000"/>
@@ -32438,7 +32495,7 @@
         </w:tc>
         <w:tc>
           <w:tcPr>
-            <w:tcW w:w="876" w:type="dxa"/>
+            <w:tcW w:w="877" w:type="dxa"/>
             <w:tcBorders>
               <w:bottom w:val="single" w:sz="4" w:space="0" w:color="000000"/>
               <w:right w:val="single" w:sz="4" w:space="0" w:color="000000"/>
@@ -32470,7 +32527,7 @@
         </w:tc>
         <w:tc>
           <w:tcPr>
-            <w:tcW w:w="636" w:type="dxa"/>
+            <w:tcW w:w="635" w:type="dxa"/>
             <w:tcBorders>
               <w:bottom w:val="single" w:sz="4" w:space="0" w:color="000000"/>
               <w:right w:val="single" w:sz="4" w:space="0" w:color="000000"/>
@@ -32757,7 +32814,7 @@
         </w:tc>
         <w:tc>
           <w:tcPr>
-            <w:tcW w:w="876" w:type="dxa"/>
+            <w:tcW w:w="877" w:type="dxa"/>
             <w:tcBorders>
               <w:bottom w:val="single" w:sz="4" w:space="0" w:color="000000"/>
               <w:right w:val="single" w:sz="4" w:space="0" w:color="000000"/>
@@ -32789,7 +32846,7 @@
         </w:tc>
         <w:tc>
           <w:tcPr>
-            <w:tcW w:w="636" w:type="dxa"/>
+            <w:tcW w:w="635" w:type="dxa"/>
             <w:tcBorders>
               <w:bottom w:val="single" w:sz="4" w:space="0" w:color="000000"/>
               <w:right w:val="single" w:sz="4" w:space="0" w:color="000000"/>
@@ -33064,7 +33121,7 @@
         </w:tc>
         <w:tc>
           <w:tcPr>
-            <w:tcW w:w="876" w:type="dxa"/>
+            <w:tcW w:w="877" w:type="dxa"/>
             <w:tcBorders>
               <w:bottom w:val="single" w:sz="4" w:space="0" w:color="000000"/>
               <w:right w:val="single" w:sz="4" w:space="0" w:color="000000"/>
@@ -33096,7 +33153,7 @@
         </w:tc>
         <w:tc>
           <w:tcPr>
-            <w:tcW w:w="636" w:type="dxa"/>
+            <w:tcW w:w="635" w:type="dxa"/>
             <w:tcBorders>
               <w:bottom w:val="single" w:sz="4" w:space="0" w:color="000000"/>
               <w:right w:val="single" w:sz="4" w:space="0" w:color="000000"/>
@@ -33389,7 +33446,7 @@
         </w:tc>
         <w:tc>
           <w:tcPr>
-            <w:tcW w:w="876" w:type="dxa"/>
+            <w:tcW w:w="877" w:type="dxa"/>
             <w:tcBorders>
               <w:bottom w:val="single" w:sz="4" w:space="0" w:color="000000"/>
               <w:right w:val="single" w:sz="4" w:space="0" w:color="000000"/>
@@ -33421,7 +33478,7 @@
         </w:tc>
         <w:tc>
           <w:tcPr>
-            <w:tcW w:w="636" w:type="dxa"/>
+            <w:tcW w:w="635" w:type="dxa"/>
             <w:vMerge w:val="restart"/>
             <w:tcBorders>
               <w:left w:val="single" w:sz="4" w:space="0" w:color="000000"/>
@@ -33709,7 +33766,7 @@
         </w:tc>
         <w:tc>
           <w:tcPr>
-            <w:tcW w:w="876" w:type="dxa"/>
+            <w:tcW w:w="877" w:type="dxa"/>
             <w:tcBorders>
               <w:bottom w:val="single" w:sz="4" w:space="0" w:color="000000"/>
               <w:right w:val="single" w:sz="4" w:space="0" w:color="000000"/>
@@ -33744,7 +33801,7 @@
         </w:tc>
         <w:tc>
           <w:tcPr>
-            <w:tcW w:w="636" w:type="dxa"/>
+            <w:tcW w:w="635" w:type="dxa"/>
             <w:vMerge w:val="continue"/>
             <w:tcBorders>
               <w:left w:val="single" w:sz="4" w:space="0" w:color="000000"/>
@@ -34026,7 +34083,7 @@
         </w:tc>
         <w:tc>
           <w:tcPr>
-            <w:tcW w:w="876" w:type="dxa"/>
+            <w:tcW w:w="877" w:type="dxa"/>
             <w:tcBorders>
               <w:bottom w:val="single" w:sz="4" w:space="0" w:color="000000"/>
               <w:right w:val="single" w:sz="4" w:space="0" w:color="000000"/>
@@ -34058,7 +34115,7 @@
         </w:tc>
         <w:tc>
           <w:tcPr>
-            <w:tcW w:w="636" w:type="dxa"/>
+            <w:tcW w:w="635" w:type="dxa"/>
             <w:vMerge w:val="continue"/>
             <w:tcBorders>
               <w:left w:val="single" w:sz="4" w:space="0" w:color="000000"/>
@@ -34410,7 +34467,7 @@
         </w:tc>
         <w:tc>
           <w:tcPr>
-            <w:tcW w:w="876" w:type="dxa"/>
+            <w:tcW w:w="877" w:type="dxa"/>
             <w:tcBorders>
               <w:bottom w:val="single" w:sz="4" w:space="0" w:color="000000"/>
               <w:right w:val="single" w:sz="4" w:space="0" w:color="000000"/>
@@ -34442,7 +34499,7 @@
         </w:tc>
         <w:tc>
           <w:tcPr>
-            <w:tcW w:w="636" w:type="dxa"/>
+            <w:tcW w:w="635" w:type="dxa"/>
             <w:vMerge w:val="restart"/>
             <w:tcBorders>
               <w:left w:val="single" w:sz="4" w:space="0" w:color="000000"/>
@@ -34750,7 +34807,7 @@
         </w:tc>
         <w:tc>
           <w:tcPr>
-            <w:tcW w:w="876" w:type="dxa"/>
+            <w:tcW w:w="877" w:type="dxa"/>
             <w:tcBorders>
               <w:bottom w:val="single" w:sz="4" w:space="0" w:color="000000"/>
               <w:right w:val="single" w:sz="4" w:space="0" w:color="000000"/>
@@ -34782,7 +34839,7 @@
         </w:tc>
         <w:tc>
           <w:tcPr>
-            <w:tcW w:w="636" w:type="dxa"/>
+            <w:tcW w:w="635" w:type="dxa"/>
             <w:vMerge w:val="continue"/>
             <w:tcBorders>
               <w:left w:val="single" w:sz="4" w:space="0" w:color="000000"/>
@@ -35082,7 +35139,7 @@
         </w:tc>
         <w:tc>
           <w:tcPr>
-            <w:tcW w:w="876" w:type="dxa"/>
+            <w:tcW w:w="877" w:type="dxa"/>
             <w:tcBorders>
               <w:bottom w:val="single" w:sz="4" w:space="0" w:color="000000"/>
               <w:right w:val="single" w:sz="4" w:space="0" w:color="000000"/>
@@ -35114,7 +35171,7 @@
         </w:tc>
         <w:tc>
           <w:tcPr>
-            <w:tcW w:w="636" w:type="dxa"/>
+            <w:tcW w:w="635" w:type="dxa"/>
             <w:tcBorders>
               <w:bottom w:val="single" w:sz="4" w:space="0" w:color="000000"/>
               <w:right w:val="single" w:sz="4" w:space="0" w:color="000000"/>
@@ -35416,7 +35473,7 @@
         </w:tc>
         <w:tc>
           <w:tcPr>
-            <w:tcW w:w="876" w:type="dxa"/>
+            <w:tcW w:w="877" w:type="dxa"/>
             <w:tcBorders>
               <w:bottom w:val="single" w:sz="4" w:space="0" w:color="000000"/>
               <w:right w:val="single" w:sz="4" w:space="0" w:color="000000"/>
@@ -35448,7 +35505,7 @@
         </w:tc>
         <w:tc>
           <w:tcPr>
-            <w:tcW w:w="636" w:type="dxa"/>
+            <w:tcW w:w="635" w:type="dxa"/>
             <w:tcBorders>
               <w:bottom w:val="single" w:sz="4" w:space="0" w:color="000000"/>
               <w:right w:val="single" w:sz="4" w:space="0" w:color="000000"/>
@@ -35775,7 +35832,7 @@
         </w:tc>
         <w:tc>
           <w:tcPr>
-            <w:tcW w:w="876" w:type="dxa"/>
+            <w:tcW w:w="877" w:type="dxa"/>
             <w:tcBorders>
               <w:bottom w:val="single" w:sz="4" w:space="0" w:color="000000"/>
               <w:right w:val="single" w:sz="4" w:space="0" w:color="000000"/>
@@ -35807,7 +35864,7 @@
         </w:tc>
         <w:tc>
           <w:tcPr>
-            <w:tcW w:w="636" w:type="dxa"/>
+            <w:tcW w:w="635" w:type="dxa"/>
             <w:tcBorders>
               <w:bottom w:val="single" w:sz="4" w:space="0" w:color="000000"/>
               <w:right w:val="single" w:sz="4" w:space="0" w:color="000000"/>
@@ -36114,7 +36171,7 @@
         </w:tc>
         <w:tc>
           <w:tcPr>
-            <w:tcW w:w="876" w:type="dxa"/>
+            <w:tcW w:w="877" w:type="dxa"/>
             <w:tcBorders>
               <w:bottom w:val="single" w:sz="4" w:space="0" w:color="000000"/>
               <w:right w:val="single" w:sz="4" w:space="0" w:color="000000"/>
@@ -36146,7 +36203,7 @@
         </w:tc>
         <w:tc>
           <w:tcPr>
-            <w:tcW w:w="636" w:type="dxa"/>
+            <w:tcW w:w="635" w:type="dxa"/>
             <w:tcBorders>
               <w:bottom w:val="single" w:sz="4" w:space="0" w:color="000000"/>
               <w:right w:val="single" w:sz="4" w:space="0" w:color="000000"/>
@@ -36445,7 +36502,7 @@
         </w:tc>
         <w:tc>
           <w:tcPr>
-            <w:tcW w:w="876" w:type="dxa"/>
+            <w:tcW w:w="877" w:type="dxa"/>
             <w:tcBorders>
               <w:bottom w:val="single" w:sz="4" w:space="0" w:color="000000"/>
               <w:right w:val="single" w:sz="4" w:space="0" w:color="000000"/>
@@ -36477,7 +36534,7 @@
         </w:tc>
         <w:tc>
           <w:tcPr>
-            <w:tcW w:w="636" w:type="dxa"/>
+            <w:tcW w:w="635" w:type="dxa"/>
             <w:vMerge w:val="restart"/>
             <w:tcBorders>
               <w:left w:val="single" w:sz="4" w:space="0" w:color="000000"/>
@@ -36760,7 +36817,7 @@
         </w:tc>
         <w:tc>
           <w:tcPr>
-            <w:tcW w:w="876" w:type="dxa"/>
+            <w:tcW w:w="877" w:type="dxa"/>
             <w:tcBorders>
               <w:bottom w:val="single" w:sz="4" w:space="0" w:color="000000"/>
               <w:right w:val="single" w:sz="4" w:space="0" w:color="000000"/>
@@ -36792,7 +36849,7 @@
         </w:tc>
         <w:tc>
           <w:tcPr>
-            <w:tcW w:w="636" w:type="dxa"/>
+            <w:tcW w:w="635" w:type="dxa"/>
             <w:vMerge w:val="continue"/>
             <w:tcBorders>
               <w:left w:val="single" w:sz="4" w:space="0" w:color="000000"/>
@@ -37069,7 +37126,7 @@
         </w:tc>
         <w:tc>
           <w:tcPr>
-            <w:tcW w:w="876" w:type="dxa"/>
+            <w:tcW w:w="877" w:type="dxa"/>
             <w:tcBorders>
               <w:bottom w:val="single" w:sz="4" w:space="0" w:color="000000"/>
               <w:right w:val="single" w:sz="4" w:space="0" w:color="000000"/>
@@ -37101,7 +37158,7 @@
         </w:tc>
         <w:tc>
           <w:tcPr>
-            <w:tcW w:w="636" w:type="dxa"/>
+            <w:tcW w:w="635" w:type="dxa"/>
             <w:vMerge w:val="continue"/>
             <w:tcBorders>
               <w:left w:val="single" w:sz="4" w:space="0" w:color="000000"/>
@@ -37401,7 +37458,7 @@
         </w:tc>
         <w:tc>
           <w:tcPr>
-            <w:tcW w:w="876" w:type="dxa"/>
+            <w:tcW w:w="877" w:type="dxa"/>
             <w:tcBorders>
               <w:bottom w:val="single" w:sz="4" w:space="0" w:color="000000"/>
               <w:right w:val="single" w:sz="4" w:space="0" w:color="000000"/>
@@ -37433,7 +37490,7 @@
         </w:tc>
         <w:tc>
           <w:tcPr>
-            <w:tcW w:w="636" w:type="dxa"/>
+            <w:tcW w:w="635" w:type="dxa"/>
             <w:tcBorders>
               <w:bottom w:val="single" w:sz="4" w:space="0" w:color="000000"/>
               <w:right w:val="single" w:sz="4" w:space="0" w:color="000000"/>
@@ -37740,7 +37797,7 @@
         </w:tc>
         <w:tc>
           <w:tcPr>
-            <w:tcW w:w="876" w:type="dxa"/>
+            <w:tcW w:w="877" w:type="dxa"/>
             <w:tcBorders>
               <w:bottom w:val="single" w:sz="4" w:space="0" w:color="000000"/>
               <w:right w:val="single" w:sz="4" w:space="0" w:color="000000"/>
@@ -37772,7 +37829,7 @@
         </w:tc>
         <w:tc>
           <w:tcPr>
-            <w:tcW w:w="636" w:type="dxa"/>
+            <w:tcW w:w="635" w:type="dxa"/>
             <w:tcBorders>
               <w:bottom w:val="single" w:sz="4" w:space="0" w:color="000000"/>
               <w:right w:val="single" w:sz="4" w:space="0" w:color="000000"/>
@@ -38084,7 +38141,7 @@
         </w:tc>
         <w:tc>
           <w:tcPr>
-            <w:tcW w:w="876" w:type="dxa"/>
+            <w:tcW w:w="877" w:type="dxa"/>
             <w:tcBorders>
               <w:bottom w:val="single" w:sz="4" w:space="0" w:color="000000"/>
               <w:right w:val="single" w:sz="4" w:space="0" w:color="000000"/>
@@ -38116,7 +38173,7 @@
         </w:tc>
         <w:tc>
           <w:tcPr>
-            <w:tcW w:w="636" w:type="dxa"/>
+            <w:tcW w:w="635" w:type="dxa"/>
             <w:vMerge w:val="restart"/>
             <w:tcBorders>
               <w:left w:val="single" w:sz="4" w:space="0" w:color="000000"/>
@@ -38404,7 +38461,7 @@
         </w:tc>
         <w:tc>
           <w:tcPr>
-            <w:tcW w:w="876" w:type="dxa"/>
+            <w:tcW w:w="877" w:type="dxa"/>
             <w:tcBorders>
               <w:bottom w:val="single" w:sz="4" w:space="0" w:color="000000"/>
               <w:right w:val="single" w:sz="4" w:space="0" w:color="000000"/>
@@ -38436,7 +38493,7 @@
         </w:tc>
         <w:tc>
           <w:tcPr>
-            <w:tcW w:w="636" w:type="dxa"/>
+            <w:tcW w:w="635" w:type="dxa"/>
             <w:vMerge w:val="continue"/>
             <w:tcBorders>
               <w:left w:val="single" w:sz="4" w:space="0" w:color="000000"/>
@@ -38718,7 +38775,7 @@
         </w:tc>
         <w:tc>
           <w:tcPr>
-            <w:tcW w:w="876" w:type="dxa"/>
+            <w:tcW w:w="877" w:type="dxa"/>
             <w:tcBorders>
               <w:bottom w:val="single" w:sz="4" w:space="0" w:color="000000"/>
               <w:right w:val="single" w:sz="4" w:space="0" w:color="000000"/>
@@ -38750,7 +38807,7 @@
         </w:tc>
         <w:tc>
           <w:tcPr>
-            <w:tcW w:w="636" w:type="dxa"/>
+            <w:tcW w:w="635" w:type="dxa"/>
             <w:vMerge w:val="continue"/>
             <w:tcBorders>
               <w:left w:val="single" w:sz="4" w:space="0" w:color="000000"/>
@@ -39032,7 +39089,7 @@
         </w:tc>
         <w:tc>
           <w:tcPr>
-            <w:tcW w:w="876" w:type="dxa"/>
+            <w:tcW w:w="877" w:type="dxa"/>
             <w:tcBorders>
               <w:bottom w:val="single" w:sz="4" w:space="0" w:color="000000"/>
               <w:right w:val="single" w:sz="4" w:space="0" w:color="000000"/>
@@ -39064,7 +39121,7 @@
         </w:tc>
         <w:tc>
           <w:tcPr>
-            <w:tcW w:w="636" w:type="dxa"/>
+            <w:tcW w:w="635" w:type="dxa"/>
             <w:vMerge w:val="continue"/>
             <w:tcBorders>
               <w:left w:val="single" w:sz="4" w:space="0" w:color="000000"/>
@@ -39346,7 +39403,7 @@
         </w:tc>
         <w:tc>
           <w:tcPr>
-            <w:tcW w:w="876" w:type="dxa"/>
+            <w:tcW w:w="877" w:type="dxa"/>
             <w:tcBorders>
               <w:bottom w:val="single" w:sz="4" w:space="0" w:color="000000"/>
               <w:right w:val="single" w:sz="4" w:space="0" w:color="000000"/>
@@ -39381,7 +39438,7 @@
         </w:tc>
         <w:tc>
           <w:tcPr>
-            <w:tcW w:w="636" w:type="dxa"/>
+            <w:tcW w:w="635" w:type="dxa"/>
             <w:vMerge w:val="continue"/>
             <w:tcBorders>
               <w:left w:val="single" w:sz="4" w:space="0" w:color="000000"/>
@@ -39663,7 +39720,7 @@
         </w:tc>
         <w:tc>
           <w:tcPr>
-            <w:tcW w:w="876" w:type="dxa"/>
+            <w:tcW w:w="877" w:type="dxa"/>
             <w:tcBorders>
               <w:bottom w:val="single" w:sz="4" w:space="0" w:color="000000"/>
               <w:right w:val="single" w:sz="4" w:space="0" w:color="000000"/>
@@ -39695,7 +39752,7 @@
         </w:tc>
         <w:tc>
           <w:tcPr>
-            <w:tcW w:w="636" w:type="dxa"/>
+            <w:tcW w:w="635" w:type="dxa"/>
             <w:vMerge w:val="continue"/>
             <w:tcBorders>
               <w:left w:val="single" w:sz="4" w:space="0" w:color="000000"/>
@@ -40065,7 +40122,7 @@
         </w:tc>
         <w:tc>
           <w:tcPr>
-            <w:tcW w:w="876" w:type="dxa"/>
+            <w:tcW w:w="877" w:type="dxa"/>
             <w:tcBorders>
               <w:bottom w:val="single" w:sz="4" w:space="0" w:color="000000"/>
               <w:right w:val="single" w:sz="4" w:space="0" w:color="000000"/>
@@ -40097,7 +40154,7 @@
         </w:tc>
         <w:tc>
           <w:tcPr>
-            <w:tcW w:w="636" w:type="dxa"/>
+            <w:tcW w:w="635" w:type="dxa"/>
             <w:vMerge w:val="restart"/>
             <w:tcBorders>
               <w:left w:val="single" w:sz="4" w:space="0" w:color="000000"/>
@@ -40385,7 +40442,7 @@
         </w:tc>
         <w:tc>
           <w:tcPr>
-            <w:tcW w:w="876" w:type="dxa"/>
+            <w:tcW w:w="877" w:type="dxa"/>
             <w:tcBorders>
               <w:bottom w:val="single" w:sz="4" w:space="0" w:color="000000"/>
               <w:right w:val="single" w:sz="4" w:space="0" w:color="000000"/>
@@ -40417,7 +40474,7 @@
         </w:tc>
         <w:tc>
           <w:tcPr>
-            <w:tcW w:w="636" w:type="dxa"/>
+            <w:tcW w:w="635" w:type="dxa"/>
             <w:vMerge w:val="continue"/>
             <w:tcBorders>
               <w:left w:val="single" w:sz="4" w:space="0" w:color="000000"/>
@@ -40699,7 +40756,7 @@
         </w:tc>
         <w:tc>
           <w:tcPr>
-            <w:tcW w:w="876" w:type="dxa"/>
+            <w:tcW w:w="877" w:type="dxa"/>
             <w:tcBorders>
               <w:bottom w:val="single" w:sz="4" w:space="0" w:color="000000"/>
               <w:right w:val="single" w:sz="4" w:space="0" w:color="000000"/>
@@ -40731,7 +40788,7 @@
         </w:tc>
         <w:tc>
           <w:tcPr>
-            <w:tcW w:w="636" w:type="dxa"/>
+            <w:tcW w:w="635" w:type="dxa"/>
             <w:vMerge w:val="continue"/>
             <w:tcBorders>
               <w:left w:val="single" w:sz="4" w:space="0" w:color="000000"/>
@@ -41132,7 +41189,7 @@
         </w:tc>
         <w:tc>
           <w:tcPr>
-            <w:tcW w:w="876" w:type="dxa"/>
+            <w:tcW w:w="877" w:type="dxa"/>
             <w:tcBorders>
               <w:bottom w:val="single" w:sz="4" w:space="0" w:color="000000"/>
               <w:right w:val="single" w:sz="4" w:space="0" w:color="000000"/>
@@ -41164,7 +41221,7 @@
         </w:tc>
         <w:tc>
           <w:tcPr>
-            <w:tcW w:w="636" w:type="dxa"/>
+            <w:tcW w:w="635" w:type="dxa"/>
             <w:tcBorders>
               <w:bottom w:val="single" w:sz="4" w:space="0" w:color="000000"/>
               <w:right w:val="single" w:sz="4" w:space="0" w:color="000000"/>
@@ -41451,7 +41508,7 @@
         </w:tc>
         <w:tc>
           <w:tcPr>
-            <w:tcW w:w="876" w:type="dxa"/>
+            <w:tcW w:w="877" w:type="dxa"/>
             <w:tcBorders>
               <w:bottom w:val="single" w:sz="4" w:space="0" w:color="000000"/>
               <w:right w:val="single" w:sz="4" w:space="0" w:color="000000"/>
@@ -41483,7 +41540,7 @@
         </w:tc>
         <w:tc>
           <w:tcPr>
-            <w:tcW w:w="636" w:type="dxa"/>
+            <w:tcW w:w="635" w:type="dxa"/>
             <w:vMerge w:val="restart"/>
             <w:tcBorders>
               <w:left w:val="single" w:sz="4" w:space="0" w:color="000000"/>
@@ -41766,7 +41823,7 @@
         </w:tc>
         <w:tc>
           <w:tcPr>
-            <w:tcW w:w="876" w:type="dxa"/>
+            <w:tcW w:w="877" w:type="dxa"/>
             <w:tcBorders>
               <w:bottom w:val="single" w:sz="4" w:space="0" w:color="000000"/>
               <w:right w:val="single" w:sz="4" w:space="0" w:color="000000"/>
@@ -41798,7 +41855,7 @@
         </w:tc>
         <w:tc>
           <w:tcPr>
-            <w:tcW w:w="636" w:type="dxa"/>
+            <w:tcW w:w="635" w:type="dxa"/>
             <w:vMerge w:val="continue"/>
             <w:tcBorders>
               <w:left w:val="single" w:sz="4" w:space="0" w:color="000000"/>
@@ -42083,7 +42140,7 @@
         </w:tc>
         <w:tc>
           <w:tcPr>
-            <w:tcW w:w="876" w:type="dxa"/>
+            <w:tcW w:w="877" w:type="dxa"/>
             <w:tcBorders>
               <w:bottom w:val="single" w:sz="4" w:space="0" w:color="000000"/>
               <w:right w:val="single" w:sz="4" w:space="0" w:color="000000"/>
@@ -42115,7 +42172,7 @@
         </w:tc>
         <w:tc>
           <w:tcPr>
-            <w:tcW w:w="636" w:type="dxa"/>
+            <w:tcW w:w="635" w:type="dxa"/>
             <w:tcBorders>
               <w:bottom w:val="single" w:sz="4" w:space="0" w:color="000000"/>
               <w:right w:val="single" w:sz="4" w:space="0" w:color="000000"/>
@@ -42402,7 +42459,7 @@
         </w:tc>
         <w:tc>
           <w:tcPr>
-            <w:tcW w:w="876" w:type="dxa"/>
+            <w:tcW w:w="877" w:type="dxa"/>
             <w:tcBorders>
               <w:bottom w:val="single" w:sz="4" w:space="0" w:color="000000"/>
               <w:right w:val="single" w:sz="4" w:space="0" w:color="000000"/>
@@ -42434,7 +42491,7 @@
         </w:tc>
         <w:tc>
           <w:tcPr>
-            <w:tcW w:w="636" w:type="dxa"/>
+            <w:tcW w:w="635" w:type="dxa"/>
             <w:vMerge w:val="restart"/>
             <w:tcBorders>
               <w:left w:val="single" w:sz="4" w:space="0" w:color="000000"/>
@@ -42717,7 +42774,7 @@
         </w:tc>
         <w:tc>
           <w:tcPr>
-            <w:tcW w:w="876" w:type="dxa"/>
+            <w:tcW w:w="877" w:type="dxa"/>
             <w:tcBorders>
               <w:bottom w:val="single" w:sz="4" w:space="0" w:color="000000"/>
               <w:right w:val="single" w:sz="4" w:space="0" w:color="000000"/>
@@ -42749,7 +42806,7 @@
         </w:tc>
         <w:tc>
           <w:tcPr>
-            <w:tcW w:w="636" w:type="dxa"/>
+            <w:tcW w:w="635" w:type="dxa"/>
             <w:vMerge w:val="continue"/>
             <w:tcBorders>
               <w:left w:val="single" w:sz="4" w:space="0" w:color="000000"/>
@@ -43026,7 +43083,7 @@
         </w:tc>
         <w:tc>
           <w:tcPr>
-            <w:tcW w:w="876" w:type="dxa"/>
+            <w:tcW w:w="877" w:type="dxa"/>
             <w:tcBorders>
               <w:bottom w:val="single" w:sz="4" w:space="0" w:color="000000"/>
               <w:right w:val="single" w:sz="4" w:space="0" w:color="000000"/>
@@ -43058,7 +43115,7 @@
         </w:tc>
         <w:tc>
           <w:tcPr>
-            <w:tcW w:w="636" w:type="dxa"/>
+            <w:tcW w:w="635" w:type="dxa"/>
             <w:vMerge w:val="continue"/>
             <w:tcBorders>
               <w:left w:val="single" w:sz="4" w:space="0" w:color="000000"/>
@@ -43346,7 +43403,7 @@
         </w:tc>
         <w:tc>
           <w:tcPr>
-            <w:tcW w:w="876" w:type="dxa"/>
+            <w:tcW w:w="877" w:type="dxa"/>
             <w:tcBorders>
               <w:bottom w:val="single" w:sz="4" w:space="0" w:color="000000"/>
               <w:right w:val="single" w:sz="4" w:space="0" w:color="000000"/>
@@ -43378,7 +43435,7 @@
         </w:tc>
         <w:tc>
           <w:tcPr>
-            <w:tcW w:w="636" w:type="dxa"/>
+            <w:tcW w:w="635" w:type="dxa"/>
             <w:vMerge w:val="continue"/>
             <w:tcBorders>
               <w:left w:val="single" w:sz="4" w:space="0" w:color="000000"/>
@@ -43663,7 +43720,7 @@
         </w:tc>
         <w:tc>
           <w:tcPr>
-            <w:tcW w:w="876" w:type="dxa"/>
+            <w:tcW w:w="877" w:type="dxa"/>
             <w:tcBorders>
               <w:bottom w:val="single" w:sz="4" w:space="0" w:color="000000"/>
               <w:right w:val="single" w:sz="4" w:space="0" w:color="000000"/>
@@ -43695,7 +43752,7 @@
         </w:tc>
         <w:tc>
           <w:tcPr>
-            <w:tcW w:w="636" w:type="dxa"/>
+            <w:tcW w:w="635" w:type="dxa"/>
             <w:tcBorders>
               <w:bottom w:val="single" w:sz="4" w:space="0" w:color="000000"/>
               <w:right w:val="single" w:sz="4" w:space="0" w:color="000000"/>
@@ -43982,7 +44039,7 @@
         </w:tc>
         <w:tc>
           <w:tcPr>
-            <w:tcW w:w="876" w:type="dxa"/>
+            <w:tcW w:w="877" w:type="dxa"/>
             <w:tcBorders>
               <w:bottom w:val="single" w:sz="4" w:space="0" w:color="000000"/>
               <w:right w:val="single" w:sz="4" w:space="0" w:color="000000"/>
@@ -44014,7 +44071,7 @@
         </w:tc>
         <w:tc>
           <w:tcPr>
-            <w:tcW w:w="636" w:type="dxa"/>
+            <w:tcW w:w="635" w:type="dxa"/>
             <w:tcBorders>
               <w:bottom w:val="single" w:sz="4" w:space="0" w:color="000000"/>
               <w:right w:val="single" w:sz="4" w:space="0" w:color="000000"/>
@@ -44326,7 +44383,7 @@
         </w:tc>
         <w:tc>
           <w:tcPr>
-            <w:tcW w:w="876" w:type="dxa"/>
+            <w:tcW w:w="877" w:type="dxa"/>
             <w:tcBorders>
               <w:bottom w:val="single" w:sz="4" w:space="0" w:color="000000"/>
               <w:right w:val="single" w:sz="4" w:space="0" w:color="000000"/>
@@ -44358,7 +44415,7 @@
         </w:tc>
         <w:tc>
           <w:tcPr>
-            <w:tcW w:w="636" w:type="dxa"/>
+            <w:tcW w:w="635" w:type="dxa"/>
             <w:vMerge w:val="restart"/>
             <w:tcBorders>
               <w:left w:val="single" w:sz="4" w:space="0" w:color="000000"/>
@@ -44646,7 +44703,7 @@
         </w:tc>
         <w:tc>
           <w:tcPr>
-            <w:tcW w:w="876" w:type="dxa"/>
+            <w:tcW w:w="877" w:type="dxa"/>
             <w:tcBorders>
               <w:bottom w:val="single" w:sz="4" w:space="0" w:color="000000"/>
               <w:right w:val="single" w:sz="4" w:space="0" w:color="000000"/>
@@ -44678,7 +44735,7 @@
         </w:tc>
         <w:tc>
           <w:tcPr>
-            <w:tcW w:w="636" w:type="dxa"/>
+            <w:tcW w:w="635" w:type="dxa"/>
             <w:vMerge w:val="continue"/>
             <w:tcBorders>
               <w:left w:val="single" w:sz="4" w:space="0" w:color="000000"/>
@@ -44960,7 +45017,7 @@
         </w:tc>
         <w:tc>
           <w:tcPr>
-            <w:tcW w:w="876" w:type="dxa"/>
+            <w:tcW w:w="877" w:type="dxa"/>
             <w:tcBorders>
               <w:bottom w:val="single" w:sz="4" w:space="0" w:color="000000"/>
               <w:right w:val="single" w:sz="4" w:space="0" w:color="000000"/>
@@ -44992,7 +45049,7 @@
         </w:tc>
         <w:tc>
           <w:tcPr>
-            <w:tcW w:w="636" w:type="dxa"/>
+            <w:tcW w:w="635" w:type="dxa"/>
             <w:vMerge w:val="continue"/>
             <w:tcBorders>
               <w:left w:val="single" w:sz="4" w:space="0" w:color="000000"/>
@@ -45193,13 +45250,13 @@
         <w:rPr/>
         <w:t xml:space="preserve"> agg. může zahrnovat i významné a vzácné taxony </w:t>
       </w:r>
-      <w:del w:id="81" w:author="Martin Vojík" w:date="2024-09-04T11:57:00Z">
+      <w:del w:id="85" w:author="Martin Vojík" w:date="2024-09-04T11:57:00Z">
         <w:r>
           <w:rPr/>
           <w:delText>(např.</w:delText>
         </w:r>
       </w:del>
-      <w:ins w:id="82" w:author="Martin Vojík" w:date="2024-09-04T11:57:00Z">
+      <w:ins w:id="86" w:author="Martin Vojík" w:date="2024-09-04T11:57:00Z">
         <w:r>
           <w:rPr/>
           <w:t>–</w:t>
@@ -45249,13 +45306,13 @@
         <w:rPr/>
         <w:t>), které nevykazují expanzní aktivitu, ba naopak, může se jednat o druhy end</w:t>
       </w:r>
-      <w:ins w:id="83" w:author="Martin Vojík" w:date="2024-09-04T11:58:00Z">
+      <w:ins w:id="87" w:author="Martin Vojík" w:date="2024-09-04T11:58:00Z">
         <w:r>
           <w:rPr/>
           <w:t>e</w:t>
         </w:r>
       </w:ins>
-      <w:del w:id="84" w:author="Martin Vojík" w:date="2024-09-04T11:58:00Z">
+      <w:del w:id="88" w:author="Martin Vojík" w:date="2024-09-04T11:58:00Z">
         <w:r>
           <w:rPr/>
           <w:delText>e</w:delText>
@@ -51454,7 +51511,63 @@
       </w:r>
     </w:p>
   </w:comment>
-  <w:comment w:id="2" w:author="Jakub Rataj" w:date="2026-01-20T11:18:28Z" w:initials="JR">
+  <w:comment w:id="2" w:author="Jakub Rataj" w:date="2026-02-05T12:35:29Z" w:initials="JR">
+    <w:p>
+      <w:r>
+        <w:rPr>
+          <w:rFonts w:eastAsia="Calibri" w:cstheme="minorBidi" w:eastAsiaTheme="minorHAnsi" w:cs="" w:ascii="Calibri" w:hAnsi="Calibri"/>
+          <w:b w:val="false"/>
+          <w:bCs w:val="false"/>
+          <w:i/>
+          <w:iCs w:val="false"/>
+          <w:caps w:val="false"/>
+          <w:smallCaps w:val="false"/>
+          <w:strike w:val="false"/>
+          <w:dstrike w:val="false"/>
+          <w:outline w:val="false"/>
+          <w:shadow w:val="false"/>
+          <w:emboss w:val="false"/>
+          <w:imprint w:val="false"/>
+          <w:color w:val="auto"/>
+          <w:spacing w:val="0"/>
+          <w:w w:val="100"/>
+          <w:kern w:val="0"/>
+          <w:position w:val="0"/>
+          <w:sz w:val="16"/>
+          <w:sz w:val="16"/>
+          <w:szCs w:val="22"/>
+          <w:u w:val="none"/>
+          <w:vertAlign w:val="baseline"/>
+          <w:em w:val="none"/>
+          <w:lang w:bidi="ar-SA" w:eastAsia="en-US" w:val="cs-CZ"/>
+        </w:rPr>
+        <w:t>Reply to Martin Vojík (04/09/2024, 13:23): "..."</w:t>
+      </w:r>
+    </w:p>
+    <w:p>
+      <w:r>
+        <w:rPr>
+          <w:rFonts w:ascii="Liberation Serif" w:hAnsi="Liberation Serif" w:eastAsia="DejaVu Sans" w:cs="DejaVu Sans"/>
+          <w:sz w:val="20"/>
+          <w:szCs w:val="24"/>
+          <w:lang w:bidi="ar-SA" w:eastAsia="en-US" w:val="cs-CZ"/>
+        </w:rPr>
+        <w:t>vzdy vyuzita posledni verze redlistu a kriterii IUCN</w:t>
+      </w:r>
+    </w:p>
+    <w:p>
+      <w:r>
+        <w:rPr>
+          <w:rFonts w:ascii="Liberation Serif" w:hAnsi="Liberation Serif" w:eastAsia="DejaVu Sans" w:cs="DejaVu Sans"/>
+          <w:sz w:val="20"/>
+          <w:szCs w:val="24"/>
+          <w:lang w:bidi="ar-SA" w:eastAsia="en-US" w:val="cs-CZ"/>
+        </w:rPr>
+        <w:t>aktualni je grulich 2017</w:t>
+      </w:r>
+    </w:p>
+  </w:comment>
+  <w:comment w:id="3" w:author="Jakub Rataj" w:date="2026-01-20T11:18:28Z" w:initials="JR">
     <w:p>
       <w:r>
         <w:rPr>
@@ -51488,7 +51601,7 @@
       </w:r>
     </w:p>
   </w:comment>
-  <w:comment w:id="3" w:author="Martin Vojík" w:date="2024-09-03T14:36:00Z" w:initials="MV">
+  <w:comment w:id="4" w:author="Martin Vojík" w:date="2024-09-03T14:36:00Z" w:initials="MV">
     <w:p>
       <w:r>
         <w:rPr>
@@ -51501,11 +51614,11 @@
       </w:r>
     </w:p>
   </w:comment>
-  <w:comment w:id="4" w:author="Jakub Rataj" w:date="2026-02-04T15:14:28Z" w:initials="JR">
+  <w:comment w:id="5" w:author="Jakub Rataj" w:date="2026-02-04T15:14:28Z" w:initials="JR">
     <w:p>
       <w:r>
         <w:rPr>
-          <w:rFonts w:eastAsia="Calibri" w:cstheme="minorBidi" w:eastAsiaTheme="minorHAnsi" w:cs="" w:ascii="Calibri" w:hAnsi="Calibri"/>
+          <w:rFonts w:ascii="Calibri" w:hAnsi="Calibri" w:eastAsia="Calibri" w:cs=""/>
           <w:b w:val="false"/>
           <w:bCs w:val="false"/>
           <w:i/>
@@ -51529,7 +51642,7 @@
           <w:u w:val="none"/>
           <w:vertAlign w:val="baseline"/>
           <w:em w:val="none"/>
-          <w:lang w:bidi="ar-SA" w:eastAsia="en-US" w:val="cs-CZ"/>
+          <w:lang w:val="cs-CZ" w:eastAsia="en-US" w:bidi="ar-SA"/>
         </w:rPr>
         <w:t>Reply to Martin Vojík (03/09/2024, 14:36): "..."</w:t>
       </w:r>
@@ -51540,7 +51653,7 @@
           <w:rFonts w:ascii="Liberation Serif" w:hAnsi="Liberation Serif" w:eastAsia="DejaVu Sans" w:cs="DejaVu Sans"/>
           <w:sz w:val="20"/>
           <w:szCs w:val="24"/>
-          <w:lang w:bidi="ar-SA" w:eastAsia="en-US" w:val="cs-CZ"/>
+          <w:lang w:val="cs-CZ" w:eastAsia="en-US" w:bidi="ar-SA"/>
         </w:rPr>
         <w:t>dle kódu platí. navíc i opačným směrem (5% nárůst vede na hodnocení zlepšující se). v interpretačním klíči chybí</w:t>
       </w:r>
@@ -51553,10 +51666,53 @@
           <w:szCs w:val="24"/>
           <w:lang w:val="en-US" w:eastAsia="en-US" w:bidi="en-US"/>
         </w:rPr>
+        <w:br/>
+      </w:r>
+      <w:r>
+        <w:rPr>
+          <w:rFonts w:ascii="Liberation Serif" w:hAnsi="Liberation Serif" w:eastAsia="DejaVu Sans" w:cs="DejaVu Sans"/>
+          <w:sz w:val="24"/>
+          <w:szCs w:val="24"/>
+          <w:lang w:val="en-US" w:eastAsia="en-US" w:bidi="en-US"/>
+        </w:rPr>
+        <w:t>doplnit větu o cílovém stavu a vztahu tohoto stavu k toleranci  5%</w:t>
       </w:r>
     </w:p>
   </w:comment>
-  <w:comment w:id="5" w:author="Martin Vojík" w:date="2024-09-04T10:48:00Z" w:initials="MV">
+  <w:comment w:id="6" w:author="Jakub Rataj" w:date="2026-02-05T12:41:50Z" w:initials="JR">
+    <w:p>
+      <w:r>
+        <w:rPr>
+          <w:rFonts w:eastAsia="Calibri" w:cstheme="minorBidi" w:eastAsiaTheme="minorHAnsi" w:cs="" w:ascii="Calibri" w:hAnsi="Calibri"/>
+          <w:b w:val="false"/>
+          <w:bCs w:val="false"/>
+          <w:i w:val="false"/>
+          <w:iCs w:val="false"/>
+          <w:caps w:val="false"/>
+          <w:smallCaps w:val="false"/>
+          <w:strike w:val="false"/>
+          <w:dstrike w:val="false"/>
+          <w:outline w:val="false"/>
+          <w:shadow w:val="false"/>
+          <w:emboss w:val="false"/>
+          <w:imprint w:val="false"/>
+          <w:color w:val="auto"/>
+          <w:spacing w:val="0"/>
+          <w:w w:val="100"/>
+          <w:kern w:val="0"/>
+          <w:position w:val="0"/>
+          <w:sz w:val="20"/>
+          <w:szCs w:val="22"/>
+          <w:u w:val="none"/>
+          <w:vertAlign w:val="baseline"/>
+          <w:em w:val="none"/>
+          <w:lang w:bidi="ar-SA" w:eastAsia="en-US" w:val="cs-CZ"/>
+        </w:rPr>
+        <w:t>také doplnit povídání o trendu, viz rozloha</w:t>
+      </w:r>
+    </w:p>
+  </w:comment>
+  <w:comment w:id="7" w:author="Martin Vojík" w:date="2024-09-04T10:48:00Z" w:initials="MV">
     <w:p>
       <w:r>
         <w:rPr>
@@ -51569,7 +51725,7 @@
       </w:r>
     </w:p>
   </w:comment>
-  <w:comment w:id="6" w:author="Unknown Author" w:date="2026-01-07T15:02:07Z" w:initials="">
+  <w:comment w:id="8" w:author="Unknown Author" w:date="2026-01-07T15:02:07Z" w:initials="">
     <w:p>
       <w:r>
         <w:rPr>
@@ -51603,7 +51759,7 @@
       </w:r>
     </w:p>
   </w:comment>
-  <w:comment w:id="7" w:author="Jakub Rataj" w:date="2026-01-07T15:03:01Z" w:initials="JR">
+  <w:comment w:id="9" w:author="Jakub Rataj" w:date="2026-01-07T15:03:01Z" w:initials="JR">
     <w:p>
       <w:r>
         <w:rPr>
@@ -51637,7 +51793,7 @@
       </w:r>
     </w:p>
   </w:comment>
-  <w:comment w:id="8" w:author="Martin Vojík" w:date="2024-09-04T10:29:00Z" w:initials="MV">
+  <w:comment w:id="10" w:author="Martin Vojík" w:date="2024-09-04T10:29:00Z" w:initials="MV">
     <w:p>
       <w:r>
         <w:rPr>
@@ -51650,7 +51806,7 @@
       </w:r>
     </w:p>
   </w:comment>
-  <w:comment w:id="10" w:author="Martin Vojík" w:date="2024-09-04T09:09:00Z" w:initials="MV">
+  <w:comment w:id="12" w:author="Martin Vojík" w:date="2024-09-04T09:09:00Z" w:initials="MV">
     <w:p>
       <w:r>
         <w:rPr>
@@ -51663,7 +51819,7 @@
       </w:r>
     </w:p>
   </w:comment>
-  <w:comment w:id="9" w:author="Martin Vojík" w:date="2024-09-04T09:07:00Z" w:initials="MV">
+  <w:comment w:id="11" w:author="Martin Vojík" w:date="2024-09-04T09:07:00Z" w:initials="MV">
     <w:p>
       <w:r>
         <w:rPr>
@@ -51676,7 +51832,7 @@
       </w:r>
     </w:p>
   </w:comment>
-  <w:comment w:id="11" w:author="Jakub Rataj" w:date="2026-01-29T14:35:59Z" w:initials="JR">
+  <w:comment w:id="13" w:author="Jakub Rataj" w:date="2026-01-29T14:35:59Z" w:initials="JR">
     <w:p>
       <w:r>
         <w:rPr>
@@ -51710,7 +51866,7 @@
       </w:r>
     </w:p>
   </w:comment>
-  <w:comment w:id="12" w:author="Jakub Rataj" w:date="2026-01-29T14:37:59Z" w:initials="JR">
+  <w:comment w:id="14" w:author="Jakub Rataj" w:date="2026-01-29T14:37:59Z" w:initials="JR">
     <w:p>
       <w:r>
         <w:rPr>
@@ -51740,11 +51896,11 @@
           <w:em w:val="none"/>
           <w:lang w:val="cs-CZ" w:eastAsia="en-US" w:bidi="ar-SA"/>
         </w:rPr>
-        <w:t>ve formuli je jenom jako „plocha stanoviště“</w:t>
+        <w:t>ve formuli je jenom jako „plocha stanoviště“, nahradit Vb?</w:t>
       </w:r>
     </w:p>
   </w:comment>
-  <w:comment w:id="13" w:author="Jakub Rataj" w:date="2026-01-07T16:08:22Z" w:initials="JR">
+  <w:comment w:id="15" w:author="Jakub Rataj" w:date="2026-01-07T16:08:22Z" w:initials="JR">
     <w:p>
       <w:r>
         <w:rPr>
@@ -51777,8 +51933,49 @@
         <w:t>vzorec: v kódu chybí začátek rovnice 100-…</w:t>
       </w:r>
     </w:p>
+    <w:p>
+      <w:r>
+        <w:rPr>
+          <w:rFonts w:ascii="Liberation Serif" w:hAnsi="Liberation Serif" w:eastAsia="DejaVu Sans" w:cs="DejaVu Sans"/>
+          <w:sz w:val="24"/>
+          <w:szCs w:val="24"/>
+          <w:lang w:val="en-US" w:eastAsia="en-US" w:bidi="en-US"/>
+        </w:rPr>
+      </w:r>
+    </w:p>
+    <w:p>
+      <w:r>
+        <w:rPr>
+          <w:rFonts w:cs="" w:eastAsia="Calibri" w:ascii="Calibri" w:hAnsi="Calibri"/>
+          <w:b w:val="false"/>
+          <w:bCs w:val="false"/>
+          <w:i w:val="false"/>
+          <w:iCs w:val="false"/>
+          <w:caps w:val="false"/>
+          <w:smallCaps w:val="false"/>
+          <w:strike w:val="false"/>
+          <w:dstrike w:val="false"/>
+          <w:outline w:val="false"/>
+          <w:shadow w:val="false"/>
+          <w:emboss w:val="false"/>
+          <w:imprint w:val="false"/>
+          <w:color w:val="auto"/>
+          <w:spacing w:val="0"/>
+          <w:w w:val="100"/>
+          <w:kern w:val="0"/>
+          <w:position w:val="0"/>
+          <w:sz w:val="20"/>
+          <w:szCs w:val="22"/>
+          <w:u w:val="none"/>
+          <w:vertAlign w:val="baseline"/>
+          <w:em w:val="none"/>
+          <w:lang w:val="cs-CZ" w:bidi="ar-SA" w:eastAsia="en-US"/>
+        </w:rPr>
+        <w:t>spravne je kod</w:t>
+      </w:r>
+    </w:p>
   </w:comment>
-  <w:comment w:id="14" w:author="Jakub Rataj" w:date="2026-01-29T15:05:44Z" w:initials="JR">
+  <w:comment w:id="16" w:author="Jakub Rataj" w:date="2026-01-29T15:05:44Z" w:initials="JR">
     <w:p>
       <w:r>
         <w:rPr>
@@ -51812,7 +52009,7 @@
       </w:r>
     </w:p>
   </w:comment>
-  <w:comment w:id="15" w:author="Martin Vojík" w:date="2024-09-04T10:24:00Z" w:initials="MV">
+  <w:comment w:id="17" w:author="Martin Vojík" w:date="2024-09-04T10:24:00Z" w:initials="MV">
     <w:p>
       <w:r>
         <w:rPr>
@@ -51825,7 +52022,7 @@
       </w:r>
     </w:p>
   </w:comment>
-  <w:comment w:id="16" w:author="Martin Vojík" w:date="2024-09-04T10:24:00Z" w:initials="MV">
+  <w:comment w:id="18" w:author="Martin Vojík" w:date="2024-09-04T10:24:00Z" w:initials="MV">
     <w:p>
       <w:r>
         <w:rPr>
@@ -51838,11 +52035,11 @@
       </w:r>
     </w:p>
   </w:comment>
-  <w:comment w:id="17" w:author="Jakub Rataj" w:date="2026-02-04T16:48:13Z" w:initials="JR">
+  <w:comment w:id="19" w:author="Jakub Rataj" w:date="2026-02-04T16:48:13Z" w:initials="JR">
     <w:p>
       <w:r>
         <w:rPr>
-          <w:rFonts w:eastAsia="Calibri" w:cstheme="minorBidi" w:eastAsiaTheme="minorHAnsi" w:cs="" w:ascii="Calibri" w:hAnsi="Calibri"/>
+          <w:rFonts w:ascii="Calibri" w:hAnsi="Calibri" w:eastAsia="Calibri" w:cs=""/>
           <w:b w:val="false"/>
           <w:bCs w:val="false"/>
           <w:i/>
@@ -51866,7 +52063,7 @@
           <w:u w:val="none"/>
           <w:vertAlign w:val="baseline"/>
           <w:em w:val="none"/>
-          <w:lang w:bidi="ar-SA" w:eastAsia="en-US" w:val="cs-CZ"/>
+          <w:lang w:val="cs-CZ" w:eastAsia="en-US" w:bidi="ar-SA"/>
         </w:rPr>
         <w:t>Reply to Martin Vojík (04/09/2024, 10:24): "..."</w:t>
       </w:r>
@@ -51877,7 +52074,7 @@
           <w:rFonts w:ascii="Liberation Serif" w:hAnsi="Liberation Serif" w:eastAsia="DejaVu Sans" w:cs="DejaVu Sans"/>
           <w:sz w:val="20"/>
           <w:szCs w:val="24"/>
-          <w:lang w:bidi="ar-SA" w:eastAsia="en-US" w:val="cs-CZ"/>
+          <w:lang w:val="cs-CZ" w:eastAsia="en-US" w:bidi="ar-SA"/>
         </w:rPr>
         <w:t>v interpretačním manuálu tohle vůbec nevidím, každopádně bych tuto věto nahradil tabulkou</w:t>
       </w:r>
@@ -51892,8 +52089,17 @@
         </w:rPr>
       </w:r>
     </w:p>
-  </w:comment>
-  <w:comment w:id="19" w:author="Martin Vojík" w:date="2024-09-04T10:26:00Z" w:initials="MV">
+    <w:p>
+      <w:r>
+        <w:rPr>
+          <w:rFonts w:ascii="Liberation Serif" w:hAnsi="Liberation Serif" w:eastAsia="DejaVu Sans" w:cs="DejaVu Sans"/>
+          <w:sz w:val="20"/>
+          <w:szCs w:val="24"/>
+          <w:lang w:val="cs-CZ" w:eastAsia="en-US" w:bidi="ar-SA"/>
+        </w:rPr>
+        <w:t>ano, nahradit tabulkou, včetně MD</w:t>
+      </w:r>
+    </w:p>
     <w:p>
       <w:r>
         <w:rPr>
@@ -51902,11 +52108,23 @@
           <w:szCs w:val="24"/>
           <w:lang w:val="en-US" w:eastAsia="en-US" w:bidi="en-US"/>
         </w:rPr>
-        <w:t>Chceme zde mít nějaké ty příklady z interpetačního manuálu či nikoli?</w:t>
       </w:r>
     </w:p>
   </w:comment>
-  <w:comment w:id="18" w:author="Martin Vojík" w:date="2024-09-04T12:27:00Z" w:initials="MV">
+  <w:comment w:id="21" w:author="Martin Vojík" w:date="2024-09-04T10:26:00Z" w:initials="MV">
+    <w:p>
+      <w:r>
+        <w:rPr>
+          <w:rFonts w:ascii="Liberation Serif" w:hAnsi="Liberation Serif" w:eastAsia="DejaVu Sans" w:cs="DejaVu Sans"/>
+          <w:sz w:val="24"/>
+          <w:szCs w:val="24"/>
+          <w:lang w:val="en-US" w:eastAsia="en-US" w:bidi="en-US"/>
+        </w:rPr>
+        <w:t>Chceme zde mít nějaké ty příklady z interpetačního manuálu či nikoli?</w:t>
+      </w:r>
+    </w:p>
+  </w:comment>
+  <w:comment w:id="20" w:author="Martin Vojík" w:date="2024-09-04T12:27:00Z" w:initials="MV">
     <w:p>
       <w:r>
         <w:rPr>
@@ -51990,25 +52208,25 @@
         <w:rPr/>
         <w:t>Lustyk P. (20</w:t>
       </w:r>
-      <w:ins w:id="86" w:author="Martin Vojík" w:date="2024-09-04T12:28:00Z">
+      <w:ins w:id="90" w:author="Martin Vojík" w:date="2024-09-04T12:28:00Z">
         <w:r>
           <w:rPr/>
           <w:t>24</w:t>
         </w:r>
       </w:ins>
-      <w:del w:id="87" w:author="Martin Vojík" w:date="2024-09-04T13:14:00Z">
+      <w:del w:id="91" w:author="Martin Vojík" w:date="2024-09-04T13:14:00Z">
         <w:r>
           <w:rPr/>
           <w:delText>16): Metodika aktualizace vrstvy mapování biotopů, pracovní verze pro sezónu 20</w:delText>
         </w:r>
       </w:del>
-      <w:ins w:id="88" w:author="Martin Vojík" w:date="2024-09-04T12:28:00Z">
+      <w:ins w:id="92" w:author="Martin Vojík" w:date="2024-09-04T12:28:00Z">
         <w:r>
           <w:rPr/>
           <w:t>24</w:t>
         </w:r>
       </w:ins>
-      <w:del w:id="89" w:author="Martin Vojík" w:date="2024-09-04T13:14:00Z">
+      <w:del w:id="93" w:author="Martin Vojík" w:date="2024-09-04T13:14:00Z">
         <w:r>
           <w:rPr/>
           <w:delText>16. – Ms., 33 p. [Depon in: Agentura ochrany přírody a krajiny ČR, Praha]</w:delText>
@@ -52021,7 +52239,7 @@
       <w:pPr>
         <w:pStyle w:val="Footnote"/>
         <w:rPr>
-          <w:del w:id="90" w:author="Martin Vojík" w:date="2024-09-04T13:14:00Z"/>
+          <w:del w:id="94" w:author="Martin Vojík" w:date="2024-09-04T13:14:00Z"/>
         </w:rPr>
       </w:pPr>
       <w:r>
@@ -52044,7 +52262,7 @@
         <w:pStyle w:val="Footnote"/>
         <w:rPr/>
       </w:pPr>
-      <w:del w:id="91" w:author="Martin Vojík" w:date="2024-09-04T13:14:00Z">
+      <w:del w:id="95" w:author="Martin Vojík" w:date="2024-09-04T13:14:00Z">
         <w:r>
           <w:rPr/>
           <w:delText>Chytrý M., Kučera T., Kočí M., Grulich V. &amp; Lustyk P. [eds] (2010): Katalog biotopů České republiky, Ed. 2. – Agentura ochrany přírody a krajiny ČR, Praha.</w:delText>
@@ -52072,13 +52290,13 @@
         <w:rPr/>
         <w:t>Lustyk P. [ed.] (20</w:t>
       </w:r>
-      <w:ins w:id="92" w:author="Martin Vojík" w:date="2024-09-04T12:25:00Z">
+      <w:ins w:id="96" w:author="Martin Vojík" w:date="2024-09-04T12:25:00Z">
         <w:r>
           <w:rPr/>
           <w:t>24</w:t>
         </w:r>
       </w:ins>
-      <w:del w:id="93" w:author="Martin Vojík" w:date="2024-09-04T13:15:00Z">
+      <w:del w:id="97" w:author="Martin Vojík" w:date="2024-09-04T13:15:00Z">
         <w:r>
           <w:rPr/>
           <w:delText>15): Příručka hodnocení biotopů. – Ms., 540 p. [Depon in: Agentura ochrany přírody a krajiny ČR, Praha]</w:delText>
@@ -52251,13 +52469,13 @@
         <w:rPr/>
         <w:t xml:space="preserve">Zde je myšlena mozaika segmentů či polygonů v rámci EVL, nikoliv mozaikovité segmenty </w:t>
       </w:r>
-      <w:del w:id="94" w:author="Martin Vojík" w:date="2024-09-04T09:10:00Z">
+      <w:del w:id="98" w:author="Martin Vojík" w:date="2024-09-04T09:10:00Z">
         <w:r>
           <w:rPr/>
           <w:delText>z více</w:delText>
         </w:r>
       </w:del>
-      <w:ins w:id="95" w:author="Martin Vojík" w:date="2024-09-04T09:10:00Z">
+      <w:ins w:id="99" w:author="Martin Vojík" w:date="2024-09-04T09:10:00Z">
         <w:r>
           <w:rPr/>
           <w:t>tvořené více</w:t>
@@ -52267,13 +52485,13 @@
         <w:rPr/>
         <w:t xml:space="preserve"> biotop</w:t>
       </w:r>
-      <w:ins w:id="96" w:author="Martin Vojík" w:date="2024-09-04T09:10:00Z">
+      <w:ins w:id="100" w:author="Martin Vojík" w:date="2024-09-04T09:10:00Z">
         <w:r>
           <w:rPr/>
           <w:t>y</w:t>
         </w:r>
       </w:ins>
-      <w:del w:id="97" w:author="Martin Vojík" w:date="2024-09-04T09:10:00Z">
+      <w:del w:id="101" w:author="Martin Vojík" w:date="2024-09-04T09:10:00Z">
         <w:r>
           <w:rPr/>
           <w:delText>ů</w:delText>

</xml_diff>

<commit_message>
Martin Vojik comments resolved
</commit_message>
<xml_diff>
--- a/Metodiky/Stanoviste/hodnoceni_stavu_stanovist.docx
+++ b/Metodiky/Stanoviste/hodnoceni_stavu_stanovist.docx
@@ -201,25 +201,8 @@
         <w:rPr>
           <w:rFonts w:ascii="Times New Roman" w:hAnsi="Times New Roman"/>
         </w:rPr>
-        <w:t>- aktualizovaná vrstva mapování biotopů, blíže viz metodika</w:t>
-      </w:r>
-      <w:ins w:id="0" w:author="Martin Vojík" w:date="2024-09-04T13:14:00Z">
-        <w:r>
-          <w:rPr>
-            <w:rFonts w:ascii="Times New Roman" w:hAnsi="Times New Roman"/>
-          </w:rPr>
-          <w:t xml:space="preserve"> (Lustyk 2024a)</w:t>
-        </w:r>
-      </w:ins>
-      <w:del w:id="1" w:author="Martin Vojík" w:date="2024-09-04T13:14:00Z">
-        <w:r>
-          <w:rPr>
-            <w:rStyle w:val="FootnoteAnchor"/>
-            <w:rFonts w:ascii="Times New Roman" w:hAnsi="Times New Roman"/>
-          </w:rPr>
-          <w:footnoteReference w:id="3"/>
-        </w:r>
-      </w:del>
+        <w:t>- aktualizovaná vrstva mapování biotopů, blíže viz metodika (Lustyk 2024a)</w:t>
+      </w:r>
     </w:p>
     <w:p>
       <w:pPr>
@@ -242,30 +225,7 @@
         <w:rPr>
           <w:rFonts w:ascii="Times New Roman" w:hAnsi="Times New Roman"/>
         </w:rPr>
-        <w:t>– základní klasifikační jednotka popsaná v Katalogu biotopů</w:t>
-      </w:r>
-      <w:ins w:id="2" w:author="Martin Vojík" w:date="2024-09-04T13:14:00Z">
-        <w:r>
-          <w:rPr>
-            <w:rFonts w:ascii="Times New Roman" w:hAnsi="Times New Roman"/>
-          </w:rPr>
-          <w:t xml:space="preserve"> (Chytrý a kol. 2010)</w:t>
-        </w:r>
-      </w:ins>
-      <w:del w:id="3" w:author="Martin Vojík" w:date="2024-09-04T13:14:00Z">
-        <w:r>
-          <w:rPr>
-            <w:rStyle w:val="FootnoteAnchor"/>
-            <w:rFonts w:ascii="Times New Roman" w:hAnsi="Times New Roman"/>
-          </w:rPr>
-          <w:footnoteReference w:id="4"/>
-        </w:r>
-      </w:del>
-      <w:r>
-        <w:rPr>
-          <w:rFonts w:ascii="Times New Roman" w:hAnsi="Times New Roman"/>
-        </w:rPr>
-        <w:t>, jeden či více biotopů tvoří tzv. typ přírodního stanoviště, zkráceně stanoviště (anglicky habitat) podle Přílohy 1 Směrnice 92/43/EHS o ochraně přírodních stanovišť, volně žijících živočichů a planě rostoucích rostlin.</w:t>
+        <w:t>– základní klasifikační jednotka popsaná v Katalogu biotopů (Chytrý a kol. 2010), jeden či více biotopů tvoří tzv. typ přírodního stanoviště, zkráceně stanoviště (anglicky habitat) podle Přílohy 1 Směrnice 92/43/EHS o ochraně přírodních stanovišť, volně žijících živočichů a planě rostoucích rostlin.</w:t>
       </w:r>
     </w:p>
     <w:p>
@@ -337,49 +297,7 @@
         <w:rPr>
           <w:rFonts w:ascii="Times New Roman" w:hAnsi="Times New Roman"/>
         </w:rPr>
-        <w:t xml:space="preserve"> – hranice</w:t>
-      </w:r>
-      <w:ins w:id="4" w:author="Martin Vojík" w:date="2024-09-04T11:53:00Z">
-        <w:r>
-          <w:rPr>
-            <w:rFonts w:ascii="Times New Roman" w:hAnsi="Times New Roman"/>
-          </w:rPr>
-          <w:t>,</w:t>
-        </w:r>
-      </w:ins>
-      <w:r>
-        <w:rPr>
-          <w:rFonts w:ascii="Times New Roman" w:hAnsi="Times New Roman"/>
-        </w:rPr>
-        <w:t xml:space="preserve"> jejíž překroč</w:t>
-      </w:r>
-      <w:ins w:id="5" w:author="Martin Vojík" w:date="2024-09-04T11:54:00Z">
-        <w:r>
-          <w:rPr>
-            <w:rFonts w:ascii="Times New Roman" w:hAnsi="Times New Roman"/>
-          </w:rPr>
-          <w:t>e</w:t>
-        </w:r>
-      </w:ins>
-      <w:r>
-        <w:rPr>
-          <w:rFonts w:ascii="Times New Roman" w:hAnsi="Times New Roman"/>
-        </w:rPr>
-        <w:t xml:space="preserve">ní indikuje významné zhoršení stavu předmětu ochrany, a tedy klasifikaci stavu předmětu ochrany </w:t>
-      </w:r>
-      <w:ins w:id="6" w:author="Martin Vojík" w:date="2024-09-04T11:54:00Z">
-        <w:r>
-          <w:rPr>
-            <w:rFonts w:ascii="Times New Roman" w:hAnsi="Times New Roman"/>
-          </w:rPr>
-          <w:t xml:space="preserve">jako </w:t>
-        </w:r>
-      </w:ins>
-      <w:r>
-        <w:rPr>
-          <w:rFonts w:ascii="Times New Roman" w:hAnsi="Times New Roman"/>
-        </w:rPr>
-        <w:t>„špatný“.</w:t>
+        <w:t xml:space="preserve"> – hranice, jejíž překročení indikuje významné zhoršení stavu předmětu ochrany, a tedy klasifikaci stavu předmětu ochrany jako „špatný“.</w:t>
       </w:r>
     </w:p>
     <w:p>
@@ -402,25 +320,8 @@
         <w:rPr>
           <w:rFonts w:ascii="Times New Roman" w:hAnsi="Times New Roman"/>
         </w:rPr>
-        <w:t xml:space="preserve"> - Příručka hodnocení biotopů</w:t>
-      </w:r>
-      <w:ins w:id="7" w:author="Martin Vojík" w:date="2024-09-04T13:15:00Z">
-        <w:r>
-          <w:rPr>
-            <w:rFonts w:ascii="Times New Roman" w:hAnsi="Times New Roman"/>
-          </w:rPr>
-          <w:t xml:space="preserve"> (Lustyk 2024b)</w:t>
-        </w:r>
-      </w:ins>
-      <w:del w:id="8" w:author="Martin Vojík" w:date="2024-09-04T13:15:00Z">
-        <w:r>
-          <w:rPr>
-            <w:rStyle w:val="FootnoteAnchor"/>
-            <w:rFonts w:ascii="Times New Roman" w:hAnsi="Times New Roman"/>
-          </w:rPr>
-          <w:footnoteReference w:id="5"/>
-        </w:r>
-      </w:del>
+        <w:t xml:space="preserve"> - Příručka hodnocení biotopů (Lustyk 2024b)</w:t>
+      </w:r>
     </w:p>
     <w:p>
       <w:pPr>
@@ -690,99 +591,38 @@
           <w:rFonts w:ascii="Times New Roman" w:hAnsi="Times New Roman"/>
           <w:sz w:val="24"/>
         </w:rPr>
-        <w:t>Metodika sledování stavu předmětů ochrany vychází z terénních dat pořízených při aktualizacích vrstvy mapování biotopů (aVMB k roku 2022). Podrobný postup sběru dat v terénu, jakož i specifika mapování v různých formačních skupinách jsou popsány (a) v Metodice 2. vlny aktualizace vrstvy mapování biotopů (Lustyk 202</w:t>
-      </w:r>
-      <w:ins w:id="9" w:author="Martin Vojík" w:date="2024-09-04T12:25:00Z">
+        <w:t>Metodika sledování stavu předmětů ochrany vychází z terénních dat pořízených při aktualizacích vrstvy mapování biotopů (aVMB k roku 2022). Podrobný postup sběru dat v terénu, jakož i specifika mapování v různých formačních skupinách jsou popsány (a) v Metodice 2. vlny aktualizace vrstvy mapování biotopů (Lustyk 2024a</w:t>
+      </w:r>
+      <w:r>
+        <w:rPr>
+          <w:rStyle w:val="FootnoteAnchor"/>
+          <w:rFonts w:ascii="Times New Roman" w:hAnsi="Times New Roman"/>
+          <w:sz w:val="24"/>
+        </w:rPr>
+        <w:footnoteReference w:id="3"/>
+      </w:r>
+      <w:r>
+        <w:rPr>
+          <w:rFonts w:ascii="Times New Roman" w:hAnsi="Times New Roman"/>
+          <w:sz w:val="24"/>
+        </w:rPr>
+        <w:t xml:space="preserve">) a (b) v Příručce hodnocení biotopů (Lustyk 2024b, dále </w:t>
+      </w:r>
+      <w:del w:id="0" w:author="Jakub Rataj" w:date="2026-02-13T11:49:30Z">
         <w:r>
           <w:rPr>
             <w:rFonts w:ascii="Times New Roman" w:hAnsi="Times New Roman"/>
             <w:sz w:val="24"/>
           </w:rPr>
-          <w:t>4</w:t>
-        </w:r>
-      </w:ins>
-      <w:ins w:id="10" w:author="Martin Vojík" w:date="2024-09-04T12:58:00Z">
-        <w:r>
-          <w:rPr>
-            <w:rFonts w:ascii="Times New Roman" w:hAnsi="Times New Roman"/>
-            <w:sz w:val="24"/>
-          </w:rPr>
-          <w:t>a</w:t>
-        </w:r>
-      </w:ins>
-      <w:del w:id="11" w:author="Martin Vojík" w:date="2024-09-04T12:25:00Z">
-        <w:r>
-          <w:rPr>
-            <w:rFonts w:ascii="Times New Roman" w:hAnsi="Times New Roman"/>
-            <w:sz w:val="24"/>
-          </w:rPr>
-          <w:delText>0</w:delText>
+          <w:delText xml:space="preserve">jen </w:delText>
         </w:r>
       </w:del>
       <w:r>
         <w:rPr>
-          <w:rStyle w:val="FootnoteAnchor"/>
           <w:rFonts w:ascii="Times New Roman" w:hAnsi="Times New Roman"/>
           <w:sz w:val="24"/>
         </w:rPr>
-        <w:footnoteReference w:id="6"/>
-      </w:r>
-      <w:r>
-        <w:rPr>
-          <w:rFonts w:ascii="Times New Roman" w:hAnsi="Times New Roman"/>
-          <w:sz w:val="24"/>
-        </w:rPr>
-        <w:t>) a (b) v Příručce hodnocení biotopů (Lustyk 20</w:t>
-      </w:r>
-      <w:ins w:id="12" w:author="Martin Vojík" w:date="2024-09-04T12:25:00Z">
-        <w:r>
-          <w:rPr>
-            <w:rFonts w:ascii="Times New Roman" w:hAnsi="Times New Roman"/>
-            <w:sz w:val="24"/>
-          </w:rPr>
-          <w:t>24</w:t>
-        </w:r>
-      </w:ins>
-      <w:ins w:id="13" w:author="Martin Vojík" w:date="2024-09-04T12:58:00Z">
-        <w:r>
-          <w:rPr>
-            <w:rFonts w:ascii="Times New Roman" w:hAnsi="Times New Roman"/>
-            <w:sz w:val="24"/>
-          </w:rPr>
-          <w:t>b</w:t>
-        </w:r>
-      </w:ins>
-      <w:del w:id="14" w:author="Martin Vojík" w:date="2024-09-04T12:25:00Z">
-        <w:r>
-          <w:rPr>
-            <w:rFonts w:ascii="Times New Roman" w:hAnsi="Times New Roman"/>
-            <w:sz w:val="24"/>
-          </w:rPr>
-          <w:delText>15</w:delText>
-        </w:r>
-      </w:del>
-      <w:r>
-        <w:rPr>
-          <w:rFonts w:ascii="Times New Roman" w:hAnsi="Times New Roman"/>
-          <w:sz w:val="24"/>
-        </w:rPr>
-        <w:t xml:space="preserve">, dále </w:t>
-      </w:r>
-      <w:del w:id="15" w:author="Martin Vojík" w:date="2024-09-04T12:23:00Z">
-        <w:r>
-          <w:rPr>
-            <w:rFonts w:ascii="Times New Roman" w:hAnsi="Times New Roman"/>
-            <w:sz w:val="24"/>
-          </w:rPr>
-          <w:delText xml:space="preserve">také </w:delText>
-        </w:r>
-      </w:del>
-      <w:r>
-        <w:rPr>
-          <w:rFonts w:ascii="Times New Roman" w:hAnsi="Times New Roman"/>
-          <w:sz w:val="24"/>
-        </w:rPr>
-        <w:t xml:space="preserve">jen PHB). </w:t>
+        <w:t xml:space="preserve">PHB). </w:t>
       </w:r>
     </w:p>
     <w:p>
@@ -894,7 +734,7 @@
         </w:rPr>
         <w:t>Rešerše všech dostupných podkladů k hodnocení kvality stanovišť, zejména metodik AOPK ČR a dalších dokumentů používaných v ochraně přírody (rešerše zahrnuje základní parametry a metodiky pro hodnocení kvality biotopů ve vrstvě mapování biotopů po aktualizacích, dále postupy při navrhování EVL, hodnocení stavu stanovišť na celostátní úrovni, regionální přístupy ke stanovení limitů a konečně hodnocení kvality stanovišť / stavu z hlediska ochrany (FCS) v Dánsku, jehož metodiku lze považovat za příkladnou</w:t>
       </w:r>
-      <w:ins w:id="16" w:author="Martin Vojík" w:date="2024-09-04T13:17:00Z">
+      <w:ins w:id="1" w:author="Martin Vojík" w:date="2024-09-04T13:17:00Z">
         <w:r>
           <w:rPr>
             <w:rFonts w:ascii="Times New Roman" w:hAnsi="Times New Roman"/>
@@ -903,7 +743,7 @@
           <w:t xml:space="preserve"> (Sogaard</w:t>
         </w:r>
       </w:ins>
-      <w:ins w:id="17" w:author="Martin Vojík" w:date="2024-09-04T13:17:00Z">
+      <w:ins w:id="2" w:author="Martin Vojík" w:date="2024-09-04T13:17:00Z">
         <w:r>
           <w:rPr>
             <w:rStyle w:val="FootnoteCharacters"/>
@@ -916,14 +756,14 @@
           <w:t xml:space="preserve"> a kol. 2007)</w:t>
         </w:r>
       </w:ins>
-      <w:del w:id="18" w:author="Martin Vojík" w:date="2024-09-04T13:17:00Z">
+      <w:del w:id="3" w:author="Martin Vojík" w:date="2024-09-04T13:17:00Z">
         <w:r>
           <w:rPr>
             <w:rStyle w:val="FootnoteAnchor"/>
             <w:rFonts w:ascii="Times New Roman" w:hAnsi="Times New Roman"/>
             <w:sz w:val="20"/>
           </w:rPr>
-          <w:footnoteReference w:id="7"/>
+          <w:footnoteReference w:id="4"/>
         </w:r>
       </w:del>
       <w:r>
@@ -948,7 +788,7 @@
           <w:rFonts w:ascii="Times New Roman" w:hAnsi="Times New Roman"/>
           <w:sz w:val="20"/>
         </w:rPr>
-        <w:footnoteReference w:id="8"/>
+        <w:footnoteReference w:id="5"/>
       </w:r>
       <w:r>
         <w:rPr>
@@ -973,16 +813,13 @@
           <w:sz w:val="20"/>
         </w:rPr>
       </w:r>
-      <w:ins w:id="19" w:author="Jakub Rataj" w:date="2026-02-05T12:35:29Z">
+      <w:ins w:id="4" w:author="Jakub Rataj" w:date="2026-02-05T12:35:29Z">
         <w:commentRangeEnd w:id="0"/>
         <w:r>
           <w:commentReference w:id="0"/>
         </w:r>
         <w:r>
-          <w:rPr>
-            <w:rFonts w:ascii="Times New Roman" w:hAnsi="Times New Roman"/>
-            <w:sz w:val="20"/>
-          </w:rPr>
+          <w:rPr/>
           <w:commentReference w:id="2"/>
         </w:r>
       </w:ins>
@@ -993,7 +830,7 @@
         </w:rPr>
         <w:t>červená kniha rostlinných společenstev ČR (stav 1995)</w:t>
       </w:r>
-      <w:ins w:id="20" w:author="Martin Vojík" w:date="2024-09-04T13:20:00Z">
+      <w:ins w:id="5" w:author="Martin Vojík" w:date="2024-09-04T13:20:00Z">
         <w:r>
           <w:rPr>
             <w:rFonts w:ascii="Times New Roman" w:hAnsi="Times New Roman"/>
@@ -1002,14 +839,14 @@
           <w:t xml:space="preserve"> (Moravec 1995)</w:t>
         </w:r>
       </w:ins>
-      <w:del w:id="21" w:author="Martin Vojík" w:date="2024-09-04T13:20:00Z">
+      <w:del w:id="6" w:author="Martin Vojík" w:date="2024-09-04T13:20:00Z">
         <w:r>
           <w:rPr>
             <w:rStyle w:val="FootnoteAnchor"/>
             <w:rFonts w:ascii="Times New Roman" w:hAnsi="Times New Roman"/>
             <w:sz w:val="20"/>
           </w:rPr>
-          <w:footnoteReference w:id="9"/>
+          <w:footnoteReference w:id="6"/>
         </w:r>
       </w:del>
       <w:r>
@@ -1019,7 +856,7 @@
         </w:rPr>
         <w:t xml:space="preserve"> a červená kniha biotopů (</w:t>
       </w:r>
-      <w:ins w:id="22" w:author="Martin Vojík" w:date="2024-09-04T13:21:00Z">
+      <w:ins w:id="7" w:author="Martin Vojík" w:date="2024-09-04T13:21:00Z">
         <w:r>
           <w:rPr>
             <w:rFonts w:ascii="Times New Roman" w:hAnsi="Times New Roman"/>
@@ -1028,7 +865,7 @@
           <w:t>Härtel a kol. 2009</w:t>
         </w:r>
       </w:ins>
-      <w:del w:id="23" w:author="Martin Vojík" w:date="2024-09-04T13:21:00Z">
+      <w:del w:id="8" w:author="Martin Vojík" w:date="2024-09-04T13:21:00Z">
         <w:r>
           <w:rPr>
             <w:rFonts w:ascii="Times New Roman" w:hAnsi="Times New Roman"/>
@@ -1044,14 +881,14 @@
         </w:rPr>
         <w:t>)</w:t>
       </w:r>
-      <w:del w:id="24" w:author="Martin Vojík" w:date="2024-09-04T13:23:00Z">
+      <w:del w:id="9" w:author="Martin Vojík" w:date="2024-09-04T13:23:00Z">
         <w:r>
           <w:rPr>
             <w:rStyle w:val="FootnoteAnchor"/>
             <w:rFonts w:ascii="Times New Roman" w:hAnsi="Times New Roman"/>
             <w:sz w:val="20"/>
           </w:rPr>
-          <w:footnoteReference w:id="10"/>
+          <w:footnoteReference w:id="7"/>
         </w:r>
       </w:del>
       <w:r>
@@ -1182,7 +1019,7 @@
         </w:rPr>
         <w:t>.</w:t>
       </w:r>
-      <w:del w:id="25" w:author="Unknown Author" w:date="2026-01-07T14:46:52Z">
+      <w:del w:id="10" w:author="Unknown Author" w:date="2026-01-07T14:46:52Z">
         <w:r>
           <w:rPr>
             <w:rFonts w:ascii="Times New Roman" w:hAnsi="Times New Roman"/>
@@ -1199,7 +1036,7 @@
           <w:szCs w:val="24"/>
         </w:rPr>
       </w:r>
-      <w:del w:id="26" w:author="Unknown Author" w:date="2026-01-07T14:46:52Z">
+      <w:del w:id="11" w:author="Unknown Author" w:date="2026-01-07T14:46:52Z">
         <w:commentRangeEnd w:id="3"/>
         <w:r>
           <w:commentReference w:id="3"/>
@@ -1293,7 +1130,7 @@
           <w:sz w:val="24"/>
         </w:rPr>
       </w:r>
-      <w:ins w:id="27" w:author="Jakub Rataj" w:date="2026-02-04T15:14:28Z">
+      <w:ins w:id="12" w:author="Jakub Rataj" w:date="2026-02-04T15:14:28Z">
         <w:commentRangeEnd w:id="4"/>
         <w:r>
           <w:commentReference w:id="4"/>
@@ -1388,15 +1225,13 @@
         </w:rPr>
         <w:t xml:space="preserve">Popis </w:t>
       </w:r>
-      <w:ins w:id="28" w:author="Jakub Rataj" w:date="2026-02-05T12:41:50Z">
-        <w:r>
-          <w:rPr>
-            <w:rFonts w:ascii="Times New Roman" w:hAnsi="Times New Roman"/>
-            <w:b/>
-            <w:sz w:val="24"/>
-          </w:rPr>
-        </w:r>
-      </w:ins>
+      <w:r>
+        <w:rPr>
+          <w:rFonts w:ascii="Times New Roman" w:hAnsi="Times New Roman"/>
+          <w:b/>
+          <w:sz w:val="24"/>
+        </w:rPr>
+      </w:r>
       <w:commentRangeEnd w:id="6"/>
       <w:r>
         <w:commentReference w:id="6"/>
@@ -1678,21 +1513,21 @@
         </w:rPr>
         <w:t>Parametr ukazuje plochou vážené zastoupení typických druhů na úz</w:t>
       </w:r>
-      <w:ins w:id="29" w:author="Unknown Author" w:date="2026-01-07T15:02:07Z">
-        <w:del w:id="30" w:author="Jakub Rataj" w:date="2026-01-20T11:37:13Z">
+      <w:ins w:id="13" w:author="Unknown Author" w:date="2026-01-07T15:02:07Z">
+        <w:del w:id="14" w:author="Jakub Rataj" w:date="2026-01-20T11:37:13Z">
           <w:r>
             <w:rPr/>
             <w:commentReference w:id="8"/>
           </w:r>
         </w:del>
       </w:ins>
-      <w:ins w:id="31" w:author="Jakub Rataj" w:date="2026-02-05T12:43:20Z">
+      <w:ins w:id="15" w:author="Jakub Rataj" w:date="2026-02-05T12:43:20Z">
         <w:r>
           <w:rPr/>
           <w:t>emí</w:t>
         </w:r>
       </w:ins>
-      <w:del w:id="32" w:author="Jakub Rataj" w:date="2026-01-20T11:37:42Z">
+      <w:del w:id="16" w:author="Jakub Rataj" w:date="2026-01-20T11:37:42Z">
         <w:r>
           <w:rPr/>
           <w:commentReference w:id="9"/>
@@ -1703,41 +1538,7 @@
           <w:rFonts w:ascii="Times New Roman" w:hAnsi="Times New Roman"/>
           <w:sz w:val="24"/>
         </w:rPr>
-        <w:t>. Typické druhy charakterizují stav a vývoj stanoviště, jeho zachovalost a reprezentativnost. Zároveň dokládají stanovištní poměry a to, nakolik je dané stanoviště typické ve srovnání s poměry v širším regionu. Úbytek typických druhů je pak zpravidla známkou degradace či nějaké změny ekologických podmínek, k níž na stanovišti dochází. Parametr vychází z Příručky hodnocení biotopů (Lustyk 2</w:t>
-      </w:r>
-      <w:ins w:id="33" w:author="Martin Vojík" w:date="2024-09-04T12:29:00Z">
-        <w:r>
-          <w:rPr>
-            <w:rFonts w:ascii="Times New Roman" w:hAnsi="Times New Roman"/>
-            <w:sz w:val="24"/>
-          </w:rPr>
-          <w:t>024</w:t>
-        </w:r>
-      </w:ins>
-      <w:ins w:id="34" w:author="Martin Vojík" w:date="2024-09-04T12:58:00Z">
-        <w:r>
-          <w:rPr>
-            <w:rFonts w:ascii="Times New Roman" w:hAnsi="Times New Roman"/>
-            <w:sz w:val="24"/>
-          </w:rPr>
-          <w:t>b</w:t>
-        </w:r>
-      </w:ins>
-      <w:del w:id="35" w:author="Martin Vojík" w:date="2024-09-04T12:29:00Z">
-        <w:r>
-          <w:rPr>
-            <w:rFonts w:ascii="Times New Roman" w:hAnsi="Times New Roman"/>
-            <w:sz w:val="24"/>
-          </w:rPr>
-          <w:delText>015</w:delText>
-        </w:r>
-      </w:del>
-      <w:r>
-        <w:rPr>
-          <w:rFonts w:ascii="Times New Roman" w:hAnsi="Times New Roman"/>
-          <w:sz w:val="24"/>
-        </w:rPr>
-        <w:t>). Bodové hodnoty jsou odvozené ze tří stupňů stavu segmentu.</w:t>
+        <w:t>. Typické druhy charakterizují stav a vývoj stanoviště, jeho zachovalost a reprezentativnost. Zároveň dokládají stanovištní poměry a to, nakolik je dané stanoviště typické ve srovnání s poměry v širším regionu. Úbytek typických druhů je pak zpravidla známkou degradace či nějaké změny ekologických podmínek, k níž na stanovišti dochází. Parametr vychází z Příručky hodnocení biotopů (Lustyk 2024b). Bodové hodnoty jsou odvozené ze tří stupňů stavu segmentu.</w:t>
       </w:r>
     </w:p>
     <w:p>
@@ -1904,41 +1705,7 @@
           <w:rFonts w:ascii="Times New Roman" w:hAnsi="Times New Roman"/>
           <w:sz w:val="24"/>
         </w:rPr>
-        <w:t xml:space="preserve">mohou nastat u těch stanovišť, která mají málo typických druhů cévnatých rostlin, nebo typické druhy mají nepravidelný výskyt s vazbou životního cyklu na jedinečnou událost (typicky se jedná o vodní biotopy). Hodnocení parametru v těchto případech je popsáno individuálně v PHB </w:t>
-      </w:r>
-      <w:ins w:id="36" w:author="Martin Vojík" w:date="2024-09-04T12:56:00Z">
-        <w:r>
-          <w:rPr>
-            <w:rFonts w:ascii="Times New Roman" w:hAnsi="Times New Roman"/>
-            <w:sz w:val="24"/>
-          </w:rPr>
-          <w:t>(Lustyk 2024</w:t>
-        </w:r>
-      </w:ins>
-      <w:ins w:id="37" w:author="Martin Vojík" w:date="2024-09-04T12:58:00Z">
-        <w:r>
-          <w:rPr>
-            <w:rFonts w:ascii="Times New Roman" w:hAnsi="Times New Roman"/>
-            <w:sz w:val="24"/>
-          </w:rPr>
-          <w:t>b</w:t>
-        </w:r>
-      </w:ins>
-      <w:ins w:id="38" w:author="Martin Vojík" w:date="2024-09-04T12:56:00Z">
-        <w:r>
-          <w:rPr>
-            <w:rFonts w:ascii="Times New Roman" w:hAnsi="Times New Roman"/>
-            <w:sz w:val="24"/>
-          </w:rPr>
-          <w:t xml:space="preserve">) </w:t>
-        </w:r>
-      </w:ins>
-      <w:r>
-        <w:rPr>
-          <w:rFonts w:ascii="Times New Roman" w:hAnsi="Times New Roman"/>
-          <w:sz w:val="24"/>
-        </w:rPr>
-        <w:t>a musí být podrobně zdokumentováno.</w:t>
+        <w:t>mohou nastat u těch stanovišť, která mají málo typických druhů cévnatých rostlin, nebo typické druhy mají nepravidelný výskyt s vazbou životního cyklu na jedinečnou událost (typicky se jedná o vodní biotopy). Hodnocení parametru v těchto případech je popsáno individuálně v PHB (Lustyk 2024b) a musí být podrobně zdokumentováno.</w:t>
       </w:r>
     </w:p>
     <w:p>
@@ -2062,7 +1829,7 @@
           <w:rFonts w:ascii="Times New Roman" w:hAnsi="Times New Roman"/>
           <w:sz w:val="24"/>
         </w:rPr>
-        <w:footnoteReference w:id="11"/>
+        <w:footnoteReference w:id="8"/>
       </w:r>
       <w:r>
         <w:rPr>
@@ -2357,13 +2124,13 @@
         <w:rPr/>
         <w:t>(</w:t>
       </w:r>
-      <w:ins w:id="39" w:author="Martin Vojík" w:date="2024-09-04T09:09:00Z">
+      <w:ins w:id="17" w:author="Martin Vojík" w:date="2024-09-04T09:09:00Z">
         <w:r>
           <w:rPr/>
           <w:t>a</w:t>
         </w:r>
       </w:ins>
-      <w:del w:id="40" w:author="Martin Vojík" w:date="2024-09-04T09:09:00Z">
+      <w:del w:id="18" w:author="Martin Vojík" w:date="2024-09-04T09:09:00Z">
         <w:r>
           <w:rPr/>
           <w:delText>1</w:delText>
@@ -2453,7 +2220,7 @@
           <w:rFonts w:ascii="Times New Roman" w:hAnsi="Times New Roman"/>
           <w:sz w:val="24"/>
         </w:rPr>
-        <w:footnoteReference w:id="12"/>
+        <w:footnoteReference w:id="9"/>
       </w:r>
       <w:r>
         <w:rPr>
@@ -2711,23 +2478,7 @@
           <w:rFonts w:ascii="Times New Roman" w:hAnsi="Times New Roman"/>
           <w:sz w:val="24"/>
         </w:rPr>
-        <w:t>– parametr je počítán 2 různými způsoby podle procenta plochy stanoviště vyskytujícího se v rámci sledované EVL v mozaikách se zastoupením pod 50 % (viz tabulka</w:t>
-      </w:r>
-      <w:del w:id="41" w:author="Jakub Rataj" w:date="2026-01-07T15:21:16Z">
-        <w:r>
-          <w:rPr>
-            <w:rFonts w:ascii="Times New Roman" w:hAnsi="Times New Roman"/>
-            <w:sz w:val="24"/>
-          </w:rPr>
-          <w:delText xml:space="preserve"> níže</w:delText>
-        </w:r>
-      </w:del>
-      <w:r>
-        <w:rPr>
-          <w:rFonts w:ascii="Times New Roman" w:hAnsi="Times New Roman"/>
-          <w:sz w:val="24"/>
-        </w:rPr>
-        <w:t>). Rozdílný postup je aplikován vhledem k vysoké nejistotě uspořádání členů v mozaice při nízkém zastoupení sledovaného typu stanoviště. Nízká hranice pro způsob výpočtu vnější mozaikou (25 %) byla zvolena vzhledem k předpokládanému snižování zastoupení mozaik.</w:t>
+        <w:t>– parametr je počítán 2 různými způsoby podle procenta plochy stanoviště vyskytujícího se v rámci sledované EVL v mozaikách se zastoupením pod 50 % (viz tabulka). Rozdílný postup je aplikován vhledem k vysoké nejistotě uspořádání členů v mozaice při nízkém zastoupení sledovaného typu stanoviště. Nízká hranice pro způsob výpočtu vnější mozaikou (25 %) byla zvolena vzhledem k předpokládanému snižování zastoupení mozaik.</w:t>
       </w:r>
     </w:p>
     <w:p>
@@ -3166,32 +2917,7 @@
           <w:rFonts w:ascii="Times New Roman" w:hAnsi="Times New Roman"/>
           <w:sz w:val="24"/>
         </w:rPr>
-        <w:t>V </w:t>
-      </w:r>
-      <w:del w:id="42" w:author="Martin Vojík" w:date="2024-09-04T09:16:00Z">
-        <w:r>
-          <w:rPr>
-            <w:rFonts w:ascii="Times New Roman" w:hAnsi="Times New Roman"/>
-            <w:sz w:val="24"/>
-          </w:rPr>
-          <w:delText xml:space="preserve">případě </w:delText>
-        </w:r>
-      </w:del>
-      <w:ins w:id="43" w:author="Martin Vojík" w:date="2024-09-04T09:16:00Z">
-        <w:r>
-          <w:rPr>
-            <w:rFonts w:ascii="Times New Roman" w:hAnsi="Times New Roman"/>
-            <w:sz w:val="24"/>
-          </w:rPr>
-          <w:t xml:space="preserve">rámci </w:t>
-        </w:r>
-      </w:ins>
-      <w:r>
-        <w:rPr>
-          <w:rFonts w:ascii="Times New Roman" w:hAnsi="Times New Roman"/>
-          <w:sz w:val="24"/>
-        </w:rPr>
-        <w:t>parametru nastává výjimečný případ, kdy jsou pro okrajové polygony zahrnuty do hodnocení i segmenty mimo EVL, jinak by tato část hranice v hodnocení neodůvodněně chyběla. Zároveň řada EVL leží na hranici ČR a zahraniční data o výskytu přírodních biotopů nejsou pro výpočet k dispozici. Pro polygony, jejichž okraj je shodný s hranicí ČR, je předpokládaný poměr dopočítán na základě dostupných dat z české strany.</w:t>
+        <w:t>V rámci parametru nastává výjimečný případ, kdy jsou pro okrajové polygony zahrnuty do hodnocení i segmenty mimo EVL, jinak by tato část hranice v hodnocení neodůvodněně chyběla. Zároveň řada EVL leží na hranici ČR a zahraniční data o výskytu přírodních biotopů nejsou pro výpočet k dispozici. Pro polygony, jejichž okraj je shodný s hranicí ČR, je předpokládaný poměr dopočítán na základě dostupných dat z české strany.</w:t>
       </w:r>
     </w:p>
     <w:p>
@@ -3625,18 +3351,46 @@
           <w:rFonts w:ascii="Times New Roman" w:hAnsi="Times New Roman"/>
           <w:sz w:val="24"/>
         </w:rPr>
-        <w:t>Parametr výskytu invazních druhů, z nichž se část povinně zaznamenává při aktualizaci vrstvy mapování biotopů (Lustyk 202</w:t>
-      </w:r>
-      <w:ins w:id="44" w:author="Martin Vojík" w:date="2024-09-04T12:29:00Z">
-        <w:r>
-          <w:rPr>
-            <w:rFonts w:ascii="Times New Roman" w:hAnsi="Times New Roman"/>
-            <w:sz w:val="24"/>
-          </w:rPr>
-          <w:t>4</w:t>
-        </w:r>
-      </w:ins>
-      <w:ins w:id="45" w:author="Martin Vojík" w:date="2024-09-04T12:58:00Z">
+        <w:t xml:space="preserve">Parametr výskytu invazních druhů, z nichž se část povinně zaznamenává při aktualizaci vrstvy mapování biotopů (Lustyk 2024a), indikuje míru narušení a degradace stanoviště. </w:t>
+      </w:r>
+    </w:p>
+    <w:p>
+      <w:pPr>
+        <w:pStyle w:val="Normal"/>
+        <w:jc w:val="both"/>
+        <w:rPr>
+          <w:rFonts w:ascii="Times New Roman" w:hAnsi="Times New Roman"/>
+          <w:i/>
+          <w:i/>
+          <w:sz w:val="24"/>
+        </w:rPr>
+      </w:pPr>
+      <w:commentRangeStart w:id="15"/>
+      <w:r>
+        <w:rPr>
+          <w:rFonts w:ascii="Times New Roman" w:hAnsi="Times New Roman"/>
+          <w:b/>
+          <w:sz w:val="24"/>
+        </w:rPr>
+        <w:t>Popis parametru –</w:t>
+      </w:r>
+      <w:r>
+        <w:rPr>
+          <w:rFonts w:ascii="Times New Roman" w:hAnsi="Times New Roman"/>
+          <w:i/>
+          <w:color w:val="4F81BD"/>
+          <w:sz w:val="24"/>
+        </w:rPr>
+        <w:t xml:space="preserve"> </w:t>
+      </w:r>
+      <w:r>
+        <w:rPr>
+          <w:rFonts w:ascii="Times New Roman" w:hAnsi="Times New Roman"/>
+          <w:sz w:val="24"/>
+        </w:rPr>
+        <w:t>předmětem hodnocení je procento plochy s výskytem invazních druhů cévnatých rostlin uvedených v příloze 2 Metodiky aktualizace vrstvy mapování biotopů (Lustyk, 2024</w:t>
+      </w:r>
+      <w:ins w:id="19" w:author="Jakub Rataj" w:date="2026-02-13T11:40:27Z">
         <w:r>
           <w:rPr>
             <w:rFonts w:ascii="Times New Roman" w:hAnsi="Times New Roman"/>
@@ -3645,77 +3399,6 @@
           <w:t>a</w:t>
         </w:r>
       </w:ins>
-      <w:del w:id="46" w:author="Martin Vojík" w:date="2024-09-04T12:29:00Z">
-        <w:r>
-          <w:rPr>
-            <w:rFonts w:ascii="Times New Roman" w:hAnsi="Times New Roman"/>
-            <w:sz w:val="24"/>
-          </w:rPr>
-          <w:delText>0</w:delText>
-        </w:r>
-      </w:del>
-      <w:r>
-        <w:rPr>
-          <w:rFonts w:ascii="Times New Roman" w:hAnsi="Times New Roman"/>
-          <w:sz w:val="24"/>
-        </w:rPr>
-        <w:t xml:space="preserve">), indikuje míru narušení a degradace stanoviště. </w:t>
-      </w:r>
-    </w:p>
-    <w:p>
-      <w:pPr>
-        <w:pStyle w:val="Normal"/>
-        <w:jc w:val="both"/>
-        <w:rPr>
-          <w:rFonts w:ascii="Times New Roman" w:hAnsi="Times New Roman"/>
-          <w:i/>
-          <w:i/>
-          <w:sz w:val="24"/>
-        </w:rPr>
-      </w:pPr>
-      <w:commentRangeStart w:id="15"/>
-      <w:r>
-        <w:rPr>
-          <w:rFonts w:ascii="Times New Roman" w:hAnsi="Times New Roman"/>
-          <w:b/>
-          <w:sz w:val="24"/>
-        </w:rPr>
-        <w:t>Popis parametru –</w:t>
-      </w:r>
-      <w:r>
-        <w:rPr>
-          <w:rFonts w:ascii="Times New Roman" w:hAnsi="Times New Roman"/>
-          <w:i/>
-          <w:color w:val="4F81BD"/>
-          <w:sz w:val="24"/>
-        </w:rPr>
-        <w:t xml:space="preserve"> </w:t>
-      </w:r>
-      <w:r>
-        <w:rPr>
-          <w:rFonts w:ascii="Times New Roman" w:hAnsi="Times New Roman"/>
-          <w:sz w:val="24"/>
-        </w:rPr>
-        <w:t>předmětem hodnocení je procento plochy s výskytem invazních druhů cévnatých rostlin uvedených v příloze 2 Metodiky aktualizace vrstvy mapování biotopů (Lustyk, 202</w:t>
-      </w:r>
-      <w:ins w:id="47" w:author="Martin Vojík" w:date="2024-09-04T12:29:00Z">
-        <w:r>
-          <w:rPr>
-            <w:rFonts w:ascii="Times New Roman" w:hAnsi="Times New Roman"/>
-            <w:sz w:val="24"/>
-          </w:rPr>
-          <w:t>4</w:t>
-        </w:r>
-      </w:ins>
-      <w:del w:id="48" w:author="Martin Vojík" w:date="2024-09-04T12:29:00Z">
-        <w:r>
-          <w:rPr>
-            <w:rFonts w:ascii="Times New Roman" w:hAnsi="Times New Roman"/>
-            <w:sz w:val="24"/>
-          </w:rPr>
-          <w:delText>0</w:delText>
-        </w:r>
-      </w:del>
       <w:r>
         <w:rPr>
           <w:rFonts w:ascii="Times New Roman" w:hAnsi="Times New Roman"/>
@@ -4032,23 +3715,7 @@
           <w:rFonts w:ascii="Times New Roman" w:hAnsi="Times New Roman"/>
           <w:sz w:val="24"/>
         </w:rPr>
-        <w:t>předmětem hodnocení je procento plochy stanoviště s významným výskytem nativních expanzivních druhů uvedených v příloze 3</w:t>
-      </w:r>
-      <w:ins w:id="49" w:author="Martin Vojík" w:date="2024-09-04T10:02:00Z">
-        <w:r>
-          <w:rPr>
-            <w:rFonts w:ascii="Times New Roman" w:hAnsi="Times New Roman"/>
-            <w:sz w:val="24"/>
-          </w:rPr>
-          <w:t xml:space="preserve"> tohoto dokumentu</w:t>
-        </w:r>
-      </w:ins>
-      <w:r>
-        <w:rPr>
-          <w:rFonts w:ascii="Times New Roman" w:hAnsi="Times New Roman"/>
-          <w:sz w:val="24"/>
-        </w:rPr>
-        <w:t xml:space="preserve"> (příloha bude ve spolupráci s odborníky doplňována o vazbu druhů na konkrétní biotopy), které mají obdobný dopad na přírodní stanoviště, jako druhy invazní. </w:t>
+        <w:t xml:space="preserve">předmětem hodnocení je procento plochy stanoviště s významným výskytem nativních expanzivních druhů uvedených v příloze 3 tohoto dokumentu (příloha bude ve spolupráci s odborníky doplňována o vazbu druhů na konkrétní biotopy), které mají obdobný dopad na přírodní stanoviště, jako druhy invazní. </w:t>
       </w:r>
       <w:commentRangeStart w:id="16"/>
       <w:r>
@@ -4347,82 +4014,7 @@
           <w:rFonts w:ascii="Times New Roman" w:hAnsi="Times New Roman"/>
           <w:sz w:val="24"/>
         </w:rPr>
-        <w:t>Mrtvé dřevo charakterizuje stav a stupeň přirozenost</w:t>
-      </w:r>
-      <w:ins w:id="50" w:author="Martin Vojík" w:date="2024-09-04T09:51:00Z">
-        <w:r>
-          <w:rPr>
-            <w:rFonts w:ascii="Times New Roman" w:hAnsi="Times New Roman"/>
-            <w:sz w:val="24"/>
-          </w:rPr>
-          <w:t>i</w:t>
-        </w:r>
-      </w:ins>
-      <w:r>
-        <w:rPr>
-          <w:rFonts w:ascii="Times New Roman" w:hAnsi="Times New Roman"/>
-          <w:sz w:val="24"/>
-        </w:rPr>
-        <w:t xml:space="preserve"> stanoviště, jeho zachovalost a reprezentativnost. Parametr vychází z </w:t>
-      </w:r>
-      <w:del w:id="51" w:author="Martin Vojík" w:date="2024-09-04T11:56:00Z">
-        <w:r>
-          <w:rPr>
-            <w:rFonts w:ascii="Times New Roman" w:hAnsi="Times New Roman"/>
-            <w:sz w:val="24"/>
-          </w:rPr>
-          <w:delText>Příručky hodnocení biotopů</w:delText>
-        </w:r>
-      </w:del>
-      <w:ins w:id="52" w:author="Martin Vojík" w:date="2024-09-04T11:56:00Z">
-        <w:r>
-          <w:rPr>
-            <w:rFonts w:ascii="Times New Roman" w:hAnsi="Times New Roman"/>
-            <w:sz w:val="24"/>
-          </w:rPr>
-          <w:t>PHB</w:t>
-        </w:r>
-      </w:ins>
-      <w:r>
-        <w:rPr>
-          <w:rFonts w:ascii="Times New Roman" w:hAnsi="Times New Roman"/>
-          <w:sz w:val="24"/>
-        </w:rPr>
-        <w:t xml:space="preserve"> (Lustyk </w:t>
-      </w:r>
-      <w:del w:id="53" w:author="Martin Vojík" w:date="2024-09-04T12:26:00Z">
-        <w:r>
-          <w:rPr>
-            <w:rFonts w:ascii="Times New Roman" w:hAnsi="Times New Roman"/>
-            <w:sz w:val="24"/>
-          </w:rPr>
-          <w:delText>2015</w:delText>
-        </w:r>
-      </w:del>
-      <w:ins w:id="54" w:author="Martin Vojík" w:date="2024-09-04T12:26:00Z">
-        <w:r>
-          <w:rPr>
-            <w:rFonts w:ascii="Times New Roman" w:hAnsi="Times New Roman"/>
-            <w:sz w:val="24"/>
-          </w:rPr>
-          <w:t>2024</w:t>
-        </w:r>
-      </w:ins>
-      <w:ins w:id="55" w:author="Martin Vojík" w:date="2024-09-04T12:58:00Z">
-        <w:r>
-          <w:rPr>
-            <w:rFonts w:ascii="Times New Roman" w:hAnsi="Times New Roman"/>
-            <w:sz w:val="24"/>
-          </w:rPr>
-          <w:t>b</w:t>
-        </w:r>
-      </w:ins>
-      <w:r>
-        <w:rPr>
-          <w:rFonts w:ascii="Times New Roman" w:hAnsi="Times New Roman"/>
-          <w:sz w:val="24"/>
-        </w:rPr>
-        <w:t>). Bodové hodnoty jsou odvozené ze tří stupňů stavu segmentu.</w:t>
+        <w:t>Mrtvé dřevo charakterizuje stav a stupeň přirozenosti stanoviště, jeho zachovalost a reprezentativnost. Parametr vychází z PHB (Lustyk 2024b). Bodové hodnoty jsou odvozené ze tří stupňů stavu segmentu.</w:t>
       </w:r>
     </w:p>
     <w:p>
@@ -4605,8 +4197,7 @@
       </w:r>
       <w:r>
         <w:rPr>
-          <w:rFonts w:ascii="Times New Roman" w:hAnsi="Times New Roman"/>
-          <w:rFonts w:ascii="Times New Roman" w:hAnsi="Times New Roman" w:eastAsia="Calibri" w:cs="" w:cstheme="minorBidi" w:eastAsiaTheme="minorHAnsi"/>
+          <w:rFonts w:eastAsia="Calibri" w:cs="" w:ascii="Times New Roman" w:hAnsi="Times New Roman" w:cstheme="minorBidi" w:eastAsiaTheme="minorHAnsi"/>
           <w:b/>
           <w:bCs/>
           <w:color w:val="auto"/>
@@ -4629,7 +4220,7 @@
         </w:rPr>
         <w:t>, který vyjadřuje budoucí potenciál výskytu mrtvého dřeva na lokalitě: 3 (les po kalamitě</w:t>
       </w:r>
-      <w:ins w:id="57" w:author="Martin Vojík" w:date="2024-09-04T10:23:00Z">
+      <w:ins w:id="21" w:author="Martin Vojík" w:date="2024-09-04T10:23:00Z">
         <w:r>
           <w:rPr>
             <w:rFonts w:ascii="Times New Roman" w:hAnsi="Times New Roman"/>
@@ -4638,7 +4229,7 @@
           <w:t xml:space="preserve">, </w:t>
         </w:r>
       </w:ins>
-      <w:del w:id="58" w:author="Martin Vojík" w:date="2024-09-04T10:23:00Z">
+      <w:del w:id="22" w:author="Martin Vojík" w:date="2024-09-04T10:23:00Z">
         <w:r>
           <w:rPr>
             <w:rFonts w:ascii="Times New Roman" w:hAnsi="Times New Roman"/>
@@ -4654,7 +4245,7 @@
         </w:rPr>
         <w:t>např. kůrovcová, imisní, les po požáru, apod.</w:t>
       </w:r>
-      <w:del w:id="59" w:author="Martin Vojík" w:date="2024-09-04T10:23:00Z">
+      <w:del w:id="23" w:author="Martin Vojík" w:date="2024-09-04T10:23:00Z">
         <w:r>
           <w:rPr>
             <w:rFonts w:ascii="Times New Roman" w:hAnsi="Times New Roman"/>
@@ -4709,7 +4300,7 @@
           <w:sz w:val="24"/>
         </w:rPr>
       </w:r>
-      <w:ins w:id="60" w:author="Jakub Rataj" w:date="2026-02-04T16:48:13Z">
+      <w:ins w:id="24" w:author="Jakub Rataj" w:date="2026-02-04T16:48:13Z">
         <w:commentRangeEnd w:id="18"/>
         <w:r>
           <w:commentReference w:id="18"/>
@@ -4916,7 +4507,6 @@
         <w:rPr>
           <w:rFonts w:ascii="Times New Roman" w:hAnsi="Times New Roman"/>
           <w:sz w:val="24"/>
-          <w:ins w:id="61" w:author="Martin Vojík" w:date="2024-09-04T10:27:00Z"/>
         </w:rPr>
       </w:pPr>
       <w:r>
@@ -4949,18 +4539,11 @@
         <w:pStyle w:val="Normal"/>
         <w:spacing w:before="120" w:after="0"/>
         <w:jc w:val="both"/>
-        <w:pPrChange w:id="0" w:author="Martin Vojík" w:date="2024-09-04T10:27:00Z">
-          <w:pPr>
-            <w:jc w:val="both"/>
-            <w:spacing w:before="0" w:after="120"/>
-          </w:pPr>
-        </w:pPrChange>
         <w:rPr>
           <w:rFonts w:ascii="Times New Roman" w:hAnsi="Times New Roman"/>
           <w:b/>
           <w:b/>
           <w:sz w:val="24"/>
-          <w:del w:id="62" w:author="Martin Vojík" w:date="2024-09-04T10:27:00Z"/>
         </w:rPr>
       </w:pPr>
       <w:r>
@@ -4984,32 +4567,6 @@
         <w:pStyle w:val="Normal"/>
         <w:spacing w:before="120" w:after="0"/>
         <w:jc w:val="both"/>
-        <w:rPr>
-          <w:rFonts w:ascii="Times New Roman" w:hAnsi="Times New Roman"/>
-          <w:sz w:val="24"/>
-          <w:ins w:id="64" w:author="Martin Vojík" w:date="2024-09-04T10:27:00Z"/>
-        </w:rPr>
-      </w:pPr>
-      <w:ins w:id="63" w:author="Martin Vojík" w:date="2024-09-04T10:27:00Z">
-        <w:r>
-          <w:rPr>
-            <w:rFonts w:ascii="Times New Roman" w:hAnsi="Times New Roman"/>
-            <w:sz w:val="24"/>
-          </w:rPr>
-        </w:r>
-      </w:ins>
-    </w:p>
-    <w:p>
-      <w:pPr>
-        <w:pStyle w:val="Normal"/>
-        <w:spacing w:before="120" w:after="0"/>
-        <w:jc w:val="both"/>
-        <w:pPrChange w:id="0" w:author="Martin Vojík" w:date="2024-09-04T10:27:00Z">
-          <w:pPr>
-            <w:jc w:val="both"/>
-            <w:spacing w:before="0" w:after="120"/>
-          </w:pPr>
-        </w:pPrChange>
         <w:rPr>
           <w:rFonts w:ascii="Times New Roman" w:hAnsi="Times New Roman"/>
           <w:b/>
@@ -5203,19 +4760,16 @@
           <w:rFonts w:ascii="Times New Roman" w:hAnsi="Times New Roman" w:cs="Times New Roman"/>
           <w:sz w:val="24"/>
           <w:szCs w:val="24"/>
-          <w:del w:id="66" w:author="Martin Vojík" w:date="2024-09-04T13:16:00Z"/>
         </w:rPr>
       </w:pPr>
-      <w:del w:id="65" w:author="Martin Vojík" w:date="2024-09-04T13:16:00Z">
-        <w:r>
-          <w:rPr>
-            <w:rFonts w:cs="Times New Roman" w:ascii="Times New Roman" w:hAnsi="Times New Roman"/>
-            <w:sz w:val="24"/>
-            <w:szCs w:val="24"/>
-          </w:rPr>
-          <w:delText>Chytrý M., Kučera T. &amp; Kočí M. [eds] (2001): Katalog biotopů České republiky. Interpretační příručka k evropským programům Natura 2000 a Smaragd. – Agentura ochrany přírody a krajiny ČR, Praha.</w:delText>
-        </w:r>
-      </w:del>
+      <w:r>
+        <w:rPr>
+          <w:rFonts w:cs="Times New Roman" w:ascii="Times New Roman" w:hAnsi="Times New Roman"/>
+          <w:sz w:val="24"/>
+          <w:szCs w:val="24"/>
+        </w:rPr>
+        <w:t>Chytrý M., Kučera T., Kočí M., Grulich V. &amp; Lustyk P. [eds] (2010): Katalog biotopů České republiky, Ed. 2. – Agentura ochrany přírody a krajiny ČR, Praha.</w:t>
+      </w:r>
     </w:p>
     <w:p>
       <w:pPr>
@@ -5225,7 +4779,6 @@
           <w:rFonts w:ascii="Times New Roman" w:hAnsi="Times New Roman" w:cs="Times New Roman"/>
           <w:sz w:val="24"/>
           <w:szCs w:val="24"/>
-          <w:ins w:id="67" w:author="Martin Vojík" w:date="2024-09-04T13:02:00Z"/>
         </w:rPr>
       </w:pPr>
       <w:r>
@@ -5234,7 +4787,7 @@
           <w:sz w:val="24"/>
           <w:szCs w:val="24"/>
         </w:rPr>
-        <w:t>Chytrý M., Kučera T., Kočí M., Grulich V. &amp; Lustyk P. [eds] (2010): Katalog biotopů České republiky, Ed. 2. – Agentura ochrany přírody a krajiny ČR, Praha.</w:t>
+        <w:t>Kučera T., Čížek L., Hofmeister J., Hošek J., Kloubcová P., Kučerová A., Malíček J., Svoboda T. &amp; Zítková I. (2016): Metodika sledování stavu předmětů ochrany evropsky významných lokalit – Ms., 827 p. [Depon in: Agentura ochrany přírody a krajiny ČR, Praha]</w:t>
       </w:r>
     </w:p>
     <w:p>
@@ -5247,26 +4800,14 @@
           <w:szCs w:val="24"/>
         </w:rPr>
       </w:pPr>
-      <w:ins w:id="68" w:author="Martin Vojík" w:date="2024-09-04T13:02:00Z">
-        <w:r>
-          <w:rPr>
-            <w:rFonts w:cs="Times New Roman" w:ascii="Times New Roman" w:hAnsi="Times New Roman"/>
-            <w:sz w:val="24"/>
-            <w:szCs w:val="24"/>
-          </w:rPr>
-          <w:t>Kučera T., Čížek L., Hofmeister J., Hošek J., Kloubcová P., Kučerová A., Malíček J., Svoboda T. &amp; Zítková I. (2016): Metodika sledování stavu předmětů ochrany evropsky významných lokalit</w:t>
-        </w:r>
-      </w:ins>
-      <w:ins w:id="69" w:author="Martin Vojík" w:date="2024-09-04T13:04:00Z">
-        <w:r>
-          <w:rPr>
-            <w:rFonts w:cs="Times New Roman" w:ascii="Times New Roman" w:hAnsi="Times New Roman"/>
-            <w:sz w:val="24"/>
-            <w:szCs w:val="24"/>
-          </w:rPr>
-          <w:t xml:space="preserve"> – Ms., 827 p. [Depon in: Agentura ochrany přírody a krajiny ČR, Praha]</w:t>
-        </w:r>
-      </w:ins>
+      <w:r>
+        <w:rPr>
+          <w:rFonts w:cs="Times New Roman" w:ascii="Times New Roman" w:hAnsi="Times New Roman"/>
+          <w:sz w:val="24"/>
+          <w:szCs w:val="24"/>
+        </w:rPr>
+        <w:t>Lustyk P. (2024a): Metodika aktualizace vrstvy mapování biotopů, pracovní verze pro sezónu 2020. – Ms., 33 p. [Depon in: Agentura ochrany přírody a krajiny ČR, Praha]</w:t>
+      </w:r>
     </w:p>
     <w:p>
       <w:pPr>
@@ -5276,118 +4817,16 @@
           <w:rFonts w:ascii="Times New Roman" w:hAnsi="Times New Roman" w:cs="Times New Roman"/>
           <w:sz w:val="24"/>
           <w:szCs w:val="24"/>
-          <w:del w:id="73" w:author="Martin Vojík" w:date="2024-09-04T13:01:00Z"/>
         </w:rPr>
       </w:pPr>
-      <w:del w:id="70" w:author="Martin Vojík" w:date="2024-09-04T13:01:00Z">
-        <w:r>
-          <w:rPr>
-            <w:rFonts w:cs="Times New Roman" w:ascii="Times New Roman" w:hAnsi="Times New Roman"/>
-            <w:sz w:val="24"/>
-            <w:szCs w:val="24"/>
-          </w:rPr>
-          <w:delText>Lustyk P. [ed.] (20</w:delText>
-        </w:r>
-      </w:del>
-      <w:del w:id="71" w:author="Martin Vojík" w:date="2024-09-04T12:30:00Z">
-        <w:r>
-          <w:rPr>
-            <w:rFonts w:cs="Times New Roman" w:ascii="Times New Roman" w:hAnsi="Times New Roman"/>
-            <w:sz w:val="24"/>
-            <w:szCs w:val="24"/>
-          </w:rPr>
-          <w:delText>15</w:delText>
-        </w:r>
-      </w:del>
-      <w:del w:id="72" w:author="Martin Vojík" w:date="2024-09-04T13:01:00Z">
-        <w:r>
-          <w:rPr>
-            <w:rFonts w:cs="Times New Roman" w:ascii="Times New Roman" w:hAnsi="Times New Roman"/>
-            <w:sz w:val="24"/>
-            <w:szCs w:val="24"/>
-          </w:rPr>
-          <w:delText>): Příručka hodnocení biotopů. – Ms., 540 p. [Depon in: Agentura ochrany přírody a krajiny ČR, Praha]</w:delText>
-        </w:r>
-      </w:del>
-    </w:p>
-    <w:p>
-      <w:pPr>
-        <w:pStyle w:val="NormalWeb"/>
-        <w:spacing w:before="280" w:after="280"/>
-        <w:rPr>
-          <w:rFonts w:ascii="Times New Roman" w:hAnsi="Times New Roman" w:cs="Times New Roman"/>
+      <w:r>
+        <w:rPr>
+          <w:rFonts w:cs="Times New Roman" w:ascii="Times New Roman" w:hAnsi="Times New Roman"/>
           <w:sz w:val="24"/>
           <w:szCs w:val="24"/>
         </w:rPr>
-      </w:pPr>
-      <w:r>
-        <w:rPr>
-          <w:rFonts w:cs="Times New Roman" w:ascii="Times New Roman" w:hAnsi="Times New Roman"/>
-          <w:sz w:val="24"/>
-          <w:szCs w:val="24"/>
-        </w:rPr>
-        <w:t>Lustyk P. (202</w:t>
-      </w:r>
-      <w:ins w:id="74" w:author="Martin Vojík" w:date="2024-09-04T12:30:00Z">
-        <w:r>
-          <w:rPr>
-            <w:rFonts w:cs="Times New Roman" w:ascii="Times New Roman" w:hAnsi="Times New Roman"/>
-            <w:sz w:val="24"/>
-            <w:szCs w:val="24"/>
-          </w:rPr>
-          <w:t>4</w:t>
-        </w:r>
-      </w:ins>
-      <w:ins w:id="75" w:author="Martin Vojík" w:date="2024-09-04T13:01:00Z">
-        <w:r>
-          <w:rPr>
-            <w:rFonts w:cs="Times New Roman" w:ascii="Times New Roman" w:hAnsi="Times New Roman"/>
-            <w:sz w:val="24"/>
-            <w:szCs w:val="24"/>
-          </w:rPr>
-          <w:t>a</w:t>
-        </w:r>
-      </w:ins>
-      <w:del w:id="76" w:author="Martin Vojík" w:date="2024-09-04T12:30:00Z">
-        <w:r>
-          <w:rPr>
-            <w:rFonts w:cs="Times New Roman" w:ascii="Times New Roman" w:hAnsi="Times New Roman"/>
-            <w:sz w:val="24"/>
-            <w:szCs w:val="24"/>
-          </w:rPr>
-          <w:delText>0</w:delText>
-        </w:r>
-      </w:del>
-      <w:r>
-        <w:rPr>
-          <w:rFonts w:cs="Times New Roman" w:ascii="Times New Roman" w:hAnsi="Times New Roman"/>
-          <w:sz w:val="24"/>
-          <w:szCs w:val="24"/>
-        </w:rPr>
-        <w:t>): Metodika aktualizace vrstvy mapování biotopů, pracovní verze pro sezónu 2020. – Ms., 33 p. [Depon in: Agentura ochrany přírody a krajiny ČR, Praha]</w:t>
-      </w:r>
-    </w:p>
-    <w:p>
-      <w:pPr>
-        <w:pStyle w:val="NormalWeb"/>
-        <w:spacing w:before="280" w:after="280"/>
-        <w:rPr>
-          <w:rFonts w:ascii="Times New Roman" w:hAnsi="Times New Roman" w:cs="Times New Roman"/>
-          <w:sz w:val="24"/>
-          <w:szCs w:val="24"/>
-          <w:ins w:id="78" w:author="Martin Vojík" w:date="2024-09-04T13:01:00Z"/>
-        </w:rPr>
-      </w:pPr>
-      <w:ins w:id="77" w:author="Martin Vojík" w:date="2024-09-04T13:01:00Z">
-        <w:r>
-          <w:rPr>
-            <w:rFonts w:cs="Times New Roman" w:ascii="Times New Roman" w:hAnsi="Times New Roman"/>
-            <w:sz w:val="24"/>
-            <w:szCs w:val="24"/>
-          </w:rPr>
-          <w:t>Lustyk P. [ed.] (2024b): Příručka hodnocení biotopů. – Ms., 540 p. [Depon in: Agentura ochrany přírody a krajiny ČR, Praha]</w:t>
-        </w:r>
-      </w:ins>
+        <w:t>Lustyk P. [ed.] (2024b): Příručka hodnocení biotopů. – Ms., 540 p. [Depon in: Agentura ochrany přírody a krajiny ČR, Praha]</w:t>
+      </w:r>
     </w:p>
     <w:p>
       <w:pPr>
@@ -5397,24 +4836,13 @@
           <w:sz w:val="24"/>
         </w:rPr>
       </w:pPr>
-      <w:del w:id="79" w:author="Martin Vojík" w:date="2024-09-04T13:23:00Z">
-        <w:r>
-          <w:rPr>
-            <w:rFonts w:ascii="Times New Roman" w:hAnsi="Times New Roman"/>
-            <w:sz w:val="24"/>
-          </w:rPr>
-          <w:delText>Mehtälä J. &amp; Vuorisalo T. (2007): Conservation policy and the EU Habitats directive: favourable conservation status as a measure of conservation success. – European Environment 17: 363–375.</w:delText>
-        </w:r>
-      </w:del>
-      <w:ins w:id="80" w:author="Martin Vojík" w:date="2024-09-04T13:21:00Z">
-        <w:r>
-          <w:rPr>
-            <w:rFonts w:ascii="Times New Roman" w:hAnsi="Times New Roman"/>
-            <w:sz w:val="24"/>
-          </w:rPr>
-          <w:t>Moravec J. (ed., 1995): Rostlinná společenstva České republiky a jejich ohrožení. 2. Vydání. Severočeskou přírodou, Litoměřice, Příloha 1995: 1-206.</w:t>
-        </w:r>
-      </w:ins>
+      <w:r>
+        <w:rPr>
+          <w:rFonts w:ascii="Times New Roman" w:hAnsi="Times New Roman"/>
+          <w:sz w:val="24"/>
+        </w:rPr>
+        <w:t>Moravec J. (ed., 1995): Rostlinná společenstva České republiky a jejich ohrožení. 2. Vydání. Severočeskou přírodou, Litoměřice, Příloha 1995: 1-206.</w:t>
+      </w:r>
     </w:p>
     <w:p>
       <w:pPr>
@@ -5500,22 +4928,15 @@
     <w:p>
       <w:pPr>
         <w:pStyle w:val="Normal"/>
-        <w:spacing w:before="0" w:after="120"/>
-        <w:jc w:val="both"/>
         <w:rPr>
           <w:rFonts w:ascii="Times New Roman" w:hAnsi="Times New Roman"/>
           <w:sz w:val="24"/>
-          <w:del w:id="82" w:author="Martin Vojík" w:date="2024-09-04T13:05:00Z"/>
+          <w:szCs w:val="28"/>
         </w:rPr>
       </w:pPr>
-      <w:del w:id="81" w:author="Martin Vojík" w:date="2024-09-04T13:05:00Z">
-        <w:r>
-          <w:rPr>
-            <w:rFonts w:ascii="Times New Roman" w:hAnsi="Times New Roman"/>
-            <w:sz w:val="24"/>
-          </w:rPr>
-        </w:r>
-      </w:del>
+      <w:r>
+        <w:rPr/>
+      </w:r>
       <w:r>
         <w:br w:type="page"/>
       </w:r>
@@ -5548,6 +4969,7 @@
           <w:sz w:val="24"/>
         </w:rPr>
       </w:pPr>
+      <w:commentRangeStart w:id="22"/>
       <w:r>
         <w:rPr>
           <w:rFonts w:ascii="Times New Roman" w:hAnsi="Times New Roman"/>
@@ -5617,6 +5039,17 @@
         </w:rPr>
         <w:t>Dalším krokem je sloučení sousedících polygonů se stejnými určenými atributy. Lze k tomu využít nástroj Dissolve v programu ArcGIS. U polygonů X a OST postačuje pouze shoda parametru X, resp. OST, u stanovišť byla ke sloučení sousedících polygonů zapotřebí shoda typu stanoviště, třídy kvality a (ne)příslušnosti k EVL. Aby při výpočtu parametru mozaika nedocházelo ke zkreslení na hranici republiky, vytvoří se kolem hranice buffer polygon, který je též přidán do sloučené vrstvy s habitatovým atributem např. LVI (Hic sunt leones). Následně je proveden výpočet plochy všech polygonů.</w:t>
       </w:r>
+      <w:ins w:id="25" w:author="Jakub Rataj" w:date="2026-02-13T11:38:19Z">
+        <w:commentRangeEnd w:id="22"/>
+        <w:r>
+          <w:commentReference w:id="22"/>
+        </w:r>
+        <w:r>
+          <w:rPr>
+            <w:rFonts w:ascii="Times New Roman" w:hAnsi="Times New Roman"/>
+          </w:rPr>
+        </w:r>
+      </w:ins>
     </w:p>
     <w:p>
       <w:pPr>
@@ -5666,6 +5099,7 @@
           <w:rFonts w:ascii="Times New Roman" w:hAnsi="Times New Roman" w:cs="Times New Roman"/>
         </w:rPr>
       </w:pPr>
+      <w:commentRangeStart w:id="23"/>
       <w:r>
         <w:rPr>
           <w:rFonts w:cs="Times New Roman" w:ascii="Times New Roman" w:hAnsi="Times New Roman"/>
@@ -5705,10 +5139,78 @@
         <w:rPr>
           <w:rFonts w:cs="Times New Roman" w:ascii="Times New Roman" w:hAnsi="Times New Roman"/>
         </w:rPr>
+      </w:r>
+      <w:commentRangeEnd w:id="23"/>
+      <w:r>
+        <w:commentReference w:id="23"/>
+      </w:r>
+      <w:r>
+        <w:rPr>
+          <w:rFonts w:cs="Times New Roman" w:ascii="Times New Roman" w:hAnsi="Times New Roman"/>
+        </w:rPr>
         <w:br/>
       </w:r>
       <w:r>
         <w:br w:type="page"/>
+      </w:r>
+    </w:p>
+    <w:p>
+      <w:pPr>
+        <w:pStyle w:val="Normal"/>
+        <w:spacing w:lineRule="auto" w:line="240" w:before="0" w:after="0"/>
+        <w:rPr>
+          <w:ins w:id="29" w:author="Jakub Rataj" w:date="2026-02-13T11:32:02Z"/>
+        </w:rPr>
+      </w:pPr>
+      <w:r>
+        <w:rPr>
+          <w:rFonts w:cs="Times New Roman" w:ascii="Times New Roman" w:hAnsi="Times New Roman"/>
+          <w:b/>
+          <w:sz w:val="24"/>
+          <w:szCs w:val="24"/>
+        </w:rPr>
+        <w:t>Příloha 2</w:t>
+      </w:r>
+      <w:r>
+        <w:rPr/>
+        <w:t xml:space="preserve"> </w:t>
+      </w:r>
+      <w:ins w:id="26" w:author="Jakub Rataj" w:date="2026-02-13T11:31:41Z">
+        <w:r>
+          <w:rPr/>
+          <w:t>‒</w:t>
+        </w:r>
+      </w:ins>
+      <w:del w:id="27" w:author="Jakub Rataj" w:date="2026-02-13T11:31:40Z">
+        <w:r>
+          <w:rPr/>
+          <w:delText>-</w:delText>
+        </w:r>
+      </w:del>
+      <w:r>
+        <w:rPr/>
+        <w:t xml:space="preserve"> </w:t>
+      </w:r>
+      <w:r>
+        <w:rPr>
+          <w:rFonts w:ascii="Calibri" w:hAnsi="Calibri" w:eastAsia="Calibri" w:cs="" w:asciiTheme="minorHAnsi" w:cstheme="minorBidi" w:eastAsiaTheme="minorHAnsi" w:hAnsiTheme="minorHAnsi"/>
+          <w:b/>
+          <w:bCs/>
+          <w:color w:val="auto"/>
+          <w:lang w:val="cs-CZ" w:eastAsia="en-US" w:bidi="ar-SA"/>
+          <w:rPrChange w:id="0" w:author="Jakub Rataj" w:date="2026-02-13T11:32:55Z">
+            <w:rPr>
+              <w:sz w:val="22"/>
+              <w:kern w:val="0"/>
+              <w:szCs w:val="22"/>
+            </w:rPr>
+          </w:rPrChange>
+        </w:rPr>
+        <w:t>Kombinované expertní stanovení hodnoty minimiareálu a stupně ohrožení stanoviště</w:t>
+      </w:r>
+      <w:r>
+        <w:rPr/>
+        <w:t xml:space="preserve"> aktualizovaného podle ohrožení vegetace a stavu v okolních zemích EU a s ohledem na plochu výskytu. Stupeň ohrožení v závorce představuje odlišný odhad stavu před deseti lety (Červená kniha biotopů, Kučera 2005). Stupně: CR - kriticky ohrožený, EN - ohrožený, VU - zranitelný, NT - téměř ohrožený, LC - málo dotčený (přejato z práce Kučera a kol. 2016).</w:t>
       </w:r>
     </w:p>
     <w:p>
@@ -5718,30 +5220,8 @@
         <w:rPr/>
       </w:pPr>
       <w:r>
-        <w:rPr>
-          <w:rFonts w:cs="Times New Roman" w:ascii="Times New Roman" w:hAnsi="Times New Roman"/>
-          <w:b/>
-          <w:sz w:val="24"/>
-          <w:szCs w:val="24"/>
-        </w:rPr>
-        <w:t>Příloha 2</w:t>
-      </w:r>
-      <w:r>
         <w:rPr/>
-        <w:t xml:space="preserve"> - Kombinované expertní stanovení hodnoty minimiareálu a stupně ohrožení stanoviště aktualizovaného podle ohrožení vegetace a stavu v okolních zemích EU a s ohledem na plochu výskytu. Stupeň ohrožení v závorce představuje odlišný odhad stavu před deseti lety (Červená kniha biotopů, Kučera 2005). Stupně: CR - kriticky ohrožený, EN - ohrožený, VU - zranitelný, NT - téměř ohrožený, LC - málo dotčený</w:t>
-      </w:r>
-      <w:ins w:id="83" w:author="Martin Vojík" w:date="2024-09-04T13:05:00Z">
-        <w:r>
-          <w:rPr/>
-          <w:t xml:space="preserve"> (přejato z práce Kučera a kol. 2016).</w:t>
-        </w:r>
-      </w:ins>
-      <w:del w:id="84" w:author="Martin Vojík" w:date="2024-09-04T13:05:00Z">
-        <w:r>
-          <w:rPr/>
-          <w:delText>.</w:delText>
-        </w:r>
-      </w:del>
+      </w:r>
     </w:p>
     <w:tbl>
       <w:tblPr>
@@ -5763,8 +5243,8 @@
         <w:gridCol w:w="875"/>
         <w:gridCol w:w="2016"/>
         <w:gridCol w:w="853"/>
-        <w:gridCol w:w="877"/>
-        <w:gridCol w:w="635"/>
+        <w:gridCol w:w="878"/>
+        <w:gridCol w:w="634"/>
         <w:gridCol w:w="604"/>
         <w:gridCol w:w="976"/>
       </w:tblGrid>
@@ -5983,7 +5463,7 @@
         </w:tc>
         <w:tc>
           <w:tcPr>
-            <w:tcW w:w="877" w:type="dxa"/>
+            <w:tcW w:w="878" w:type="dxa"/>
             <w:tcBorders>
               <w:top w:val="single" w:sz="8" w:space="0" w:color="000000"/>
               <w:bottom w:val="single" w:sz="8" w:space="0" w:color="000000"/>
@@ -6023,7 +5503,7 @@
         </w:tc>
         <w:tc>
           <w:tcPr>
-            <w:tcW w:w="635" w:type="dxa"/>
+            <w:tcW w:w="634" w:type="dxa"/>
             <w:tcBorders>
               <w:top w:val="single" w:sz="8" w:space="0" w:color="000000"/>
               <w:left w:val="single" w:sz="4" w:space="0" w:color="000000"/>
@@ -6333,7 +5813,7 @@
         </w:tc>
         <w:tc>
           <w:tcPr>
-            <w:tcW w:w="877" w:type="dxa"/>
+            <w:tcW w:w="878" w:type="dxa"/>
             <w:tcBorders>
               <w:bottom w:val="single" w:sz="4" w:space="0" w:color="000000"/>
               <w:right w:val="single" w:sz="4" w:space="0" w:color="000000"/>
@@ -6368,7 +5848,7 @@
         </w:tc>
         <w:tc>
           <w:tcPr>
-            <w:tcW w:w="635" w:type="dxa"/>
+            <w:tcW w:w="634" w:type="dxa"/>
             <w:tcBorders>
               <w:bottom w:val="single" w:sz="4" w:space="0" w:color="000000"/>
               <w:right w:val="single" w:sz="4" w:space="0" w:color="000000"/>
@@ -6700,7 +6180,7 @@
         </w:tc>
         <w:tc>
           <w:tcPr>
-            <w:tcW w:w="877" w:type="dxa"/>
+            <w:tcW w:w="878" w:type="dxa"/>
             <w:tcBorders>
               <w:bottom w:val="single" w:sz="4" w:space="0" w:color="000000"/>
               <w:right w:val="single" w:sz="4" w:space="0" w:color="000000"/>
@@ -6735,7 +6215,7 @@
         </w:tc>
         <w:tc>
           <w:tcPr>
-            <w:tcW w:w="635" w:type="dxa"/>
+            <w:tcW w:w="634" w:type="dxa"/>
             <w:vMerge w:val="restart"/>
             <w:tcBorders>
               <w:left w:val="single" w:sz="4" w:space="0" w:color="000000"/>
@@ -7043,7 +6523,7 @@
         </w:tc>
         <w:tc>
           <w:tcPr>
-            <w:tcW w:w="877" w:type="dxa"/>
+            <w:tcW w:w="878" w:type="dxa"/>
             <w:tcBorders>
               <w:bottom w:val="single" w:sz="4" w:space="0" w:color="000000"/>
               <w:right w:val="single" w:sz="4" w:space="0" w:color="000000"/>
@@ -7075,7 +6555,7 @@
         </w:tc>
         <w:tc>
           <w:tcPr>
-            <w:tcW w:w="635" w:type="dxa"/>
+            <w:tcW w:w="634" w:type="dxa"/>
             <w:vMerge w:val="continue"/>
             <w:tcBorders>
               <w:left w:val="single" w:sz="4" w:space="0" w:color="000000"/>
@@ -7357,7 +6837,7 @@
         </w:tc>
         <w:tc>
           <w:tcPr>
-            <w:tcW w:w="877" w:type="dxa"/>
+            <w:tcW w:w="878" w:type="dxa"/>
             <w:tcBorders>
               <w:bottom w:val="single" w:sz="4" w:space="0" w:color="000000"/>
               <w:right w:val="single" w:sz="4" w:space="0" w:color="000000"/>
@@ -7389,7 +6869,7 @@
         </w:tc>
         <w:tc>
           <w:tcPr>
-            <w:tcW w:w="635" w:type="dxa"/>
+            <w:tcW w:w="634" w:type="dxa"/>
             <w:vMerge w:val="continue"/>
             <w:tcBorders>
               <w:left w:val="single" w:sz="4" w:space="0" w:color="000000"/>
@@ -7708,7 +7188,7 @@
         </w:tc>
         <w:tc>
           <w:tcPr>
-            <w:tcW w:w="877" w:type="dxa"/>
+            <w:tcW w:w="878" w:type="dxa"/>
             <w:tcBorders>
               <w:bottom w:val="single" w:sz="4" w:space="0" w:color="000000"/>
               <w:right w:val="single" w:sz="4" w:space="0" w:color="000000"/>
@@ -7740,7 +7220,7 @@
         </w:tc>
         <w:tc>
           <w:tcPr>
-            <w:tcW w:w="635" w:type="dxa"/>
+            <w:tcW w:w="634" w:type="dxa"/>
             <w:vMerge w:val="restart"/>
             <w:tcBorders>
               <w:left w:val="single" w:sz="4" w:space="0" w:color="000000"/>
@@ -8024,7 +7504,7 @@
         </w:tc>
         <w:tc>
           <w:tcPr>
-            <w:tcW w:w="877" w:type="dxa"/>
+            <w:tcW w:w="878" w:type="dxa"/>
             <w:tcBorders>
               <w:bottom w:val="single" w:sz="4" w:space="0" w:color="000000"/>
               <w:right w:val="single" w:sz="4" w:space="0" w:color="000000"/>
@@ -8059,7 +7539,7 @@
         </w:tc>
         <w:tc>
           <w:tcPr>
-            <w:tcW w:w="635" w:type="dxa"/>
+            <w:tcW w:w="634" w:type="dxa"/>
             <w:vMerge w:val="continue"/>
             <w:tcBorders>
               <w:left w:val="single" w:sz="4" w:space="0" w:color="000000"/>
@@ -8342,7 +7822,7 @@
         </w:tc>
         <w:tc>
           <w:tcPr>
-            <w:tcW w:w="877" w:type="dxa"/>
+            <w:tcW w:w="878" w:type="dxa"/>
             <w:tcBorders>
               <w:bottom w:val="single" w:sz="4" w:space="0" w:color="000000"/>
               <w:right w:val="single" w:sz="4" w:space="0" w:color="000000"/>
@@ -8374,7 +7854,7 @@
         </w:tc>
         <w:tc>
           <w:tcPr>
-            <w:tcW w:w="635" w:type="dxa"/>
+            <w:tcW w:w="634" w:type="dxa"/>
             <w:vMerge w:val="continue"/>
             <w:tcBorders>
               <w:left w:val="single" w:sz="4" w:space="0" w:color="000000"/>
@@ -8652,7 +8132,7 @@
         </w:tc>
         <w:tc>
           <w:tcPr>
-            <w:tcW w:w="877" w:type="dxa"/>
+            <w:tcW w:w="878" w:type="dxa"/>
             <w:tcBorders>
               <w:bottom w:val="single" w:sz="4" w:space="0" w:color="000000"/>
               <w:right w:val="single" w:sz="4" w:space="0" w:color="000000"/>
@@ -8684,7 +8164,7 @@
         </w:tc>
         <w:tc>
           <w:tcPr>
-            <w:tcW w:w="635" w:type="dxa"/>
+            <w:tcW w:w="634" w:type="dxa"/>
             <w:vMerge w:val="continue"/>
             <w:tcBorders>
               <w:left w:val="single" w:sz="4" w:space="0" w:color="000000"/>
@@ -8982,7 +8462,7 @@
         </w:tc>
         <w:tc>
           <w:tcPr>
-            <w:tcW w:w="877" w:type="dxa"/>
+            <w:tcW w:w="878" w:type="dxa"/>
             <w:tcBorders>
               <w:bottom w:val="single" w:sz="4" w:space="0" w:color="000000"/>
               <w:right w:val="single" w:sz="4" w:space="0" w:color="000000"/>
@@ -9017,7 +8497,7 @@
         </w:tc>
         <w:tc>
           <w:tcPr>
-            <w:tcW w:w="635" w:type="dxa"/>
+            <w:tcW w:w="634" w:type="dxa"/>
             <w:vMerge w:val="continue"/>
             <w:tcBorders>
               <w:left w:val="single" w:sz="4" w:space="0" w:color="000000"/>
@@ -9297,7 +8777,7 @@
         </w:tc>
         <w:tc>
           <w:tcPr>
-            <w:tcW w:w="877" w:type="dxa"/>
+            <w:tcW w:w="878" w:type="dxa"/>
             <w:tcBorders>
               <w:bottom w:val="single" w:sz="4" w:space="0" w:color="000000"/>
               <w:right w:val="single" w:sz="4" w:space="0" w:color="000000"/>
@@ -9329,7 +8809,7 @@
         </w:tc>
         <w:tc>
           <w:tcPr>
-            <w:tcW w:w="635" w:type="dxa"/>
+            <w:tcW w:w="634" w:type="dxa"/>
             <w:tcBorders>
               <w:bottom w:val="single" w:sz="4" w:space="0" w:color="000000"/>
               <w:right w:val="single" w:sz="4" w:space="0" w:color="000000"/>
@@ -9672,7 +9152,7 @@
         </w:tc>
         <w:tc>
           <w:tcPr>
-            <w:tcW w:w="877" w:type="dxa"/>
+            <w:tcW w:w="878" w:type="dxa"/>
             <w:tcBorders>
               <w:bottom w:val="single" w:sz="4" w:space="0" w:color="000000"/>
               <w:right w:val="single" w:sz="4" w:space="0" w:color="000000"/>
@@ -9704,7 +9184,7 @@
         </w:tc>
         <w:tc>
           <w:tcPr>
-            <w:tcW w:w="635" w:type="dxa"/>
+            <w:tcW w:w="634" w:type="dxa"/>
             <w:vMerge w:val="restart"/>
             <w:tcBorders>
               <w:left w:val="single" w:sz="4" w:space="0" w:color="000000"/>
@@ -10012,7 +9492,7 @@
         </w:tc>
         <w:tc>
           <w:tcPr>
-            <w:tcW w:w="877" w:type="dxa"/>
+            <w:tcW w:w="878" w:type="dxa"/>
             <w:tcBorders>
               <w:bottom w:val="single" w:sz="4" w:space="0" w:color="000000"/>
               <w:right w:val="single" w:sz="4" w:space="0" w:color="000000"/>
@@ -10044,7 +9524,7 @@
         </w:tc>
         <w:tc>
           <w:tcPr>
-            <w:tcW w:w="635" w:type="dxa"/>
+            <w:tcW w:w="634" w:type="dxa"/>
             <w:vMerge w:val="continue"/>
             <w:tcBorders>
               <w:left w:val="single" w:sz="4" w:space="0" w:color="000000"/>
@@ -10366,7 +9846,7 @@
         </w:tc>
         <w:tc>
           <w:tcPr>
-            <w:tcW w:w="877" w:type="dxa"/>
+            <w:tcW w:w="878" w:type="dxa"/>
             <w:tcBorders>
               <w:bottom w:val="single" w:sz="4" w:space="0" w:color="000000"/>
               <w:right w:val="single" w:sz="4" w:space="0" w:color="000000"/>
@@ -10398,7 +9878,7 @@
         </w:tc>
         <w:tc>
           <w:tcPr>
-            <w:tcW w:w="635" w:type="dxa"/>
+            <w:tcW w:w="634" w:type="dxa"/>
             <w:vMerge w:val="continue"/>
             <w:tcBorders>
               <w:left w:val="single" w:sz="4" w:space="0" w:color="000000"/>
@@ -10700,7 +10180,7 @@
         </w:tc>
         <w:tc>
           <w:tcPr>
-            <w:tcW w:w="877" w:type="dxa"/>
+            <w:tcW w:w="878" w:type="dxa"/>
             <w:tcBorders>
               <w:bottom w:val="single" w:sz="4" w:space="0" w:color="000000"/>
               <w:right w:val="single" w:sz="4" w:space="0" w:color="000000"/>
@@ -10732,7 +10212,7 @@
         </w:tc>
         <w:tc>
           <w:tcPr>
-            <w:tcW w:w="635" w:type="dxa"/>
+            <w:tcW w:w="634" w:type="dxa"/>
             <w:vMerge w:val="continue"/>
             <w:tcBorders>
               <w:left w:val="single" w:sz="4" w:space="0" w:color="000000"/>
@@ -11034,7 +10514,7 @@
         </w:tc>
         <w:tc>
           <w:tcPr>
-            <w:tcW w:w="877" w:type="dxa"/>
+            <w:tcW w:w="878" w:type="dxa"/>
             <w:tcBorders>
               <w:bottom w:val="single" w:sz="4" w:space="0" w:color="000000"/>
               <w:right w:val="single" w:sz="4" w:space="0" w:color="000000"/>
@@ -11066,7 +10546,7 @@
         </w:tc>
         <w:tc>
           <w:tcPr>
-            <w:tcW w:w="635" w:type="dxa"/>
+            <w:tcW w:w="634" w:type="dxa"/>
             <w:vMerge w:val="continue"/>
             <w:tcBorders>
               <w:left w:val="single" w:sz="4" w:space="0" w:color="000000"/>
@@ -11348,7 +10828,7 @@
         </w:tc>
         <w:tc>
           <w:tcPr>
-            <w:tcW w:w="877" w:type="dxa"/>
+            <w:tcW w:w="878" w:type="dxa"/>
             <w:tcBorders>
               <w:bottom w:val="single" w:sz="4" w:space="0" w:color="000000"/>
               <w:right w:val="single" w:sz="4" w:space="0" w:color="000000"/>
@@ -11380,7 +10860,7 @@
         </w:tc>
         <w:tc>
           <w:tcPr>
-            <w:tcW w:w="635" w:type="dxa"/>
+            <w:tcW w:w="634" w:type="dxa"/>
             <w:vMerge w:val="continue"/>
             <w:tcBorders>
               <w:left w:val="single" w:sz="4" w:space="0" w:color="000000"/>
@@ -11665,7 +11145,7 @@
         </w:tc>
         <w:tc>
           <w:tcPr>
-            <w:tcW w:w="877" w:type="dxa"/>
+            <w:tcW w:w="878" w:type="dxa"/>
             <w:tcBorders>
               <w:bottom w:val="single" w:sz="4" w:space="0" w:color="000000"/>
               <w:right w:val="single" w:sz="4" w:space="0" w:color="000000"/>
@@ -11697,7 +11177,7 @@
         </w:tc>
         <w:tc>
           <w:tcPr>
-            <w:tcW w:w="635" w:type="dxa"/>
+            <w:tcW w:w="634" w:type="dxa"/>
             <w:tcBorders>
               <w:bottom w:val="single" w:sz="4" w:space="0" w:color="000000"/>
               <w:right w:val="single" w:sz="4" w:space="0" w:color="000000"/>
@@ -12004,7 +11484,7 @@
         </w:tc>
         <w:tc>
           <w:tcPr>
-            <w:tcW w:w="877" w:type="dxa"/>
+            <w:tcW w:w="878" w:type="dxa"/>
             <w:tcBorders>
               <w:bottom w:val="single" w:sz="4" w:space="0" w:color="000000"/>
               <w:right w:val="single" w:sz="4" w:space="0" w:color="000000"/>
@@ -12036,7 +11516,7 @@
         </w:tc>
         <w:tc>
           <w:tcPr>
-            <w:tcW w:w="635" w:type="dxa"/>
+            <w:tcW w:w="634" w:type="dxa"/>
             <w:tcBorders>
               <w:bottom w:val="single" w:sz="4" w:space="0" w:color="000000"/>
               <w:right w:val="single" w:sz="4" w:space="0" w:color="000000"/>
@@ -12358,7 +11838,7 @@
         </w:tc>
         <w:tc>
           <w:tcPr>
-            <w:tcW w:w="877" w:type="dxa"/>
+            <w:tcW w:w="878" w:type="dxa"/>
             <w:tcBorders>
               <w:bottom w:val="single" w:sz="4" w:space="0" w:color="000000"/>
               <w:right w:val="single" w:sz="4" w:space="0" w:color="000000"/>
@@ -12393,7 +11873,7 @@
         </w:tc>
         <w:tc>
           <w:tcPr>
-            <w:tcW w:w="635" w:type="dxa"/>
+            <w:tcW w:w="634" w:type="dxa"/>
             <w:tcBorders>
               <w:bottom w:val="single" w:sz="4" w:space="0" w:color="000000"/>
               <w:right w:val="single" w:sz="4" w:space="0" w:color="000000"/>
@@ -12700,7 +12180,7 @@
         </w:tc>
         <w:tc>
           <w:tcPr>
-            <w:tcW w:w="877" w:type="dxa"/>
+            <w:tcW w:w="878" w:type="dxa"/>
             <w:tcBorders>
               <w:bottom w:val="single" w:sz="4" w:space="0" w:color="000000"/>
               <w:right w:val="single" w:sz="4" w:space="0" w:color="000000"/>
@@ -12732,7 +12212,7 @@
         </w:tc>
         <w:tc>
           <w:tcPr>
-            <w:tcW w:w="635" w:type="dxa"/>
+            <w:tcW w:w="634" w:type="dxa"/>
             <w:tcBorders>
               <w:bottom w:val="single" w:sz="4" w:space="0" w:color="000000"/>
               <w:right w:val="single" w:sz="4" w:space="0" w:color="000000"/>
@@ -13059,7 +12539,7 @@
         </w:tc>
         <w:tc>
           <w:tcPr>
-            <w:tcW w:w="877" w:type="dxa"/>
+            <w:tcW w:w="878" w:type="dxa"/>
             <w:tcBorders>
               <w:bottom w:val="single" w:sz="4" w:space="0" w:color="000000"/>
               <w:right w:val="single" w:sz="4" w:space="0" w:color="000000"/>
@@ -13091,7 +12571,7 @@
         </w:tc>
         <w:tc>
           <w:tcPr>
-            <w:tcW w:w="635" w:type="dxa"/>
+            <w:tcW w:w="634" w:type="dxa"/>
             <w:tcBorders>
               <w:bottom w:val="single" w:sz="4" w:space="0" w:color="000000"/>
               <w:right w:val="single" w:sz="4" w:space="0" w:color="000000"/>
@@ -13418,7 +12898,7 @@
         </w:tc>
         <w:tc>
           <w:tcPr>
-            <w:tcW w:w="877" w:type="dxa"/>
+            <w:tcW w:w="878" w:type="dxa"/>
             <w:tcBorders>
               <w:bottom w:val="single" w:sz="4" w:space="0" w:color="000000"/>
               <w:right w:val="single" w:sz="4" w:space="0" w:color="000000"/>
@@ -13450,7 +12930,7 @@
         </w:tc>
         <w:tc>
           <w:tcPr>
-            <w:tcW w:w="635" w:type="dxa"/>
+            <w:tcW w:w="634" w:type="dxa"/>
             <w:tcBorders>
               <w:bottom w:val="single" w:sz="4" w:space="0" w:color="000000"/>
               <w:right w:val="single" w:sz="4" w:space="0" w:color="000000"/>
@@ -13757,7 +13237,7 @@
         </w:tc>
         <w:tc>
           <w:tcPr>
-            <w:tcW w:w="877" w:type="dxa"/>
+            <w:tcW w:w="878" w:type="dxa"/>
             <w:tcBorders>
               <w:bottom w:val="single" w:sz="4" w:space="0" w:color="000000"/>
               <w:right w:val="single" w:sz="4" w:space="0" w:color="000000"/>
@@ -13789,7 +13269,7 @@
         </w:tc>
         <w:tc>
           <w:tcPr>
-            <w:tcW w:w="635" w:type="dxa"/>
+            <w:tcW w:w="634" w:type="dxa"/>
             <w:vMerge w:val="restart"/>
             <w:tcBorders>
               <w:left w:val="single" w:sz="4" w:space="0" w:color="000000"/>
@@ -14092,7 +13572,7 @@
         </w:tc>
         <w:tc>
           <w:tcPr>
-            <w:tcW w:w="877" w:type="dxa"/>
+            <w:tcW w:w="878" w:type="dxa"/>
             <w:tcBorders>
               <w:bottom w:val="single" w:sz="4" w:space="0" w:color="000000"/>
               <w:right w:val="single" w:sz="4" w:space="0" w:color="000000"/>
@@ -14124,7 +13604,7 @@
         </w:tc>
         <w:tc>
           <w:tcPr>
-            <w:tcW w:w="635" w:type="dxa"/>
+            <w:tcW w:w="634" w:type="dxa"/>
             <w:vMerge w:val="continue"/>
             <w:tcBorders>
               <w:left w:val="single" w:sz="4" w:space="0" w:color="000000"/>
@@ -14401,7 +13881,7 @@
         </w:tc>
         <w:tc>
           <w:tcPr>
-            <w:tcW w:w="877" w:type="dxa"/>
+            <w:tcW w:w="878" w:type="dxa"/>
             <w:tcBorders>
               <w:bottom w:val="single" w:sz="4" w:space="0" w:color="000000"/>
               <w:right w:val="single" w:sz="4" w:space="0" w:color="000000"/>
@@ -14433,7 +13913,7 @@
         </w:tc>
         <w:tc>
           <w:tcPr>
-            <w:tcW w:w="635" w:type="dxa"/>
+            <w:tcW w:w="634" w:type="dxa"/>
             <w:vMerge w:val="continue"/>
             <w:tcBorders>
               <w:left w:val="single" w:sz="4" w:space="0" w:color="000000"/>
@@ -14718,7 +14198,7 @@
         </w:tc>
         <w:tc>
           <w:tcPr>
-            <w:tcW w:w="877" w:type="dxa"/>
+            <w:tcW w:w="878" w:type="dxa"/>
             <w:tcBorders>
               <w:bottom w:val="single" w:sz="4" w:space="0" w:color="000000"/>
               <w:right w:val="single" w:sz="4" w:space="0" w:color="000000"/>
@@ -14750,7 +14230,7 @@
         </w:tc>
         <w:tc>
           <w:tcPr>
-            <w:tcW w:w="635" w:type="dxa"/>
+            <w:tcW w:w="634" w:type="dxa"/>
             <w:vMerge w:val="restart"/>
             <w:tcBorders>
               <w:left w:val="single" w:sz="4" w:space="0" w:color="000000"/>
@@ -15033,7 +14513,7 @@
         </w:tc>
         <w:tc>
           <w:tcPr>
-            <w:tcW w:w="877" w:type="dxa"/>
+            <w:tcW w:w="878" w:type="dxa"/>
             <w:tcBorders>
               <w:bottom w:val="single" w:sz="4" w:space="0" w:color="000000"/>
               <w:right w:val="single" w:sz="4" w:space="0" w:color="000000"/>
@@ -15065,7 +14545,7 @@
         </w:tc>
         <w:tc>
           <w:tcPr>
-            <w:tcW w:w="635" w:type="dxa"/>
+            <w:tcW w:w="634" w:type="dxa"/>
             <w:vMerge w:val="continue"/>
             <w:tcBorders>
               <w:left w:val="single" w:sz="4" w:space="0" w:color="000000"/>
@@ -15410,7 +14890,7 @@
         </w:tc>
         <w:tc>
           <w:tcPr>
-            <w:tcW w:w="877" w:type="dxa"/>
+            <w:tcW w:w="878" w:type="dxa"/>
             <w:tcBorders>
               <w:bottom w:val="single" w:sz="4" w:space="0" w:color="000000"/>
               <w:right w:val="single" w:sz="4" w:space="0" w:color="000000"/>
@@ -15442,7 +14922,7 @@
         </w:tc>
         <w:tc>
           <w:tcPr>
-            <w:tcW w:w="635" w:type="dxa"/>
+            <w:tcW w:w="634" w:type="dxa"/>
             <w:tcBorders>
               <w:bottom w:val="single" w:sz="4" w:space="0" w:color="000000"/>
               <w:right w:val="single" w:sz="4" w:space="0" w:color="000000"/>
@@ -15754,7 +15234,7 @@
         </w:tc>
         <w:tc>
           <w:tcPr>
-            <w:tcW w:w="877" w:type="dxa"/>
+            <w:tcW w:w="878" w:type="dxa"/>
             <w:tcBorders>
               <w:bottom w:val="single" w:sz="4" w:space="0" w:color="000000"/>
               <w:right w:val="single" w:sz="4" w:space="0" w:color="000000"/>
@@ -15789,7 +15269,7 @@
         </w:tc>
         <w:tc>
           <w:tcPr>
-            <w:tcW w:w="635" w:type="dxa"/>
+            <w:tcW w:w="634" w:type="dxa"/>
             <w:vMerge w:val="restart"/>
             <w:tcBorders>
               <w:left w:val="single" w:sz="4" w:space="0" w:color="000000"/>
@@ -16077,7 +15557,7 @@
         </w:tc>
         <w:tc>
           <w:tcPr>
-            <w:tcW w:w="877" w:type="dxa"/>
+            <w:tcW w:w="878" w:type="dxa"/>
             <w:tcBorders>
               <w:bottom w:val="single" w:sz="4" w:space="0" w:color="000000"/>
               <w:right w:val="single" w:sz="4" w:space="0" w:color="000000"/>
@@ -16109,7 +15589,7 @@
         </w:tc>
         <w:tc>
           <w:tcPr>
-            <w:tcW w:w="635" w:type="dxa"/>
+            <w:tcW w:w="634" w:type="dxa"/>
             <w:vMerge w:val="continue"/>
             <w:tcBorders>
               <w:left w:val="single" w:sz="4" w:space="0" w:color="000000"/>
@@ -16410,7 +15890,7 @@
         </w:tc>
         <w:tc>
           <w:tcPr>
-            <w:tcW w:w="877" w:type="dxa"/>
+            <w:tcW w:w="878" w:type="dxa"/>
             <w:tcBorders>
               <w:bottom w:val="single" w:sz="4" w:space="0" w:color="000000"/>
               <w:right w:val="single" w:sz="4" w:space="0" w:color="000000"/>
@@ -16442,7 +15922,7 @@
         </w:tc>
         <w:tc>
           <w:tcPr>
-            <w:tcW w:w="635" w:type="dxa"/>
+            <w:tcW w:w="634" w:type="dxa"/>
             <w:vMerge w:val="restart"/>
             <w:tcBorders>
               <w:left w:val="single" w:sz="4" w:space="0" w:color="000000"/>
@@ -16750,7 +16230,7 @@
         </w:tc>
         <w:tc>
           <w:tcPr>
-            <w:tcW w:w="877" w:type="dxa"/>
+            <w:tcW w:w="878" w:type="dxa"/>
             <w:tcBorders>
               <w:bottom w:val="single" w:sz="4" w:space="0" w:color="000000"/>
               <w:right w:val="single" w:sz="4" w:space="0" w:color="000000"/>
@@ -16785,7 +16265,7 @@
         </w:tc>
         <w:tc>
           <w:tcPr>
-            <w:tcW w:w="635" w:type="dxa"/>
+            <w:tcW w:w="634" w:type="dxa"/>
             <w:vMerge w:val="continue"/>
             <w:tcBorders>
               <w:left w:val="single" w:sz="4" w:space="0" w:color="000000"/>
@@ -17115,7 +16595,7 @@
         </w:tc>
         <w:tc>
           <w:tcPr>
-            <w:tcW w:w="877" w:type="dxa"/>
+            <w:tcW w:w="878" w:type="dxa"/>
             <w:tcBorders>
               <w:bottom w:val="single" w:sz="4" w:space="0" w:color="000000"/>
               <w:right w:val="single" w:sz="4" w:space="0" w:color="000000"/>
@@ -17147,7 +16627,7 @@
         </w:tc>
         <w:tc>
           <w:tcPr>
-            <w:tcW w:w="635" w:type="dxa"/>
+            <w:tcW w:w="634" w:type="dxa"/>
             <w:vMerge w:val="restart"/>
             <w:tcBorders>
               <w:left w:val="single" w:sz="4" w:space="0" w:color="000000"/>
@@ -17455,7 +16935,7 @@
         </w:tc>
         <w:tc>
           <w:tcPr>
-            <w:tcW w:w="877" w:type="dxa"/>
+            <w:tcW w:w="878" w:type="dxa"/>
             <w:tcBorders>
               <w:bottom w:val="single" w:sz="4" w:space="0" w:color="000000"/>
               <w:right w:val="single" w:sz="4" w:space="0" w:color="000000"/>
@@ -17487,7 +16967,7 @@
         </w:tc>
         <w:tc>
           <w:tcPr>
-            <w:tcW w:w="635" w:type="dxa"/>
+            <w:tcW w:w="634" w:type="dxa"/>
             <w:vMerge w:val="continue"/>
             <w:tcBorders>
               <w:left w:val="single" w:sz="4" w:space="0" w:color="000000"/>
@@ -17789,7 +17269,7 @@
         </w:tc>
         <w:tc>
           <w:tcPr>
-            <w:tcW w:w="877" w:type="dxa"/>
+            <w:tcW w:w="878" w:type="dxa"/>
             <w:tcBorders>
               <w:bottom w:val="single" w:sz="4" w:space="0" w:color="000000"/>
               <w:right w:val="single" w:sz="4" w:space="0" w:color="000000"/>
@@ -17821,7 +17301,7 @@
         </w:tc>
         <w:tc>
           <w:tcPr>
-            <w:tcW w:w="635" w:type="dxa"/>
+            <w:tcW w:w="634" w:type="dxa"/>
             <w:vMerge w:val="continue"/>
             <w:tcBorders>
               <w:left w:val="single" w:sz="4" w:space="0" w:color="000000"/>
@@ -18151,7 +17631,7 @@
         </w:tc>
         <w:tc>
           <w:tcPr>
-            <w:tcW w:w="877" w:type="dxa"/>
+            <w:tcW w:w="878" w:type="dxa"/>
             <w:tcBorders>
               <w:bottom w:val="single" w:sz="4" w:space="0" w:color="000000"/>
               <w:right w:val="single" w:sz="4" w:space="0" w:color="000000"/>
@@ -18183,7 +17663,7 @@
         </w:tc>
         <w:tc>
           <w:tcPr>
-            <w:tcW w:w="635" w:type="dxa"/>
+            <w:tcW w:w="634" w:type="dxa"/>
             <w:vMerge w:val="restart"/>
             <w:tcBorders>
               <w:left w:val="single" w:sz="4" w:space="0" w:color="000000"/>
@@ -18491,7 +17971,7 @@
         </w:tc>
         <w:tc>
           <w:tcPr>
-            <w:tcW w:w="877" w:type="dxa"/>
+            <w:tcW w:w="878" w:type="dxa"/>
             <w:tcBorders>
               <w:bottom w:val="single" w:sz="4" w:space="0" w:color="000000"/>
               <w:right w:val="single" w:sz="4" w:space="0" w:color="000000"/>
@@ -18523,7 +18003,7 @@
         </w:tc>
         <w:tc>
           <w:tcPr>
-            <w:tcW w:w="635" w:type="dxa"/>
+            <w:tcW w:w="634" w:type="dxa"/>
             <w:vMerge w:val="continue"/>
             <w:tcBorders>
               <w:left w:val="single" w:sz="4" w:space="0" w:color="000000"/>
@@ -18813,7 +18293,7 @@
         </w:tc>
         <w:tc>
           <w:tcPr>
-            <w:tcW w:w="877" w:type="dxa"/>
+            <w:tcW w:w="878" w:type="dxa"/>
             <w:tcBorders>
               <w:bottom w:val="single" w:sz="4" w:space="0" w:color="000000"/>
               <w:right w:val="single" w:sz="4" w:space="0" w:color="000000"/>
@@ -18845,7 +18325,7 @@
         </w:tc>
         <w:tc>
           <w:tcPr>
-            <w:tcW w:w="635" w:type="dxa"/>
+            <w:tcW w:w="634" w:type="dxa"/>
             <w:vMerge w:val="restart"/>
             <w:tcBorders>
               <w:left w:val="single" w:sz="4" w:space="0" w:color="000000"/>
@@ -19133,7 +18613,7 @@
         </w:tc>
         <w:tc>
           <w:tcPr>
-            <w:tcW w:w="877" w:type="dxa"/>
+            <w:tcW w:w="878" w:type="dxa"/>
             <w:tcBorders>
               <w:bottom w:val="single" w:sz="4" w:space="0" w:color="000000"/>
               <w:right w:val="single" w:sz="4" w:space="0" w:color="000000"/>
@@ -19165,7 +18645,7 @@
         </w:tc>
         <w:tc>
           <w:tcPr>
-            <w:tcW w:w="635" w:type="dxa"/>
+            <w:tcW w:w="634" w:type="dxa"/>
             <w:vMerge w:val="continue"/>
             <w:tcBorders>
               <w:left w:val="single" w:sz="4" w:space="0" w:color="000000"/>
@@ -19447,7 +18927,7 @@
         </w:tc>
         <w:tc>
           <w:tcPr>
-            <w:tcW w:w="877" w:type="dxa"/>
+            <w:tcW w:w="878" w:type="dxa"/>
             <w:tcBorders>
               <w:bottom w:val="single" w:sz="4" w:space="0" w:color="000000"/>
               <w:right w:val="single" w:sz="4" w:space="0" w:color="000000"/>
@@ -19482,7 +18962,7 @@
         </w:tc>
         <w:tc>
           <w:tcPr>
-            <w:tcW w:w="635" w:type="dxa"/>
+            <w:tcW w:w="634" w:type="dxa"/>
             <w:vMerge w:val="continue"/>
             <w:tcBorders>
               <w:left w:val="single" w:sz="4" w:space="0" w:color="000000"/>
@@ -19812,7 +19292,7 @@
         </w:tc>
         <w:tc>
           <w:tcPr>
-            <w:tcW w:w="877" w:type="dxa"/>
+            <w:tcW w:w="878" w:type="dxa"/>
             <w:tcBorders>
               <w:bottom w:val="single" w:sz="4" w:space="0" w:color="000000"/>
               <w:right w:val="single" w:sz="4" w:space="0" w:color="000000"/>
@@ -19844,7 +19324,7 @@
         </w:tc>
         <w:tc>
           <w:tcPr>
-            <w:tcW w:w="635" w:type="dxa"/>
+            <w:tcW w:w="634" w:type="dxa"/>
             <w:vMerge w:val="restart"/>
             <w:tcBorders>
               <w:left w:val="single" w:sz="4" w:space="0" w:color="000000"/>
@@ -20132,7 +19612,7 @@
         </w:tc>
         <w:tc>
           <w:tcPr>
-            <w:tcW w:w="877" w:type="dxa"/>
+            <w:tcW w:w="878" w:type="dxa"/>
             <w:tcBorders>
               <w:bottom w:val="single" w:sz="4" w:space="0" w:color="000000"/>
               <w:right w:val="single" w:sz="4" w:space="0" w:color="000000"/>
@@ -20164,7 +19644,7 @@
         </w:tc>
         <w:tc>
           <w:tcPr>
-            <w:tcW w:w="635" w:type="dxa"/>
+            <w:tcW w:w="634" w:type="dxa"/>
             <w:vMerge w:val="continue"/>
             <w:tcBorders>
               <w:left w:val="single" w:sz="4" w:space="0" w:color="000000"/>
@@ -20474,7 +19954,7 @@
         </w:tc>
         <w:tc>
           <w:tcPr>
-            <w:tcW w:w="877" w:type="dxa"/>
+            <w:tcW w:w="878" w:type="dxa"/>
             <w:tcBorders>
               <w:bottom w:val="single" w:sz="4" w:space="0" w:color="000000"/>
               <w:right w:val="single" w:sz="4" w:space="0" w:color="000000"/>
@@ -20506,7 +19986,7 @@
         </w:tc>
         <w:tc>
           <w:tcPr>
-            <w:tcW w:w="635" w:type="dxa"/>
+            <w:tcW w:w="634" w:type="dxa"/>
             <w:vMerge w:val="restart"/>
             <w:tcBorders>
               <w:left w:val="single" w:sz="4" w:space="0" w:color="000000"/>
@@ -20794,7 +20274,7 @@
         </w:tc>
         <w:tc>
           <w:tcPr>
-            <w:tcW w:w="877" w:type="dxa"/>
+            <w:tcW w:w="878" w:type="dxa"/>
             <w:tcBorders>
               <w:bottom w:val="single" w:sz="4" w:space="0" w:color="000000"/>
               <w:right w:val="single" w:sz="4" w:space="0" w:color="000000"/>
@@ -20826,7 +20306,7 @@
         </w:tc>
         <w:tc>
           <w:tcPr>
-            <w:tcW w:w="635" w:type="dxa"/>
+            <w:tcW w:w="634" w:type="dxa"/>
             <w:vMerge w:val="continue"/>
             <w:tcBorders>
               <w:left w:val="single" w:sz="4" w:space="0" w:color="000000"/>
@@ -21128,7 +20608,7 @@
         </w:tc>
         <w:tc>
           <w:tcPr>
-            <w:tcW w:w="877" w:type="dxa"/>
+            <w:tcW w:w="878" w:type="dxa"/>
             <w:tcBorders>
               <w:bottom w:val="single" w:sz="4" w:space="0" w:color="000000"/>
               <w:right w:val="single" w:sz="4" w:space="0" w:color="000000"/>
@@ -21160,7 +20640,7 @@
         </w:tc>
         <w:tc>
           <w:tcPr>
-            <w:tcW w:w="635" w:type="dxa"/>
+            <w:tcW w:w="634" w:type="dxa"/>
             <w:vMerge w:val="continue"/>
             <w:tcBorders>
               <w:left w:val="single" w:sz="4" w:space="0" w:color="000000"/>
@@ -21462,7 +20942,7 @@
         </w:tc>
         <w:tc>
           <w:tcPr>
-            <w:tcW w:w="877" w:type="dxa"/>
+            <w:tcW w:w="878" w:type="dxa"/>
             <w:tcBorders>
               <w:bottom w:val="single" w:sz="4" w:space="0" w:color="000000"/>
               <w:right w:val="single" w:sz="4" w:space="0" w:color="000000"/>
@@ -21494,7 +20974,7 @@
         </w:tc>
         <w:tc>
           <w:tcPr>
-            <w:tcW w:w="635" w:type="dxa"/>
+            <w:tcW w:w="634" w:type="dxa"/>
             <w:vMerge w:val="continue"/>
             <w:tcBorders>
               <w:left w:val="single" w:sz="4" w:space="0" w:color="000000"/>
@@ -21776,7 +21256,7 @@
         </w:tc>
         <w:tc>
           <w:tcPr>
-            <w:tcW w:w="877" w:type="dxa"/>
+            <w:tcW w:w="878" w:type="dxa"/>
             <w:tcBorders>
               <w:bottom w:val="single" w:sz="4" w:space="0" w:color="000000"/>
               <w:right w:val="single" w:sz="4" w:space="0" w:color="000000"/>
@@ -21808,7 +21288,7 @@
         </w:tc>
         <w:tc>
           <w:tcPr>
-            <w:tcW w:w="635" w:type="dxa"/>
+            <w:tcW w:w="634" w:type="dxa"/>
             <w:vMerge w:val="continue"/>
             <w:tcBorders>
               <w:left w:val="single" w:sz="4" w:space="0" w:color="000000"/>
@@ -22090,7 +21570,7 @@
         </w:tc>
         <w:tc>
           <w:tcPr>
-            <w:tcW w:w="877" w:type="dxa"/>
+            <w:tcW w:w="878" w:type="dxa"/>
             <w:tcBorders>
               <w:bottom w:val="single" w:sz="4" w:space="0" w:color="000000"/>
               <w:right w:val="single" w:sz="4" w:space="0" w:color="000000"/>
@@ -22122,7 +21602,7 @@
         </w:tc>
         <w:tc>
           <w:tcPr>
-            <w:tcW w:w="635" w:type="dxa"/>
+            <w:tcW w:w="634" w:type="dxa"/>
             <w:vMerge w:val="continue"/>
             <w:tcBorders>
               <w:left w:val="single" w:sz="4" w:space="0" w:color="000000"/>
@@ -22404,7 +21884,7 @@
         </w:tc>
         <w:tc>
           <w:tcPr>
-            <w:tcW w:w="877" w:type="dxa"/>
+            <w:tcW w:w="878" w:type="dxa"/>
             <w:tcBorders>
               <w:bottom w:val="single" w:sz="4" w:space="0" w:color="000000"/>
               <w:right w:val="single" w:sz="4" w:space="0" w:color="000000"/>
@@ -22436,7 +21916,7 @@
         </w:tc>
         <w:tc>
           <w:tcPr>
-            <w:tcW w:w="635" w:type="dxa"/>
+            <w:tcW w:w="634" w:type="dxa"/>
             <w:vMerge w:val="continue"/>
             <w:tcBorders>
               <w:left w:val="single" w:sz="4" w:space="0" w:color="000000"/>
@@ -22726,7 +22206,7 @@
         </w:tc>
         <w:tc>
           <w:tcPr>
-            <w:tcW w:w="877" w:type="dxa"/>
+            <w:tcW w:w="878" w:type="dxa"/>
             <w:tcBorders>
               <w:bottom w:val="single" w:sz="4" w:space="0" w:color="000000"/>
               <w:right w:val="single" w:sz="4" w:space="0" w:color="000000"/>
@@ -22758,7 +22238,7 @@
         </w:tc>
         <w:tc>
           <w:tcPr>
-            <w:tcW w:w="635" w:type="dxa"/>
+            <w:tcW w:w="634" w:type="dxa"/>
             <w:vMerge w:val="restart"/>
             <w:tcBorders>
               <w:left w:val="single" w:sz="4" w:space="0" w:color="000000"/>
@@ -23046,7 +22526,7 @@
         </w:tc>
         <w:tc>
           <w:tcPr>
-            <w:tcW w:w="877" w:type="dxa"/>
+            <w:tcW w:w="878" w:type="dxa"/>
             <w:tcBorders>
               <w:bottom w:val="single" w:sz="4" w:space="0" w:color="000000"/>
               <w:right w:val="single" w:sz="4" w:space="0" w:color="000000"/>
@@ -23078,7 +22558,7 @@
         </w:tc>
         <w:tc>
           <w:tcPr>
-            <w:tcW w:w="635" w:type="dxa"/>
+            <w:tcW w:w="634" w:type="dxa"/>
             <w:vMerge w:val="continue"/>
             <w:tcBorders>
               <w:left w:val="single" w:sz="4" w:space="0" w:color="000000"/>
@@ -23380,7 +22860,7 @@
         </w:tc>
         <w:tc>
           <w:tcPr>
-            <w:tcW w:w="877" w:type="dxa"/>
+            <w:tcW w:w="878" w:type="dxa"/>
             <w:tcBorders>
               <w:bottom w:val="single" w:sz="4" w:space="0" w:color="000000"/>
               <w:right w:val="single" w:sz="4" w:space="0" w:color="000000"/>
@@ -23412,7 +22892,7 @@
         </w:tc>
         <w:tc>
           <w:tcPr>
-            <w:tcW w:w="635" w:type="dxa"/>
+            <w:tcW w:w="634" w:type="dxa"/>
             <w:vMerge w:val="continue"/>
             <w:tcBorders>
               <w:left w:val="single" w:sz="4" w:space="0" w:color="000000"/>
@@ -23694,7 +23174,7 @@
         </w:tc>
         <w:tc>
           <w:tcPr>
-            <w:tcW w:w="877" w:type="dxa"/>
+            <w:tcW w:w="878" w:type="dxa"/>
             <w:tcBorders>
               <w:bottom w:val="single" w:sz="4" w:space="0" w:color="000000"/>
               <w:right w:val="single" w:sz="4" w:space="0" w:color="000000"/>
@@ -23726,7 +23206,7 @@
         </w:tc>
         <w:tc>
           <w:tcPr>
-            <w:tcW w:w="635" w:type="dxa"/>
+            <w:tcW w:w="634" w:type="dxa"/>
             <w:vMerge w:val="continue"/>
             <w:tcBorders>
               <w:left w:val="single" w:sz="4" w:space="0" w:color="000000"/>
@@ -24011,7 +23491,7 @@
         </w:tc>
         <w:tc>
           <w:tcPr>
-            <w:tcW w:w="877" w:type="dxa"/>
+            <w:tcW w:w="878" w:type="dxa"/>
             <w:tcBorders>
               <w:bottom w:val="single" w:sz="4" w:space="0" w:color="000000"/>
               <w:right w:val="single" w:sz="4" w:space="0" w:color="000000"/>
@@ -24043,7 +23523,7 @@
         </w:tc>
         <w:tc>
           <w:tcPr>
-            <w:tcW w:w="635" w:type="dxa"/>
+            <w:tcW w:w="634" w:type="dxa"/>
             <w:tcBorders>
               <w:bottom w:val="single" w:sz="4" w:space="0" w:color="000000"/>
               <w:right w:val="single" w:sz="4" w:space="0" w:color="000000"/>
@@ -24330,7 +23810,7 @@
         </w:tc>
         <w:tc>
           <w:tcPr>
-            <w:tcW w:w="877" w:type="dxa"/>
+            <w:tcW w:w="878" w:type="dxa"/>
             <w:tcBorders>
               <w:bottom w:val="single" w:sz="4" w:space="0" w:color="000000"/>
               <w:right w:val="single" w:sz="4" w:space="0" w:color="000000"/>
@@ -24362,7 +23842,7 @@
         </w:tc>
         <w:tc>
           <w:tcPr>
-            <w:tcW w:w="635" w:type="dxa"/>
+            <w:tcW w:w="634" w:type="dxa"/>
             <w:tcBorders>
               <w:bottom w:val="single" w:sz="4" w:space="0" w:color="000000"/>
               <w:right w:val="single" w:sz="4" w:space="0" w:color="000000"/>
@@ -24649,7 +24129,7 @@
         </w:tc>
         <w:tc>
           <w:tcPr>
-            <w:tcW w:w="877" w:type="dxa"/>
+            <w:tcW w:w="878" w:type="dxa"/>
             <w:tcBorders>
               <w:bottom w:val="single" w:sz="4" w:space="0" w:color="000000"/>
               <w:right w:val="single" w:sz="4" w:space="0" w:color="000000"/>
@@ -24689,7 +24169,7 @@
         </w:tc>
         <w:tc>
           <w:tcPr>
-            <w:tcW w:w="635" w:type="dxa"/>
+            <w:tcW w:w="634" w:type="dxa"/>
             <w:tcBorders>
               <w:bottom w:val="single" w:sz="4" w:space="0" w:color="000000"/>
               <w:right w:val="single" w:sz="4" w:space="0" w:color="000000"/>
@@ -24991,7 +24471,7 @@
         </w:tc>
         <w:tc>
           <w:tcPr>
-            <w:tcW w:w="877" w:type="dxa"/>
+            <w:tcW w:w="878" w:type="dxa"/>
             <w:tcBorders>
               <w:bottom w:val="single" w:sz="4" w:space="0" w:color="000000"/>
               <w:right w:val="single" w:sz="4" w:space="0" w:color="000000"/>
@@ -25023,7 +24503,7 @@
         </w:tc>
         <w:tc>
           <w:tcPr>
-            <w:tcW w:w="635" w:type="dxa"/>
+            <w:tcW w:w="634" w:type="dxa"/>
             <w:tcBorders>
               <w:bottom w:val="single" w:sz="4" w:space="0" w:color="000000"/>
               <w:right w:val="single" w:sz="4" w:space="0" w:color="000000"/>
@@ -25315,7 +24795,7 @@
         </w:tc>
         <w:tc>
           <w:tcPr>
-            <w:tcW w:w="877" w:type="dxa"/>
+            <w:tcW w:w="878" w:type="dxa"/>
             <w:tcBorders>
               <w:bottom w:val="single" w:sz="4" w:space="0" w:color="000000"/>
               <w:right w:val="single" w:sz="4" w:space="0" w:color="000000"/>
@@ -25347,7 +24827,7 @@
         </w:tc>
         <w:tc>
           <w:tcPr>
-            <w:tcW w:w="635" w:type="dxa"/>
+            <w:tcW w:w="634" w:type="dxa"/>
             <w:vMerge w:val="restart"/>
             <w:tcBorders>
               <w:left w:val="single" w:sz="4" w:space="0" w:color="000000"/>
@@ -25635,7 +25115,7 @@
         </w:tc>
         <w:tc>
           <w:tcPr>
-            <w:tcW w:w="877" w:type="dxa"/>
+            <w:tcW w:w="878" w:type="dxa"/>
             <w:tcBorders>
               <w:bottom w:val="single" w:sz="4" w:space="0" w:color="000000"/>
               <w:right w:val="single" w:sz="4" w:space="0" w:color="000000"/>
@@ -25667,7 +25147,7 @@
         </w:tc>
         <w:tc>
           <w:tcPr>
-            <w:tcW w:w="635" w:type="dxa"/>
+            <w:tcW w:w="634" w:type="dxa"/>
             <w:vMerge w:val="continue"/>
             <w:tcBorders>
               <w:left w:val="single" w:sz="4" w:space="0" w:color="000000"/>
@@ -25949,7 +25429,7 @@
         </w:tc>
         <w:tc>
           <w:tcPr>
-            <w:tcW w:w="877" w:type="dxa"/>
+            <w:tcW w:w="878" w:type="dxa"/>
             <w:tcBorders>
               <w:bottom w:val="single" w:sz="4" w:space="0" w:color="000000"/>
               <w:right w:val="single" w:sz="4" w:space="0" w:color="000000"/>
@@ -25981,7 +25461,7 @@
         </w:tc>
         <w:tc>
           <w:tcPr>
-            <w:tcW w:w="635" w:type="dxa"/>
+            <w:tcW w:w="634" w:type="dxa"/>
             <w:vMerge w:val="continue"/>
             <w:tcBorders>
               <w:left w:val="single" w:sz="4" w:space="0" w:color="000000"/>
@@ -26263,7 +25743,7 @@
         </w:tc>
         <w:tc>
           <w:tcPr>
-            <w:tcW w:w="877" w:type="dxa"/>
+            <w:tcW w:w="878" w:type="dxa"/>
             <w:tcBorders>
               <w:bottom w:val="single" w:sz="4" w:space="0" w:color="000000"/>
               <w:right w:val="single" w:sz="4" w:space="0" w:color="000000"/>
@@ -26295,7 +25775,7 @@
         </w:tc>
         <w:tc>
           <w:tcPr>
-            <w:tcW w:w="635" w:type="dxa"/>
+            <w:tcW w:w="634" w:type="dxa"/>
             <w:vMerge w:val="continue"/>
             <w:tcBorders>
               <w:left w:val="single" w:sz="4" w:space="0" w:color="000000"/>
@@ -26577,7 +26057,7 @@
         </w:tc>
         <w:tc>
           <w:tcPr>
-            <w:tcW w:w="877" w:type="dxa"/>
+            <w:tcW w:w="878" w:type="dxa"/>
             <w:tcBorders>
               <w:bottom w:val="single" w:sz="4" w:space="0" w:color="000000"/>
               <w:right w:val="single" w:sz="4" w:space="0" w:color="000000"/>
@@ -26609,7 +26089,7 @@
         </w:tc>
         <w:tc>
           <w:tcPr>
-            <w:tcW w:w="635" w:type="dxa"/>
+            <w:tcW w:w="634" w:type="dxa"/>
             <w:vMerge w:val="continue"/>
             <w:tcBorders>
               <w:left w:val="single" w:sz="4" w:space="0" w:color="000000"/>
@@ -26891,7 +26371,7 @@
         </w:tc>
         <w:tc>
           <w:tcPr>
-            <w:tcW w:w="877" w:type="dxa"/>
+            <w:tcW w:w="878" w:type="dxa"/>
             <w:tcBorders>
               <w:bottom w:val="single" w:sz="4" w:space="0" w:color="000000"/>
               <w:right w:val="single" w:sz="4" w:space="0" w:color="000000"/>
@@ -26923,7 +26403,7 @@
         </w:tc>
         <w:tc>
           <w:tcPr>
-            <w:tcW w:w="635" w:type="dxa"/>
+            <w:tcW w:w="634" w:type="dxa"/>
             <w:vMerge w:val="continue"/>
             <w:tcBorders>
               <w:left w:val="single" w:sz="4" w:space="0" w:color="000000"/>
@@ -27205,7 +26685,7 @@
         </w:tc>
         <w:tc>
           <w:tcPr>
-            <w:tcW w:w="877" w:type="dxa"/>
+            <w:tcW w:w="878" w:type="dxa"/>
             <w:tcBorders>
               <w:bottom w:val="single" w:sz="4" w:space="0" w:color="000000"/>
               <w:right w:val="single" w:sz="4" w:space="0" w:color="000000"/>
@@ -27240,7 +26720,7 @@
         </w:tc>
         <w:tc>
           <w:tcPr>
-            <w:tcW w:w="635" w:type="dxa"/>
+            <w:tcW w:w="634" w:type="dxa"/>
             <w:vMerge w:val="continue"/>
             <w:tcBorders>
               <w:left w:val="single" w:sz="4" w:space="0" w:color="000000"/>
@@ -27545,7 +27025,7 @@
         </w:tc>
         <w:tc>
           <w:tcPr>
-            <w:tcW w:w="877" w:type="dxa"/>
+            <w:tcW w:w="878" w:type="dxa"/>
             <w:tcBorders>
               <w:bottom w:val="single" w:sz="4" w:space="0" w:color="000000"/>
               <w:right w:val="single" w:sz="4" w:space="0" w:color="000000"/>
@@ -27577,7 +27057,7 @@
         </w:tc>
         <w:tc>
           <w:tcPr>
-            <w:tcW w:w="635" w:type="dxa"/>
+            <w:tcW w:w="634" w:type="dxa"/>
             <w:tcBorders>
               <w:bottom w:val="single" w:sz="4" w:space="0" w:color="000000"/>
               <w:right w:val="single" w:sz="4" w:space="0" w:color="000000"/>
@@ -27899,7 +27379,7 @@
         </w:tc>
         <w:tc>
           <w:tcPr>
-            <w:tcW w:w="877" w:type="dxa"/>
+            <w:tcW w:w="878" w:type="dxa"/>
             <w:tcBorders>
               <w:bottom w:val="single" w:sz="4" w:space="0" w:color="000000"/>
               <w:right w:val="single" w:sz="4" w:space="0" w:color="000000"/>
@@ -27931,7 +27411,7 @@
         </w:tc>
         <w:tc>
           <w:tcPr>
-            <w:tcW w:w="635" w:type="dxa"/>
+            <w:tcW w:w="634" w:type="dxa"/>
             <w:tcBorders>
               <w:bottom w:val="single" w:sz="4" w:space="0" w:color="000000"/>
               <w:right w:val="single" w:sz="4" w:space="0" w:color="000000"/>
@@ -28213,7 +27693,7 @@
         </w:tc>
         <w:tc>
           <w:tcPr>
-            <w:tcW w:w="877" w:type="dxa"/>
+            <w:tcW w:w="878" w:type="dxa"/>
             <w:tcBorders>
               <w:bottom w:val="single" w:sz="4" w:space="0" w:color="000000"/>
               <w:right w:val="single" w:sz="4" w:space="0" w:color="000000"/>
@@ -28245,7 +27725,7 @@
         </w:tc>
         <w:tc>
           <w:tcPr>
-            <w:tcW w:w="635" w:type="dxa"/>
+            <w:tcW w:w="634" w:type="dxa"/>
             <w:tcBorders>
               <w:bottom w:val="single" w:sz="4" w:space="0" w:color="000000"/>
               <w:right w:val="single" w:sz="4" w:space="0" w:color="000000"/>
@@ -28537,7 +28017,7 @@
         </w:tc>
         <w:tc>
           <w:tcPr>
-            <w:tcW w:w="877" w:type="dxa"/>
+            <w:tcW w:w="878" w:type="dxa"/>
             <w:tcBorders>
               <w:bottom w:val="single" w:sz="4" w:space="0" w:color="000000"/>
               <w:right w:val="single" w:sz="4" w:space="0" w:color="000000"/>
@@ -28569,7 +28049,7 @@
         </w:tc>
         <w:tc>
           <w:tcPr>
-            <w:tcW w:w="635" w:type="dxa"/>
+            <w:tcW w:w="634" w:type="dxa"/>
             <w:vMerge w:val="restart"/>
             <w:tcBorders>
               <w:left w:val="single" w:sz="4" w:space="0" w:color="000000"/>
@@ -28857,7 +28337,7 @@
         </w:tc>
         <w:tc>
           <w:tcPr>
-            <w:tcW w:w="877" w:type="dxa"/>
+            <w:tcW w:w="878" w:type="dxa"/>
             <w:tcBorders>
               <w:bottom w:val="single" w:sz="4" w:space="0" w:color="000000"/>
               <w:right w:val="single" w:sz="4" w:space="0" w:color="000000"/>
@@ -28889,7 +28369,7 @@
         </w:tc>
         <w:tc>
           <w:tcPr>
-            <w:tcW w:w="635" w:type="dxa"/>
+            <w:tcW w:w="634" w:type="dxa"/>
             <w:vMerge w:val="continue"/>
             <w:tcBorders>
               <w:left w:val="single" w:sz="4" w:space="0" w:color="000000"/>
@@ -29174,7 +28654,7 @@
         </w:tc>
         <w:tc>
           <w:tcPr>
-            <w:tcW w:w="877" w:type="dxa"/>
+            <w:tcW w:w="878" w:type="dxa"/>
             <w:tcBorders>
               <w:bottom w:val="single" w:sz="4" w:space="0" w:color="000000"/>
               <w:right w:val="single" w:sz="4" w:space="0" w:color="000000"/>
@@ -29206,7 +28686,7 @@
         </w:tc>
         <w:tc>
           <w:tcPr>
-            <w:tcW w:w="635" w:type="dxa"/>
+            <w:tcW w:w="634" w:type="dxa"/>
             <w:tcBorders>
               <w:bottom w:val="single" w:sz="4" w:space="0" w:color="000000"/>
               <w:right w:val="single" w:sz="4" w:space="0" w:color="000000"/>
@@ -29498,7 +28978,7 @@
         </w:tc>
         <w:tc>
           <w:tcPr>
-            <w:tcW w:w="877" w:type="dxa"/>
+            <w:tcW w:w="878" w:type="dxa"/>
             <w:tcBorders>
               <w:bottom w:val="single" w:sz="4" w:space="0" w:color="000000"/>
               <w:right w:val="single" w:sz="4" w:space="0" w:color="000000"/>
@@ -29530,7 +29010,7 @@
         </w:tc>
         <w:tc>
           <w:tcPr>
-            <w:tcW w:w="635" w:type="dxa"/>
+            <w:tcW w:w="634" w:type="dxa"/>
             <w:vMerge w:val="restart"/>
             <w:tcBorders>
               <w:left w:val="single" w:sz="4" w:space="0" w:color="000000"/>
@@ -29818,7 +29298,7 @@
         </w:tc>
         <w:tc>
           <w:tcPr>
-            <w:tcW w:w="877" w:type="dxa"/>
+            <w:tcW w:w="878" w:type="dxa"/>
             <w:tcBorders>
               <w:bottom w:val="single" w:sz="4" w:space="0" w:color="000000"/>
               <w:right w:val="single" w:sz="4" w:space="0" w:color="000000"/>
@@ -29850,7 +29330,7 @@
         </w:tc>
         <w:tc>
           <w:tcPr>
-            <w:tcW w:w="635" w:type="dxa"/>
+            <w:tcW w:w="634" w:type="dxa"/>
             <w:vMerge w:val="continue"/>
             <w:tcBorders>
               <w:left w:val="single" w:sz="4" w:space="0" w:color="000000"/>
@@ -30132,7 +29612,7 @@
         </w:tc>
         <w:tc>
           <w:tcPr>
-            <w:tcW w:w="877" w:type="dxa"/>
+            <w:tcW w:w="878" w:type="dxa"/>
             <w:tcBorders>
               <w:bottom w:val="single" w:sz="4" w:space="0" w:color="000000"/>
               <w:right w:val="single" w:sz="4" w:space="0" w:color="000000"/>
@@ -30164,7 +29644,7 @@
         </w:tc>
         <w:tc>
           <w:tcPr>
-            <w:tcW w:w="635" w:type="dxa"/>
+            <w:tcW w:w="634" w:type="dxa"/>
             <w:vMerge w:val="continue"/>
             <w:tcBorders>
               <w:left w:val="single" w:sz="4" w:space="0" w:color="000000"/>
@@ -30489,7 +29969,7 @@
         </w:tc>
         <w:tc>
           <w:tcPr>
-            <w:tcW w:w="877" w:type="dxa"/>
+            <w:tcW w:w="878" w:type="dxa"/>
             <w:tcBorders>
               <w:bottom w:val="single" w:sz="4" w:space="0" w:color="000000"/>
               <w:right w:val="single" w:sz="4" w:space="0" w:color="000000"/>
@@ -30521,7 +30001,7 @@
         </w:tc>
         <w:tc>
           <w:tcPr>
-            <w:tcW w:w="635" w:type="dxa"/>
+            <w:tcW w:w="634" w:type="dxa"/>
             <w:tcBorders>
               <w:bottom w:val="single" w:sz="4" w:space="0" w:color="000000"/>
               <w:right w:val="single" w:sz="4" w:space="0" w:color="000000"/>
@@ -30843,7 +30323,7 @@
         </w:tc>
         <w:tc>
           <w:tcPr>
-            <w:tcW w:w="877" w:type="dxa"/>
+            <w:tcW w:w="878" w:type="dxa"/>
             <w:tcBorders>
               <w:bottom w:val="single" w:sz="4" w:space="0" w:color="000000"/>
               <w:right w:val="single" w:sz="4" w:space="0" w:color="000000"/>
@@ -30878,7 +30358,7 @@
         </w:tc>
         <w:tc>
           <w:tcPr>
-            <w:tcW w:w="635" w:type="dxa"/>
+            <w:tcW w:w="634" w:type="dxa"/>
             <w:tcBorders>
               <w:bottom w:val="single" w:sz="4" w:space="0" w:color="000000"/>
               <w:right w:val="single" w:sz="4" w:space="0" w:color="000000"/>
@@ -31185,7 +30665,7 @@
         </w:tc>
         <w:tc>
           <w:tcPr>
-            <w:tcW w:w="877" w:type="dxa"/>
+            <w:tcW w:w="878" w:type="dxa"/>
             <w:tcBorders>
               <w:bottom w:val="single" w:sz="4" w:space="0" w:color="000000"/>
               <w:right w:val="single" w:sz="4" w:space="0" w:color="000000"/>
@@ -31217,7 +30697,7 @@
         </w:tc>
         <w:tc>
           <w:tcPr>
-            <w:tcW w:w="635" w:type="dxa"/>
+            <w:tcW w:w="634" w:type="dxa"/>
             <w:vMerge w:val="restart"/>
             <w:tcBorders>
               <w:left w:val="single" w:sz="4" w:space="0" w:color="000000"/>
@@ -31500,7 +30980,7 @@
         </w:tc>
         <w:tc>
           <w:tcPr>
-            <w:tcW w:w="877" w:type="dxa"/>
+            <w:tcW w:w="878" w:type="dxa"/>
             <w:tcBorders>
               <w:bottom w:val="single" w:sz="4" w:space="0" w:color="000000"/>
               <w:right w:val="single" w:sz="4" w:space="0" w:color="000000"/>
@@ -31532,7 +31012,7 @@
         </w:tc>
         <w:tc>
           <w:tcPr>
-            <w:tcW w:w="635" w:type="dxa"/>
+            <w:tcW w:w="634" w:type="dxa"/>
             <w:vMerge w:val="continue"/>
             <w:tcBorders>
               <w:left w:val="single" w:sz="4" w:space="0" w:color="000000"/>
@@ -31817,7 +31297,7 @@
         </w:tc>
         <w:tc>
           <w:tcPr>
-            <w:tcW w:w="877" w:type="dxa"/>
+            <w:tcW w:w="878" w:type="dxa"/>
             <w:tcBorders>
               <w:bottom w:val="single" w:sz="4" w:space="0" w:color="000000"/>
               <w:right w:val="single" w:sz="4" w:space="0" w:color="000000"/>
@@ -31849,7 +31329,7 @@
         </w:tc>
         <w:tc>
           <w:tcPr>
-            <w:tcW w:w="635" w:type="dxa"/>
+            <w:tcW w:w="634" w:type="dxa"/>
             <w:tcBorders>
               <w:bottom w:val="single" w:sz="4" w:space="0" w:color="000000"/>
               <w:right w:val="single" w:sz="4" w:space="0" w:color="000000"/>
@@ -32176,7 +31656,7 @@
         </w:tc>
         <w:tc>
           <w:tcPr>
-            <w:tcW w:w="877" w:type="dxa"/>
+            <w:tcW w:w="878" w:type="dxa"/>
             <w:tcBorders>
               <w:bottom w:val="single" w:sz="4" w:space="0" w:color="000000"/>
               <w:right w:val="single" w:sz="4" w:space="0" w:color="000000"/>
@@ -32208,7 +31688,7 @@
         </w:tc>
         <w:tc>
           <w:tcPr>
-            <w:tcW w:w="635" w:type="dxa"/>
+            <w:tcW w:w="634" w:type="dxa"/>
             <w:tcBorders>
               <w:bottom w:val="single" w:sz="4" w:space="0" w:color="000000"/>
               <w:right w:val="single" w:sz="4" w:space="0" w:color="000000"/>
@@ -32495,7 +31975,7 @@
         </w:tc>
         <w:tc>
           <w:tcPr>
-            <w:tcW w:w="877" w:type="dxa"/>
+            <w:tcW w:w="878" w:type="dxa"/>
             <w:tcBorders>
               <w:bottom w:val="single" w:sz="4" w:space="0" w:color="000000"/>
               <w:right w:val="single" w:sz="4" w:space="0" w:color="000000"/>
@@ -32527,7 +32007,7 @@
         </w:tc>
         <w:tc>
           <w:tcPr>
-            <w:tcW w:w="635" w:type="dxa"/>
+            <w:tcW w:w="634" w:type="dxa"/>
             <w:tcBorders>
               <w:bottom w:val="single" w:sz="4" w:space="0" w:color="000000"/>
               <w:right w:val="single" w:sz="4" w:space="0" w:color="000000"/>
@@ -32814,7 +32294,7 @@
         </w:tc>
         <w:tc>
           <w:tcPr>
-            <w:tcW w:w="877" w:type="dxa"/>
+            <w:tcW w:w="878" w:type="dxa"/>
             <w:tcBorders>
               <w:bottom w:val="single" w:sz="4" w:space="0" w:color="000000"/>
               <w:right w:val="single" w:sz="4" w:space="0" w:color="000000"/>
@@ -32846,7 +32326,7 @@
         </w:tc>
         <w:tc>
           <w:tcPr>
-            <w:tcW w:w="635" w:type="dxa"/>
+            <w:tcW w:w="634" w:type="dxa"/>
             <w:tcBorders>
               <w:bottom w:val="single" w:sz="4" w:space="0" w:color="000000"/>
               <w:right w:val="single" w:sz="4" w:space="0" w:color="000000"/>
@@ -33121,7 +32601,7 @@
         </w:tc>
         <w:tc>
           <w:tcPr>
-            <w:tcW w:w="877" w:type="dxa"/>
+            <w:tcW w:w="878" w:type="dxa"/>
             <w:tcBorders>
               <w:bottom w:val="single" w:sz="4" w:space="0" w:color="000000"/>
               <w:right w:val="single" w:sz="4" w:space="0" w:color="000000"/>
@@ -33153,7 +32633,7 @@
         </w:tc>
         <w:tc>
           <w:tcPr>
-            <w:tcW w:w="635" w:type="dxa"/>
+            <w:tcW w:w="634" w:type="dxa"/>
             <w:tcBorders>
               <w:bottom w:val="single" w:sz="4" w:space="0" w:color="000000"/>
               <w:right w:val="single" w:sz="4" w:space="0" w:color="000000"/>
@@ -33446,7 +32926,7 @@
         </w:tc>
         <w:tc>
           <w:tcPr>
-            <w:tcW w:w="877" w:type="dxa"/>
+            <w:tcW w:w="878" w:type="dxa"/>
             <w:tcBorders>
               <w:bottom w:val="single" w:sz="4" w:space="0" w:color="000000"/>
               <w:right w:val="single" w:sz="4" w:space="0" w:color="000000"/>
@@ -33478,7 +32958,7 @@
         </w:tc>
         <w:tc>
           <w:tcPr>
-            <w:tcW w:w="635" w:type="dxa"/>
+            <w:tcW w:w="634" w:type="dxa"/>
             <w:vMerge w:val="restart"/>
             <w:tcBorders>
               <w:left w:val="single" w:sz="4" w:space="0" w:color="000000"/>
@@ -33766,7 +33246,7 @@
         </w:tc>
         <w:tc>
           <w:tcPr>
-            <w:tcW w:w="877" w:type="dxa"/>
+            <w:tcW w:w="878" w:type="dxa"/>
             <w:tcBorders>
               <w:bottom w:val="single" w:sz="4" w:space="0" w:color="000000"/>
               <w:right w:val="single" w:sz="4" w:space="0" w:color="000000"/>
@@ -33801,7 +33281,7 @@
         </w:tc>
         <w:tc>
           <w:tcPr>
-            <w:tcW w:w="635" w:type="dxa"/>
+            <w:tcW w:w="634" w:type="dxa"/>
             <w:vMerge w:val="continue"/>
             <w:tcBorders>
               <w:left w:val="single" w:sz="4" w:space="0" w:color="000000"/>
@@ -34083,7 +33563,7 @@
         </w:tc>
         <w:tc>
           <w:tcPr>
-            <w:tcW w:w="877" w:type="dxa"/>
+            <w:tcW w:w="878" w:type="dxa"/>
             <w:tcBorders>
               <w:bottom w:val="single" w:sz="4" w:space="0" w:color="000000"/>
               <w:right w:val="single" w:sz="4" w:space="0" w:color="000000"/>
@@ -34115,7 +33595,7 @@
         </w:tc>
         <w:tc>
           <w:tcPr>
-            <w:tcW w:w="635" w:type="dxa"/>
+            <w:tcW w:w="634" w:type="dxa"/>
             <w:vMerge w:val="continue"/>
             <w:tcBorders>
               <w:left w:val="single" w:sz="4" w:space="0" w:color="000000"/>
@@ -34467,7 +33947,7 @@
         </w:tc>
         <w:tc>
           <w:tcPr>
-            <w:tcW w:w="877" w:type="dxa"/>
+            <w:tcW w:w="878" w:type="dxa"/>
             <w:tcBorders>
               <w:bottom w:val="single" w:sz="4" w:space="0" w:color="000000"/>
               <w:right w:val="single" w:sz="4" w:space="0" w:color="000000"/>
@@ -34499,7 +33979,7 @@
         </w:tc>
         <w:tc>
           <w:tcPr>
-            <w:tcW w:w="635" w:type="dxa"/>
+            <w:tcW w:w="634" w:type="dxa"/>
             <w:vMerge w:val="restart"/>
             <w:tcBorders>
               <w:left w:val="single" w:sz="4" w:space="0" w:color="000000"/>
@@ -34807,7 +34287,7 @@
         </w:tc>
         <w:tc>
           <w:tcPr>
-            <w:tcW w:w="877" w:type="dxa"/>
+            <w:tcW w:w="878" w:type="dxa"/>
             <w:tcBorders>
               <w:bottom w:val="single" w:sz="4" w:space="0" w:color="000000"/>
               <w:right w:val="single" w:sz="4" w:space="0" w:color="000000"/>
@@ -34839,7 +34319,7 @@
         </w:tc>
         <w:tc>
           <w:tcPr>
-            <w:tcW w:w="635" w:type="dxa"/>
+            <w:tcW w:w="634" w:type="dxa"/>
             <w:vMerge w:val="continue"/>
             <w:tcBorders>
               <w:left w:val="single" w:sz="4" w:space="0" w:color="000000"/>
@@ -35139,7 +34619,7 @@
         </w:tc>
         <w:tc>
           <w:tcPr>
-            <w:tcW w:w="877" w:type="dxa"/>
+            <w:tcW w:w="878" w:type="dxa"/>
             <w:tcBorders>
               <w:bottom w:val="single" w:sz="4" w:space="0" w:color="000000"/>
               <w:right w:val="single" w:sz="4" w:space="0" w:color="000000"/>
@@ -35171,7 +34651,7 @@
         </w:tc>
         <w:tc>
           <w:tcPr>
-            <w:tcW w:w="635" w:type="dxa"/>
+            <w:tcW w:w="634" w:type="dxa"/>
             <w:tcBorders>
               <w:bottom w:val="single" w:sz="4" w:space="0" w:color="000000"/>
               <w:right w:val="single" w:sz="4" w:space="0" w:color="000000"/>
@@ -35473,7 +34953,7 @@
         </w:tc>
         <w:tc>
           <w:tcPr>
-            <w:tcW w:w="877" w:type="dxa"/>
+            <w:tcW w:w="878" w:type="dxa"/>
             <w:tcBorders>
               <w:bottom w:val="single" w:sz="4" w:space="0" w:color="000000"/>
               <w:right w:val="single" w:sz="4" w:space="0" w:color="000000"/>
@@ -35505,7 +34985,7 @@
         </w:tc>
         <w:tc>
           <w:tcPr>
-            <w:tcW w:w="635" w:type="dxa"/>
+            <w:tcW w:w="634" w:type="dxa"/>
             <w:tcBorders>
               <w:bottom w:val="single" w:sz="4" w:space="0" w:color="000000"/>
               <w:right w:val="single" w:sz="4" w:space="0" w:color="000000"/>
@@ -35832,7 +35312,7 @@
         </w:tc>
         <w:tc>
           <w:tcPr>
-            <w:tcW w:w="877" w:type="dxa"/>
+            <w:tcW w:w="878" w:type="dxa"/>
             <w:tcBorders>
               <w:bottom w:val="single" w:sz="4" w:space="0" w:color="000000"/>
               <w:right w:val="single" w:sz="4" w:space="0" w:color="000000"/>
@@ -35864,7 +35344,7 @@
         </w:tc>
         <w:tc>
           <w:tcPr>
-            <w:tcW w:w="635" w:type="dxa"/>
+            <w:tcW w:w="634" w:type="dxa"/>
             <w:tcBorders>
               <w:bottom w:val="single" w:sz="4" w:space="0" w:color="000000"/>
               <w:right w:val="single" w:sz="4" w:space="0" w:color="000000"/>
@@ -36171,7 +35651,7 @@
         </w:tc>
         <w:tc>
           <w:tcPr>
-            <w:tcW w:w="877" w:type="dxa"/>
+            <w:tcW w:w="878" w:type="dxa"/>
             <w:tcBorders>
               <w:bottom w:val="single" w:sz="4" w:space="0" w:color="000000"/>
               <w:right w:val="single" w:sz="4" w:space="0" w:color="000000"/>
@@ -36203,7 +35683,7 @@
         </w:tc>
         <w:tc>
           <w:tcPr>
-            <w:tcW w:w="635" w:type="dxa"/>
+            <w:tcW w:w="634" w:type="dxa"/>
             <w:tcBorders>
               <w:bottom w:val="single" w:sz="4" w:space="0" w:color="000000"/>
               <w:right w:val="single" w:sz="4" w:space="0" w:color="000000"/>
@@ -36502,7 +35982,7 @@
         </w:tc>
         <w:tc>
           <w:tcPr>
-            <w:tcW w:w="877" w:type="dxa"/>
+            <w:tcW w:w="878" w:type="dxa"/>
             <w:tcBorders>
               <w:bottom w:val="single" w:sz="4" w:space="0" w:color="000000"/>
               <w:right w:val="single" w:sz="4" w:space="0" w:color="000000"/>
@@ -36534,7 +36014,7 @@
         </w:tc>
         <w:tc>
           <w:tcPr>
-            <w:tcW w:w="635" w:type="dxa"/>
+            <w:tcW w:w="634" w:type="dxa"/>
             <w:vMerge w:val="restart"/>
             <w:tcBorders>
               <w:left w:val="single" w:sz="4" w:space="0" w:color="000000"/>
@@ -36817,7 +36297,7 @@
         </w:tc>
         <w:tc>
           <w:tcPr>
-            <w:tcW w:w="877" w:type="dxa"/>
+            <w:tcW w:w="878" w:type="dxa"/>
             <w:tcBorders>
               <w:bottom w:val="single" w:sz="4" w:space="0" w:color="000000"/>
               <w:right w:val="single" w:sz="4" w:space="0" w:color="000000"/>
@@ -36849,7 +36329,7 @@
         </w:tc>
         <w:tc>
           <w:tcPr>
-            <w:tcW w:w="635" w:type="dxa"/>
+            <w:tcW w:w="634" w:type="dxa"/>
             <w:vMerge w:val="continue"/>
             <w:tcBorders>
               <w:left w:val="single" w:sz="4" w:space="0" w:color="000000"/>
@@ -37126,7 +36606,7 @@
         </w:tc>
         <w:tc>
           <w:tcPr>
-            <w:tcW w:w="877" w:type="dxa"/>
+            <w:tcW w:w="878" w:type="dxa"/>
             <w:tcBorders>
               <w:bottom w:val="single" w:sz="4" w:space="0" w:color="000000"/>
               <w:right w:val="single" w:sz="4" w:space="0" w:color="000000"/>
@@ -37158,7 +36638,7 @@
         </w:tc>
         <w:tc>
           <w:tcPr>
-            <w:tcW w:w="635" w:type="dxa"/>
+            <w:tcW w:w="634" w:type="dxa"/>
             <w:vMerge w:val="continue"/>
             <w:tcBorders>
               <w:left w:val="single" w:sz="4" w:space="0" w:color="000000"/>
@@ -37458,7 +36938,7 @@
         </w:tc>
         <w:tc>
           <w:tcPr>
-            <w:tcW w:w="877" w:type="dxa"/>
+            <w:tcW w:w="878" w:type="dxa"/>
             <w:tcBorders>
               <w:bottom w:val="single" w:sz="4" w:space="0" w:color="000000"/>
               <w:right w:val="single" w:sz="4" w:space="0" w:color="000000"/>
@@ -37490,7 +36970,7 @@
         </w:tc>
         <w:tc>
           <w:tcPr>
-            <w:tcW w:w="635" w:type="dxa"/>
+            <w:tcW w:w="634" w:type="dxa"/>
             <w:tcBorders>
               <w:bottom w:val="single" w:sz="4" w:space="0" w:color="000000"/>
               <w:right w:val="single" w:sz="4" w:space="0" w:color="000000"/>
@@ -37797,7 +37277,7 @@
         </w:tc>
         <w:tc>
           <w:tcPr>
-            <w:tcW w:w="877" w:type="dxa"/>
+            <w:tcW w:w="878" w:type="dxa"/>
             <w:tcBorders>
               <w:bottom w:val="single" w:sz="4" w:space="0" w:color="000000"/>
               <w:right w:val="single" w:sz="4" w:space="0" w:color="000000"/>
@@ -37829,7 +37309,7 @@
         </w:tc>
         <w:tc>
           <w:tcPr>
-            <w:tcW w:w="635" w:type="dxa"/>
+            <w:tcW w:w="634" w:type="dxa"/>
             <w:tcBorders>
               <w:bottom w:val="single" w:sz="4" w:space="0" w:color="000000"/>
               <w:right w:val="single" w:sz="4" w:space="0" w:color="000000"/>
@@ -38141,7 +37621,7 @@
         </w:tc>
         <w:tc>
           <w:tcPr>
-            <w:tcW w:w="877" w:type="dxa"/>
+            <w:tcW w:w="878" w:type="dxa"/>
             <w:tcBorders>
               <w:bottom w:val="single" w:sz="4" w:space="0" w:color="000000"/>
               <w:right w:val="single" w:sz="4" w:space="0" w:color="000000"/>
@@ -38173,7 +37653,7 @@
         </w:tc>
         <w:tc>
           <w:tcPr>
-            <w:tcW w:w="635" w:type="dxa"/>
+            <w:tcW w:w="634" w:type="dxa"/>
             <w:vMerge w:val="restart"/>
             <w:tcBorders>
               <w:left w:val="single" w:sz="4" w:space="0" w:color="000000"/>
@@ -38461,7 +37941,7 @@
         </w:tc>
         <w:tc>
           <w:tcPr>
-            <w:tcW w:w="877" w:type="dxa"/>
+            <w:tcW w:w="878" w:type="dxa"/>
             <w:tcBorders>
               <w:bottom w:val="single" w:sz="4" w:space="0" w:color="000000"/>
               <w:right w:val="single" w:sz="4" w:space="0" w:color="000000"/>
@@ -38493,7 +37973,7 @@
         </w:tc>
         <w:tc>
           <w:tcPr>
-            <w:tcW w:w="635" w:type="dxa"/>
+            <w:tcW w:w="634" w:type="dxa"/>
             <w:vMerge w:val="continue"/>
             <w:tcBorders>
               <w:left w:val="single" w:sz="4" w:space="0" w:color="000000"/>
@@ -38775,7 +38255,7 @@
         </w:tc>
         <w:tc>
           <w:tcPr>
-            <w:tcW w:w="877" w:type="dxa"/>
+            <w:tcW w:w="878" w:type="dxa"/>
             <w:tcBorders>
               <w:bottom w:val="single" w:sz="4" w:space="0" w:color="000000"/>
               <w:right w:val="single" w:sz="4" w:space="0" w:color="000000"/>
@@ -38807,7 +38287,7 @@
         </w:tc>
         <w:tc>
           <w:tcPr>
-            <w:tcW w:w="635" w:type="dxa"/>
+            <w:tcW w:w="634" w:type="dxa"/>
             <w:vMerge w:val="continue"/>
             <w:tcBorders>
               <w:left w:val="single" w:sz="4" w:space="0" w:color="000000"/>
@@ -39089,7 +38569,7 @@
         </w:tc>
         <w:tc>
           <w:tcPr>
-            <w:tcW w:w="877" w:type="dxa"/>
+            <w:tcW w:w="878" w:type="dxa"/>
             <w:tcBorders>
               <w:bottom w:val="single" w:sz="4" w:space="0" w:color="000000"/>
               <w:right w:val="single" w:sz="4" w:space="0" w:color="000000"/>
@@ -39121,7 +38601,7 @@
         </w:tc>
         <w:tc>
           <w:tcPr>
-            <w:tcW w:w="635" w:type="dxa"/>
+            <w:tcW w:w="634" w:type="dxa"/>
             <w:vMerge w:val="continue"/>
             <w:tcBorders>
               <w:left w:val="single" w:sz="4" w:space="0" w:color="000000"/>
@@ -39403,7 +38883,7 @@
         </w:tc>
         <w:tc>
           <w:tcPr>
-            <w:tcW w:w="877" w:type="dxa"/>
+            <w:tcW w:w="878" w:type="dxa"/>
             <w:tcBorders>
               <w:bottom w:val="single" w:sz="4" w:space="0" w:color="000000"/>
               <w:right w:val="single" w:sz="4" w:space="0" w:color="000000"/>
@@ -39438,7 +38918,7 @@
         </w:tc>
         <w:tc>
           <w:tcPr>
-            <w:tcW w:w="635" w:type="dxa"/>
+            <w:tcW w:w="634" w:type="dxa"/>
             <w:vMerge w:val="continue"/>
             <w:tcBorders>
               <w:left w:val="single" w:sz="4" w:space="0" w:color="000000"/>
@@ -39720,7 +39200,7 @@
         </w:tc>
         <w:tc>
           <w:tcPr>
-            <w:tcW w:w="877" w:type="dxa"/>
+            <w:tcW w:w="878" w:type="dxa"/>
             <w:tcBorders>
               <w:bottom w:val="single" w:sz="4" w:space="0" w:color="000000"/>
               <w:right w:val="single" w:sz="4" w:space="0" w:color="000000"/>
@@ -39752,7 +39232,7 @@
         </w:tc>
         <w:tc>
           <w:tcPr>
-            <w:tcW w:w="635" w:type="dxa"/>
+            <w:tcW w:w="634" w:type="dxa"/>
             <w:vMerge w:val="continue"/>
             <w:tcBorders>
               <w:left w:val="single" w:sz="4" w:space="0" w:color="000000"/>
@@ -40122,7 +39602,7 @@
         </w:tc>
         <w:tc>
           <w:tcPr>
-            <w:tcW w:w="877" w:type="dxa"/>
+            <w:tcW w:w="878" w:type="dxa"/>
             <w:tcBorders>
               <w:bottom w:val="single" w:sz="4" w:space="0" w:color="000000"/>
               <w:right w:val="single" w:sz="4" w:space="0" w:color="000000"/>
@@ -40154,7 +39634,7 @@
         </w:tc>
         <w:tc>
           <w:tcPr>
-            <w:tcW w:w="635" w:type="dxa"/>
+            <w:tcW w:w="634" w:type="dxa"/>
             <w:vMerge w:val="restart"/>
             <w:tcBorders>
               <w:left w:val="single" w:sz="4" w:space="0" w:color="000000"/>
@@ -40442,7 +39922,7 @@
         </w:tc>
         <w:tc>
           <w:tcPr>
-            <w:tcW w:w="877" w:type="dxa"/>
+            <w:tcW w:w="878" w:type="dxa"/>
             <w:tcBorders>
               <w:bottom w:val="single" w:sz="4" w:space="0" w:color="000000"/>
               <w:right w:val="single" w:sz="4" w:space="0" w:color="000000"/>
@@ -40474,7 +39954,7 @@
         </w:tc>
         <w:tc>
           <w:tcPr>
-            <w:tcW w:w="635" w:type="dxa"/>
+            <w:tcW w:w="634" w:type="dxa"/>
             <w:vMerge w:val="continue"/>
             <w:tcBorders>
               <w:left w:val="single" w:sz="4" w:space="0" w:color="000000"/>
@@ -40756,7 +40236,7 @@
         </w:tc>
         <w:tc>
           <w:tcPr>
-            <w:tcW w:w="877" w:type="dxa"/>
+            <w:tcW w:w="878" w:type="dxa"/>
             <w:tcBorders>
               <w:bottom w:val="single" w:sz="4" w:space="0" w:color="000000"/>
               <w:right w:val="single" w:sz="4" w:space="0" w:color="000000"/>
@@ -40788,7 +40268,7 @@
         </w:tc>
         <w:tc>
           <w:tcPr>
-            <w:tcW w:w="635" w:type="dxa"/>
+            <w:tcW w:w="634" w:type="dxa"/>
             <w:vMerge w:val="continue"/>
             <w:tcBorders>
               <w:left w:val="single" w:sz="4" w:space="0" w:color="000000"/>
@@ -41189,7 +40669,7 @@
         </w:tc>
         <w:tc>
           <w:tcPr>
-            <w:tcW w:w="877" w:type="dxa"/>
+            <w:tcW w:w="878" w:type="dxa"/>
             <w:tcBorders>
               <w:bottom w:val="single" w:sz="4" w:space="0" w:color="000000"/>
               <w:right w:val="single" w:sz="4" w:space="0" w:color="000000"/>
@@ -41221,7 +40701,7 @@
         </w:tc>
         <w:tc>
           <w:tcPr>
-            <w:tcW w:w="635" w:type="dxa"/>
+            <w:tcW w:w="634" w:type="dxa"/>
             <w:tcBorders>
               <w:bottom w:val="single" w:sz="4" w:space="0" w:color="000000"/>
               <w:right w:val="single" w:sz="4" w:space="0" w:color="000000"/>
@@ -41508,7 +40988,7 @@
         </w:tc>
         <w:tc>
           <w:tcPr>
-            <w:tcW w:w="877" w:type="dxa"/>
+            <w:tcW w:w="878" w:type="dxa"/>
             <w:tcBorders>
               <w:bottom w:val="single" w:sz="4" w:space="0" w:color="000000"/>
               <w:right w:val="single" w:sz="4" w:space="0" w:color="000000"/>
@@ -41540,7 +41020,7 @@
         </w:tc>
         <w:tc>
           <w:tcPr>
-            <w:tcW w:w="635" w:type="dxa"/>
+            <w:tcW w:w="634" w:type="dxa"/>
             <w:vMerge w:val="restart"/>
             <w:tcBorders>
               <w:left w:val="single" w:sz="4" w:space="0" w:color="000000"/>
@@ -41823,7 +41303,7 @@
         </w:tc>
         <w:tc>
           <w:tcPr>
-            <w:tcW w:w="877" w:type="dxa"/>
+            <w:tcW w:w="878" w:type="dxa"/>
             <w:tcBorders>
               <w:bottom w:val="single" w:sz="4" w:space="0" w:color="000000"/>
               <w:right w:val="single" w:sz="4" w:space="0" w:color="000000"/>
@@ -41855,7 +41335,7 @@
         </w:tc>
         <w:tc>
           <w:tcPr>
-            <w:tcW w:w="635" w:type="dxa"/>
+            <w:tcW w:w="634" w:type="dxa"/>
             <w:vMerge w:val="continue"/>
             <w:tcBorders>
               <w:left w:val="single" w:sz="4" w:space="0" w:color="000000"/>
@@ -42140,7 +41620,7 @@
         </w:tc>
         <w:tc>
           <w:tcPr>
-            <w:tcW w:w="877" w:type="dxa"/>
+            <w:tcW w:w="878" w:type="dxa"/>
             <w:tcBorders>
               <w:bottom w:val="single" w:sz="4" w:space="0" w:color="000000"/>
               <w:right w:val="single" w:sz="4" w:space="0" w:color="000000"/>
@@ -42172,7 +41652,7 @@
         </w:tc>
         <w:tc>
           <w:tcPr>
-            <w:tcW w:w="635" w:type="dxa"/>
+            <w:tcW w:w="634" w:type="dxa"/>
             <w:tcBorders>
               <w:bottom w:val="single" w:sz="4" w:space="0" w:color="000000"/>
               <w:right w:val="single" w:sz="4" w:space="0" w:color="000000"/>
@@ -42459,7 +41939,7 @@
         </w:tc>
         <w:tc>
           <w:tcPr>
-            <w:tcW w:w="877" w:type="dxa"/>
+            <w:tcW w:w="878" w:type="dxa"/>
             <w:tcBorders>
               <w:bottom w:val="single" w:sz="4" w:space="0" w:color="000000"/>
               <w:right w:val="single" w:sz="4" w:space="0" w:color="000000"/>
@@ -42491,7 +41971,7 @@
         </w:tc>
         <w:tc>
           <w:tcPr>
-            <w:tcW w:w="635" w:type="dxa"/>
+            <w:tcW w:w="634" w:type="dxa"/>
             <w:vMerge w:val="restart"/>
             <w:tcBorders>
               <w:left w:val="single" w:sz="4" w:space="0" w:color="000000"/>
@@ -42774,7 +42254,7 @@
         </w:tc>
         <w:tc>
           <w:tcPr>
-            <w:tcW w:w="877" w:type="dxa"/>
+            <w:tcW w:w="878" w:type="dxa"/>
             <w:tcBorders>
               <w:bottom w:val="single" w:sz="4" w:space="0" w:color="000000"/>
               <w:right w:val="single" w:sz="4" w:space="0" w:color="000000"/>
@@ -42806,7 +42286,7 @@
         </w:tc>
         <w:tc>
           <w:tcPr>
-            <w:tcW w:w="635" w:type="dxa"/>
+            <w:tcW w:w="634" w:type="dxa"/>
             <w:vMerge w:val="continue"/>
             <w:tcBorders>
               <w:left w:val="single" w:sz="4" w:space="0" w:color="000000"/>
@@ -43083,7 +42563,7 @@
         </w:tc>
         <w:tc>
           <w:tcPr>
-            <w:tcW w:w="877" w:type="dxa"/>
+            <w:tcW w:w="878" w:type="dxa"/>
             <w:tcBorders>
               <w:bottom w:val="single" w:sz="4" w:space="0" w:color="000000"/>
               <w:right w:val="single" w:sz="4" w:space="0" w:color="000000"/>
@@ -43115,7 +42595,7 @@
         </w:tc>
         <w:tc>
           <w:tcPr>
-            <w:tcW w:w="635" w:type="dxa"/>
+            <w:tcW w:w="634" w:type="dxa"/>
             <w:vMerge w:val="continue"/>
             <w:tcBorders>
               <w:left w:val="single" w:sz="4" w:space="0" w:color="000000"/>
@@ -43403,7 +42883,7 @@
         </w:tc>
         <w:tc>
           <w:tcPr>
-            <w:tcW w:w="877" w:type="dxa"/>
+            <w:tcW w:w="878" w:type="dxa"/>
             <w:tcBorders>
               <w:bottom w:val="single" w:sz="4" w:space="0" w:color="000000"/>
               <w:right w:val="single" w:sz="4" w:space="0" w:color="000000"/>
@@ -43435,7 +42915,7 @@
         </w:tc>
         <w:tc>
           <w:tcPr>
-            <w:tcW w:w="635" w:type="dxa"/>
+            <w:tcW w:w="634" w:type="dxa"/>
             <w:vMerge w:val="continue"/>
             <w:tcBorders>
               <w:left w:val="single" w:sz="4" w:space="0" w:color="000000"/>
@@ -43720,7 +43200,7 @@
         </w:tc>
         <w:tc>
           <w:tcPr>
-            <w:tcW w:w="877" w:type="dxa"/>
+            <w:tcW w:w="878" w:type="dxa"/>
             <w:tcBorders>
               <w:bottom w:val="single" w:sz="4" w:space="0" w:color="000000"/>
               <w:right w:val="single" w:sz="4" w:space="0" w:color="000000"/>
@@ -43752,7 +43232,7 @@
         </w:tc>
         <w:tc>
           <w:tcPr>
-            <w:tcW w:w="635" w:type="dxa"/>
+            <w:tcW w:w="634" w:type="dxa"/>
             <w:tcBorders>
               <w:bottom w:val="single" w:sz="4" w:space="0" w:color="000000"/>
               <w:right w:val="single" w:sz="4" w:space="0" w:color="000000"/>
@@ -44039,7 +43519,7 @@
         </w:tc>
         <w:tc>
           <w:tcPr>
-            <w:tcW w:w="877" w:type="dxa"/>
+            <w:tcW w:w="878" w:type="dxa"/>
             <w:tcBorders>
               <w:bottom w:val="single" w:sz="4" w:space="0" w:color="000000"/>
               <w:right w:val="single" w:sz="4" w:space="0" w:color="000000"/>
@@ -44071,7 +43551,7 @@
         </w:tc>
         <w:tc>
           <w:tcPr>
-            <w:tcW w:w="635" w:type="dxa"/>
+            <w:tcW w:w="634" w:type="dxa"/>
             <w:tcBorders>
               <w:bottom w:val="single" w:sz="4" w:space="0" w:color="000000"/>
               <w:right w:val="single" w:sz="4" w:space="0" w:color="000000"/>
@@ -44383,7 +43863,7 @@
         </w:tc>
         <w:tc>
           <w:tcPr>
-            <w:tcW w:w="877" w:type="dxa"/>
+            <w:tcW w:w="878" w:type="dxa"/>
             <w:tcBorders>
               <w:bottom w:val="single" w:sz="4" w:space="0" w:color="000000"/>
               <w:right w:val="single" w:sz="4" w:space="0" w:color="000000"/>
@@ -44415,7 +43895,7 @@
         </w:tc>
         <w:tc>
           <w:tcPr>
-            <w:tcW w:w="635" w:type="dxa"/>
+            <w:tcW w:w="634" w:type="dxa"/>
             <w:vMerge w:val="restart"/>
             <w:tcBorders>
               <w:left w:val="single" w:sz="4" w:space="0" w:color="000000"/>
@@ -44703,7 +44183,7 @@
         </w:tc>
         <w:tc>
           <w:tcPr>
-            <w:tcW w:w="877" w:type="dxa"/>
+            <w:tcW w:w="878" w:type="dxa"/>
             <w:tcBorders>
               <w:bottom w:val="single" w:sz="4" w:space="0" w:color="000000"/>
               <w:right w:val="single" w:sz="4" w:space="0" w:color="000000"/>
@@ -44735,7 +44215,7 @@
         </w:tc>
         <w:tc>
           <w:tcPr>
-            <w:tcW w:w="635" w:type="dxa"/>
+            <w:tcW w:w="634" w:type="dxa"/>
             <w:vMerge w:val="continue"/>
             <w:tcBorders>
               <w:left w:val="single" w:sz="4" w:space="0" w:color="000000"/>
@@ -45017,7 +44497,7 @@
         </w:tc>
         <w:tc>
           <w:tcPr>
-            <w:tcW w:w="877" w:type="dxa"/>
+            <w:tcW w:w="878" w:type="dxa"/>
             <w:tcBorders>
               <w:bottom w:val="single" w:sz="4" w:space="0" w:color="000000"/>
               <w:right w:val="single" w:sz="4" w:space="0" w:color="000000"/>
@@ -45049,7 +44529,7 @@
         </w:tc>
         <w:tc>
           <w:tcPr>
-            <w:tcW w:w="635" w:type="dxa"/>
+            <w:tcW w:w="634" w:type="dxa"/>
             <w:vMerge w:val="continue"/>
             <w:tcBorders>
               <w:left w:val="single" w:sz="4" w:space="0" w:color="000000"/>
@@ -45217,7 +44697,7 @@
       </w:pPr>
       <w:r>
         <w:rPr/>
-        <w:t>Jedná se o první (hrubý) podklad pro hodnocení habitatů z hlediska expanzních druhů</w:t>
+        <w:t>Jedná se o první (hrubý) podklad pro hodnocení habitatů z hlediska expanzních druhů.</w:t>
       </w:r>
     </w:p>
     <w:p>
@@ -45248,23 +44728,7 @@
       </w:r>
       <w:r>
         <w:rPr/>
-        <w:t xml:space="preserve"> agg. může zahrnovat i významné a vzácné taxony </w:t>
-      </w:r>
-      <w:del w:id="85" w:author="Martin Vojík" w:date="2024-09-04T11:57:00Z">
-        <w:r>
-          <w:rPr/>
-          <w:delText>(např.</w:delText>
-        </w:r>
-      </w:del>
-      <w:ins w:id="86" w:author="Martin Vojík" w:date="2024-09-04T11:57:00Z">
-        <w:r>
-          <w:rPr/>
-          <w:t>–</w:t>
-        </w:r>
-      </w:ins>
-      <w:r>
-        <w:rPr/>
-        <w:t xml:space="preserve"> </w:t>
+        <w:t xml:space="preserve"> agg. může zahrnovat i významné a vzácné taxony – </w:t>
       </w:r>
       <w:r>
         <w:rPr>
@@ -45304,23 +44768,7 @@
       </w:r>
       <w:r>
         <w:rPr/>
-        <w:t>), které nevykazují expanzní aktivitu, ba naopak, může se jednat o druhy end</w:t>
-      </w:r>
-      <w:ins w:id="87" w:author="Martin Vojík" w:date="2024-09-04T11:58:00Z">
-        <w:r>
-          <w:rPr/>
-          <w:t>e</w:t>
-        </w:r>
-      </w:ins>
-      <w:del w:id="88" w:author="Martin Vojík" w:date="2024-09-04T11:58:00Z">
-        <w:r>
-          <w:rPr/>
-          <w:delText>e</w:delText>
-        </w:r>
-      </w:del>
-      <w:r>
-        <w:rPr/>
-        <w:t>mitní.</w:t>
+        <w:t>), které nevykazují expanzní aktivitu, ba naopak, může se jednat o druhy endemitní.</w:t>
       </w:r>
     </w:p>
     <w:p>
@@ -46432,27 +45880,7 @@
           <w:rFonts w:cs="Times New Roman" w:ascii="Times New Roman" w:hAnsi="Times New Roman"/>
           <w:sz w:val="24"/>
         </w:rPr>
-        <w:t xml:space="preserve"> K tomuto účelu bude využit aktuální Červený seznam lišejníků ČR (</w:t>
-      </w:r>
-      <w:r>
-        <w:rPr>
-          <w:rFonts w:cs="Times New Roman" w:ascii="Times New Roman" w:hAnsi="Times New Roman"/>
-          <w:sz w:val="24"/>
-          <w:rPrChange w:id="0" w:author="Martin Vojík" w:date="2024-09-04T13:00:00Z">
-            <w:rPr>
-              <w:sz w:val="24"/>
-              <w:highlight w:val="yellow"/>
-            </w:rPr>
-          </w:rPrChange>
-        </w:rPr>
-        <w:t>Liška &amp; Palice 2010</w:t>
-      </w:r>
-      <w:r>
-        <w:rPr>
-          <w:rFonts w:cs="Times New Roman" w:ascii="Times New Roman" w:hAnsi="Times New Roman"/>
-          <w:sz w:val="24"/>
-        </w:rPr>
-        <w:t>). U těchto vzácných druhů bude zaznamenávána také jejich početnost, ideálně dle Braun-Blanquetovy stupnice (v kategoriích r, +, 1–5), z důvodu sledování vývoje populací v delším časovém měřítku.</w:t>
+        <w:t xml:space="preserve"> K tomuto účelu bude využit aktuální Červený seznam lišejníků ČR (Liška &amp; Palice 2010). U těchto vzácných druhů bude zaznamenávána také jejich početnost, ideálně dle Braun-Blanquetovy stupnice (v kategoriích r, +, 1–5), z důvodu sledování vývoje populací v delším časovém měřítku.</w:t>
       </w:r>
     </w:p>
     <w:p>
@@ -50226,7 +49654,7 @@
           <w:rFonts w:ascii="Times New Roman" w:hAnsi="Times New Roman"/>
           <w:sz w:val="24"/>
         </w:rPr>
-        <w:footnoteReference w:id="13"/>
+        <w:footnoteReference w:id="10"/>
       </w:r>
       <w:r>
         <w:rPr>
@@ -50502,7 +49930,7 @@
           <w:rFonts w:ascii="Times New Roman" w:hAnsi="Times New Roman"/>
           <w:sz w:val="24"/>
         </w:rPr>
-        <w:footnoteReference w:id="14"/>
+        <w:footnoteReference w:id="11"/>
       </w:r>
     </w:p>
     <w:p>
@@ -51515,7 +50943,7 @@
     <w:p>
       <w:r>
         <w:rPr>
-          <w:rFonts w:eastAsia="Calibri" w:cstheme="minorBidi" w:eastAsiaTheme="minorHAnsi" w:cs="" w:ascii="Calibri" w:hAnsi="Calibri"/>
+          <w:rFonts w:ascii="Calibri" w:hAnsi="Calibri" w:eastAsia="Calibri" w:cs=""/>
           <w:b w:val="false"/>
           <w:bCs w:val="false"/>
           <w:i/>
@@ -51539,7 +50967,7 @@
           <w:u w:val="none"/>
           <w:vertAlign w:val="baseline"/>
           <w:em w:val="none"/>
-          <w:lang w:bidi="ar-SA" w:eastAsia="en-US" w:val="cs-CZ"/>
+          <w:lang w:val="cs-CZ" w:eastAsia="en-US" w:bidi="ar-SA"/>
         </w:rPr>
         <w:t>Reply to Martin Vojík (04/09/2024, 13:23): "..."</w:t>
       </w:r>
@@ -51550,7 +50978,7 @@
           <w:rFonts w:ascii="Liberation Serif" w:hAnsi="Liberation Serif" w:eastAsia="DejaVu Sans" w:cs="DejaVu Sans"/>
           <w:sz w:val="20"/>
           <w:szCs w:val="24"/>
-          <w:lang w:bidi="ar-SA" w:eastAsia="en-US" w:val="cs-CZ"/>
+          <w:lang w:val="cs-CZ" w:eastAsia="en-US" w:bidi="ar-SA"/>
         </w:rPr>
         <w:t>vzdy vyuzita posledni verze redlistu a kriterii IUCN</w:t>
       </w:r>
@@ -51561,7 +50989,7 @@
           <w:rFonts w:ascii="Liberation Serif" w:hAnsi="Liberation Serif" w:eastAsia="DejaVu Sans" w:cs="DejaVu Sans"/>
           <w:sz w:val="20"/>
           <w:szCs w:val="24"/>
-          <w:lang w:bidi="ar-SA" w:eastAsia="en-US" w:val="cs-CZ"/>
+          <w:lang w:val="cs-CZ" w:eastAsia="en-US" w:bidi="ar-SA"/>
         </w:rPr>
         <w:t>aktualni je grulich 2017</w:t>
       </w:r>
@@ -51666,8 +51094,9 @@
           <w:szCs w:val="24"/>
           <w:lang w:val="en-US" w:eastAsia="en-US" w:bidi="en-US"/>
         </w:rPr>
-        <w:br/>
-      </w:r>
+      </w:r>
+    </w:p>
+    <w:p>
       <w:r>
         <w:rPr>
           <w:rFonts w:ascii="Liberation Serif" w:hAnsi="Liberation Serif" w:eastAsia="DejaVu Sans" w:cs="DejaVu Sans"/>
@@ -51680,52 +51109,6 @@
     </w:p>
   </w:comment>
   <w:comment w:id="6" w:author="Jakub Rataj" w:date="2026-02-05T12:41:50Z" w:initials="JR">
-    <w:p>
-      <w:r>
-        <w:rPr>
-          <w:rFonts w:eastAsia="Calibri" w:cstheme="minorBidi" w:eastAsiaTheme="minorHAnsi" w:cs="" w:ascii="Calibri" w:hAnsi="Calibri"/>
-          <w:b w:val="false"/>
-          <w:bCs w:val="false"/>
-          <w:i w:val="false"/>
-          <w:iCs w:val="false"/>
-          <w:caps w:val="false"/>
-          <w:smallCaps w:val="false"/>
-          <w:strike w:val="false"/>
-          <w:dstrike w:val="false"/>
-          <w:outline w:val="false"/>
-          <w:shadow w:val="false"/>
-          <w:emboss w:val="false"/>
-          <w:imprint w:val="false"/>
-          <w:color w:val="auto"/>
-          <w:spacing w:val="0"/>
-          <w:w w:val="100"/>
-          <w:kern w:val="0"/>
-          <w:position w:val="0"/>
-          <w:sz w:val="20"/>
-          <w:szCs w:val="22"/>
-          <w:u w:val="none"/>
-          <w:vertAlign w:val="baseline"/>
-          <w:em w:val="none"/>
-          <w:lang w:bidi="ar-SA" w:eastAsia="en-US" w:val="cs-CZ"/>
-        </w:rPr>
-        <w:t>také doplnit povídání o trendu, viz rozloha</w:t>
-      </w:r>
-    </w:p>
-  </w:comment>
-  <w:comment w:id="7" w:author="Martin Vojík" w:date="2024-09-04T10:48:00Z" w:initials="MV">
-    <w:p>
-      <w:r>
-        <w:rPr>
-          <w:rFonts w:ascii="Liberation Serif" w:hAnsi="Liberation Serif" w:eastAsia="DejaVu Sans" w:cs="DejaVu Sans"/>
-          <w:sz w:val="24"/>
-          <w:szCs w:val="24"/>
-          <w:lang w:val="en-US" w:eastAsia="en-US" w:bidi="en-US"/>
-        </w:rPr>
-        <w:t>Proč je potřeba jít nad rámec citování, když to má být stručné a jasné? Musel bych přejmout celou převodní tabulku včetně odstavce, kde říkají, že se to jede podle ní…nemají to ani v té velké metodice aktualizace, asi jim to také přijde zbytečné…a když je to zbytečné zahlcení tam, necpal bych to ani sem…</w:t>
-      </w:r>
-    </w:p>
-  </w:comment>
-  <w:comment w:id="8" w:author="Unknown Author" w:date="2026-01-07T15:02:07Z" w:initials="">
     <w:p>
       <w:r>
         <w:rPr>
@@ -51755,11 +51138,24 @@
           <w:em w:val="none"/>
           <w:lang w:val="cs-CZ" w:eastAsia="en-US" w:bidi="ar-SA"/>
         </w:rPr>
-        <w:t>?</w:t>
+        <w:t>také doplnit povídání o trendu, viz rozloha</w:t>
       </w:r>
     </w:p>
   </w:comment>
-  <w:comment w:id="9" w:author="Jakub Rataj" w:date="2026-01-07T15:03:01Z" w:initials="JR">
+  <w:comment w:id="7" w:author="Martin Vojík" w:date="2024-09-04T10:48:00Z" w:initials="MV">
+    <w:p>
+      <w:r>
+        <w:rPr>
+          <w:rFonts w:ascii="Liberation Serif" w:hAnsi="Liberation Serif" w:eastAsia="DejaVu Sans" w:cs="DejaVu Sans"/>
+          <w:sz w:val="24"/>
+          <w:szCs w:val="24"/>
+          <w:lang w:val="en-US" w:eastAsia="en-US" w:bidi="en-US"/>
+        </w:rPr>
+        <w:t>Proč je potřeba jít nad rámec citování, když to má být stručné a jasné? Musel bych přejmout celou převodní tabulku včetně odstavce, kde říkají, že se to jede podle ní…nemají to ani v té velké metodice aktualizace, asi jim to také přijde zbytečné…a když je to zbytečné zahlcení tam, necpal bych to ani sem…</w:t>
+      </w:r>
+    </w:p>
+  </w:comment>
+  <w:comment w:id="8" w:author="Unknown Author" w:date="2026-01-07T15:02:07Z" w:initials="">
     <w:p>
       <w:r>
         <w:rPr>
@@ -51793,46 +51189,7 @@
       </w:r>
     </w:p>
   </w:comment>
-  <w:comment w:id="10" w:author="Martin Vojík" w:date="2024-09-04T10:29:00Z" w:initials="MV">
-    <w:p>
-      <w:r>
-        <w:rPr>
-          <w:rFonts w:ascii="Liberation Serif" w:hAnsi="Liberation Serif" w:eastAsia="DejaVu Sans" w:cs="DejaVu Sans"/>
-          <w:sz w:val="24"/>
-          <w:szCs w:val="24"/>
-          <w:lang w:val="en-US" w:eastAsia="en-US" w:bidi="en-US"/>
-        </w:rPr>
-        <w:t>Přílohu 2 tedy zachováme, je tak?</w:t>
-      </w:r>
-    </w:p>
-  </w:comment>
-  <w:comment w:id="12" w:author="Martin Vojík" w:date="2024-09-04T09:09:00Z" w:initials="MV">
-    <w:p>
-      <w:r>
-        <w:rPr>
-          <w:rFonts w:ascii="Liberation Serif" w:hAnsi="Liberation Serif" w:eastAsia="DejaVu Sans" w:cs="DejaVu Sans"/>
-          <w:sz w:val="24"/>
-          <w:szCs w:val="24"/>
-          <w:lang w:val="en-US" w:eastAsia="en-US" w:bidi="en-US"/>
-        </w:rPr>
-        <w:t>Z a) udělat „1“ a z b „2“, udělal bych to ale nemám editovatelnou verzi obrázku</w:t>
-      </w:r>
-    </w:p>
-  </w:comment>
-  <w:comment w:id="11" w:author="Martin Vojík" w:date="2024-09-04T09:07:00Z" w:initials="MV">
-    <w:p>
-      <w:r>
-        <w:rPr>
-          <w:rFonts w:ascii="Liberation Serif" w:hAnsi="Liberation Serif" w:eastAsia="DejaVu Sans" w:cs="DejaVu Sans"/>
-          <w:sz w:val="24"/>
-          <w:szCs w:val="24"/>
-          <w:lang w:val="en-US" w:eastAsia="en-US" w:bidi="en-US"/>
-        </w:rPr>
-        <w:t>Tady není úplně jasné co znamená A a B…pak tu jsou skupiny C a D, to také není popsáno</w:t>
-      </w:r>
-    </w:p>
-  </w:comment>
-  <w:comment w:id="13" w:author="Jakub Rataj" w:date="2026-01-29T14:35:59Z" w:initials="JR">
+  <w:comment w:id="9" w:author="Jakub Rataj" w:date="2026-01-07T15:03:01Z" w:initials="JR">
     <w:p>
       <w:r>
         <w:rPr>
@@ -51862,11 +51219,50 @@
           <w:em w:val="none"/>
           <w:lang w:val="cs-CZ" w:eastAsia="en-US" w:bidi="ar-SA"/>
         </w:rPr>
-        <w:t>v habitatech v EVL</w:t>
+        <w:t>?</w:t>
       </w:r>
     </w:p>
   </w:comment>
-  <w:comment w:id="14" w:author="Jakub Rataj" w:date="2026-01-29T14:37:59Z" w:initials="JR">
+  <w:comment w:id="10" w:author="Martin Vojík" w:date="2024-09-04T10:29:00Z" w:initials="MV">
+    <w:p>
+      <w:r>
+        <w:rPr>
+          <w:rFonts w:ascii="Liberation Serif" w:hAnsi="Liberation Serif" w:eastAsia="DejaVu Sans" w:cs="DejaVu Sans"/>
+          <w:sz w:val="24"/>
+          <w:szCs w:val="24"/>
+          <w:lang w:val="en-US" w:eastAsia="en-US" w:bidi="en-US"/>
+        </w:rPr>
+        <w:t>Přílohu 2 tedy zachováme, je tak?</w:t>
+      </w:r>
+    </w:p>
+  </w:comment>
+  <w:comment w:id="12" w:author="Martin Vojík" w:date="2024-09-04T09:09:00Z" w:initials="MV">
+    <w:p>
+      <w:r>
+        <w:rPr>
+          <w:rFonts w:ascii="Liberation Serif" w:hAnsi="Liberation Serif" w:eastAsia="DejaVu Sans" w:cs="DejaVu Sans"/>
+          <w:sz w:val="24"/>
+          <w:szCs w:val="24"/>
+          <w:lang w:val="en-US" w:eastAsia="en-US" w:bidi="en-US"/>
+        </w:rPr>
+        <w:t>Z a) udělat „1“ a z b „2“, udělal bych to ale nemám editovatelnou verzi obrázku</w:t>
+      </w:r>
+    </w:p>
+  </w:comment>
+  <w:comment w:id="11" w:author="Martin Vojík" w:date="2024-09-04T09:07:00Z" w:initials="MV">
+    <w:p>
+      <w:r>
+        <w:rPr>
+          <w:rFonts w:ascii="Liberation Serif" w:hAnsi="Liberation Serif" w:eastAsia="DejaVu Sans" w:cs="DejaVu Sans"/>
+          <w:sz w:val="24"/>
+          <w:szCs w:val="24"/>
+          <w:lang w:val="en-US" w:eastAsia="en-US" w:bidi="en-US"/>
+        </w:rPr>
+        <w:t>Tady není úplně jasné co znamená A a B…pak tu jsou skupiny C a D, to také není popsáno</w:t>
+      </w:r>
+    </w:p>
+  </w:comment>
+  <w:comment w:id="13" w:author="Jakub Rataj" w:date="2026-01-29T14:35:59Z" w:initials="JR">
     <w:p>
       <w:r>
         <w:rPr>
@@ -51896,11 +51292,11 @@
           <w:em w:val="none"/>
           <w:lang w:val="cs-CZ" w:eastAsia="en-US" w:bidi="ar-SA"/>
         </w:rPr>
-        <w:t>ve formuli je jenom jako „plocha stanoviště“, nahradit Vb?</w:t>
+        <w:t>v habitatech v EVL</w:t>
       </w:r>
     </w:p>
   </w:comment>
-  <w:comment w:id="15" w:author="Jakub Rataj" w:date="2026-01-07T16:08:22Z" w:initials="JR">
+  <w:comment w:id="14" w:author="Jakub Rataj" w:date="2026-01-29T14:37:59Z" w:initials="JR">
     <w:p>
       <w:r>
         <w:rPr>
@@ -51930,52 +51326,11 @@
           <w:em w:val="none"/>
           <w:lang w:val="cs-CZ" w:eastAsia="en-US" w:bidi="ar-SA"/>
         </w:rPr>
-        <w:t>vzorec: v kódu chybí začátek rovnice 100-…</w:t>
-      </w:r>
-    </w:p>
-    <w:p>
-      <w:r>
-        <w:rPr>
-          <w:rFonts w:ascii="Liberation Serif" w:hAnsi="Liberation Serif" w:eastAsia="DejaVu Sans" w:cs="DejaVu Sans"/>
-          <w:sz w:val="24"/>
-          <w:szCs w:val="24"/>
-          <w:lang w:val="en-US" w:eastAsia="en-US" w:bidi="en-US"/>
-        </w:rPr>
-      </w:r>
-    </w:p>
-    <w:p>
-      <w:r>
-        <w:rPr>
-          <w:rFonts w:cs="" w:eastAsia="Calibri" w:ascii="Calibri" w:hAnsi="Calibri"/>
-          <w:b w:val="false"/>
-          <w:bCs w:val="false"/>
-          <w:i w:val="false"/>
-          <w:iCs w:val="false"/>
-          <w:caps w:val="false"/>
-          <w:smallCaps w:val="false"/>
-          <w:strike w:val="false"/>
-          <w:dstrike w:val="false"/>
-          <w:outline w:val="false"/>
-          <w:shadow w:val="false"/>
-          <w:emboss w:val="false"/>
-          <w:imprint w:val="false"/>
-          <w:color w:val="auto"/>
-          <w:spacing w:val="0"/>
-          <w:w w:val="100"/>
-          <w:kern w:val="0"/>
-          <w:position w:val="0"/>
-          <w:sz w:val="20"/>
-          <w:szCs w:val="22"/>
-          <w:u w:val="none"/>
-          <w:vertAlign w:val="baseline"/>
-          <w:em w:val="none"/>
-          <w:lang w:val="cs-CZ" w:bidi="ar-SA" w:eastAsia="en-US"/>
-        </w:rPr>
-        <w:t>spravne je kod</w:t>
+        <w:t>ve formuli je jenom jako „plocha stanoviště“, nahradit Vb?</w:t>
       </w:r>
     </w:p>
   </w:comment>
-  <w:comment w:id="16" w:author="Jakub Rataj" w:date="2026-01-29T15:05:44Z" w:initials="JR">
+  <w:comment w:id="15" w:author="Jakub Rataj" w:date="2026-01-07T16:08:22Z" w:initials="JR">
     <w:p>
       <w:r>
         <w:rPr>
@@ -52005,6 +51360,82 @@
           <w:em w:val="none"/>
           <w:lang w:val="cs-CZ" w:eastAsia="en-US" w:bidi="ar-SA"/>
         </w:rPr>
+        <w:t>vzorec: v kódu chybí začátek rovnice 100-…</w:t>
+      </w:r>
+    </w:p>
+    <w:p>
+      <w:r>
+        <w:rPr>
+          <w:rFonts w:ascii="Liberation Serif" w:hAnsi="Liberation Serif" w:eastAsia="DejaVu Sans" w:cs="DejaVu Sans"/>
+          <w:sz w:val="24"/>
+          <w:szCs w:val="24"/>
+          <w:lang w:val="en-US" w:eastAsia="en-US" w:bidi="en-US"/>
+        </w:rPr>
+      </w:r>
+    </w:p>
+    <w:p>
+      <w:r>
+        <w:rPr>
+          <w:rFonts w:ascii="Calibri" w:hAnsi="Calibri" w:eastAsia="Calibri" w:cs=""/>
+          <w:b w:val="false"/>
+          <w:bCs w:val="false"/>
+          <w:i w:val="false"/>
+          <w:iCs w:val="false"/>
+          <w:caps w:val="false"/>
+          <w:smallCaps w:val="false"/>
+          <w:strike w:val="false"/>
+          <w:dstrike w:val="false"/>
+          <w:outline w:val="false"/>
+          <w:shadow w:val="false"/>
+          <w:emboss w:val="false"/>
+          <w:imprint w:val="false"/>
+          <w:color w:val="auto"/>
+          <w:spacing w:val="0"/>
+          <w:w w:val="100"/>
+          <w:kern w:val="0"/>
+          <w:position w:val="0"/>
+          <w:sz w:val="20"/>
+          <w:sz w:val="20"/>
+          <w:szCs w:val="22"/>
+          <w:u w:val="none"/>
+          <w:vertAlign w:val="baseline"/>
+          <w:em w:val="none"/>
+          <w:lang w:val="cs-CZ" w:eastAsia="en-US" w:bidi="ar-SA"/>
+        </w:rPr>
+        <w:t>spravne je kod</w:t>
+      </w:r>
+    </w:p>
+  </w:comment>
+  <w:comment w:id="16" w:author="Jakub Rataj" w:date="2026-01-29T15:05:44Z" w:initials="JR">
+    <w:p>
+      <w:r>
+        <w:rPr>
+          <w:rFonts w:ascii="Calibri" w:hAnsi="Calibri" w:eastAsia="Calibri" w:cs=""/>
+          <w:b w:val="false"/>
+          <w:bCs w:val="false"/>
+          <w:i w:val="false"/>
+          <w:iCs w:val="false"/>
+          <w:caps w:val="false"/>
+          <w:smallCaps w:val="false"/>
+          <w:strike w:val="false"/>
+          <w:dstrike w:val="false"/>
+          <w:outline w:val="false"/>
+          <w:shadow w:val="false"/>
+          <w:emboss w:val="false"/>
+          <w:imprint w:val="false"/>
+          <w:color w:val="auto"/>
+          <w:spacing w:val="0"/>
+          <w:w w:val="100"/>
+          <w:kern w:val="0"/>
+          <w:position w:val="0"/>
+          <w:sz w:val="20"/>
+          <w:sz w:val="20"/>
+          <w:szCs w:val="22"/>
+          <w:u w:val="none"/>
+          <w:vertAlign w:val="baseline"/>
+          <w:em w:val="none"/>
+          <w:lang w:val="cs-CZ" w:eastAsia="en-US" w:bidi="ar-SA"/>
+        </w:rPr>
         <w:t>opět, v kódu nevidím 100-...</w:t>
       </w:r>
     </w:p>
@@ -52137,7 +51568,79 @@
       </w:r>
     </w:p>
   </w:comment>
+  <w:comment w:id="22" w:author="Jakub Rataj" w:date="2026-02-13T11:38:19Z" w:initials="JR">
+    <w:p>
+      <w:r>
+        <w:rPr>
+          <w:rFonts w:eastAsia="Calibri" w:cstheme="minorBidi" w:eastAsiaTheme="minorHAnsi" w:cs="" w:ascii="Calibri" w:hAnsi="Calibri"/>
+          <w:b w:val="false"/>
+          <w:bCs w:val="false"/>
+          <w:i w:val="false"/>
+          <w:iCs w:val="false"/>
+          <w:caps w:val="false"/>
+          <w:smallCaps w:val="false"/>
+          <w:strike w:val="false"/>
+          <w:dstrike w:val="false"/>
+          <w:outline w:val="false"/>
+          <w:shadow w:val="false"/>
+          <w:emboss w:val="false"/>
+          <w:imprint w:val="false"/>
+          <w:color w:val="auto"/>
+          <w:spacing w:val="0"/>
+          <w:w w:val="100"/>
+          <w:kern w:val="0"/>
+          <w:position w:val="0"/>
+          <w:sz w:val="20"/>
+          <w:szCs w:val="22"/>
+          <w:u w:val="none"/>
+          <w:vertAlign w:val="baseline"/>
+          <w:em w:val="none"/>
+          <w:lang w:bidi="ar-SA" w:eastAsia="en-US" w:val="cs-CZ"/>
+        </w:rPr>
+        <w:t>stále aktuální? nedělá se část tohoto kódem při přípravě dat a nikoli v ArcGIS?</w:t>
+      </w:r>
+    </w:p>
+  </w:comment>
+  <w:comment w:id="23" w:author="Jakub Rataj" w:date="2026-02-13T11:21:01Z" w:initials="JR">
+    <w:p>
+      <w:r>
+        <w:rPr>
+          <w:rFonts w:eastAsia="Calibri" w:cstheme="minorBidi" w:eastAsiaTheme="minorHAnsi" w:cs="" w:ascii="Calibri" w:hAnsi="Calibri"/>
+          <w:b w:val="false"/>
+          <w:bCs w:val="false"/>
+          <w:i w:val="false"/>
+          <w:iCs w:val="false"/>
+          <w:caps w:val="false"/>
+          <w:smallCaps w:val="false"/>
+          <w:strike w:val="false"/>
+          <w:dstrike w:val="false"/>
+          <w:outline w:val="false"/>
+          <w:shadow w:val="false"/>
+          <w:emboss w:val="false"/>
+          <w:imprint w:val="false"/>
+          <w:color w:val="auto"/>
+          <w:spacing w:val="0"/>
+          <w:w w:val="100"/>
+          <w:kern w:val="0"/>
+          <w:position w:val="0"/>
+          <w:sz w:val="20"/>
+          <w:szCs w:val="22"/>
+          <w:u w:val="none"/>
+          <w:vertAlign w:val="baseline"/>
+          <w:em w:val="none"/>
+          <w:lang w:bidi="ar-SA" w:eastAsia="en-US" w:val="cs-CZ"/>
+        </w:rPr>
+        <w:t>aktualizovat</w:t>
+      </w:r>
+    </w:p>
+  </w:comment>
 </w:comments>
+</file>
+
+<file path=word/commentsExtended.xml><?xml version="1.0" encoding="utf-8"?>
+<w15:commentsEx xmlns:mc="http://schemas.openxmlformats.org/markup-compatibility/2006" xmlns:w15="http://schemas.microsoft.com/office/word/2012/wordml" mc:Ignorable="w15">
+  <w15:commentEx w15:paraId="01000000" w15:done="1"/>
+</w15:commentsEx>
 </file>
 
 <file path=word/footnotes.xml><?xml version="1.0" encoding="utf-8"?>
@@ -52192,6 +51695,7 @@
     <w:p>
       <w:pPr>
         <w:pStyle w:val="Footnote"/>
+        <w:jc w:val="both"/>
         <w:rPr/>
       </w:pPr>
       <w:r>
@@ -52206,41 +51710,16 @@
       </w:r>
       <w:r>
         <w:rPr/>
-        <w:t>Lustyk P. (20</w:t>
-      </w:r>
-      <w:ins w:id="90" w:author="Martin Vojík" w:date="2024-09-04T12:28:00Z">
-        <w:r>
-          <w:rPr/>
-          <w:t>24</w:t>
-        </w:r>
-      </w:ins>
-      <w:del w:id="91" w:author="Martin Vojík" w:date="2024-09-04T13:14:00Z">
-        <w:r>
-          <w:rPr/>
-          <w:delText>16): Metodika aktualizace vrstvy mapování biotopů, pracovní verze pro sezónu 20</w:delText>
-        </w:r>
-      </w:del>
-      <w:ins w:id="92" w:author="Martin Vojík" w:date="2024-09-04T12:28:00Z">
-        <w:r>
-          <w:rPr/>
-          <w:t>24</w:t>
-        </w:r>
-      </w:ins>
-      <w:del w:id="93" w:author="Martin Vojík" w:date="2024-09-04T13:14:00Z">
-        <w:r>
-          <w:rPr/>
-          <w:delText>16. – Ms., 33 p. [Depon in: Agentura ochrany přírody a krajiny ČR, Praha]</w:delText>
-        </w:r>
-      </w:del>
+        <w:t>Platí k termínu revize této metodiky. Metodika aktualizací se nadále vyvíjí, platná je vždy poslední verze.</w:t>
+      </w:r>
     </w:p>
   </w:footnote>
   <w:footnote w:id="4">
     <w:p>
       <w:pPr>
         <w:pStyle w:val="Footnote"/>
-        <w:rPr>
-          <w:del w:id="94" w:author="Martin Vojík" w:date="2024-09-04T13:14:00Z"/>
-        </w:rPr>
+        <w:jc w:val="both"/>
+        <w:rPr/>
       </w:pPr>
       <w:r>
         <w:rPr>
@@ -52254,7 +51733,30 @@
       </w:r>
       <w:r>
         <w:rPr/>
-        <w:t>Chytrý M., Kučera T. &amp; Kočí M. [eds] (2001): Katalog biotopů České republiky. Interpretační příručka k evropským programům Natura 2000 a Smaragd. – Agentura ochrany přírody a krajiny ČR, Praha.</w:t>
+        <w:t>Sogaard B. et al. (2007): Criteria for favourable conservation status in Denmark. – NERI Tech. Rep. No 647, Aarhus.</w:t>
+      </w:r>
+    </w:p>
+  </w:footnote>
+  <w:footnote w:id="5">
+    <w:p>
+      <w:pPr>
+        <w:pStyle w:val="Footnote"/>
+        <w:jc w:val="both"/>
+        <w:rPr/>
+      </w:pPr>
+      <w:r>
+        <w:rPr>
+          <w:rStyle w:val="FootnoteCharacters"/>
+        </w:rPr>
+        <w:footnoteRef/>
+      </w:r>
+      <w:r>
+        <w:rPr/>
+        <w:t xml:space="preserve"> </w:t>
+      </w:r>
+      <w:r>
+        <w:rPr/>
+        <w:t>Byla excerpována starší verze červeného seznamu především z důvodu nomenklatury bližší číselníku databáze Wanas. AOPK ČR používá dosud seznam odpovídající nomenklatuře použité v Klíči ke květeně ČR (Kubát et al. 2002), kdežto aktuální červený seznam (Grulich 2012) používá odlišnou nomenklaturu podle Danihelky (2012). Danihelka J., Chrtek Jr. &amp; Kaplan Z. (2012): Checklist of vascular plants of the Czech Republic. – Preslia 84: 647–812.</w:t>
       </w:r>
     </w:p>
     <w:p>
@@ -52262,53 +51764,16 @@
         <w:pStyle w:val="Footnote"/>
         <w:rPr/>
       </w:pPr>
-      <w:del w:id="95" w:author="Martin Vojík" w:date="2024-09-04T13:14:00Z">
-        <w:r>
-          <w:rPr/>
-          <w:delText>Chytrý M., Kučera T., Kočí M., Grulich V. &amp; Lustyk P. [eds] (2010): Katalog biotopů České republiky, Ed. 2. – Agentura ochrany přírody a krajiny ČR, Praha.</w:delText>
-        </w:r>
-      </w:del>
-    </w:p>
-  </w:footnote>
-  <w:footnote w:id="5">
-    <w:p>
-      <w:pPr>
-        <w:pStyle w:val="Footnote"/>
+      <w:r>
         <w:rPr/>
-      </w:pPr>
-      <w:r>
-        <w:rPr>
-          <w:rStyle w:val="FootnoteCharacters"/>
-        </w:rPr>
-        <w:footnoteRef/>
-      </w:r>
-      <w:r>
-        <w:rPr/>
-        <w:t xml:space="preserve"> </w:t>
-      </w:r>
-      <w:r>
-        <w:rPr/>
-        <w:t>Lustyk P. [ed.] (20</w:t>
-      </w:r>
-      <w:ins w:id="96" w:author="Martin Vojík" w:date="2024-09-04T12:25:00Z">
-        <w:r>
-          <w:rPr/>
-          <w:t>24</w:t>
-        </w:r>
-      </w:ins>
-      <w:del w:id="97" w:author="Martin Vojík" w:date="2024-09-04T13:15:00Z">
-        <w:r>
-          <w:rPr/>
-          <w:delText>15): Příručka hodnocení biotopů. – Ms., 540 p. [Depon in: Agentura ochrany přírody a krajiny ČR, Praha]</w:delText>
-        </w:r>
-      </w:del>
+        <w:t>Grulich V. (2012): Red List of vascular plants of the Czech Republic: 3rd edition. – Preslia 84: 631–645.</w:t>
+      </w:r>
     </w:p>
   </w:footnote>
   <w:footnote w:id="6">
     <w:p>
       <w:pPr>
         <w:pStyle w:val="Footnote"/>
-        <w:jc w:val="both"/>
         <w:rPr/>
       </w:pPr>
       <w:r>
@@ -52323,7 +51788,7 @@
       </w:r>
       <w:r>
         <w:rPr/>
-        <w:t>Platí k termínu revize této metodiky. Metodika aktualizací se nadále vyvíjí, platná je vždy poslední verze.</w:t>
+        <w:t>Moravec J. (ed., 1995): Rostlinná společenstva České republiky a jejich ohrožení. 2. Vydání. Severočeskou přírodou, Litoměřice, Příloha 1995: 1-206.</w:t>
       </w:r>
     </w:p>
   </w:footnote>
@@ -52331,7 +51796,6 @@
     <w:p>
       <w:pPr>
         <w:pStyle w:val="Footnote"/>
-        <w:jc w:val="both"/>
         <w:rPr/>
       </w:pPr>
       <w:r>
@@ -52346,7 +51810,7 @@
       </w:r>
       <w:r>
         <w:rPr/>
-        <w:t>Sogaard B. et al. (2007): Criteria for favourable conservation status in Denmark. – NERI Tech. Rep. No 647, Aarhus.</w:t>
+        <w:t>Kučera T. (ed., 2005): Červená kniha biotopů ČR. – In: Härtel H., Lončáková J. &amp; Hošek M. [eds] (2009): Mapování biotopů v České republice. Východiska, výsledky, perspektivy. – Agentura ochrany přírody a krajiny ČR, Praha.</w:t>
       </w:r>
     </w:p>
   </w:footnote>
@@ -52354,7 +51818,6 @@
     <w:p>
       <w:pPr>
         <w:pStyle w:val="Footnote"/>
-        <w:jc w:val="both"/>
         <w:rPr/>
       </w:pPr>
       <w:r>
@@ -52369,17 +51832,7 @@
       </w:r>
       <w:r>
         <w:rPr/>
-        <w:t>Byla excerpována starší verze červeného seznamu především z důvodu nomenklatury bližší číselníku databáze Wanas. AOPK ČR používá dosud seznam odpovídající nomenklatuře použité v Klíči ke květeně ČR (Kubát et al. 2002), kdežto aktuální červený seznam (Grulich 2012) používá odlišnou nomenklaturu podle Danihelky (2012). Danihelka J., Chrtek Jr. &amp; Kaplan Z. (2012): Checklist of vascular plants of the Czech Republic. – Preslia 84: 647–812.</w:t>
-      </w:r>
-    </w:p>
-    <w:p>
-      <w:pPr>
-        <w:pStyle w:val="Footnote"/>
-        <w:rPr/>
-      </w:pPr>
-      <w:r>
-        <w:rPr/>
-        <w:t>Grulich V. (2012): Red List of vascular plants of the Czech Republic: 3rd edition. – Preslia 84: 631–645.</w:t>
+        <w:t xml:space="preserve">Je třeba rozlišovat parametr minimiareál vztahující se k dané předmětolokalitě od obecných hodnot minimiareálu biotopu / stanoviště, které byly stanoveny expertně na základě dostupných reálných dat </w:t>
       </w:r>
     </w:p>
   </w:footnote>
@@ -52401,7 +51854,7 @@
       </w:r>
       <w:r>
         <w:rPr/>
-        <w:t>Moravec J. (ed., 1995): Rostlinná společenstva České republiky a jejich ohrožení. 2. Vydání. Severočeskou přírodou, Litoměřice, Příloha 1995: 1-206.</w:t>
+        <w:t xml:space="preserve">Zde je myšlena mozaika segmentů či polygonů v rámci EVL, nikoliv mozaikovité segmenty z více biotopů. </w:t>
       </w:r>
     </w:p>
   </w:footnote>
@@ -52423,109 +51876,11 @@
       </w:r>
       <w:r>
         <w:rPr/>
-        <w:t>Kučera T. (ed., 2005): Červená kniha biotopů ČR. – In: Härtel H., Lončáková J. &amp; Hošek M. [eds] (2009): Mapování biotopů v České republice. Východiska, výsledky, perspektivy. – Agentura ochrany přírody a krajiny ČR, Praha.</w:t>
+        <w:t xml:space="preserve">Z důvodu dosavadního nízkého pokrytí ČR floristickými daty a z toho vyplývající neexistence relevantního Červeného seznamu parožnatek není možné použít jiné dělení, než běžné a méně běžné druhy. </w:t>
       </w:r>
     </w:p>
   </w:footnote>
   <w:footnote w:id="11">
-    <w:p>
-      <w:pPr>
-        <w:pStyle w:val="Footnote"/>
-        <w:rPr/>
-      </w:pPr>
-      <w:r>
-        <w:rPr>
-          <w:rStyle w:val="FootnoteCharacters"/>
-        </w:rPr>
-        <w:footnoteRef/>
-      </w:r>
-      <w:r>
-        <w:rPr/>
-        <w:t xml:space="preserve"> </w:t>
-      </w:r>
-      <w:r>
-        <w:rPr/>
-        <w:t xml:space="preserve">Je třeba rozlišovat parametr minimiareál vztahující se k dané předmětolokalitě od obecných hodnot minimiareálu biotopu / stanoviště, které byly stanoveny expertně na základě dostupných reálných dat </w:t>
-      </w:r>
-    </w:p>
-  </w:footnote>
-  <w:footnote w:id="12">
-    <w:p>
-      <w:pPr>
-        <w:pStyle w:val="Footnote"/>
-        <w:rPr/>
-      </w:pPr>
-      <w:r>
-        <w:rPr>
-          <w:rStyle w:val="FootnoteCharacters"/>
-        </w:rPr>
-        <w:footnoteRef/>
-      </w:r>
-      <w:r>
-        <w:rPr/>
-        <w:t xml:space="preserve"> </w:t>
-      </w:r>
-      <w:r>
-        <w:rPr/>
-        <w:t xml:space="preserve">Zde je myšlena mozaika segmentů či polygonů v rámci EVL, nikoliv mozaikovité segmenty </w:t>
-      </w:r>
-      <w:del w:id="98" w:author="Martin Vojík" w:date="2024-09-04T09:10:00Z">
-        <w:r>
-          <w:rPr/>
-          <w:delText>z více</w:delText>
-        </w:r>
-      </w:del>
-      <w:ins w:id="99" w:author="Martin Vojík" w:date="2024-09-04T09:10:00Z">
-        <w:r>
-          <w:rPr/>
-          <w:t>tvořené více</w:t>
-        </w:r>
-      </w:ins>
-      <w:r>
-        <w:rPr/>
-        <w:t xml:space="preserve"> biotop</w:t>
-      </w:r>
-      <w:ins w:id="100" w:author="Martin Vojík" w:date="2024-09-04T09:10:00Z">
-        <w:r>
-          <w:rPr/>
-          <w:t>y</w:t>
-        </w:r>
-      </w:ins>
-      <w:del w:id="101" w:author="Martin Vojík" w:date="2024-09-04T09:10:00Z">
-        <w:r>
-          <w:rPr/>
-          <w:delText>ů</w:delText>
-        </w:r>
-      </w:del>
-      <w:r>
-        <w:rPr/>
-        <w:t xml:space="preserve">. </w:t>
-      </w:r>
-    </w:p>
-  </w:footnote>
-  <w:footnote w:id="13">
-    <w:p>
-      <w:pPr>
-        <w:pStyle w:val="Footnote"/>
-        <w:rPr/>
-      </w:pPr>
-      <w:r>
-        <w:rPr>
-          <w:rStyle w:val="FootnoteCharacters"/>
-        </w:rPr>
-        <w:footnoteRef/>
-      </w:r>
-      <w:r>
-        <w:rPr/>
-        <w:t xml:space="preserve"> </w:t>
-      </w:r>
-      <w:r>
-        <w:rPr/>
-        <w:t xml:space="preserve">Z důvodu dosavadního nízkého pokrytí ČR floristickými daty a z toho vyplývající neexistence relevantního Červeného seznamu parožnatek není možné použít jiné dělení, než běžné a méně běžné druhy. </w:t>
-      </w:r>
-    </w:p>
-  </w:footnote>
-  <w:footnote w:id="14">
     <w:p>
       <w:pPr>
         <w:pStyle w:val="Footnote"/>

</xml_diff>